<commit_message>
Add Sakhnin College logo and name to the title page
Co-Authored-By: Claude Fable 5.1 <noreply@anthropic.com>
Claude-Session: https://claude.ai/code/session_019RaBW72rT1xkbcXD9zJSh3
</commit_message>
<xml_diff>
--- a/seminar/עבודה_סמינריונית_סופית_מסכים_שינה_פעילות_גופנית_לקויות_למידה.docx
+++ b/seminar/עבודה_סמינריונית_סופית_מסכים_שינה_פעילות_גופנית_לקויות_למידה.docx
@@ -14,25 +14,50 @@
       </w:r>
     </w:p>
     <w:p>
+      <w:pPr>
+        <w:keepNext/>
+        <w:spacing w:after="60" w:before="120"/>
+        <w:jc w:val="center"/>
+      </w:pPr>
       <w:r>
-        <w:rPr>
-          <w:rFonts w:ascii="Times New Roman" w:cs="David" w:eastAsia="David" w:hAnsi="Times New Roman"/>
-          <w:sz w:val="24"/>
-          <w:szCs w:val="24"/>
-          <w:rtl/>
-        </w:rPr>
-        <w:t xml:space="preserve"/>
-      </w:r>
-    </w:p>
-    <w:p>
-      <w:r>
-        <w:rPr>
-          <w:rFonts w:ascii="Times New Roman" w:cs="David" w:eastAsia="David" w:hAnsi="Times New Roman"/>
-          <w:sz w:val="24"/>
-          <w:szCs w:val="24"/>
-          <w:rtl/>
-        </w:rPr>
-        <w:t xml:space="preserve"/>
+        <w:drawing>
+          <wp:inline distT="0" distB="0" distL="0" distR="0">
+            <wp:extent cx="1981200" cy="1981200"/>
+            <wp:effectExtent t="0" r="0" b="0" l="0"/>
+            <wp:docPr id="1" name="" descr="" title=""/>
+            <wp:cNvGraphicFramePr>
+              <a:graphicFrameLocks xmlns:a="http://schemas.openxmlformats.org/drawingml/2006/main" noChangeAspect="1"/>
+            </wp:cNvGraphicFramePr>
+            <a:graphic xmlns:a="http://schemas.openxmlformats.org/drawingml/2006/main">
+              <a:graphicData uri="http://schemas.openxmlformats.org/drawingml/2006/picture">
+                <pic:pic xmlns:pic="http://schemas.openxmlformats.org/drawingml/2006/picture">
+                  <pic:nvPicPr>
+                    <pic:cNvPr id="0" name="" descr=""/>
+                    <pic:cNvPicPr>
+                      <a:picLocks noChangeAspect="1" noChangeArrowheads="1"/>
+                    </pic:cNvPicPr>
+                  </pic:nvPicPr>
+                  <pic:blipFill>
+                    <a:blip r:embed="rId9" cstate="none"/>
+                    <a:srcRect/>
+                    <a:stretch>
+                      <a:fillRect/>
+                    </a:stretch>
+                  </pic:blipFill>
+                  <pic:spPr bwMode="auto">
+                    <a:xfrm>
+                      <a:off x="0" y="0"/>
+                      <a:ext cx="1981200" cy="1981200"/>
+                    </a:xfrm>
+                    <a:prstGeom prst="rect">
+                      <a:avLst/>
+                    </a:prstGeom>
+                  </pic:spPr>
+                </pic:pic>
+              </a:graphicData>
+            </a:graphic>
+          </wp:inline>
+        </w:drawing>
       </w:r>
     </w:p>
     <w:p>
@@ -50,7 +75,7 @@
           <w:szCs w:val="28"/>
           <w:rtl/>
         </w:rPr>
-        <w:t xml:space="preserve">[שם המוסד האקדמי]</w:t>
+        <w:t xml:space="preserve">מכללת סכנין להכשרת עובדי הוראה</w:t>
       </w:r>
     </w:p>
     <w:p>
@@ -68,7 +93,7 @@
           <w:szCs w:val="24"/>
           <w:rtl/>
         </w:rPr>
-        <w:t xml:space="preserve">[שם התוכנית / החוג]</w:t>
+        <w:t xml:space="preserve">[שם התוכנית / החוג, למשל: החוג לחינוך מיוחד]</w:t>
       </w:r>
     </w:p>
     <w:p>
@@ -8154,7 +8179,7 @@
                     </pic:cNvPicPr>
                   </pic:nvPicPr>
                   <pic:blipFill>
-                    <a:blip r:embed="rId9" cstate="none"/>
+                    <a:blip r:embed="rId10" cstate="none"/>
                     <a:srcRect/>
                     <a:stretch>
                       <a:fillRect/>
@@ -10627,7 +10652,7 @@
                     </pic:cNvPicPr>
                   </pic:nvPicPr>
                   <pic:blipFill>
-                    <a:blip r:embed="rId10" cstate="none"/>
+                    <a:blip r:embed="rId11" cstate="none"/>
                     <a:srcRect/>
                     <a:stretch>
                       <a:fillRect/>
@@ -12927,7 +12952,7 @@
                     </pic:cNvPicPr>
                   </pic:nvPicPr>
                   <pic:blipFill>
-                    <a:blip r:embed="rId11" cstate="none"/>
+                    <a:blip r:embed="rId12" cstate="none"/>
                     <a:srcRect/>
                     <a:stretch>
                       <a:fillRect/>

</xml_diff>

<commit_message>
Conform seminar structure to course guidelines
Co-Authored-By: Claude Fable 5.1 <noreply@anthropic.com>
Claude-Session: https://claude.ai/code/session_019RaBW72rT1xkbcXD9zJSh3
</commit_message>
<xml_diff>
--- a/seminar/עבודה_סמינריונית_סופית_מסכים_שינה_פעילות_גופנית_לקויות_למידה.docx
+++ b/seminar/עבודה_סמינריונית_סופית_מסכים_שינה_פעילות_גופנית_לקויות_למידה.docx
@@ -469,126 +469,6 @@
           <w:szCs w:val="32"/>
           <w:rtl/>
         </w:rPr>
-        <w:t xml:space="preserve">תקציר</w:t>
-      </w:r>
-    </w:p>
-    <w:p>
-      <w:pPr>
-        <w:bidi/>
-        <w:spacing w:after="120" w:line="360"/>
-        <w:ind w:firstLine="709"/>
-        <w:jc w:val="both"/>
-      </w:pPr>
-      <w:r>
-        <w:rPr>
-          <w:rFonts w:ascii="Times New Roman" w:cs="David" w:eastAsia="David" w:hAnsi="Times New Roman"/>
-          <w:sz w:val="24"/>
-          <w:szCs w:val="24"/>
-          <w:rtl/>
-        </w:rPr>
-        <w:t xml:space="preserve">העבודה בחנה את דפוסי החשיפה למסכים, השינה והפעילות הגופנית בקרב תלמידים עם לקויות למידה, את הקשרים בין שלוש ההתנהגויות לבין התפקוד הלימודי, ואת ההבדלים בין תלמידים עם וללא לקויות למידה. המסגרת התיאורטית נשענת על המודל המשולב של 24 שעות התנועה ועל הספרות על שינה וקשיים מוטוריים בלקויות למידה. המחקר כמותי במערך חתך: 65 תלמידי כיתות ז' עד י"ב, 40 עם אבחון של לקות למידה ו-25 ללא אבחון, מילאו שאלון דיווח עצמי אנונימי שכלל פריטי מסכים, שינה ופעילות גופנית מסקר HBSC, סולם ישנוניות יומית ודיווח על ציונים ותפקוד בלמידה. הנתונים נותחו ב-SPSS במתאמי פירסון, ברגרסיה מרובה, בניתוח שונות, במבחני t ובמבחני חי בריבוע. בקבוצת המחקר נמצא שזמן המסך קשור לשינה קצרה ומאוחרת יותר, לישנוניות רבה יותר ולציונים נמוכים יותר, והוא נותר המנבא היחיד המובהק של ממוצע הציונים בפיקוח על יתר ההתנהגויות. לא נמצא קשר בין מסכים לפעילות גופנית. תלמידים עם לקויות למידה לא נבדלו מעמיתיהם בכמות המסכים, אך שיעור נמוך יותר מהם עמד בהמלצת השינה, וכל המלצה נוספת שהתקיימה לוותה בתפקוד לימודי טוב יותר. המסקנה היישומית היא שליווי תלמידים עם לקויות למידה צריך לכלול, לצד ההתאמות בלמידה, התייחסות להרגלי המסך והשינה, ובראשם הוצאת המסכים מחדר השינה.</w:t>
-      </w:r>
-    </w:p>
-    <w:p>
-      <w:pPr>
-        <w:bidi/>
-        <w:spacing w:after="120" w:line="360"/>
-        <w:jc w:val="right"/>
-      </w:pPr>
-      <w:r>
-        <w:rPr>
-          <w:rFonts w:ascii="Times New Roman" w:cs="David" w:eastAsia="David" w:hAnsi="Times New Roman"/>
-          <w:sz w:val="24"/>
-          <w:szCs w:val="24"/>
-          <w:rtl/>
-        </w:rPr>
-        <w:t xml:space="preserve">מילות מפתח: לקויות למידה, זמן מסך, שינה, פעילות גופנית, הישגים לימודיים, המלצות 24 השעות</w:t>
-      </w:r>
-    </w:p>
-    <w:p>
-      <w:r>
-        <w:br w:type="page"/>
-      </w:r>
-    </w:p>
-    <w:p>
-      <w:pPr>
-        <w:pStyle w:val="Heading1"/>
-        <w:bidi w:val="false"/>
-        <w:spacing w:after="240" w:before="240" w:line="360"/>
-        <w:jc w:val="left"/>
-      </w:pPr>
-      <w:r>
-        <w:rPr>
-          <w:rFonts w:ascii="Times New Roman" w:cs="Times New Roman" w:hAnsi="Times New Roman"/>
-          <w:b/>
-          <w:bCs/>
-          <w:color w:val="000000"/>
-          <w:sz w:val="32"/>
-          <w:szCs w:val="32"/>
-        </w:rPr>
-        <w:t xml:space="preserve">Abstract</w:t>
-      </w:r>
-    </w:p>
-    <w:p>
-      <w:pPr>
-        <w:bidi w:val="false"/>
-        <w:spacing w:after="120" w:line="360"/>
-        <w:jc w:val="left"/>
-      </w:pPr>
-      <w:r>
-        <w:rPr>
-          <w:rFonts w:ascii="Times New Roman" w:cs="Times New Roman" w:hAnsi="Times New Roman"/>
-          <w:b w:val="false"/>
-          <w:bCs w:val="false"/>
-          <w:i w:val="false"/>
-          <w:iCs w:val="false"/>
-          <w:sz w:val="24"/>
-          <w:szCs w:val="24"/>
-        </w:rPr>
-        <w:t xml:space="preserve">This study examined patterns of screen exposure, sleep and physical activity among students with learning disabilities, the associations between these three behaviours and academic functioning, and differences between students with and without learning disabilities. The theoretical framework draws on the integrated 24-hour movement model and on the literature on sleep and motor difficulties in learning disabilities. A cross-sectional quantitative design was used: 65 students in grades 7 to 12, 40 with a diagnosed learning disability and 25 without, completed an anonymous self-report questionnaire including HBSC screen, sleep and physical activity items, a daytime sleepiness scale and self-reported grades and learning functioning. Data were analysed in SPSS using Pearson correlations, multiple regression, one-way ANOVA, t-tests and chi-square tests. In the learning-disability group, screen time was associated with shorter and later sleep, greater daytime sleepiness and lower grades, and remained the only significant predictor of grade average when the other behaviours were controlled. No association was found between screen time and physical activity. Students with learning disabilities did not differ from their peers in the amount of screen time, but a smaller proportion of them met the sleep guideline, and each additional guideline met was accompanied by better academic functioning. The practical conclusion is that support for students with learning disabilities should address screen and sleep habits, first of all removing screens from the bedroom, alongside learning accommodations.</w:t>
-      </w:r>
-    </w:p>
-    <w:p>
-      <w:pPr>
-        <w:bidi w:val="false"/>
-        <w:spacing w:after="120" w:line="360"/>
-        <w:jc w:val="left"/>
-      </w:pPr>
-      <w:r>
-        <w:rPr>
-          <w:rFonts w:ascii="Times New Roman" w:cs="Times New Roman" w:hAnsi="Times New Roman"/>
-          <w:b w:val="false"/>
-          <w:bCs w:val="false"/>
-          <w:i/>
-          <w:iCs/>
-          <w:sz w:val="24"/>
-          <w:szCs w:val="24"/>
-        </w:rPr>
-        <w:t xml:space="preserve">Keywords: learning disabilities, screen time, sleep, physical activity, academic achievement, 24-hour movement guidelines</w:t>
-      </w:r>
-    </w:p>
-    <w:p>
-      <w:r>
-        <w:br w:type="page"/>
-      </w:r>
-    </w:p>
-    <w:p>
-      <w:pPr>
-        <w:pStyle w:val="Heading1"/>
-        <w:bidi/>
-        <w:spacing w:after="240" w:before="240" w:line="360"/>
-        <w:jc w:val="right"/>
-      </w:pPr>
-      <w:r>
-        <w:rPr>
-          <w:rFonts w:ascii="Times New Roman" w:cs="David" w:eastAsia="David" w:hAnsi="Times New Roman"/>
-          <w:b/>
-          <w:bCs/>
-          <w:color w:val="000000"/>
-          <w:sz w:val="32"/>
-          <w:szCs w:val="32"/>
-          <w:rtl/>
-        </w:rPr>
         <w:t xml:space="preserve">מבוא</w:t>
       </w:r>
     </w:p>
@@ -674,7 +554,7 @@
           <w:szCs w:val="24"/>
           <w:rtl/>
         </w:rPr>
-        <w:t xml:space="preserve">העבודה בנויה כך: הפרק הראשון סוקר את הספרות. הוא פותח בהגדרת לקויות למידה ובמאפייניהן, ממשיך לשלוש ההתנהגויות הנחקרות ולמודל המשולב של 24 השעות, מציג את תמונת המצב בישראל ומסתיים ברציונל, במטרות, בשאלות ובהשערות המחקר. הפרק השני מתאר את שיטת המחקר: מערך המחקר, אוכלוסיית המחקר, כלי המחקר, ההליך, דרכי ניתוח הנתונים, השיקולים האתיים ומגבלות המחקר. הפרק השלישי מציג את הממצאים לפי סדר שאלות המחקר וההשערות, הפרק הרביעי דן בהם לאור הספרות ומציע מסקנות והמלצות, והפרק החמישי מסכם. גבולות העבודה: היא עוסקת בתלמידים עם לקות למידה מאובחנת בכיתות ז' עד י"ב, ואינה עוסקת במוגבלות שכלית, באוטיזם או בלקויות חושיות. הפרעת קשב נדונה רק במידה שהיא נלווית ללקות למידה.</w:t>
+        <w:t xml:space="preserve">העבודה בנויה כך: הפרק הראשון סוקר את הספרות. הוא פותח בהגדרת לקויות למידה ובמאפייניהן, ממשיך לשלוש ההתנהגויות הנחקרות ולמודל המשולב של 24 השעות, מציג את תמונת המצב בישראל ומסתיים ברציונל, במטרות, בשאלות ובהשערות המחקר. הפרק השני מתאר את שיטת המחקר: מערך המחקר, אוכלוסיית המחקר, כלי המחקר, ההליך, דרכי ניתוח הנתונים, השיקולים האתיים ומגבלות המחקר. הפרק השלישי מציג את הממצאים לפי סדר שאלות המחקר וההשערות, והפרק הרביעי דן בהם לאור הספרות, מציע מסקנות והמלצות ומסכם. מבנה זה נבחר משום שהוא עוקב אחר מהלך המחקר עצמו: קודם מה שכבר ידוע, אחר כך כיצד נבדק מה שאינו ידוע, ולבסוף מה נמצא ומה משמעותו, כך שכל שאלת מחקר שהוצגה בסקירה מקבלת מענה באותו סדר בממצאים ובדיון. גבולות העבודה: היא עוסקת בתלמידים עם לקות למידה מאובחנת בכיתות ז' עד י"ב, ואינה עוסקת במוגבלות שכלית, באוטיזם או בלקויות חושיות. הפרעת קשב נדונה רק במידה שהיא נלווית ללקות למידה.</w:t>
       </w:r>
     </w:p>
     <w:p>
@@ -2135,7 +2015,7 @@
           <w:szCs w:val="24"/>
           <w:rtl/>
         </w:rPr>
-        <w:t xml:space="preserve">[הערה לגרסה זו: פרקי הממצאים, הדיון והסיכום נכתבו על בסיס קובץ נתונים מדומה (N = 65) שנבנה לצורך תרגול הניתוח, כדי להציג את המבנה המלא של העבודה. לפני ההגשה יש להחליף את הנתונים בשאלונים שנאספו בפועל, להריץ מחדש את הסינטקס ולעדכן את הלוחות, התרשימים והטקסט. למחוק הערה זו.]</w:t>
+        <w:t xml:space="preserve">[הערה לגרסה זו: פרקי הממצאים והדיון נכתבו על בסיס קובץ נתונים מדומה (N = 65) שנבנה לצורך תרגול הניתוח, כדי להציג את המבנה המלא של העבודה. לפני ההגשה יש להחליף את הנתונים בשאלונים שנאספו בפועל, להריץ מחדש את הסינטקס ולעדכן את הלוחות, התרשימים והטקסט. למחוק הערה זו.]</w:t>
       </w:r>
     </w:p>
     <w:p>
@@ -8163,7 +8043,7 @@
       <w:r>
         <w:drawing>
           <wp:inline distT="0" distB="0" distL="0" distR="0">
-            <wp:extent cx="5219700" cy="3200400"/>
+            <wp:extent cx="4495800" cy="2771775"/>
             <wp:effectExtent t="0" r="0" b="0" l="0"/>
             <wp:docPr id="1" name="" descr="" title=""/>
             <wp:cNvGraphicFramePr>
@@ -8188,7 +8068,7 @@
                   <pic:spPr bwMode="auto">
                     <a:xfrm>
                       <a:off x="0" y="0"/>
-                      <a:ext cx="5219700" cy="3200400"/>
+                      <a:ext cx="4495800" cy="2771775"/>
                     </a:xfrm>
                     <a:prstGeom prst="rect">
                       <a:avLst/>
@@ -10636,7 +10516,7 @@
       <w:r>
         <w:drawing>
           <wp:inline distT="0" distB="0" distL="0" distR="0">
-            <wp:extent cx="5219700" cy="3381375"/>
+            <wp:extent cx="4495800" cy="2914650"/>
             <wp:effectExtent t="0" r="0" b="0" l="0"/>
             <wp:docPr id="1" name="" descr="" title=""/>
             <wp:cNvGraphicFramePr>
@@ -10661,7 +10541,7 @@
                   <pic:spPr bwMode="auto">
                     <a:xfrm>
                       <a:off x="0" y="0"/>
-                      <a:ext cx="5219700" cy="3381375"/>
+                      <a:ext cx="4495800" cy="2914650"/>
                     </a:xfrm>
                     <a:prstGeom prst="rect">
                       <a:avLst/>
@@ -12936,7 +12816,7 @@
       <w:r>
         <w:drawing>
           <wp:inline distT="0" distB="0" distL="0" distR="0">
-            <wp:extent cx="4495800" cy="3095625"/>
+            <wp:extent cx="3962400" cy="2733675"/>
             <wp:effectExtent t="0" r="0" b="0" l="0"/>
             <wp:docPr id="1" name="" descr="" title=""/>
             <wp:cNvGraphicFramePr>
@@ -12961,7 +12841,7 @@
                   <pic:spPr bwMode="auto">
                     <a:xfrm>
                       <a:off x="0" y="0"/>
-                      <a:ext cx="4495800" cy="3095625"/>
+                      <a:ext cx="3962400" cy="2733675"/>
                     </a:xfrm>
                     <a:prstGeom prst="rect">
                       <a:avLst/>
@@ -17127,7 +17007,24 @@
           <w:szCs w:val="28"/>
           <w:rtl/>
         </w:rPr>
-        <w:t xml:space="preserve">4.7 מגבלות המחקר</w:t>
+        <w:t xml:space="preserve">4.7 הערכה ביקורתית ומגבלות המחקר</w:t>
+      </w:r>
+    </w:p>
+    <w:p>
+      <w:pPr>
+        <w:bidi/>
+        <w:spacing w:after="120" w:line="360"/>
+        <w:ind w:firstLine="709"/>
+        <w:jc w:val="both"/>
+      </w:pPr>
+      <w:r>
+        <w:rPr>
+          <w:rFonts w:ascii="Times New Roman" w:cs="David" w:eastAsia="David" w:hAnsi="Times New Roman"/>
+          <w:sz w:val="24"/>
+          <w:szCs w:val="24"/>
+          <w:rtl/>
+        </w:rPr>
+        <w:t xml:space="preserve">הערכה ביקורתית של המחקר מעלה שתי נקודות שכותב העבודה רואה כחשובות במיוחד. הראשונה נוגעת למדידה: זמן המסך נמדד כסכום שעות, ואילו הממצא של קוקבש ואחרים (Kocabas et al., 2025) מרמז שאצל תלמידים עם לקויות למידה השאלה החשובה היא מה עושים מול המסך ולא רק כמה. ייתכן שחלק מהקשר שנמצא עם הציונים משקף שימוש פסיבי ומאוחר בלילה, ולא כל שימוש, ומדד כולל מטשטש זאת. השנייה נוגעת לכיוון ההשפעה: הפרשנות שהמסכים פוגעים בשינה ובלמידה טבעית ומתיישבת עם הספרות, אך תלמיד שנכשל בלמידה ומתקשה להירדם עשוי לברוח אל המסך, ואז המסך הוא סימפטום ולא סיבה. המחקר הנוכחי אינו יכול להכריע בין שני ההסברים, והתובנה המעשית שלו תקפה בשניהם: הרגלי המסך והשינה הם נקודת כניסה נגישה להתערבות, גם אם אינם המקור היחיד לקושי.</w:t>
       </w:r>
     </w:p>
     <w:p>
@@ -17185,15 +17082,10 @@
       </w:r>
     </w:p>
     <w:p>
-      <w:r>
-        <w:br w:type="page"/>
-      </w:r>
-    </w:p>
-    <w:p>
       <w:pPr>
-        <w:pStyle w:val="Heading1"/>
+        <w:pStyle w:val="Heading2"/>
         <w:bidi/>
-        <w:spacing w:after="240" w:before="240" w:line="360"/>
+        <w:spacing w:after="120" w:before="240" w:line="360"/>
         <w:jc w:val="right"/>
       </w:pPr>
       <w:r>
@@ -17202,11 +17094,11 @@
           <w:b/>
           <w:bCs/>
           <w:color w:val="000000"/>
-          <w:sz w:val="32"/>
-          <w:szCs w:val="32"/>
+          <w:sz w:val="28"/>
+          <w:szCs w:val="28"/>
           <w:rtl/>
         </w:rPr>
-        <w:t xml:space="preserve">סיכום</w:t>
+        <w:t xml:space="preserve">4.9 סיכום</w:t>
       </w:r>
     </w:p>
     <w:p>

</xml_diff>

<commit_message>
Calibrate TOC page estimates and spacing
Co-Authored-By: Claude Fable 5.1 <noreply@anthropic.com>
Claude-Session: https://claude.ai/code/session_019RaBW72rT1xkbcXD9zJSh3
</commit_message>
<xml_diff>
--- a/seminar/עבודה_סמינריונית_סופית_מסכים_שינה_פעילות_גופנית_לקויות_למידה.docx
+++ b/seminar/עבודה_סמינריונית_סופית_מסכים_שינה_פעילות_גופנית_לקויות_למידה.docx
@@ -481,7 +481,7 @@
             <w:tabs>
               <w:tab w:val="right" w:leader="dot" w:pos="9020"/>
             </w:tabs>
-            <w:spacing w:after="60" w:line="300"/>
+            <w:spacing w:after="40" w:line="240"/>
           </w:pPr>
           <w:r>
             <w:rPr>
@@ -512,7 +512,7 @@
               <w:szCs w:val="24"/>
               <w:rtl/>
             </w:rPr>
-            <w:t>5</w:t>
+            <w:t>3</w:t>
           </w:r>
         </w:p>
         <w:p>
@@ -521,7 +521,7 @@
             <w:tabs>
               <w:tab w:val="right" w:leader="dot" w:pos="9020"/>
             </w:tabs>
-            <w:spacing w:after="60" w:line="300"/>
+            <w:spacing w:after="40" w:line="240"/>
           </w:pPr>
           <w:r>
             <w:rPr>
@@ -552,7 +552,7 @@
               <w:szCs w:val="24"/>
               <w:rtl/>
             </w:rPr>
-            <w:t>7</w:t>
+            <w:t>5</w:t>
           </w:r>
         </w:p>
         <w:p>
@@ -562,7 +562,7 @@
               <w:tab w:val="right" w:leader="dot" w:pos="9020"/>
             </w:tabs>
             <w:ind w:start="440"/>
-            <w:spacing w:after="60" w:line="300"/>
+            <w:spacing w:after="40" w:line="240"/>
           </w:pPr>
           <w:r>
             <w:rPr>
@@ -589,7 +589,7 @@
               <w:szCs w:val="24"/>
               <w:rtl/>
             </w:rPr>
-            <w:t>7</w:t>
+            <w:t>5</w:t>
           </w:r>
         </w:p>
         <w:p>
@@ -599,7 +599,7 @@
               <w:tab w:val="right" w:leader="dot" w:pos="9020"/>
             </w:tabs>
             <w:ind w:start="440"/>
-            <w:spacing w:after="60" w:line="300"/>
+            <w:spacing w:after="40" w:line="240"/>
           </w:pPr>
           <w:r>
             <w:rPr>
@@ -626,7 +626,7 @@
               <w:szCs w:val="24"/>
               <w:rtl/>
             </w:rPr>
-            <w:t>8</w:t>
+            <w:t>6</w:t>
           </w:r>
         </w:p>
         <w:p>
@@ -636,7 +636,7 @@
               <w:tab w:val="right" w:leader="dot" w:pos="9020"/>
             </w:tabs>
             <w:ind w:start="440"/>
-            <w:spacing w:after="60" w:line="300"/>
+            <w:spacing w:after="40" w:line="240"/>
           </w:pPr>
           <w:r>
             <w:rPr>
@@ -663,7 +663,7 @@
               <w:szCs w:val="24"/>
               <w:rtl/>
             </w:rPr>
-            <w:t>8</w:t>
+            <w:t>6</w:t>
           </w:r>
         </w:p>
         <w:p>
@@ -673,7 +673,7 @@
               <w:tab w:val="right" w:leader="dot" w:pos="9020"/>
             </w:tabs>
             <w:ind w:start="440"/>
-            <w:spacing w:after="60" w:line="300"/>
+            <w:spacing w:after="40" w:line="240"/>
           </w:pPr>
           <w:r>
             <w:rPr>
@@ -700,7 +700,7 @@
               <w:szCs w:val="24"/>
               <w:rtl/>
             </w:rPr>
-            <w:t>9</w:t>
+            <w:t>7</w:t>
           </w:r>
         </w:p>
         <w:p>
@@ -710,7 +710,7 @@
               <w:tab w:val="right" w:leader="dot" w:pos="9020"/>
             </w:tabs>
             <w:ind w:start="440"/>
-            <w:spacing w:after="60" w:line="300"/>
+            <w:spacing w:after="40" w:line="240"/>
           </w:pPr>
           <w:r>
             <w:rPr>
@@ -737,7 +737,7 @@
               <w:szCs w:val="24"/>
               <w:rtl/>
             </w:rPr>
-            <w:t>10</w:t>
+            <w:t>8</w:t>
           </w:r>
         </w:p>
         <w:p>
@@ -747,7 +747,7 @@
               <w:tab w:val="right" w:leader="dot" w:pos="9020"/>
             </w:tabs>
             <w:ind w:start="440"/>
-            <w:spacing w:after="60" w:line="300"/>
+            <w:spacing w:after="40" w:line="240"/>
           </w:pPr>
           <w:r>
             <w:rPr>
@@ -774,7 +774,7 @@
               <w:szCs w:val="24"/>
               <w:rtl/>
             </w:rPr>
-            <w:t>11</w:t>
+            <w:t>9</w:t>
           </w:r>
         </w:p>
         <w:p>
@@ -783,7 +783,7 @@
             <w:tabs>
               <w:tab w:val="right" w:leader="dot" w:pos="9020"/>
             </w:tabs>
-            <w:spacing w:after="60" w:line="300"/>
+            <w:spacing w:after="40" w:line="240"/>
           </w:pPr>
           <w:r>
             <w:rPr>
@@ -814,7 +814,7 @@
               <w:szCs w:val="24"/>
               <w:rtl/>
             </w:rPr>
-            <w:t>14</w:t>
+            <w:t>12</w:t>
           </w:r>
         </w:p>
         <w:p>
@@ -824,7 +824,7 @@
               <w:tab w:val="right" w:leader="dot" w:pos="9020"/>
             </w:tabs>
             <w:ind w:start="440"/>
-            <w:spacing w:after="60" w:line="300"/>
+            <w:spacing w:after="40" w:line="240"/>
           </w:pPr>
           <w:r>
             <w:rPr>
@@ -851,7 +851,7 @@
               <w:szCs w:val="24"/>
               <w:rtl/>
             </w:rPr>
-            <w:t>14</w:t>
+            <w:t>12</w:t>
           </w:r>
         </w:p>
         <w:p>
@@ -861,7 +861,7 @@
               <w:tab w:val="right" w:leader="dot" w:pos="9020"/>
             </w:tabs>
             <w:ind w:start="440"/>
-            <w:spacing w:after="60" w:line="300"/>
+            <w:spacing w:after="40" w:line="240"/>
           </w:pPr>
           <w:r>
             <w:rPr>
@@ -888,7 +888,7 @@
               <w:szCs w:val="24"/>
               <w:rtl/>
             </w:rPr>
-            <w:t>14</w:t>
+            <w:t>12</w:t>
           </w:r>
         </w:p>
         <w:p>
@@ -898,7 +898,7 @@
               <w:tab w:val="right" w:leader="dot" w:pos="9020"/>
             </w:tabs>
             <w:ind w:start="440"/>
-            <w:spacing w:after="60" w:line="300"/>
+            <w:spacing w:after="40" w:line="240"/>
           </w:pPr>
           <w:r>
             <w:rPr>
@@ -925,7 +925,7 @@
               <w:szCs w:val="24"/>
               <w:rtl/>
             </w:rPr>
-            <w:t>15</w:t>
+            <w:t>13</w:t>
           </w:r>
         </w:p>
         <w:p>
@@ -935,7 +935,7 @@
               <w:tab w:val="right" w:leader="dot" w:pos="9020"/>
             </w:tabs>
             <w:ind w:start="440"/>
-            <w:spacing w:after="60" w:line="300"/>
+            <w:spacing w:after="40" w:line="240"/>
           </w:pPr>
           <w:r>
             <w:rPr>
@@ -962,7 +962,7 @@
               <w:szCs w:val="24"/>
               <w:rtl/>
             </w:rPr>
-            <w:t>16</w:t>
+            <w:t>14</w:t>
           </w:r>
         </w:p>
         <w:p>
@@ -972,7 +972,7 @@
               <w:tab w:val="right" w:leader="dot" w:pos="9020"/>
             </w:tabs>
             <w:ind w:start="440"/>
-            <w:spacing w:after="60" w:line="300"/>
+            <w:spacing w:after="40" w:line="240"/>
           </w:pPr>
           <w:r>
             <w:rPr>
@@ -999,7 +999,7 @@
               <w:szCs w:val="24"/>
               <w:rtl/>
             </w:rPr>
-            <w:t>17</w:t>
+            <w:t>15</w:t>
           </w:r>
         </w:p>
         <w:p>
@@ -1009,7 +1009,7 @@
               <w:tab w:val="right" w:leader="dot" w:pos="9020"/>
             </w:tabs>
             <w:ind w:start="440"/>
-            <w:spacing w:after="60" w:line="300"/>
+            <w:spacing w:after="40" w:line="240"/>
           </w:pPr>
           <w:r>
             <w:rPr>
@@ -1036,7 +1036,7 @@
               <w:szCs w:val="24"/>
               <w:rtl/>
             </w:rPr>
-            <w:t>17</w:t>
+            <w:t>15</w:t>
           </w:r>
         </w:p>
         <w:p>
@@ -1046,7 +1046,7 @@
               <w:tab w:val="right" w:leader="dot" w:pos="9020"/>
             </w:tabs>
             <w:ind w:start="440"/>
-            <w:spacing w:after="60" w:line="300"/>
+            <w:spacing w:after="40" w:line="240"/>
           </w:pPr>
           <w:r>
             <w:rPr>
@@ -1073,7 +1073,7 @@
               <w:szCs w:val="24"/>
               <w:rtl/>
             </w:rPr>
-            <w:t>17</w:t>
+            <w:t>15</w:t>
           </w:r>
         </w:p>
         <w:p>
@@ -1082,7 +1082,7 @@
             <w:tabs>
               <w:tab w:val="right" w:leader="dot" w:pos="9020"/>
             </w:tabs>
-            <w:spacing w:after="60" w:line="300"/>
+            <w:spacing w:after="40" w:line="240"/>
           </w:pPr>
           <w:r>
             <w:rPr>
@@ -1113,7 +1113,7 @@
               <w:szCs w:val="24"/>
               <w:rtl/>
             </w:rPr>
-            <w:t>19</w:t>
+            <w:t>17</w:t>
           </w:r>
         </w:p>
         <w:p>
@@ -1123,7 +1123,7 @@
               <w:tab w:val="right" w:leader="dot" w:pos="9020"/>
             </w:tabs>
             <w:ind w:start="440"/>
-            <w:spacing w:after="60" w:line="300"/>
+            <w:spacing w:after="40" w:line="240"/>
           </w:pPr>
           <w:r>
             <w:rPr>
@@ -1150,7 +1150,7 @@
               <w:szCs w:val="24"/>
               <w:rtl/>
             </w:rPr>
-            <w:t>19</w:t>
+            <w:t>17</w:t>
           </w:r>
         </w:p>
         <w:p>
@@ -1160,7 +1160,7 @@
               <w:tab w:val="right" w:leader="dot" w:pos="9020"/>
             </w:tabs>
             <w:ind w:start="440"/>
-            <w:spacing w:after="60" w:line="300"/>
+            <w:spacing w:after="40" w:line="240"/>
           </w:pPr>
           <w:r>
             <w:rPr>
@@ -1187,7 +1187,7 @@
               <w:szCs w:val="24"/>
               <w:rtl/>
             </w:rPr>
-            <w:t>20</w:t>
+            <w:t>18</w:t>
           </w:r>
         </w:p>
         <w:p>
@@ -1197,7 +1197,7 @@
               <w:tab w:val="right" w:leader="dot" w:pos="9020"/>
             </w:tabs>
             <w:ind w:start="440"/>
-            <w:spacing w:after="60" w:line="300"/>
+            <w:spacing w:after="40" w:line="240"/>
           </w:pPr>
           <w:r>
             <w:rPr>
@@ -1224,7 +1224,7 @@
               <w:szCs w:val="24"/>
               <w:rtl/>
             </w:rPr>
-            <w:t>20</w:t>
+            <w:t>18</w:t>
           </w:r>
         </w:p>
         <w:p>
@@ -1234,7 +1234,7 @@
               <w:tab w:val="right" w:leader="dot" w:pos="9020"/>
             </w:tabs>
             <w:ind w:start="440"/>
-            <w:spacing w:after="60" w:line="300"/>
+            <w:spacing w:after="40" w:line="240"/>
           </w:pPr>
           <w:r>
             <w:rPr>
@@ -1261,7 +1261,7 @@
               <w:szCs w:val="24"/>
               <w:rtl/>
             </w:rPr>
-            <w:t>23</w:t>
+            <w:t>21</w:t>
           </w:r>
         </w:p>
         <w:p>
@@ -1271,7 +1271,7 @@
               <w:tab w:val="right" w:leader="dot" w:pos="9020"/>
             </w:tabs>
             <w:ind w:start="440"/>
-            <w:spacing w:after="60" w:line="300"/>
+            <w:spacing w:after="40" w:line="240"/>
           </w:pPr>
           <w:r>
             <w:rPr>
@@ -1298,7 +1298,7 @@
               <w:szCs w:val="24"/>
               <w:rtl/>
             </w:rPr>
-            <w:t>23</w:t>
+            <w:t>21</w:t>
           </w:r>
         </w:p>
         <w:p>
@@ -1308,7 +1308,7 @@
               <w:tab w:val="right" w:leader="dot" w:pos="9020"/>
             </w:tabs>
             <w:ind w:start="440"/>
-            <w:spacing w:after="60" w:line="300"/>
+            <w:spacing w:after="40" w:line="240"/>
           </w:pPr>
           <w:r>
             <w:rPr>
@@ -1335,7 +1335,7 @@
               <w:szCs w:val="24"/>
               <w:rtl/>
             </w:rPr>
-            <w:t>24</w:t>
+            <w:t>22</w:t>
           </w:r>
         </w:p>
         <w:p>
@@ -1345,7 +1345,7 @@
               <w:tab w:val="right" w:leader="dot" w:pos="9020"/>
             </w:tabs>
             <w:ind w:start="440"/>
-            <w:spacing w:after="60" w:line="300"/>
+            <w:spacing w:after="40" w:line="240"/>
           </w:pPr>
           <w:r>
             <w:rPr>
@@ -1372,7 +1372,7 @@
               <w:szCs w:val="24"/>
               <w:rtl/>
             </w:rPr>
-            <w:t>26</w:t>
+            <w:t>24</w:t>
           </w:r>
         </w:p>
         <w:p>
@@ -1382,7 +1382,7 @@
               <w:tab w:val="right" w:leader="dot" w:pos="9020"/>
             </w:tabs>
             <w:ind w:start="440"/>
-            <w:spacing w:after="60" w:line="300"/>
+            <w:spacing w:after="40" w:line="240"/>
           </w:pPr>
           <w:r>
             <w:rPr>
@@ -1409,7 +1409,7 @@
               <w:szCs w:val="24"/>
               <w:rtl/>
             </w:rPr>
-            <w:t>27</w:t>
+            <w:t>25</w:t>
           </w:r>
         </w:p>
         <w:p>
@@ -1419,7 +1419,7 @@
               <w:tab w:val="right" w:leader="dot" w:pos="9020"/>
             </w:tabs>
             <w:ind w:start="440"/>
-            <w:spacing w:after="60" w:line="300"/>
+            <w:spacing w:after="40" w:line="240"/>
           </w:pPr>
           <w:r>
             <w:rPr>
@@ -1446,7 +1446,7 @@
               <w:szCs w:val="24"/>
               <w:rtl/>
             </w:rPr>
-            <w:t>29</w:t>
+            <w:t>27</w:t>
           </w:r>
         </w:p>
         <w:p>
@@ -1455,7 +1455,7 @@
             <w:tabs>
               <w:tab w:val="right" w:leader="dot" w:pos="9020"/>
             </w:tabs>
-            <w:spacing w:after="60" w:line="300"/>
+            <w:spacing w:after="40" w:line="240"/>
           </w:pPr>
           <w:r>
             <w:rPr>
@@ -1486,7 +1486,7 @@
               <w:szCs w:val="24"/>
               <w:rtl/>
             </w:rPr>
-            <w:t>31</w:t>
+            <w:t>29</w:t>
           </w:r>
         </w:p>
         <w:p>
@@ -1496,7 +1496,7 @@
               <w:tab w:val="right" w:leader="dot" w:pos="9020"/>
             </w:tabs>
             <w:ind w:start="440"/>
-            <w:spacing w:after="60" w:line="300"/>
+            <w:spacing w:after="40" w:line="240"/>
           </w:pPr>
           <w:r>
             <w:rPr>
@@ -1523,7 +1523,7 @@
               <w:szCs w:val="24"/>
               <w:rtl/>
             </w:rPr>
-            <w:t>31</w:t>
+            <w:t>29</w:t>
           </w:r>
         </w:p>
         <w:p>
@@ -1533,7 +1533,7 @@
               <w:tab w:val="right" w:leader="dot" w:pos="9020"/>
             </w:tabs>
             <w:ind w:start="440"/>
-            <w:spacing w:after="60" w:line="300"/>
+            <w:spacing w:after="40" w:line="240"/>
           </w:pPr>
           <w:r>
             <w:rPr>
@@ -1560,7 +1560,7 @@
               <w:szCs w:val="24"/>
               <w:rtl/>
             </w:rPr>
-            <w:t>31</w:t>
+            <w:t>29</w:t>
           </w:r>
         </w:p>
         <w:p>
@@ -1570,7 +1570,7 @@
               <w:tab w:val="right" w:leader="dot" w:pos="9020"/>
             </w:tabs>
             <w:ind w:start="440"/>
-            <w:spacing w:after="60" w:line="300"/>
+            <w:spacing w:after="40" w:line="240"/>
           </w:pPr>
           <w:r>
             <w:rPr>
@@ -1597,7 +1597,7 @@
               <w:szCs w:val="24"/>
               <w:rtl/>
             </w:rPr>
-            <w:t>32</w:t>
+            <w:t>30</w:t>
           </w:r>
         </w:p>
         <w:p>
@@ -1607,7 +1607,7 @@
               <w:tab w:val="right" w:leader="dot" w:pos="9020"/>
             </w:tabs>
             <w:ind w:start="440"/>
-            <w:spacing w:after="60" w:line="300"/>
+            <w:spacing w:after="40" w:line="240"/>
           </w:pPr>
           <w:r>
             <w:rPr>
@@ -1634,7 +1634,7 @@
               <w:szCs w:val="24"/>
               <w:rtl/>
             </w:rPr>
-            <w:t>32</w:t>
+            <w:t>30</w:t>
           </w:r>
         </w:p>
         <w:p>
@@ -1644,7 +1644,7 @@
               <w:tab w:val="right" w:leader="dot" w:pos="9020"/>
             </w:tabs>
             <w:ind w:start="440"/>
-            <w:spacing w:after="60" w:line="300"/>
+            <w:spacing w:after="40" w:line="240"/>
           </w:pPr>
           <w:r>
             <w:rPr>
@@ -1671,7 +1671,7 @@
               <w:szCs w:val="24"/>
               <w:rtl/>
             </w:rPr>
-            <w:t>33</w:t>
+            <w:t>31</w:t>
           </w:r>
         </w:p>
         <w:p>
@@ -1681,7 +1681,7 @@
               <w:tab w:val="right" w:leader="dot" w:pos="9020"/>
             </w:tabs>
             <w:ind w:start="440"/>
-            <w:spacing w:after="60" w:line="300"/>
+            <w:spacing w:after="40" w:line="240"/>
           </w:pPr>
           <w:r>
             <w:rPr>
@@ -1708,7 +1708,7 @@
               <w:szCs w:val="24"/>
               <w:rtl/>
             </w:rPr>
-            <w:t>33</w:t>
+            <w:t>31</w:t>
           </w:r>
         </w:p>
         <w:p>
@@ -1718,7 +1718,7 @@
               <w:tab w:val="right" w:leader="dot" w:pos="9020"/>
             </w:tabs>
             <w:ind w:start="440"/>
-            <w:spacing w:after="60" w:line="300"/>
+            <w:spacing w:after="40" w:line="240"/>
           </w:pPr>
           <w:r>
             <w:rPr>
@@ -1745,7 +1745,7 @@
               <w:szCs w:val="24"/>
               <w:rtl/>
             </w:rPr>
-            <w:t>34</w:t>
+            <w:t>32</w:t>
           </w:r>
         </w:p>
         <w:p>
@@ -1755,7 +1755,7 @@
               <w:tab w:val="right" w:leader="dot" w:pos="9020"/>
             </w:tabs>
             <w:ind w:start="440"/>
-            <w:spacing w:after="60" w:line="300"/>
+            <w:spacing w:after="40" w:line="240"/>
           </w:pPr>
           <w:r>
             <w:rPr>
@@ -1782,7 +1782,7 @@
               <w:szCs w:val="24"/>
               <w:rtl/>
             </w:rPr>
-            <w:t>34</w:t>
+            <w:t>32</w:t>
           </w:r>
         </w:p>
         <w:p>
@@ -1792,7 +1792,7 @@
               <w:tab w:val="right" w:leader="dot" w:pos="9020"/>
             </w:tabs>
             <w:ind w:start="440"/>
-            <w:spacing w:after="60" w:line="300"/>
+            <w:spacing w:after="40" w:line="240"/>
           </w:pPr>
           <w:r>
             <w:rPr>
@@ -1819,7 +1819,7 @@
               <w:szCs w:val="24"/>
               <w:rtl/>
             </w:rPr>
-            <w:t>34</w:t>
+            <w:t>32</w:t>
           </w:r>
         </w:p>
         <w:p>
@@ -1828,7 +1828,7 @@
             <w:tabs>
               <w:tab w:val="right" w:leader="dot" w:pos="9020"/>
             </w:tabs>
-            <w:spacing w:after="60" w:line="300"/>
+            <w:spacing w:after="40" w:line="240"/>
           </w:pPr>
           <w:r>
             <w:rPr>
@@ -1859,7 +1859,7 @@
               <w:szCs w:val="24"/>
               <w:rtl/>
             </w:rPr>
-            <w:t>36</w:t>
+            <w:t>34</w:t>
           </w:r>
         </w:p>
         <w:p>
@@ -1868,7 +1868,7 @@
             <w:tabs>
               <w:tab w:val="right" w:leader="dot" w:pos="9020"/>
             </w:tabs>
-            <w:spacing w:after="60" w:line="300"/>
+            <w:spacing w:after="40" w:line="240"/>
           </w:pPr>
           <w:r>
             <w:rPr>
@@ -1899,7 +1899,7 @@
               <w:szCs w:val="24"/>
               <w:rtl/>
             </w:rPr>
-            <w:t>37</w:t>
+            <w:t>35</w:t>
           </w:r>
         </w:p>
         <w:p>
@@ -1908,7 +1908,7 @@
             <w:tabs>
               <w:tab w:val="right" w:leader="dot" w:pos="9020"/>
             </w:tabs>
-            <w:spacing w:after="60" w:line="300"/>
+            <w:spacing w:after="40" w:line="240"/>
           </w:pPr>
           <w:r>
             <w:rPr>
@@ -1939,7 +1939,7 @@
               <w:szCs w:val="24"/>
               <w:rtl/>
             </w:rPr>
-            <w:t>40</w:t>
+            <w:t>38</w:t>
           </w:r>
         </w:p>
         <w:p>
@@ -1949,7 +1949,7 @@
               <w:tab w:val="right" w:leader="dot" w:pos="9020"/>
             </w:tabs>
             <w:ind w:start="440"/>
-            <w:spacing w:after="60" w:line="300"/>
+            <w:spacing w:after="40" w:line="240"/>
           </w:pPr>
           <w:r>
             <w:rPr>
@@ -1976,7 +1976,7 @@
               <w:szCs w:val="24"/>
               <w:rtl/>
             </w:rPr>
-            <w:t>40</w:t>
+            <w:t>38</w:t>
           </w:r>
         </w:p>
         <w:p>
@@ -1986,7 +1986,7 @@
               <w:tab w:val="right" w:leader="dot" w:pos="9020"/>
             </w:tabs>
             <w:ind w:start="440"/>
-            <w:spacing w:after="60" w:line="300"/>
+            <w:spacing w:after="40" w:line="240"/>
           </w:pPr>
           <w:r>
             <w:rPr>
@@ -2013,7 +2013,7 @@
               <w:szCs w:val="24"/>
               <w:rtl/>
             </w:rPr>
-            <w:t>44</w:t>
+            <w:t>42</w:t>
           </w:r>
         </w:p>
         <w:p>

</xml_diff>

<commit_message>
Add Shachaf & Sheleg (2020) and Glaser et al. (2022) to seminar literature review and bibliography
Co-Authored-By: Claude Fable 5.1 <noreply@anthropic.com>
Claude-Session: https://claude.ai/code/session_019RaBW72rT1xkbcXD9zJSh3
</commit_message>
<xml_diff>
--- a/seminar/עבודה_סמינריונית_סופית_מסכים_שינה_פעילות_גופנית_לקויות_למידה.docx
+++ b/seminar/עבודה_סמינריונית_סופית_מסכים_שינה_פעילות_גופנית_לקויות_למידה.docx
@@ -663,7 +663,7 @@
               <w:szCs w:val="24"/>
               <w:rtl/>
             </w:rPr>
-            <w:t>6</w:t>
+            <w:t>7</w:t>
           </w:r>
         </w:p>
         <w:p>
@@ -737,7 +737,7 @@
               <w:szCs w:val="24"/>
               <w:rtl/>
             </w:rPr>
-            <w:t>8</w:t>
+            <w:t>9</w:t>
           </w:r>
         </w:p>
         <w:p>
@@ -1819,7 +1819,7 @@
               <w:szCs w:val="24"/>
               <w:rtl/>
             </w:rPr>
-            <w:t>32</w:t>
+            <w:t>33</w:t>
           </w:r>
         </w:p>
         <w:p>
@@ -2313,6 +2313,24 @@
           <w:lang w:val="en-US" w:eastAsia="en-US" w:bidi="he-IL"/>
         </w:rPr>
         <w:t xml:space="preserve">סקר שערך איגוד האינטרנט הישראלי בקיץ 2022 בקרב בני נוער והורים מצא ש-54 אחוזים מבני הנוער בחברה היהודית החילונית מדווחים על ארבע עד שמונה שעות מסך ביום, ו-11 אחוזים נוספים על יותר משמונה שעות. בחברה הערבית השיעור המדווח על ארבע עד שמונה שעות ביום הגיע ל-67 אחוזים, ובחברה היהודית-דתית הוא היה הנמוך ביותר, 41 אחוזים (איגוד האינטרנט הישראלי, 2022). הפער בין ההמלצה של שעתיים לבין הדיווח בפועל הוא פער של פי שניים עד פי ארבעה, ומכאן שהשאלה המחקרית המעניינת אינה אם תלמידים חורגים מההמלצה אלא כמה, ומה זה עושה לשאר היממה שלהם.</w:t>
+      </w:r>
+    </w:p>
+    <w:p>
+      <w:pPr>
+        <w:bidi/>
+        <w:spacing w:after="120" w:line="360"/>
+        <w:jc w:val="both"/>
+      </w:pPr>
+      <w:r>
+        <w:rPr>
+          <w:rFonts w:ascii="Times New Roman" w:cs="David" w:eastAsia="David" w:hAnsi="Times New Roman"/>
+          <w:noProof/>
+          <w:sz w:val="24"/>
+          <w:szCs w:val="24"/>
+          <w:rtl/>
+          <w:lang w:val="en-US" w:eastAsia="en-US" w:bidi="he-IL"/>
+        </w:rPr>
+        <w:t xml:space="preserve">מחקר ישראלי שנערך בקרב 60 תלמידי כיתות ה' ו-ו' מיישובי עוטף עזה וממרכז הארץ מדד באותו שאלון את מספר שעות הפעילות הגופנית ואת מספר שעות הצפייה במסכים בשבוע, לצד עמדות כלפי פעילות גופנית וחרדה מצבית. התלמידים דיווחו בממוצע על כ-16 שעות מסך שבועיות לעומת כשמונה שעות של פעילות גופנית, ולא נמצא הבדל בין שתי הקבוצות ובין בנים לבנות. עם זאת, נמצא קשר שלילי בין התפיסה שפעילות גופנית תורמת לבריאות לבין זמן המסך וקשר חיובי בין תפיסה זו לבין זמן הפעילות, כלומר ככל שהילד מייחס לפעילות ערך בריאותי רב יותר, כך זמן המסך שלו קטן וזמן הפעילות שלו גדל (שחף ושלג, 2020). המחקר נערך בכיתות רגילות ולא בדק לקויות למידה, אך הוא מדגים שבקרב ילדים בישראל זמן המסך וזמן הפעילות הגופנית מתחרים זה בזה על שעות הפנאי, ושהם ניתנים למדידה יחד בדיווח עצמי פשוט, כפי שנעשה גם בעבודה הנוכחית.</w:t>
       </w:r>
     </w:p>
     <w:p>
@@ -19549,7 +19567,7 @@
           <w:rtl/>
           <w:lang w:val="en-US" w:eastAsia="en-US" w:bidi="he-IL"/>
         </w:rPr>
-        <w:t xml:space="preserve">תרומת המחקר היא בהבאת המודל של שלוש ההתנהגויות, שנחקר עד כה באוכלוסייה הכללית, אל תלמידים עם לקויות למידה בישראל, ובמדידת שלוש ההתנהגויות יחד באותו מדגם. מהממצאים נגזרות כמה המלצות מעשיות. ברמת בית הספר, מומלץ שמרכז התמיכה או רכז לקויות הלמידה יכלול בתוכנית העבודה עם כל תלמיד מאובחן שיחה קצרה על הרגלי מסך ושינה, בדומה לשיחה על התאמות בבחינות, ויציע כלים פשוטים: שעת סיום קבועה למסכים, טעינת הטלפון מחוץ לחדר השינה ושמירה על שעת השינה גם בסוף השבוע. עוד מומלץ שהמורה לחינוך גופני יקבל את רשימת התלמידים עם לקויות למידה ויעקוב אחר השתתפותם בשיעורים, בהתאם לתפקידו כגורם מאתר של קשיים מוטוריים (עוגב ויזדי-עוגב, 2024), ושבית הספר יציע להם פעילות תנועתית מובנית בקבוצה קטנה, כפי שנוסה בהצלחה בישראל (בן-אשר וברגר, 2013). ברמת ההורים, ההמלצה החשובה ביותר היא להוציא את המסכים מחדר השינה ולהפסיק את השימוש בהם חצי שעה לפני השינה, בהתאם להמלצות משרד הבריאות (2026), ולשמור על שעת שינה קבועה בסוף השבוע. ברמת המדיניות, ראוי שההמלצות הארציות בנושא מסכים ושינה יתייחסו במפורש לתלמידים עם לקויות למידה ויועברו דרך אגף לקויות למידה והפרעות קשב, שכן הממצאים מראים שאצל תלמידים אלה המחיר של אותה כמות מסך גבוה יותר.</w:t>
+        <w:t xml:space="preserve">תרומת המחקר היא בהבאת המודל של שלוש ההתנהגויות, שנחקר עד כה באוכלוסייה הכללית, אל תלמידים עם לקויות למידה בישראל, ובמדידת שלוש ההתנהגויות יחד באותו מדגם. מהממצאים נגזרות כמה המלצות מעשיות. ברמת בית הספר, מומלץ שמרכז התמיכה או רכז לקויות הלמידה יכלול בתוכנית העבודה עם כל תלמיד מאובחן שיחה קצרה על הרגלי מסך ושינה, בדומה לשיחה על התאמות בבחינות, ויציע כלים פשוטים: שעת סיום קבועה למסכים, טעינת הטלפון מחוץ לחדר השינה ושמירה על שעת השינה גם בסוף השבוע. עוד מומלץ שהמורה לחינוך גופני יקבל את רשימת התלמידים עם לקויות למידה ויעקוב אחר השתתפותם בשיעורים, בהתאם לתפקידו כגורם מאתר של קשיים מוטוריים (עוגב ויזדי-עוגב, 2024), ושבית הספר יציע להם פעילות תנועתית מובנית בקבוצה קטנה, כפי שנוסה בהצלחה בישראל (בן-אשר וברגר, 2013). ברמת ההורים, ההמלצה החשובה ביותר היא להוציא את המסכים מחדר השינה ולהפסיק את השימוש בהם חצי שעה לפני השינה, בהתאם להמלצות משרד הבריאות (2026), ולשמור על שעת שינה קבועה בסוף השבוע. ברמת המדיניות, ראוי שההמלצות הארציות בנושא מסכים ושינה יתייחסו במפורש לתלמידים עם לקויות למידה ויועברו דרך אגף לקויות למידה והפרעות קשב, שכן הממצאים מראים שאצל תלמידים אלה המחיר של אותה כמות מסך גבוה יותר. דוגמה לאפשרות כזו היא תוכנית חברו"ת, תוכנית חונכות מקוונת שבה סטודנטים לחינוך גופני ליוו בני נוער בסיכון בפעילות גופנית ובקשר אישי במשך כחצי שנה בתקופת הקורונה. בקרב 27 המשתתפים בתוכנית נמצאה לאחריה עלייה בחוסן ובתמיכה החברתית וירידה במצוקה הפסיכולוגית, ואילו בקבוצת הביקורת לא נמצא שינוי (גלסר ואחרים, 2022). מודל דומה, שמשלב פעילות גופנית עם ליווי אישי, עשוי להתאים גם לתלמידים עם לקויות למידה, שאצלם ההימנעות מפעילות קשורה לא פעם לחוויית כישלון ולא לחוסר עניין.</w:t>
       </w:r>
     </w:p>
     <w:p>
@@ -19884,6 +19902,25 @@
           <w:rtl/>
           <w:lang w:val="en-US" w:eastAsia="en-US" w:bidi="he-IL"/>
         </w:rPr>
+        <w:t xml:space="preserve">גלסר, מ', גרין, ג', ברק, ש', יוסף, ג', רגב, ע', זיגדון, א', עופרי, ל', וטסלר, ר' (2022). תוכנית התערבות מקוונת חברו"ת (חוסן, בריאות ותקווה) לעידוד הרגלי פעילות גופנית ושיפור מדדים רגשיים וחברתיים בקרב בני נוער בסיכון במהלך משבר מגפת הקורונה 2020. בתנועה: כתב-עת למדעי החינוך הגופני והספורט, יג(4), 401-421. https://www.jstor.org/stable/27194292</w:t>
+      </w:r>
+    </w:p>
+    <w:p>
+      <w:pPr>
+        <w:bidi/>
+        <w:spacing w:after="120" w:line="360"/>
+        <w:ind w:start="709" w:hanging="709"/>
+        <w:jc w:val="right"/>
+      </w:pPr>
+      <w:r>
+        <w:rPr>
+          <w:rFonts w:ascii="Times New Roman" w:cs="David" w:eastAsia="David" w:hAnsi="Times New Roman"/>
+          <w:noProof/>
+          <w:sz w:val="24"/>
+          <w:szCs w:val="24"/>
+          <w:rtl/>
+          <w:lang w:val="en-US" w:eastAsia="en-US" w:bidi="he-IL"/>
+        </w:rPr>
         <w:t xml:space="preserve">גספר, ל' ס', סנטוס, ב', בארוס-ויאגס, א' ת', קרדוזו, ז', אמרל, ס' ו', קרוואליאש-אלמיידה, ק', סנטוס-קרוואליו, א', קבדאש, ק', ואלוורו, א' ר' (2020). כוחות-העל של השינה שלנו. Frontiers for Young Minds. https://kids.frontiersin.org/he/articles/10.3389/frym.2020.540052-he</w:t>
       </w:r>
     </w:p>
@@ -20075,6 +20112,25 @@
           <w:lang w:val="en-US" w:eastAsia="en-US" w:bidi="he-IL"/>
         </w:rPr>
         <w:t xml:space="preserve">שחף, מ', כץ, י', ושובל, א' (2014). ספורט, הישגים לימודיים ומגדר: האומנם שילוש מנצח? רוח הספורט, 1, 89-98.</w:t>
+      </w:r>
+    </w:p>
+    <w:p>
+      <w:pPr>
+        <w:bidi/>
+        <w:spacing w:after="120" w:line="360"/>
+        <w:ind w:start="709" w:hanging="709"/>
+        <w:jc w:val="right"/>
+      </w:pPr>
+      <w:r>
+        <w:rPr>
+          <w:rFonts w:ascii="Times New Roman" w:cs="David" w:eastAsia="David" w:hAnsi="Times New Roman"/>
+          <w:noProof/>
+          <w:sz w:val="24"/>
+          <w:szCs w:val="24"/>
+          <w:rtl/>
+          <w:lang w:val="en-US" w:eastAsia="en-US" w:bidi="he-IL"/>
+        </w:rPr>
+        <w:t xml:space="preserve">שחף, מ', ושלג, מ' (2020). פעילות גופנית בשעות הפנאי וחרדה מצבית בקרב ילדים המתגוררים ביישובי קו העימות בישראל לעומת ילדים המתגוררים במרכז הארץ. בתנועה: כתב-עת למדעי החינוך הגופני והספורט, יב(3), 342-364. https://www.jstor.org/stable/26934757</w:t>
       </w:r>
     </w:p>
     <w:p>

</xml_diff>

<commit_message>
Seminar: method chapter in past tense, lecturer approval instead of ethics committee, shorten body
Co-Authored-By: Claude Fable 5.1 <noreply@anthropic.com>
Claude-Session: https://claude.ai/code/session_019RaBW72rT1xkbcXD9zJSh3
</commit_message>
<xml_diff>
--- a/seminar/עבודה_סמינריונית_סופית_מסכים_שינה_פעילות_גופנית_לקויות_למידה.docx
+++ b/seminar/עבודה_סמינריונית_סופית_מסכים_שינה_פעילות_גופנית_לקויות_למידה.docx
@@ -999,7 +999,7 @@
               <w:szCs w:val="24"/>
               <w:rtl/>
             </w:rPr>
-            <w:t>15</w:t>
+            <w:t>14</w:t>
           </w:r>
         </w:p>
         <w:p>
@@ -1113,7 +1113,7 @@
               <w:szCs w:val="24"/>
               <w:rtl/>
             </w:rPr>
-            <w:t>17</w:t>
+            <w:t>16</w:t>
           </w:r>
         </w:p>
         <w:p>
@@ -1150,7 +1150,7 @@
               <w:szCs w:val="24"/>
               <w:rtl/>
             </w:rPr>
-            <w:t>17</w:t>
+            <w:t>16</w:t>
           </w:r>
         </w:p>
         <w:p>
@@ -1187,7 +1187,7 @@
               <w:szCs w:val="24"/>
               <w:rtl/>
             </w:rPr>
-            <w:t>18</w:t>
+            <w:t>17</w:t>
           </w:r>
         </w:p>
         <w:p>
@@ -1224,7 +1224,7 @@
               <w:szCs w:val="24"/>
               <w:rtl/>
             </w:rPr>
-            <w:t>18</w:t>
+            <w:t>17</w:t>
           </w:r>
         </w:p>
         <w:p>
@@ -1261,7 +1261,7 @@
               <w:szCs w:val="24"/>
               <w:rtl/>
             </w:rPr>
-            <w:t>21</w:t>
+            <w:t>19</w:t>
           </w:r>
         </w:p>
         <w:p>
@@ -1298,7 +1298,7 @@
               <w:szCs w:val="24"/>
               <w:rtl/>
             </w:rPr>
-            <w:t>21</w:t>
+            <w:t>20</w:t>
           </w:r>
         </w:p>
         <w:p>
@@ -1335,7 +1335,7 @@
               <w:szCs w:val="24"/>
               <w:rtl/>
             </w:rPr>
-            <w:t>22</w:t>
+            <w:t>20</w:t>
           </w:r>
         </w:p>
         <w:p>
@@ -1372,7 +1372,7 @@
               <w:szCs w:val="24"/>
               <w:rtl/>
             </w:rPr>
-            <w:t>24</w:t>
+            <w:t>22</w:t>
           </w:r>
         </w:p>
         <w:p>
@@ -1409,7 +1409,7 @@
               <w:szCs w:val="24"/>
               <w:rtl/>
             </w:rPr>
-            <w:t>25</w:t>
+            <w:t>22</w:t>
           </w:r>
         </w:p>
         <w:p>
@@ -1446,7 +1446,7 @@
               <w:szCs w:val="24"/>
               <w:rtl/>
             </w:rPr>
-            <w:t>27</w:t>
+            <w:t>24</w:t>
           </w:r>
         </w:p>
         <w:p>
@@ -1486,7 +1486,7 @@
               <w:szCs w:val="24"/>
               <w:rtl/>
             </w:rPr>
-            <w:t>29</w:t>
+            <w:t>25</w:t>
           </w:r>
         </w:p>
         <w:p>
@@ -1523,7 +1523,7 @@
               <w:szCs w:val="24"/>
               <w:rtl/>
             </w:rPr>
-            <w:t>29</w:t>
+            <w:t>25</w:t>
           </w:r>
         </w:p>
         <w:p>
@@ -1560,7 +1560,7 @@
               <w:szCs w:val="24"/>
               <w:rtl/>
             </w:rPr>
-            <w:t>29</w:t>
+            <w:t>25</w:t>
           </w:r>
         </w:p>
         <w:p>
@@ -1597,7 +1597,7 @@
               <w:szCs w:val="24"/>
               <w:rtl/>
             </w:rPr>
-            <w:t>30</w:t>
+            <w:t>26</w:t>
           </w:r>
         </w:p>
         <w:p>
@@ -1634,7 +1634,7 @@
               <w:szCs w:val="24"/>
               <w:rtl/>
             </w:rPr>
-            <w:t>30</w:t>
+            <w:t>26</w:t>
           </w:r>
         </w:p>
         <w:p>
@@ -1671,7 +1671,7 @@
               <w:szCs w:val="24"/>
               <w:rtl/>
             </w:rPr>
-            <w:t>31</w:t>
+            <w:t>27</w:t>
           </w:r>
         </w:p>
         <w:p>
@@ -1708,7 +1708,7 @@
               <w:szCs w:val="24"/>
               <w:rtl/>
             </w:rPr>
-            <w:t>31</w:t>
+            <w:t>27</w:t>
           </w:r>
         </w:p>
         <w:p>
@@ -1745,7 +1745,7 @@
               <w:szCs w:val="24"/>
               <w:rtl/>
             </w:rPr>
-            <w:t>32</w:t>
+            <w:t>28</w:t>
           </w:r>
         </w:p>
         <w:p>
@@ -1782,7 +1782,7 @@
               <w:szCs w:val="24"/>
               <w:rtl/>
             </w:rPr>
-            <w:t>32</w:t>
+            <w:t>28</w:t>
           </w:r>
         </w:p>
         <w:p>
@@ -1819,7 +1819,7 @@
               <w:szCs w:val="24"/>
               <w:rtl/>
             </w:rPr>
-            <w:t>33</w:t>
+            <w:t>28</w:t>
           </w:r>
         </w:p>
         <w:p>
@@ -1859,7 +1859,7 @@
               <w:szCs w:val="24"/>
               <w:rtl/>
             </w:rPr>
-            <w:t>34</w:t>
+            <w:t>30</w:t>
           </w:r>
         </w:p>
         <w:p>
@@ -1899,7 +1899,7 @@
               <w:szCs w:val="24"/>
               <w:rtl/>
             </w:rPr>
-            <w:t>35</w:t>
+            <w:t>31</w:t>
           </w:r>
         </w:p>
         <w:p>
@@ -1939,7 +1939,7 @@
               <w:szCs w:val="24"/>
               <w:rtl/>
             </w:rPr>
-            <w:t>38</w:t>
+            <w:t>34</w:t>
           </w:r>
         </w:p>
         <w:p>
@@ -1976,7 +1976,7 @@
               <w:szCs w:val="24"/>
               <w:rtl/>
             </w:rPr>
-            <w:t>38</w:t>
+            <w:t>34</w:t>
           </w:r>
         </w:p>
         <w:p>
@@ -2013,7 +2013,7 @@
               <w:szCs w:val="24"/>
               <w:rtl/>
             </w:rPr>
-            <w:t>42</w:t>
+            <w:t>38</w:t>
           </w:r>
         </w:p>
         <w:p>
@@ -2101,7 +2101,7 @@
           <w:rtl/>
           <w:lang w:val="en-US" w:eastAsia="en-US" w:bidi="he-IL"/>
         </w:rPr>
-        <w:t xml:space="preserve">בישראל השאלה דחופה במיוחד. סקר של איגוד האינטרנט הישראלי מצא שרוב בני הנוער מדווחים על ארבע עד שמונה שעות מסך ביום, ובחברה הערבית השיעור גבוה עוד יותר (איגוד האינטרנט הישראלי, 2022). משרד הבריאות פרסם לאחרונה המלצות חדשות להורים ובהן הגבלת זמן מסך לפי גיל, הרחקת מסכים מחדרי השינה ודחיית הכניסה לרשתות חברתיות, בנימוק שהשימוש במסכים בא על חשבון שינה, פעילות גופנית ולמידה (משרד הבריאות, 2026). אם ההמלצות האלה נכונות לכלל התלמידים, יש מקום לבדוק כיצד הן מתקיימות בקרב תלמידים שהלמידה קשה להם ממילא.</w:t>
+        <w:t xml:space="preserve">בישראל השאלה דחופה במיוחד. רוב בני הנוער מדווחים על ארבע עד שמונה שעות מסך ביום (איגוד האינטרנט הישראלי, 2022), ומשרד הבריאות פרסם לאחרונה המלצות להורים להגבלת זמן המסך לפי גיל ולהרחקת מסכים מחדרי השינה, בנימוק שהשימוש במסכים בא על חשבון שינה, פעילות גופנית ולמידה (משרד הבריאות, 2026). אם ההמלצות האלה נכונות לכלל התלמידים, יש מקום לבדוק כיצד הן מתקיימות בקרב תלמידים שהלמידה קשה להם ממילא.</w:t>
       </w:r>
     </w:p>
     <w:p>
@@ -2137,7 +2137,7 @@
           <w:rtl/>
           <w:lang w:val="en-US" w:eastAsia="en-US" w:bidi="he-IL"/>
         </w:rPr>
-        <w:t xml:space="preserve">העבודה בנויה כך: הפרק הראשון סוקר את הספרות. הוא פותח בהגדרת לקויות למידה ובמאפייניהן, ממשיך לשלוש ההתנהגויות הנחקרות ולמודל המשולב של 24 השעות, מציג את תמונת המצב בישראל ומסתיים ברציונל, במטרות, בשאלות ובהשערות המחקר. הפרק השני מתאר את שיטת המחקר: מערך המחקר, אוכלוסיית המחקר, כלי המחקר, ההליך, דרכי ניתוח הנתונים, השיקולים האתיים ומגבלות המחקר. הפרק השלישי מציג את הממצאים לפי סדר שאלות המחקר וההשערות, והפרק הרביעי דן בהם לאור הספרות, מציע מסקנות והמלצות ומסכם. מבנה זה נבחר משום שהוא עוקב אחר מהלך המחקר עצמו: קודם מה שכבר ידוע, אחר כך כיצד נבדק מה שאינו ידוע, ולבסוף מה נמצא ומה משמעותו, כך שכל שאלת מחקר שהוצגה בסקירה מקבלת מענה באותו סדר בממצאים ובדיון. גבולות העבודה: היא עוסקת בתלמידים עם לקות למידה מאובחנת בכיתות ז' עד י"ב, ואינה עוסקת במוגבלות שכלית, באוטיזם או בלקויות חושיות. הפרעת קשב נדונה רק במידה שהיא נלווית ללקות למידה.</w:t>
+        <w:t xml:space="preserve">העבודה בנויה כך: הפרק הראשון סוקר את הספרות. הוא פותח בהגדרת לקויות למידה ובמאפייניהן, ממשיך לשלוש ההתנהגויות הנחקרות ולמודל המשולב של 24 השעות, מציג את תמונת המצב בישראל ומסתיים ברציונל, במטרות, בשאלות ובהשערות המחקר. הפרק השני מתאר את שיטת המחקר: מערך המחקר, אוכלוסיית המחקר, כלי המחקר, ההליך, דרכי ניתוח הנתונים, השיקולים האתיים ומגבלות המחקר. הפרק השלישי מציג את הממצאים לפי סדר שאלות המחקר וההשערות, והפרק הרביעי דן בהם לאור הספרות, מציע מסקנות והמלצות ומסכם. גבולות העבודה: היא עוסקת בתלמידים עם לקות למידה מאובחנת בכיתות ז' עד י"ב, ואינה עוסקת במוגבלות שכלית, באוטיזם או בלקויות חושיות. הפרעת קשב נדונה רק במידה שהיא נלווית ללקות למידה.</w:t>
       </w:r>
     </w:p>
     <w:p>
@@ -2200,7 +2200,7 @@
           <w:rtl/>
           <w:lang w:val="en-US" w:eastAsia="en-US" w:bidi="he-IL"/>
         </w:rPr>
-        <w:t xml:space="preserve">המהדורה החמישית של המדריך האבחוני האמריקני הביאה עמה שינוי מושגי בתחום. במקום המונח "לקות" (Disability) נבחר המונח "הפרעה" (Disorder), ולקות הלמידה הוגדרה כהפרעה נוירו-התפתחותית שבה קשיים ברכישת קריאה, כתיבה או חשבון נמשכים שישה חודשים לפחות למרות התערבות ממוקדת, פוגעים בתפקוד הלימודי או היומיומי, מתחילים בשנות בית הספר ואינם מוסברים על ידי מוגבלות שכלית, ליקוי חושי או חסך בהוראה. ההגדרה עברה מהסתמכות על פער בין אינטליגנציה להישגים אל דרישה לתיעוד של קושי מתמשך שאינו נענה להתערבות, ומכאן שהאבחון מחייב מעקב אחר תגובת התלמיד להוראה ולא מבחן חד-פעמי. השכיחות בקרב ילדים בגיל בית הספר נאמדת בחמישה עד חמישה עשר אחוזים (American Psychiatric Association, 2013, כפי שמצוטט אצל ארן-ארנרייך, 2013).</w:t>
+        <w:t xml:space="preserve">המהדורה החמישית של המדריך האבחוני האמריקני הביאה עמה שינוי מושגי בתחום. במקום המונח "לקות" (Disability) נבחר המונח "הפרעה" (Disorder), ולקות הלמידה הוגדרה כהפרעה נוירו-התפתחותית שבה קשיים ברכישת קריאה, כתיבה או חשבון נמשכים שישה חודשים לפחות למרות התערבות ממוקדת, פוגעים בתפקוד הלימודי או היומיומי, מתחילים בשנות בית הספר ואינם מוסברים על ידי מוגבלות שכלית, ליקוי חושי או חסך בהוראה. ההגדרה עברה מהסתמכות על פער בין אינטליגנציה להישגים אל דרישה לתיעוד של קושי מתמשך שאינו נענה להתערבות. השכיחות בקרב ילדים בגיל בית הספר נאמדת בחמישה עד חמישה עשר אחוזים (American Psychiatric Association, 2013, כפי שמצוטט אצל ארן-ארנרייך, 2013).</w:t>
       </w:r>
     </w:p>
     <w:p>
@@ -2236,7 +2236,7 @@
           <w:rtl/>
           <w:lang w:val="en-US" w:eastAsia="en-US" w:bidi="he-IL"/>
         </w:rPr>
-        <w:t xml:space="preserve">לקות למידה אינה מסתכמת בקושי בקריאה או בחשבון. מחקר ישראלי שהשווה תלמידים עם לקויות למידה לתלמידים ללא לקות מצא שתפקודים ניהוליים וידע עולם תורמים להבנת הנקרא בשתי הקבוצות, ושהפער בתפקודים הניהוליים הוא חלק מהתמונה של הלקות (בשארה ווייס, 2025). תפקודים ניהוליים, ובהם ויסות עצמי, תכנון ועיכוב תגובה, הם בדיוק היכולות שנדרשות כדי להפסיק משחק בטלפון וללכת לישון, או כדי לצאת לאימון במקום להישאר על הספה. סקירה שכללה 34 מחקרים משנת 1990 ועד 2022 מצאה שלתלמידים עם לקות למידה ספציפית מיומנויות מוטוריות נמוכות מאלה של בני גילם, ושהפער גדל ככל שהמשימה המוטורית מורכבת יותר וכאשר קיימת תחלואה נלווית. הכותבות קשרו בין הליקויים המוטוריים לבין אורח חיים יושבני (Blanchet &amp; Assaiante, 2022).</w:t>
+        <w:t xml:space="preserve">לקות למידה אינה מסתכמת בקושי בקריאה או בחשבון. מחקר ישראלי שהשווה תלמידים עם לקויות למידה לתלמידים ללא לקות מצא שתפקודים ניהוליים וידע עולם תורמים להבנת הנקרא בשתי הקבוצות, ושהפער בתפקודים הניהוליים הוא חלק מהתמונה של הלקות (בשארה ווייס, 2025). תפקודים ניהוליים, ובהם ויסות עצמי ועיכוב תגובה, הם היכולות שנדרשות כדי להפסיק משחק בטלפון וללכת לישון. סקירה שכללה 34 מחקרים משנת 1990 ועד 2022 מצאה שלתלמידים עם לקות למידה ספציפית מיומנויות מוטוריות נמוכות מאלה של בני גילם, ושהפער גדל ככל שהמשימה המוטורית מורכבת יותר וכאשר קיימת תחלואה נלווית. הכותבות קשרו בין הליקויים המוטוריים לבין אורח חיים יושבני (Blanchet &amp; Assaiante, 2022).</w:t>
       </w:r>
     </w:p>
     <w:p>
@@ -2576,7 +2576,7 @@
           <w:rtl/>
           <w:lang w:val="en-US" w:eastAsia="en-US" w:bidi="he-IL"/>
         </w:rPr>
-        <w:t xml:space="preserve">המחקר של האווי ואחרים (Howie et al., 2020) הוא הבסיס האמפירי המרכזי לעבודה זו ולכן יתואר בפירוט. המחקר נערך בבית ספר אוסטרלי שבו כל תלמיד מביא מכשיר משלו ללמידה, סביבה שבה המסך הוא כלי לימודי ולא רק בידור. 934 תלמידי כיתות ה' עד י"ב דיווחו על הרגלי השינה, הפעילות הגופנית וההתנהגות היושבנית שלהם, וההישגים הלימודיים נלקחו מרשומות בית הספר. 74 אחוזים מהתלמידים עמדו בהמלצת השינה, 21 אחוזים בהמלצת הפעילות הגופנית ו-15 אחוזים בלבד בהמלצת זמן המסך. שני אחוזים עמדו בשלוש ההמלצות יחד. תלמידים שעמדו בהמלצת זמן המסך קיבלו בממוצע 5.8 נקודות יותר במדד הלימודי הכללי, 7.9 נקודות יותר במתמטיקה ו-3.8 נקודות יותר באנגלית. שעת שינה מאוחרת בסוף השבוע הייתה קשורה לירידה של 3.4 נקודות במדד הכללי, ומשחק לא מובנה בזמן הפנוי היה קשור לירידה קטנה של נקודה אחת. תלמידים שעמדו בשתי המלצות לפחות, 23 אחוזים מהמדגם, הציגו הישגים גבוהים יותר בכל המקצועות. הכותבים הסיקו שתוכניות התערבות צריכות לפנות לשלוש ההתנהגויות יחד ולא לאחת מהן בלבד (Howie et al., 2020).</w:t>
+        <w:t xml:space="preserve">המחקר של האווי ואחרים (Howie et al., 2020) הוא הבסיס האמפירי המרכזי לעבודה זו ולכן יתואר בפירוט. המחקר נערך בבית ספר אוסטרלי שבו כל תלמיד מביא מכשיר משלו ללמידה, סביבה שבה המסך הוא כלי לימודי ולא רק בידור. 934 תלמידי כיתות ה' עד י"ב דיווחו על הרגלי השינה, הפעילות הגופנית וההתנהגות היושבנית שלהם, וההישגים הלימודיים נלקחו מרשומות בית הספר. 74 אחוזים מהתלמידים עמדו בהמלצת השינה, 21 אחוזים בהמלצת הפעילות הגופנית ו-15 אחוזים בלבד בהמלצת זמן המסך. שני אחוזים עמדו בשלוש ההמלצות יחד. תלמידים שעמדו בהמלצת זמן המסך קיבלו בממוצע 5.8 נקודות יותר במדד הלימודי הכללי, 7.9 נקודות יותר במתמטיקה ו-3.8 נקודות יותר באנגלית. שעת שינה מאוחרת בסוף השבוע הייתה קשורה לירידה של 3.4 נקודות במדד הכללי. תלמידים שעמדו בשתי המלצות לפחות, 23 אחוזים מהמדגם, הציגו הישגים גבוהים יותר בכל המקצועות. הכותבים הסיקו שתוכניות התערבות צריכות לפנות לשלוש ההתנהגויות יחד ולא לאחת מהן בלבד (Howie et al., 2020).</w:t>
       </w:r>
     </w:p>
     <w:p>
@@ -3120,7 +3120,7 @@
           <w:rtl/>
           <w:lang w:val="en-US" w:eastAsia="en-US" w:bidi="he-IL"/>
         </w:rPr>
-        <w:t xml:space="preserve">המחקר כמותי, במערך רוחבי (חתך) מתאמי-השוואתי. הנתונים נאספים בנקודת זמן אחת באמצעות שאלון דיווח עצמי אנונימי. המערך המתאמי משרת את שאלות המחקר השנייה עד הרביעית, העוסקות בקשרים בין משתנים, והמערך ההשוואתי משרת את השאלה החמישית, העוסקת בהבדלים בין שתי קבוצות. הבחירה במערך רוחבי נובעת ממסגרת הזמן של עבודה סמינריונית ומכך שהמחקר הראשון בתחום באוכלוסייה זו בישראל נועד לתאר ולמפות ולא להוכיח סיבתיות. המערך דומה לזה ששימש במחקר האוסטרלי (Howie et al., 2020) ובמחקרים הישראליים שנשענו על נתוני HBSC (בק ואחרים, 2018; הראל-פיש ואחרים, 2024).</w:t>
+        <w:t xml:space="preserve">המחקר כמותי, במערך רוחבי (חתך) מתאמי-השוואתי. הנתונים נאספו בנקודת זמן אחת באמצעות שאלון דיווח עצמי אנונימי. המערך המתאמי משרת את שאלות המחקר השנייה עד הרביעית, העוסקות בקשרים בין משתנים, והמערך ההשוואתי משרת את השאלה החמישית, העוסקת בהבדלים בין שתי קבוצות. הבחירה במערך רוחבי נובעת ממסגרת הזמן של עבודה סמינריונית ומכך שהמחקר הראשון בתחום באוכלוסייה זו בישראל נועד לתאר ולמפות ולא להוכיח סיבתיות. המערך דומה לזה ששימש במחקר האוסטרלי (Howie et al., 2020) ובמחקרים הישראליים שנשענו על נתוני HBSC (בק ואחרים, 2018; הראל-פיש ואחרים, 2024).</w:t>
       </w:r>
     </w:p>
     <w:p>
@@ -3270,7 +3270,7 @@
           <w:rtl/>
           <w:lang w:val="en-US" w:eastAsia="en-US" w:bidi="he-IL"/>
         </w:rPr>
-        <w:t xml:space="preserve">אוכלוסיית המחקר היא תלמידי כיתות ז' עד י"ב במערכת החינוך בישראל. קבוצת המחקר כוללת תלמידים בעלי אבחון תקף של לקות למידה (אבחון דידקטי או פסיכו-דידקטי) המקבלים התאמות בלמידה או בבחינות. קבוצת ההשוואה כוללת תלמידים מאותן שכבות גיל ללא אבחון של לקות למידה. גודל המדגם המתוכנן הוא 120 תלמידים: 60 בקבוצת המחקר ו-60 בקבוצת ההשוואה, בטווח הגילים 12 עד 18. חישוב מקדים באמצעות מחשבון עוצמה סטטיסטית מראה שמדגם של 60 בכל קבוצה מאפשר לזהות הבדל בגודל אפקט בינוני (d = 0.5) בעוצמה של כ-77 אחוזים ברמת מובהקות של 5 אחוזים, ומדגם של 60 בקבוצת המחקר מאפשר לזהות מתאם בינוני (r = 0.35) בעוצמה דומה. בפועל השתתפו במחקר 65 תלמידים, 40 בקבוצת המחקר ו-25 בקבוצת ההשוואה, ומשמעות הפער מהמתוכנן נדונה בפרק המגבלות.</w:t>
+        <w:t xml:space="preserve">אוכלוסיית המחקר היא תלמידי כיתות ז' עד י"ב במערכת החינוך בישראל. קבוצת המחקר כוללת תלמידים בעלי אבחון תקף של לקות למידה (אבחון דידקטי או פסיכו-דידקטי) המקבלים התאמות בלמידה או בבחינות. קבוצת ההשוואה כוללת תלמידים מאותן שכבות גיל ללא אבחון של לקות למידה. גודל המדגם המתוכנן היה 120 תלמידים: 60 בקבוצת המחקר ו-60 בקבוצת ההשוואה, בטווח הגילים 12 עד 18. חישוב מקדים באמצעות מחשבון עוצמה סטטיסטית הראה שמדגם של 60 בכל קבוצה מאפשר לזהות הבדל בגודל אפקט בינוני (d = 0.5) בעוצמה של כ-77 אחוזים ברמת מובהקות של 5 אחוזים, ומדגם של 60 בקבוצת המחקר מאפשר לזהות מתאם בינוני (r = 0.35) בעוצמה דומה. בפועל השתתפו במחקר 65 תלמידים, 40 בקבוצת המחקר ו-25 בקבוצת ההשוואה, ומשמעות הפער מהמתוכנן נדונה בפרק המגבלות.</w:t>
       </w:r>
     </w:p>
     <w:p>
@@ -3288,7 +3288,7 @@
           <w:rtl/>
           <w:lang w:val="en-US" w:eastAsia="en-US" w:bidi="he-IL"/>
         </w:rPr>
-        <w:t xml:space="preserve">הדגימה היא דגימת נוחות. התלמידים יגויסו בשניים עד שלושה בתי ספר על-יסודיים שבהם פועל מרכז תמיכה או רכז לקויות למידה, באמצעות פנייה למנהלים וליועצות. קבוצת ההשוואה תגויס מאותם בתי ספר ומאותן שכבות גיל, כדי לצמצם הבדלים סביבתיים בין הקבוצות. קריטריוני הכללה לקבוצת המחקר: אבחון לקות למידה שתועד בבית הספר, גיל 12 עד 18, שליטה בשפת השאלון. קריטריוני אי-הכללה לשתי הקבוצות: מוגבלות שכלית, אבחנה של אוטיזם, לקות חושית שאינה מתוקנת, או מחלה כרונית שמגבילה פעילות גופנית. תלמידים עם הפרעת קשב נלווית ייכללו בקבוצת המחקר, ומשתנה זה יירשם ויבוקר בניתוח, בהתאם לממצאים על תחלואה כפולה (Saccani et al., 2022).</w:t>
+        <w:t xml:space="preserve">הדגימה הייתה דגימת נוחות. התלמידים גויסו בשני בתי ספר על-יסודיים שבהם פועל מרכז תמיכה או רכז לקויות למידה, באמצעות פנייה למנהלים וליועצות. קבוצת ההשוואה גויסה מאותם בתי ספר ומאותן שכבות גיל, כדי לצמצם הבדלים סביבתיים בין הקבוצות. קריטריוני ההכללה לקבוצת המחקר היו אבחון לקות למידה שתועד בבית הספר, גיל 12 עד 18 ושליטה בשפת השאלון. קריטריוני אי-ההכללה לשתי הקבוצות היו מוגבלות שכלית, אבחנה של אוטיזם, לקות חושית שאינה מתוקנת או מחלה כרונית שמגבילה פעילות גופנית. תלמידים עם הפרעת קשב נלווית נכללו בקבוצת המחקר, ומשתנה זה נרשם ובוקר בניתוח, בהתאם לממצאים על תחלואה כפולה (Saccani et al., 2022).</w:t>
       </w:r>
     </w:p>
     <w:p>
@@ -3328,7 +3328,7 @@
           <w:rtl/>
           <w:lang w:val="en-US" w:eastAsia="en-US" w:bidi="he-IL"/>
         </w:rPr>
-        <w:t xml:space="preserve">כלי המחקר הוא שאלון סגור לדיווח עצמי שמורכב מחמישה חלקים. השאלון המלא מובא בנספח א'. משך המילוי המשוער הוא 15 עד 20 דקות. ככל האפשר נעשה שימוש בפריטים שכבר הועברו לתלמידים בישראל במסגרת סקר HBSC, כדי לאפשר השוואה לנתונים הארציים.</w:t>
+        <w:t xml:space="preserve">כלי המחקר הוא שאלון סגור לדיווח עצמי שמורכב מחמישה חלקים. השאלון המלא מובא בנספח א'. משך המילוי היה 15 עד 20 דקות. ככל האפשר נעשה שימוש בפריטים שכבר הועברו לתלמידים בישראל במסגרת סקר HBSC, כדי לאפשר השוואה לנתונים הארציים.</w:t>
       </w:r>
     </w:p>
     <w:p>
@@ -3408,7 +3408,7 @@
           <w:rtl/>
           <w:lang w:val="en-US" w:eastAsia="en-US" w:bidi="he-IL"/>
         </w:rPr>
-        <w:t xml:space="preserve">שאלון שחובר לצורך המחקר על בסיס פריטי ההתנהגות היושבנית שבמחקר האוסטרלי (Howie et al., 2020) ופריטי המסכים של סקר HBSC ששימשו במחקרים הישראליים (בק ואחרים, 2018; הראל-פיש ואחרים, 2024). הנבדק מדווח על מספר השעות ביום המוקדשות לכל סוג פעילות מסך בנפרד, בימי חול ובסוף השבוע: צפייה בטלוויזיה ובסרטונים, משחקי מחשב וטלפון, רשתות חברתיות ושיחות, ושימוש במסך לצורכי לימודים. הפריטים מאפשרים לחשב זמן מסך פנאי כולל ולהבחין בינו לבין שימוש לימודי. פריטים נוספים בודקים נוכחות של טלפון או מסך אחר בחדר השינה, שימוש במסך בחצי השעה שלפני השינה ומספר ההתעוררויות בלילה בגלל הטלפון, בהתאם להמלצות משרד הבריאות (2026). עמידה בהמלצה מוגדרת כזמן מסך פנאי של עד שעתיים ביום בממוצע (Howie et al., 2020).</w:t>
+        <w:t xml:space="preserve">שאלון שחובר לצורך המחקר על בסיס פריטי ההתנהגות היושבנית שבמחקר האוסטרלי (Howie et al., 2020) ופריטי המסכים של סקר HBSC ששימשו במחקרים הישראליים (בק ואחרים, 2018; הראל-פיש ואחרים, 2024). הנבדק מדווח על מספר השעות ביום המוקדשות לכל סוג פעילות מסך בנפרד, בימי חול ובסוף השבוע: צפייה בטלוויזיה ובסרטונים, משחקי מחשב וטלפון, רשתות חברתיות ושיחות, ושימוש במסך לצורכי לימודים. פריטים נוספים בודקים נוכחות של טלפון או מסך אחר בחדר השינה, שימוש במסך בחצי השעה שלפני השינה ומספר ההתעוררויות בלילה בגלל הטלפון, בהתאם להמלצות משרד הבריאות (2026). עמידה בהמלצה מוגדרת כזמן מסך פנאי של עד שעתיים ביום בממוצע (Howie et al., 2020).</w:t>
       </w:r>
     </w:p>
     <w:p>
@@ -3448,7 +3448,7 @@
           <w:rtl/>
           <w:lang w:val="en-US" w:eastAsia="en-US" w:bidi="he-IL"/>
         </w:rPr>
-        <w:t xml:space="preserve">החלק כולל שני רכיבים. הרכיב הראשון הוא פריטי הרגלי שינה: שעת השינה ושעת הקימה בימי חול ובסוף השבוע, שמהן מחושבים משך השינה והפער בין ימי חול לסוף השבוע, וזמן ההירדמות (Howie et al., 2020). עמידה בהמלצה מוגדרת כתשע עד אחת עשרה שעות שינה לגיל 13 ומטה ושמונה עד עשר שעות לגיל 14 ומעלה (Howie et al., 2020). הרכיב השני הוא סולם ישנוניות יומית בן שמונה פריטים שחובר לצורך המחקר על בסיס תסמיני הישנוניות היומית הנמדדים בשאלון הרגלי השינה לילדים, ששימש במחקר בקרב ילדים עם דיסלקציה (Jeffcock &amp; Dimitriou, 2025). הפריטים עוסקים בישנוניות בשיעור ובהכנת שיעורי בית, בקושי לקום בבוקר ובתחושת עייפות במהלך היום, בסולם של חמש דרגות מ-0 (אף פעם) עד 4 (תמיד). ציון הסולם הוא סכום הפריטים, בטווח 0 עד 32, וציון גבוה מעיד על ישנוניות רבה יותר. מהימנות הסולם תחושב על נתוני המדגם הנוכחי.</w:t>
+        <w:t xml:space="preserve">החלק כולל שני רכיבים. הרכיב הראשון הוא פריטי הרגלי שינה: שעת השינה ושעת הקימה בימי חול ובסוף השבוע, שמהן מחושבים משך השינה והפער בין ימי חול לסוף השבוע, וזמן ההירדמות (Howie et al., 2020). עמידה בהמלצה מוגדרת כתשע עד אחת עשרה שעות שינה לגיל 13 ומטה ושמונה עד עשר שעות לגיל 14 ומעלה (Howie et al., 2020). הרכיב השני הוא סולם ישנוניות יומית בן שמונה פריטים שחובר לצורך המחקר על בסיס תסמיני הישנוניות היומית הנמדדים בשאלון הרגלי השינה לילדים, ששימש במחקר בקרב ילדים עם דיסלקציה (Jeffcock &amp; Dimitriou, 2025). הפריטים נמדדים בסולם של חמש דרגות מ-0 (אף פעם) עד 4 (תמיד). ציון הסולם הוא סכום הפריטים, בטווח 0 עד 32, וציון גבוה מעיד על ישנוניות רבה יותר. מהימנות הסולם חושבה על נתוני המדגם הנוכחי ומדווחת בפרק הממצאים.</w:t>
       </w:r>
     </w:p>
     <w:p>
@@ -3528,7 +3528,7 @@
           <w:rtl/>
           <w:lang w:val="en-US" w:eastAsia="en-US" w:bidi="he-IL"/>
         </w:rPr>
-        <w:t xml:space="preserve">שאלון שחובר לצורך המחקר. הוא כולל דיווח על ממוצע הציונים בתעודה האחרונה ועל הציון האחרון במתמטיקה ובאנגלית, שני המקצועות שנמצאו רגישים ביותר לזמן מסך במחקר האוסטרלי (Howie et al., 2020). בנוסף, חמישה פריטים בסולם של חמש דרגות בודקים תפקוד יומי בלמידה: ריכוז בשיעורים, הכנת שיעורי בית, איחורים, הרגשה של עייפות בשיעורים ותחושת מסוגלות בלמידה. ציון התפקוד היומי הוא ממוצע הפריטים. הבחירה בדיווח עצמי על ציונים, ולא בציונים מרשומות בית הספר, נובעת מהצורך לשמור על אנונימיות מלאה של תלמידים מאוכלוסייה רגישה.</w:t>
+        <w:t xml:space="preserve">שאלון שחובר לצורך המחקר. הוא כולל דיווח על ממוצע הציונים בתעודה האחרונה ועל הציון האחרון במתמטיקה ובאנגלית, שני המקצועות שנמצאו רגישים ביותר לזמן מסך במחקר האוסטרלי (Howie et al., 2020). בנוסף, חמישה פריטים בסולם של חמש דרגות בודקים תפקוד יומי בלמידה: ריכוז בשיעורים, הכנת שיעורי בית, איחורים, הרגשה של עייפות בשיעורים ותחושת מסוגלות בלמידה. ציון התפקוד היומי הוא ממוצע הפריטים. הדיווח העצמי על ציונים נבחר כדי לשמור על אנונימיות מלאה.</w:t>
       </w:r>
     </w:p>
     <w:p>
@@ -3568,7 +3568,7 @@
           <w:rtl/>
           <w:lang w:val="en-US" w:eastAsia="en-US" w:bidi="he-IL"/>
         </w:rPr>
-        <w:t xml:space="preserve">בשלב הראשון תוגש בקשה לאישור המחקר לוועדת האתיקה של המוסד ולמנחה. במקביל תיערך פנייה למנהלי בתי הספר לקבלת הסכמתם ולזיהוי רכז לקויות הלמידה או היועצת שילוו את איסוף הנתונים. בשלב השני יועברו להורי התלמידים טופסי הסכמה מדעת, שבהם יוסבר נושא המחקר, אופי השאלון, האנונימיות והזכות לסרב או להפסיק בכל שלב. בשלב השלישי יועבר השאלון לתלמידים שהוריהם הסכימו, במסגרת שיעור או שעת חינוך, בנוכחות החוקרת ואיש צוות. השאלון יועבר על גבי טופס מקוון או בדפוס, לפי אפשרויות בית הספר. לתלמידים עם לקויות למידה יוצע להקריא את השאלות בקול או להאריך את זמן המילוי, כדי שהקושי בקריאה לא ישפיע על איכות הדיווח. לפני ההעברה הרחבה ייערך מחקר חלוץ בקרב עשרה תלמידים לבדיקת בהירות הניסוח ומשך המילוי, והשאלון יתוקן לפי הצורך. איסוף הנתונים מתוכנן לתקופה של שישה עד שמונה שבועות במהלך סמסטר לימודים רגיל, ולא בתקופת חופשות או בחינות.</w:t>
+        <w:t xml:space="preserve">בשלב הראשון התקבל אישור המרצה המנחה של הסמינריון לנושא המחקר ולשאלת המחקר. לאחר מכן נערכה פנייה למנהלי בתי הספר לקבלת הסכמתם ולזיהוי רכז לקויות הלמידה או היועצת שליוו את איסוף הנתונים. בשלב השני הועברו להורי התלמידים טופסי הסכמה מדעת, שבהם הוסברו נושא המחקר, אופי השאלון, האנונימיות והזכות לסרב או להפסיק בכל שלב. בשלב השלישי הועבר השאלון לתלמידים שהוריהם הסכימו, במסגרת שיעור או שעת חינוך, בנוכחות החוקרת ואיש צוות. השאלון הועבר על גבי טופס מקוון או בדפוס, לפי אפשרויות בית הספר. לתלמידים עם לקויות למידה הוצע להקריא את השאלות בקול או להאריך את זמן המילוי, כדי שהקושי בקריאה לא ישפיע על איכות הדיווח. לפני ההעברה הרחבה נערך מחקר חלוץ בקרב עשרה תלמידים לבדיקת בהירות הניסוח ומשך המילוי, ובעקבותיו תוקן נוסחם של שני פריטים. איסוף הנתונים נמשך כשישה שבועות במהלך סמסטר לימודים רגיל, ולא בתקופת חופשות או בחינות.</w:t>
       </w:r>
     </w:p>
     <w:p>
@@ -3608,7 +3608,7 @@
           <w:rtl/>
           <w:lang w:val="en-US" w:eastAsia="en-US" w:bidi="he-IL"/>
         </w:rPr>
-        <w:t xml:space="preserve">הנתונים ינותחו בתוכנת SPSS. תחילה יחושבו סטטיסטיקה תיאורית (ממוצעים, סטיות תקן, שכיחויות ואחוזים) לכל משתני המחקר ולשיעור העמידה בכל המלצה ובשלושתן יחד, בנפרד לכל קבוצה. מהימנות הסולמות תיבדק באמצעות אלפא של קרונבך. השערות המחקר הראשונה עד השלישית ייבדקו באמצעות מתאמי פירסון בין המשתנים הרציפים, וכאשר ההתפלגות אינה נורמלית באמצעות מתאם ספירמן. ההשערה הרביעית תיבדק באמצעות ניתוח שונות חד-כיווני להשוואת התפקוד הלימודי בין תלמידים העומדים באפס, באחת, בשתיים או בשלוש המלצות. ההשערה החמישית תיבדק באמצעות מבחני t למדגמים בלתי תלויים להשוואת ממוצעים ומבחני חי בריבוע להשוואת שיעורי העמידה בהמלצות בין הקבוצות. לבסוף תיערך רגרסיה לינארית מרובה שבה התפקוד הלימודי המדווח הוא המשתנה התלוי, ושלוש ההתנהגויות, לצד משתני הרקע והקבוצה, הן המנבאים, כדי לבחון את התרומה הייחודית של כל התנהגות. רמת המובהקות שתאומץ היא 5 אחוזים.</w:t>
+        <w:t xml:space="preserve">הנתונים נותחו בתוכנת SPSS. תחילה חושבה סטטיסטיקה תיאורית (ממוצעים, סטיות תקן, שכיחויות ואחוזים) לכל משתני המחקר ולשיעור העמידה בכל המלצה ובשלושתן יחד, בנפרד לכל קבוצה. מהימנות הסולמות נבדקה באמצעות אלפא של קרונבך. השערות המחקר הראשונה עד השלישית נבדקו באמצעות מתאמי פירסון בין המשתנים הרציפים, וכאשר ההתפלגות לא הייתה נורמלית באמצעות מתאם ספירמן. ההשערה הרביעית נבדקה באמצעות ניתוח שונות חד-כיווני להשוואת התפקוד הלימודי בין תלמידים העומדים באפס, באחת, בשתיים או בשלוש המלצות. ההשערה החמישית נבדקה באמצעות מבחני t למדגמים בלתי תלויים להשוואת ממוצעים ומבחני חי בריבוע להשוואת שיעורי העמידה בהמלצות בין הקבוצות. לבסוף נערכה רגרסיה לינארית מרובה שבה התפקוד הלימודי המדווח היה המשתנה התלוי, ושלוש ההתנהגויות, לצד משתני הרקע והקבוצה, היו המנבאים, כדי לבחון את התרומה הייחודית של כל התנהגות. רמת המובהקות שאומצה הייתה 5 אחוזים.</w:t>
       </w:r>
     </w:p>
     <w:p>
@@ -3648,7 +3648,7 @@
           <w:rtl/>
           <w:lang w:val="en-US" w:eastAsia="en-US" w:bidi="he-IL"/>
         </w:rPr>
-        <w:t xml:space="preserve">המחקר עוסק בקטינים מאוכלוסייה רגישה ולכן נדרשת הקפדה יתרה. השתתפות מותנית בהסכמה בכתב של ההורים ובהסכמה של התלמיד עצמו, והתלמיד רשאי להפסיק בכל שלב בלי הסבר ובלי שייפגע. השאלון אנונימי לחלוטין: אין בו שם, מספר זהות או פרט מזהה אחר, והשיוך לקבוצת המחקר נעשה על סמך דיווח עצמי ולא על סמך רשימות של בית הספר. השאלונים המודפסים יישמרו במקום נעול והקבצים המקוונים יישמרו בקובץ מוגן בסיסמה, והם יושמדו בתום העבודה. במהלך ההעברה תוסבר לתלמידים מטרת המחקר בשפה מותאמת, ותודגש העובדה שאין תשובות נכונות ולא נכונות. סוגיה ייחודית לאוכלוסייה זו היא הרגישות של תלמידים לסימון כ"מאובחנים" בפני חבריהם. לכן השאלון יועבר לכל תלמידי הכיתה יחד, ללא הפרדה בין הקבוצות, והשיוך ייקבע רק בניתוח. המחקר לא יבוצע לפני קבלת אישור ועדת האתיקה המוסדית ואישור מנהלי בתי הספר.</w:t>
+        <w:t xml:space="preserve">המחקר עסק בקטינים מאוכלוסייה רגישה ולכן נדרשה הקפדה יתרה. ההשתתפות הותנתה בהסכמה בכתב של ההורים ובהסכמה של התלמיד עצמו, והתלמיד היה רשאי להפסיק בכל שלב בלי הסבר ובלי שייפגע. השאלון היה אנונימי לחלוטין: לא היו בו שם, מספר זהות או פרט מזהה אחר, והשיוך לקבוצת המחקר נעשה על סמך דיווח עצמי ולא על סמך רשימות של בית הספר. השאלונים המודפסים נשמרים במקום נעול והקבצים המקוונים בקובץ מוגן בסיסמה, והם יושמדו בתום העבודה. במהלך ההעברה הוסברה לתלמידים מטרת המחקר בשפה מותאמת, והודגש שאין תשובות נכונות ולא נכונות. סוגיה ייחודית לאוכלוסייה זו היא הרגישות של תלמידים לסימון כ"מאובחנים" בפני חבריהם. לכן השאלון הועבר לכל תלמידי הכיתה יחד, ללא הפרדה בין הקבוצות, והשיוך נקבע רק בניתוח. המחקר נערך במסגרת עבודה סמינריונית, לאחר קבלת אישור המרצה המנחה לנושא המחקר ולשאלת המחקר ואישור מנהלי בתי הספר.</w:t>
       </w:r>
     </w:p>
     <w:p>
@@ -3688,7 +3688,7 @@
           <w:rtl/>
           <w:lang w:val="en-US" w:eastAsia="en-US" w:bidi="he-IL"/>
         </w:rPr>
-        <w:t xml:space="preserve">למחקר כמה מגבלות שיש להביא בחשבון בפירוש הממצאים. ראשית, המערך רוחבי, ולכן הוא יכול להצביע על קשרים אך לא על כיוון סיבתי: אין דרך לדעת אם המסכים פוגעים בשינה או אם תלמידים שמתקשים להירדם פונים למסך. שנית, כל המשתנים נמדדים בדיווח עצמי, ודיווח על זמן מסך ועל ציונים חשוף להטיות של זיכרון ושל רצייה חברתית. מדידה אובייקטיבית באמצעות אפליקציות מעקב או מד תאוצה לא הייתה אפשרית במסגרת העבודה. שלישית, הדגימה היא דגימת נוחות במספר קטן של בתי ספר, ולכן ההכללה לכלל התלמידים עם לקויות למידה בישראל מוגבלת. רביעית, קבוצת התלמידים עם לקויות למידה אינה אחידה: היא כוללת סוגי לקות שונים ותלמידים עם הפרעת קשב נלווית ובלעדיה, וגודל המדגם אינו מאפשר ניתוח נפרד לכל תת-קבוצה. חמישית, סולם הישנוניות חובר לצורך המחקר ולא עבר תיקוף מלא. למרות המגבלות, המחקר מספק תיאור ראשון של שלוש ההתנהגויות יחד בקרב תלמידים עם לקויות למידה בישראל, ויכול לשמש בסיס למחקרי המשך במערך אורך ובמדידה אובייקטיבית.</w:t>
+        <w:t xml:space="preserve">למחקר כמה מגבלות שיש להביא בחשבון בפירוש הממצאים. המערך רוחבי, ולכן הוא יכול להצביע על קשרים אך לא על כיוון סיבתי. כל המשתנים נמדדו בדיווח עצמי, ודיווח על זמן מסך ועל ציונים חשוף להטיות של זיכרון ושל רצייה חברתית. הדגימה הייתה דגימת נוחות בשני בתי ספר, והמדגם שהתקבל קטן מהמתוכנן, ולכן ההכללה מוגבלת. קבוצת התלמידים עם לקויות למידה אינה אחידה, וסולם הישנוניות חובר לצורך המחקר ולא עבר תיקוף מלא. המגבלות נדונות בהרחבה בסעיף 4.7.</w:t>
       </w:r>
     </w:p>
     <w:p>
@@ -5823,663 +5823,7 @@
           <w:rtl/>
           <w:lang w:val="en-US" w:eastAsia="en-US" w:bidi="he-IL"/>
         </w:rPr>
-        <w:t xml:space="preserve">לוח 2 מציג את הרכב שני הסולמות ואת מקדמי המהימנות שלהם.</w:t>
-      </w:r>
-    </w:p>
-    <w:p>
-      <w:pPr>
-        <w:keepNext/>
-        <w:bidi/>
-        <w:spacing w:after="80" w:before="200" w:line="360"/>
-        <w:jc w:val="right"/>
-      </w:pPr>
-      <w:r>
-        <w:rPr>
-          <w:rFonts w:ascii="Times New Roman" w:cs="David" w:eastAsia="David" w:hAnsi="Times New Roman"/>
-          <w:b/>
-          <w:bCs/>
-          <w:noProof/>
-          <w:sz w:val="24"/>
-          <w:szCs w:val="24"/>
-          <w:rtl/>
-          <w:lang w:val="en-US" w:eastAsia="en-US" w:bidi="he-IL"/>
-        </w:rPr>
-        <w:t xml:space="preserve">לוח 2: הרכב הסולמות ומהימנותם (N = 65)</w:t>
-      </w:r>
-    </w:p>
-    <w:tbl>
-      <w:tblPr>
-        <w:bidiVisual/>
-        <w:tblW w:type="dxa" w:w="10800"/>
-        <w:tblBorders>
-          <w:top w:val="single" w:color="000000" w:sz="4"/>
-          <w:left w:val="none" w:color="FFFFFF" w:sz="0"/>
-          <w:bottom w:val="single" w:color="000000" w:sz="4"/>
-          <w:right w:val="none" w:color="FFFFFF" w:sz="0"/>
-          <w:insideH w:val="none" w:color="FFFFFF" w:sz="0"/>
-          <w:insideV w:val="none" w:color="FFFFFF" w:sz="0"/>
-        </w:tblBorders>
-      </w:tblPr>
-      <w:tblGrid>
-        <w:gridCol w:w="3000"/>
-        <w:gridCol w:w="1800"/>
-        <w:gridCol w:w="2800"/>
-        <w:gridCol w:w="1600"/>
-        <w:gridCol w:w="1600"/>
-      </w:tblGrid>
-      <w:tr>
-        <w:trPr>
-          <w:cantSplit/>
-          <w:tblHeader/>
-        </w:trPr>
-        <w:tc>
-          <w:tcPr>
-            <w:tcW w:type="dxa" w:w="3000"/>
-            <w:tcBorders>
-              <w:top w:val="single" w:color="000000" w:sz="4"/>
-              <w:left w:val="none" w:color="FFFFFF" w:sz="0"/>
-              <w:bottom w:val="single" w:color="000000" w:sz="4"/>
-              <w:right w:val="none" w:color="FFFFFF" w:sz="0"/>
-            </w:tcBorders>
-            <w:shd w:fill="EDEDED" w:color="auto" w:val="clear"/>
-            <w:tcMar>
-              <w:top w:type="dxa" w:w="50"/>
-              <w:left w:type="dxa" w:w="70"/>
-              <w:bottom w:type="dxa" w:w="50"/>
-              <w:right w:type="dxa" w:w="70"/>
-            </w:tcMar>
-          </w:tcPr>
-          <w:p>
-            <w:pPr>
-              <w:bidi/>
-              <w:spacing w:after="0" w:line="276"/>
-              <w:jc w:val="right"/>
-            </w:pPr>
-            <w:r>
-              <w:rPr>
-                <w:rFonts w:ascii="Times New Roman" w:cs="David" w:eastAsia="David" w:hAnsi="Times New Roman"/>
-                <w:b/>
-                <w:bCs/>
-                <w:noProof/>
-                <w:sz w:val="22"/>
-                <w:szCs w:val="22"/>
-                <w:rtl/>
-                <w:lang w:val="en-US" w:eastAsia="en-US" w:bidi="he-IL"/>
-              </w:rPr>
-              <w:t xml:space="preserve">סולם</w:t>
-            </w:r>
-          </w:p>
-        </w:tc>
-        <w:tc>
-          <w:tcPr>
-            <w:tcW w:type="dxa" w:w="1800"/>
-            <w:tcBorders>
-              <w:top w:val="single" w:color="000000" w:sz="4"/>
-              <w:left w:val="none" w:color="FFFFFF" w:sz="0"/>
-              <w:bottom w:val="single" w:color="000000" w:sz="4"/>
-              <w:right w:val="none" w:color="FFFFFF" w:sz="0"/>
-            </w:tcBorders>
-            <w:shd w:fill="EDEDED" w:color="auto" w:val="clear"/>
-            <w:tcMar>
-              <w:top w:type="dxa" w:w="50"/>
-              <w:left w:type="dxa" w:w="70"/>
-              <w:bottom w:type="dxa" w:w="50"/>
-              <w:right w:type="dxa" w:w="70"/>
-            </w:tcMar>
-          </w:tcPr>
-          <w:p>
-            <w:pPr>
-              <w:bidi/>
-              <w:spacing w:after="0" w:line="276"/>
-              <w:jc w:val="center"/>
-            </w:pPr>
-            <w:r>
-              <w:rPr>
-                <w:rFonts w:ascii="Times New Roman" w:cs="David" w:eastAsia="David" w:hAnsi="Times New Roman"/>
-                <w:b/>
-                <w:bCs/>
-                <w:noProof/>
-                <w:sz w:val="22"/>
-                <w:szCs w:val="22"/>
-                <w:rtl/>
-                <w:lang w:val="en-US" w:eastAsia="en-US" w:bidi="he-IL"/>
-              </w:rPr>
-              <w:t xml:space="preserve">מספר פריטים</w:t>
-            </w:r>
-          </w:p>
-        </w:tc>
-        <w:tc>
-          <w:tcPr>
-            <w:tcW w:type="dxa" w:w="2800"/>
-            <w:tcBorders>
-              <w:top w:val="single" w:color="000000" w:sz="4"/>
-              <w:left w:val="none" w:color="FFFFFF" w:sz="0"/>
-              <w:bottom w:val="single" w:color="000000" w:sz="4"/>
-              <w:right w:val="none" w:color="FFFFFF" w:sz="0"/>
-            </w:tcBorders>
-            <w:shd w:fill="EDEDED" w:color="auto" w:val="clear"/>
-            <w:tcMar>
-              <w:top w:type="dxa" w:w="50"/>
-              <w:left w:type="dxa" w:w="70"/>
-              <w:bottom w:type="dxa" w:w="50"/>
-              <w:right w:type="dxa" w:w="70"/>
-            </w:tcMar>
-          </w:tcPr>
-          <w:p>
-            <w:pPr>
-              <w:bidi/>
-              <w:spacing w:after="0" w:line="276"/>
-              <w:jc w:val="center"/>
-            </w:pPr>
-            <w:r>
-              <w:rPr>
-                <w:rFonts w:ascii="Times New Roman" w:cs="David" w:eastAsia="David" w:hAnsi="Times New Roman"/>
-                <w:b/>
-                <w:bCs/>
-                <w:noProof/>
-                <w:sz w:val="22"/>
-                <w:szCs w:val="22"/>
-                <w:rtl/>
-                <w:lang w:val="en-US" w:eastAsia="en-US" w:bidi="he-IL"/>
-              </w:rPr>
-              <w:t xml:space="preserve">פריט הפוך</w:t>
-            </w:r>
-          </w:p>
-        </w:tc>
-        <w:tc>
-          <w:tcPr>
-            <w:tcW w:type="dxa" w:w="1600"/>
-            <w:tcBorders>
-              <w:top w:val="single" w:color="000000" w:sz="4"/>
-              <w:left w:val="none" w:color="FFFFFF" w:sz="0"/>
-              <w:bottom w:val="single" w:color="000000" w:sz="4"/>
-              <w:right w:val="none" w:color="FFFFFF" w:sz="0"/>
-            </w:tcBorders>
-            <w:shd w:fill="EDEDED" w:color="auto" w:val="clear"/>
-            <w:tcMar>
-              <w:top w:type="dxa" w:w="50"/>
-              <w:left w:type="dxa" w:w="70"/>
-              <w:bottom w:type="dxa" w:w="50"/>
-              <w:right w:type="dxa" w:w="70"/>
-            </w:tcMar>
-          </w:tcPr>
-          <w:p>
-            <w:pPr>
-              <w:bidi/>
-              <w:spacing w:after="0" w:line="276"/>
-              <w:jc w:val="center"/>
-            </w:pPr>
-            <w:r>
-              <w:rPr>
-                <w:rFonts w:ascii="Times New Roman" w:cs="David" w:eastAsia="David" w:hAnsi="Times New Roman"/>
-                <w:b/>
-                <w:bCs/>
-                <w:noProof/>
-                <w:sz w:val="22"/>
-                <w:szCs w:val="22"/>
-                <w:rtl/>
-                <w:lang w:val="en-US" w:eastAsia="en-US" w:bidi="he-IL"/>
-              </w:rPr>
-              <w:t xml:space="preserve">טווח הציון</w:t>
-            </w:r>
-          </w:p>
-        </w:tc>
-        <w:tc>
-          <w:tcPr>
-            <w:tcW w:type="dxa" w:w="1600"/>
-            <w:tcBorders>
-              <w:top w:val="single" w:color="000000" w:sz="4"/>
-              <w:left w:val="none" w:color="FFFFFF" w:sz="0"/>
-              <w:bottom w:val="single" w:color="000000" w:sz="4"/>
-              <w:right w:val="none" w:color="FFFFFF" w:sz="0"/>
-            </w:tcBorders>
-            <w:shd w:fill="EDEDED" w:color="auto" w:val="clear"/>
-            <w:tcMar>
-              <w:top w:type="dxa" w:w="50"/>
-              <w:left w:type="dxa" w:w="70"/>
-              <w:bottom w:type="dxa" w:w="50"/>
-              <w:right w:type="dxa" w:w="70"/>
-            </w:tcMar>
-          </w:tcPr>
-          <w:p>
-            <w:pPr>
-              <w:bidi/>
-              <w:spacing w:after="0" w:line="276"/>
-              <w:jc w:val="center"/>
-            </w:pPr>
-            <w:r>
-              <w:rPr>
-                <w:rFonts w:ascii="Times New Roman" w:cs="David" w:eastAsia="David" w:hAnsi="Times New Roman"/>
-                <w:b/>
-                <w:bCs/>
-                <w:noProof/>
-                <w:sz w:val="22"/>
-                <w:szCs w:val="22"/>
-                <w:rtl/>
-                <w:lang w:val="en-US" w:eastAsia="en-US" w:bidi="he-IL"/>
-              </w:rPr>
-              <w:t xml:space="preserve">α של קרונבך</w:t>
-            </w:r>
-          </w:p>
-        </w:tc>
-      </w:tr>
-      <w:tr>
-        <w:trPr>
-          <w:cantSplit/>
-          <w:tblHeader w:val="false"/>
-        </w:trPr>
-        <w:tc>
-          <w:tcPr>
-            <w:tcW w:type="dxa" w:w="3000"/>
-            <w:tcBorders>
-              <w:top w:val="none" w:color="FFFFFF" w:sz="0"/>
-              <w:left w:val="none" w:color="FFFFFF" w:sz="0"/>
-              <w:bottom w:val="none" w:color="FFFFFF" w:sz="0"/>
-              <w:right w:val="none" w:color="FFFFFF" w:sz="0"/>
-            </w:tcBorders>
-            <w:tcMar>
-              <w:top w:type="dxa" w:w="50"/>
-              <w:left w:type="dxa" w:w="70"/>
-              <w:bottom w:type="dxa" w:w="50"/>
-              <w:right w:type="dxa" w:w="70"/>
-            </w:tcMar>
-          </w:tcPr>
-          <w:p>
-            <w:pPr>
-              <w:bidi/>
-              <w:spacing w:after="0" w:line="276"/>
-              <w:jc w:val="right"/>
-            </w:pPr>
-            <w:r>
-              <w:rPr>
-                <w:rFonts w:ascii="Times New Roman" w:cs="David" w:eastAsia="David" w:hAnsi="Times New Roman"/>
-                <w:b w:val="false"/>
-                <w:bCs w:val="false"/>
-                <w:noProof/>
-                <w:sz w:val="22"/>
-                <w:szCs w:val="22"/>
-                <w:rtl/>
-                <w:lang w:val="en-US" w:eastAsia="en-US" w:bidi="he-IL"/>
-              </w:rPr>
-              <w:t xml:space="preserve">ישנוניות יומית</w:t>
-            </w:r>
-          </w:p>
-        </w:tc>
-        <w:tc>
-          <w:tcPr>
-            <w:tcW w:type="dxa" w:w="1800"/>
-            <w:tcBorders>
-              <w:top w:val="none" w:color="FFFFFF" w:sz="0"/>
-              <w:left w:val="none" w:color="FFFFFF" w:sz="0"/>
-              <w:bottom w:val="none" w:color="FFFFFF" w:sz="0"/>
-              <w:right w:val="none" w:color="FFFFFF" w:sz="0"/>
-            </w:tcBorders>
-            <w:tcMar>
-              <w:top w:type="dxa" w:w="50"/>
-              <w:left w:type="dxa" w:w="70"/>
-              <w:bottom w:type="dxa" w:w="50"/>
-              <w:right w:type="dxa" w:w="70"/>
-            </w:tcMar>
-          </w:tcPr>
-          <w:p>
-            <w:pPr>
-              <w:bidi/>
-              <w:spacing w:after="0" w:line="276"/>
-              <w:jc w:val="center"/>
-            </w:pPr>
-            <w:r>
-              <w:rPr>
-                <w:rFonts w:ascii="Times New Roman" w:cs="David" w:eastAsia="David" w:hAnsi="Times New Roman"/>
-                <w:b w:val="false"/>
-                <w:bCs w:val="false"/>
-                <w:noProof/>
-                <w:sz w:val="22"/>
-                <w:szCs w:val="22"/>
-                <w:rtl/>
-                <w:lang w:val="en-US" w:eastAsia="en-US" w:bidi="he-IL"/>
-              </w:rPr>
-              <w:t xml:space="preserve">8</w:t>
-            </w:r>
-          </w:p>
-        </w:tc>
-        <w:tc>
-          <w:tcPr>
-            <w:tcW w:type="dxa" w:w="2800"/>
-            <w:tcBorders>
-              <w:top w:val="none" w:color="FFFFFF" w:sz="0"/>
-              <w:left w:val="none" w:color="FFFFFF" w:sz="0"/>
-              <w:bottom w:val="none" w:color="FFFFFF" w:sz="0"/>
-              <w:right w:val="none" w:color="FFFFFF" w:sz="0"/>
-            </w:tcBorders>
-            <w:tcMar>
-              <w:top w:type="dxa" w:w="50"/>
-              <w:left w:type="dxa" w:w="70"/>
-              <w:bottom w:type="dxa" w:w="50"/>
-              <w:right w:type="dxa" w:w="70"/>
-            </w:tcMar>
-          </w:tcPr>
-          <w:p>
-            <w:pPr>
-              <w:bidi/>
-              <w:spacing w:after="0" w:line="276"/>
-              <w:jc w:val="center"/>
-            </w:pPr>
-            <w:r>
-              <w:rPr>
-                <w:rFonts w:ascii="Times New Roman" w:cs="David" w:eastAsia="David" w:hAnsi="Times New Roman"/>
-                <w:b w:val="false"/>
-                <w:bCs w:val="false"/>
-                <w:noProof/>
-                <w:sz w:val="22"/>
-                <w:szCs w:val="22"/>
-                <w:rtl/>
-                <w:lang w:val="en-US" w:eastAsia="en-US" w:bidi="he-IL"/>
-              </w:rPr>
-              <w:t xml:space="preserve">פריט 3 (ערנות)</w:t>
-            </w:r>
-          </w:p>
-        </w:tc>
-        <w:tc>
-          <w:tcPr>
-            <w:tcW w:type="dxa" w:w="1600"/>
-            <w:tcBorders>
-              <w:top w:val="none" w:color="FFFFFF" w:sz="0"/>
-              <w:left w:val="none" w:color="FFFFFF" w:sz="0"/>
-              <w:bottom w:val="none" w:color="FFFFFF" w:sz="0"/>
-              <w:right w:val="none" w:color="FFFFFF" w:sz="0"/>
-            </w:tcBorders>
-            <w:tcMar>
-              <w:top w:type="dxa" w:w="50"/>
-              <w:left w:type="dxa" w:w="70"/>
-              <w:bottom w:type="dxa" w:w="50"/>
-              <w:right w:type="dxa" w:w="70"/>
-            </w:tcMar>
-          </w:tcPr>
-          <w:p>
-            <w:pPr>
-              <w:bidi/>
-              <w:spacing w:after="0" w:line="276"/>
-              <w:jc w:val="center"/>
-            </w:pPr>
-            <w:r>
-              <w:rPr>
-                <w:rFonts w:ascii="Times New Roman" w:cs="David" w:eastAsia="David" w:hAnsi="Times New Roman"/>
-                <w:b w:val="false"/>
-                <w:bCs w:val="false"/>
-                <w:noProof/>
-                <w:sz w:val="22"/>
-                <w:szCs w:val="22"/>
-                <w:rtl/>
-                <w:lang w:val="en-US" w:eastAsia="en-US" w:bidi="he-IL"/>
-              </w:rPr>
-              <w:t xml:space="preserve">0-32</w:t>
-            </w:r>
-          </w:p>
-        </w:tc>
-        <w:tc>
-          <w:tcPr>
-            <w:tcW w:type="dxa" w:w="1600"/>
-            <w:tcBorders>
-              <w:top w:val="none" w:color="FFFFFF" w:sz="0"/>
-              <w:left w:val="none" w:color="FFFFFF" w:sz="0"/>
-              <w:bottom w:val="none" w:color="FFFFFF" w:sz="0"/>
-              <w:right w:val="none" w:color="FFFFFF" w:sz="0"/>
-            </w:tcBorders>
-            <w:tcMar>
-              <w:top w:type="dxa" w:w="50"/>
-              <w:left w:type="dxa" w:w="70"/>
-              <w:bottom w:type="dxa" w:w="50"/>
-              <w:right w:type="dxa" w:w="70"/>
-            </w:tcMar>
-          </w:tcPr>
-          <w:p>
-            <w:pPr>
-              <w:bidi/>
-              <w:spacing w:after="0" w:line="276"/>
-              <w:jc w:val="center"/>
-            </w:pPr>
-            <w:r>
-              <w:rPr>
-                <w:rFonts w:ascii="Times New Roman" w:cs="David" w:eastAsia="David" w:hAnsi="Times New Roman"/>
-                <w:b w:val="false"/>
-                <w:bCs w:val="false"/>
-                <w:noProof/>
-                <w:sz w:val="22"/>
-                <w:szCs w:val="22"/>
-                <w:rtl/>
-                <w:lang w:val="en-US" w:eastAsia="en-US" w:bidi="he-IL"/>
-              </w:rPr>
-              <w:t xml:space="preserve">0.85</w:t>
-            </w:r>
-          </w:p>
-        </w:tc>
-      </w:tr>
-      <w:tr>
-        <w:trPr>
-          <w:cantSplit/>
-          <w:tblHeader w:val="false"/>
-        </w:trPr>
-        <w:tc>
-          <w:tcPr>
-            <w:tcW w:type="dxa" w:w="3000"/>
-            <w:tcBorders>
-              <w:top w:val="none" w:color="FFFFFF" w:sz="0"/>
-              <w:left w:val="none" w:color="FFFFFF" w:sz="0"/>
-              <w:bottom w:val="single" w:color="000000" w:sz="4"/>
-              <w:right w:val="none" w:color="FFFFFF" w:sz="0"/>
-            </w:tcBorders>
-            <w:tcMar>
-              <w:top w:type="dxa" w:w="50"/>
-              <w:left w:type="dxa" w:w="70"/>
-              <w:bottom w:type="dxa" w:w="50"/>
-              <w:right w:type="dxa" w:w="70"/>
-            </w:tcMar>
-          </w:tcPr>
-          <w:p>
-            <w:pPr>
-              <w:bidi/>
-              <w:spacing w:after="0" w:line="276"/>
-              <w:jc w:val="right"/>
-            </w:pPr>
-            <w:r>
-              <w:rPr>
-                <w:rFonts w:ascii="Times New Roman" w:cs="David" w:eastAsia="David" w:hAnsi="Times New Roman"/>
-                <w:b w:val="false"/>
-                <w:bCs w:val="false"/>
-                <w:noProof/>
-                <w:sz w:val="22"/>
-                <w:szCs w:val="22"/>
-                <w:rtl/>
-                <w:lang w:val="en-US" w:eastAsia="en-US" w:bidi="he-IL"/>
-              </w:rPr>
-              <w:t xml:space="preserve">תפקוד יומי בלמידה</w:t>
-            </w:r>
-          </w:p>
-        </w:tc>
-        <w:tc>
-          <w:tcPr>
-            <w:tcW w:type="dxa" w:w="1800"/>
-            <w:tcBorders>
-              <w:top w:val="none" w:color="FFFFFF" w:sz="0"/>
-              <w:left w:val="none" w:color="FFFFFF" w:sz="0"/>
-              <w:bottom w:val="single" w:color="000000" w:sz="4"/>
-              <w:right w:val="none" w:color="FFFFFF" w:sz="0"/>
-            </w:tcBorders>
-            <w:tcMar>
-              <w:top w:type="dxa" w:w="50"/>
-              <w:left w:type="dxa" w:w="70"/>
-              <w:bottom w:type="dxa" w:w="50"/>
-              <w:right w:type="dxa" w:w="70"/>
-            </w:tcMar>
-          </w:tcPr>
-          <w:p>
-            <w:pPr>
-              <w:bidi/>
-              <w:spacing w:after="0" w:line="276"/>
-              <w:jc w:val="center"/>
-            </w:pPr>
-            <w:r>
-              <w:rPr>
-                <w:rFonts w:ascii="Times New Roman" w:cs="David" w:eastAsia="David" w:hAnsi="Times New Roman"/>
-                <w:b w:val="false"/>
-                <w:bCs w:val="false"/>
-                <w:noProof/>
-                <w:sz w:val="22"/>
-                <w:szCs w:val="22"/>
-                <w:rtl/>
-                <w:lang w:val="en-US" w:eastAsia="en-US" w:bidi="he-IL"/>
-              </w:rPr>
-              <w:t xml:space="preserve">5</w:t>
-            </w:r>
-          </w:p>
-        </w:tc>
-        <w:tc>
-          <w:tcPr>
-            <w:tcW w:type="dxa" w:w="2800"/>
-            <w:tcBorders>
-              <w:top w:val="none" w:color="FFFFFF" w:sz="0"/>
-              <w:left w:val="none" w:color="FFFFFF" w:sz="0"/>
-              <w:bottom w:val="single" w:color="000000" w:sz="4"/>
-              <w:right w:val="none" w:color="FFFFFF" w:sz="0"/>
-            </w:tcBorders>
-            <w:tcMar>
-              <w:top w:type="dxa" w:w="50"/>
-              <w:left w:type="dxa" w:w="70"/>
-              <w:bottom w:type="dxa" w:w="50"/>
-              <w:right w:type="dxa" w:w="70"/>
-            </w:tcMar>
-          </w:tcPr>
-          <w:p>
-            <w:pPr>
-              <w:bidi/>
-              <w:spacing w:after="0" w:line="276"/>
-              <w:jc w:val="center"/>
-            </w:pPr>
-            <w:r>
-              <w:rPr>
-                <w:rFonts w:ascii="Times New Roman" w:cs="David" w:eastAsia="David" w:hAnsi="Times New Roman"/>
-                <w:b w:val="false"/>
-                <w:bCs w:val="false"/>
-                <w:noProof/>
-                <w:sz w:val="22"/>
-                <w:szCs w:val="22"/>
-                <w:rtl/>
-                <w:lang w:val="en-US" w:eastAsia="en-US" w:bidi="he-IL"/>
-              </w:rPr>
-              <w:t xml:space="preserve">פריט 4 (עייפות בשיעורים)</w:t>
-            </w:r>
-          </w:p>
-        </w:tc>
-        <w:tc>
-          <w:tcPr>
-            <w:tcW w:type="dxa" w:w="1600"/>
-            <w:tcBorders>
-              <w:top w:val="none" w:color="FFFFFF" w:sz="0"/>
-              <w:left w:val="none" w:color="FFFFFF" w:sz="0"/>
-              <w:bottom w:val="single" w:color="000000" w:sz="4"/>
-              <w:right w:val="none" w:color="FFFFFF" w:sz="0"/>
-            </w:tcBorders>
-            <w:tcMar>
-              <w:top w:type="dxa" w:w="50"/>
-              <w:left w:type="dxa" w:w="70"/>
-              <w:bottom w:type="dxa" w:w="50"/>
-              <w:right w:type="dxa" w:w="70"/>
-            </w:tcMar>
-          </w:tcPr>
-          <w:p>
-            <w:pPr>
-              <w:bidi/>
-              <w:spacing w:after="0" w:line="276"/>
-              <w:jc w:val="center"/>
-            </w:pPr>
-            <w:r>
-              <w:rPr>
-                <w:rFonts w:ascii="Times New Roman" w:cs="David" w:eastAsia="David" w:hAnsi="Times New Roman"/>
-                <w:b w:val="false"/>
-                <w:bCs w:val="false"/>
-                <w:noProof/>
-                <w:sz w:val="22"/>
-                <w:szCs w:val="22"/>
-                <w:rtl/>
-                <w:lang w:val="en-US" w:eastAsia="en-US" w:bidi="he-IL"/>
-              </w:rPr>
-              <w:t xml:space="preserve">1-5</w:t>
-            </w:r>
-          </w:p>
-        </w:tc>
-        <w:tc>
-          <w:tcPr>
-            <w:tcW w:type="dxa" w:w="1600"/>
-            <w:tcBorders>
-              <w:top w:val="none" w:color="FFFFFF" w:sz="0"/>
-              <w:left w:val="none" w:color="FFFFFF" w:sz="0"/>
-              <w:bottom w:val="single" w:color="000000" w:sz="4"/>
-              <w:right w:val="none" w:color="FFFFFF" w:sz="0"/>
-            </w:tcBorders>
-            <w:tcMar>
-              <w:top w:type="dxa" w:w="50"/>
-              <w:left w:type="dxa" w:w="70"/>
-              <w:bottom w:type="dxa" w:w="50"/>
-              <w:right w:type="dxa" w:w="70"/>
-            </w:tcMar>
-          </w:tcPr>
-          <w:p>
-            <w:pPr>
-              <w:bidi/>
-              <w:spacing w:after="0" w:line="276"/>
-              <w:jc w:val="center"/>
-            </w:pPr>
-            <w:r>
-              <w:rPr>
-                <w:rFonts w:ascii="Times New Roman" w:cs="David" w:eastAsia="David" w:hAnsi="Times New Roman"/>
-                <w:b w:val="false"/>
-                <w:bCs w:val="false"/>
-                <w:noProof/>
-                <w:sz w:val="22"/>
-                <w:szCs w:val="22"/>
-                <w:rtl/>
-                <w:lang w:val="en-US" w:eastAsia="en-US" w:bidi="he-IL"/>
-              </w:rPr>
-              <w:t xml:space="preserve">0.63</w:t>
-            </w:r>
-          </w:p>
-        </w:tc>
-      </w:tr>
-    </w:tbl>
-    <w:p>
-      <w:pPr>
-        <w:bidi/>
-        <w:spacing w:after="120" w:line="276"/>
-        <w:jc w:val="both"/>
-      </w:pPr>
-      <w:r>
-        <w:rPr>
-          <w:rFonts w:ascii="Times New Roman" w:cs="David" w:eastAsia="David" w:hAnsi="Times New Roman"/>
-          <w:noProof/>
-          <w:sz w:val="20"/>
-          <w:szCs w:val="20"/>
-          <w:rtl/>
-          <w:lang w:val="en-US" w:eastAsia="en-US" w:bidi="he-IL"/>
-        </w:rPr>
-        <w:t xml:space="preserve">הערה. מקור: פלט Reliability, נספח ב'.</w:t>
-      </w:r>
-    </w:p>
-    <w:p>
-      <w:pPr>
-        <w:bidi/>
-        <w:spacing w:after="120" w:line="360"/>
-        <w:jc w:val="both"/>
-      </w:pPr>
-      <w:r>
-        <w:rPr>
-          <w:rFonts w:ascii="Times New Roman" w:cs="David" w:eastAsia="David" w:hAnsi="Times New Roman"/>
-          <w:noProof/>
-          <w:sz w:val="24"/>
-          <w:szCs w:val="24"/>
-          <w:rtl/>
-          <w:lang w:val="en-US" w:eastAsia="en-US" w:bidi="he-IL"/>
-        </w:rPr>
-        <w:t xml:space="preserve">מלוח 2 ניתן ללמוד כי סולם הישנוניות היומית מהימן (α = 0.85) ומתאים לשימוש כציון כולל. מהימנות סולם התפקוד היומי בלמידה (α = 0.63) נמוכה מהסף המקובל של 0.70, ערך שאינו חריג לסולם קצר שחובר לצורך המחקר, אך הוא מחייב זהירות בפירוש הממצאים הנוגעים אליו. שני הסולמות שימשו כציון כולל בניתוחים שלהלן.</w:t>
+        <w:t xml:space="preserve">סולם הישנוניות היומית (8 פריטים, טווח 0 עד 32) נמצא מהימן (α = 0.85) ומתאים לשימוש כציון כולל. מהימנות סולם התפקוד היומי בלמידה (5 פריטים, α = 0.63) נמוכה מהסף המקובל של 0.70, ערך שאינו חריג לסולם קצר שחובר לצורך המחקר, אך הוא מחייב זהירות בפירוש הממצאים הנוגעים אליו. שני הסולמות שימשו כציון כולל בניתוחים שלהלן (פלט Reliability, נספח ב').</w:t>
       </w:r>
     </w:p>
     <w:p>
@@ -6519,7 +5863,7 @@
           <w:rtl/>
           <w:lang w:val="en-US" w:eastAsia="en-US" w:bidi="he-IL"/>
         </w:rPr>
-        <w:t xml:space="preserve">לוח 3 מציג את הממוצעים וסטיות התקן של משתני שלוש ההתנהגויות ושל התפקוד הלימודי בשתי הקבוצות.</w:t>
+        <w:t xml:space="preserve">לוח 2 מציג את הממוצעים וסטיות התקן של משתני שלוש ההתנהגויות ושל התפקוד הלימודי בשתי הקבוצות.</w:t>
       </w:r>
     </w:p>
     <w:p>
@@ -6540,7 +5884,7 @@
           <w:rtl/>
           <w:lang w:val="en-US" w:eastAsia="en-US" w:bidi="he-IL"/>
         </w:rPr>
-        <w:t xml:space="preserve">לוח 3: סטטיסטיקה תיאורית של משתני המחקר לפי קבוצה</w:t>
+        <w:t xml:space="preserve">לוח 2: סטטיסטיקה תיאורית של משתני המחקר לפי קבוצה</w:t>
       </w:r>
     </w:p>
     <w:tbl>
@@ -8756,7 +8100,7 @@
           <w:rtl/>
           <w:lang w:val="en-US" w:eastAsia="en-US" w:bidi="he-IL"/>
         </w:rPr>
-        <w:t xml:space="preserve">מלוח 3 עולה כי תלמידים עם לקויות למידה דיווחו על ממוצע של 4.09 שעות מסך פנאי ביום, 3.60 ביום חול ו-5.31 בסוף השבוע, פי שניים מההמלצה של שעתיים. 52.5 אחוזים מהם דיווחו על ארבע שעות ביום ומעלה ו-10 אחוזים על שש שעות ומעלה. 52.5 אחוזים מחזיקים טלפון או מסך אחר בחדר השינה בלילה, ו-72.5 אחוזים משתמשים במסך בחצי השעה שלפני השינה כמעט תמיד או תמיד. שעת השינה הממוצעת ביום חול הייתה 23:04 ומשך השינה הממוצע 7.87 שעות. 55 אחוזים מתלמידי קבוצת המחקר ישנים פחות משמונה שעות בלילה, לעומת 36 אחוזים בקבוצת ההשוואה, ובסוף השבוע שעת השינה מתאחרת בממוצע ב-1.77 שעות. הפעילות הגופנית מועטה: ממוצע של 2.60 ימים בשבוע עם 60 דקות פעילות, 27.5 אחוזים דיווחו על יום אחד לכל היותר, ורק 15 אחוזים על חמישה ימים ומעלה.</w:t>
+        <w:t xml:space="preserve">מלוח 2 עולה כי תלמידים עם לקויות למידה דיווחו על ממוצע של 4.09 שעות מסך פנאי ביום, 3.60 ביום חול ו-5.31 בסוף השבוע, פי שניים מההמלצה של שעתיים. 52.5 אחוזים מחזיקים טלפון או מסך אחר בחדר השינה בלילה, ו-72.5 אחוזים משתמשים במסך בחצי השעה שלפני השינה כמעט תמיד או תמיד. שעת השינה הממוצעת ביום חול הייתה 23:04 ומשך השינה הממוצע 7.87 שעות. 55 אחוזים מתלמידי קבוצת המחקר ישנים פחות משמונה שעות בלילה, לעומת 36 אחוזים בקבוצת ההשוואה, ובסוף השבוע שעת השינה מתאחרת בממוצע ב-1.77 שעות. הפעילות הגופנית מועטה: ממוצע של 2.60 ימים בשבוע עם 60 דקות פעילות, 27.5 אחוזים דיווחו על יום אחד לכל היותר, ורק 15 אחוזים על חמישה ימים ומעלה.</w:t>
       </w:r>
     </w:p>
     <w:p>
@@ -8774,1302 +8118,7 @@
           <w:rtl/>
           <w:lang w:val="en-US" w:eastAsia="en-US" w:bidi="he-IL"/>
         </w:rPr>
-        <w:t xml:space="preserve">לוח 4 ותרשים 1 מציגים את שיעורי העמידה בשלוש ההמלצות ואת התפלגות מספר ההמלצות שמתקיימות.</w:t>
-      </w:r>
-    </w:p>
-    <w:p>
-      <w:pPr>
-        <w:keepNext/>
-        <w:bidi/>
-        <w:spacing w:after="80" w:before="200" w:line="360"/>
-        <w:jc w:val="right"/>
-      </w:pPr>
-      <w:r>
-        <w:rPr>
-          <w:rFonts w:ascii="Times New Roman" w:cs="David" w:eastAsia="David" w:hAnsi="Times New Roman"/>
-          <w:b/>
-          <w:bCs/>
-          <w:noProof/>
-          <w:sz w:val="24"/>
-          <w:szCs w:val="24"/>
-          <w:rtl/>
-          <w:lang w:val="en-US" w:eastAsia="en-US" w:bidi="he-IL"/>
-        </w:rPr>
-        <w:t xml:space="preserve">לוח 4: שיעור העמידה בהמלצות לפי קבוצה</w:t>
-      </w:r>
-    </w:p>
-    <w:tbl>
-      <w:tblPr>
-        <w:bidiVisual/>
-        <w:tblW w:type="dxa" w:w="10800"/>
-        <w:tblBorders>
-          <w:top w:val="single" w:color="000000" w:sz="4"/>
-          <w:left w:val="none" w:color="FFFFFF" w:sz="0"/>
-          <w:bottom w:val="single" w:color="000000" w:sz="4"/>
-          <w:right w:val="none" w:color="FFFFFF" w:sz="0"/>
-          <w:insideH w:val="none" w:color="FFFFFF" w:sz="0"/>
-          <w:insideV w:val="none" w:color="FFFFFF" w:sz="0"/>
-        </w:tblBorders>
-      </w:tblPr>
-      <w:tblGrid>
-        <w:gridCol w:w="4200"/>
-        <w:gridCol w:w="2400"/>
-        <w:gridCol w:w="2400"/>
-        <w:gridCol w:w="1800"/>
-      </w:tblGrid>
-      <w:tr>
-        <w:trPr>
-          <w:cantSplit/>
-          <w:tblHeader/>
-        </w:trPr>
-        <w:tc>
-          <w:tcPr>
-            <w:tcW w:type="dxa" w:w="4200"/>
-            <w:tcBorders>
-              <w:top w:val="single" w:color="000000" w:sz="4"/>
-              <w:left w:val="none" w:color="FFFFFF" w:sz="0"/>
-              <w:bottom w:val="single" w:color="000000" w:sz="4"/>
-              <w:right w:val="none" w:color="FFFFFF" w:sz="0"/>
-            </w:tcBorders>
-            <w:shd w:fill="EDEDED" w:color="auto" w:val="clear"/>
-            <w:tcMar>
-              <w:top w:type="dxa" w:w="50"/>
-              <w:left w:type="dxa" w:w="70"/>
-              <w:bottom w:type="dxa" w:w="50"/>
-              <w:right w:type="dxa" w:w="70"/>
-            </w:tcMar>
-          </w:tcPr>
-          <w:p>
-            <w:pPr>
-              <w:bidi/>
-              <w:spacing w:after="0" w:line="276"/>
-              <w:jc w:val="right"/>
-            </w:pPr>
-            <w:r>
-              <w:rPr>
-                <w:rFonts w:ascii="Times New Roman" w:cs="David" w:eastAsia="David" w:hAnsi="Times New Roman"/>
-                <w:b/>
-                <w:bCs/>
-                <w:noProof/>
-                <w:sz w:val="22"/>
-                <w:szCs w:val="22"/>
-                <w:rtl/>
-                <w:lang w:val="en-US" w:eastAsia="en-US" w:bidi="he-IL"/>
-              </w:rPr>
-              <w:t xml:space="preserve">המלצה</w:t>
-            </w:r>
-          </w:p>
-        </w:tc>
-        <w:tc>
-          <w:tcPr>
-            <w:tcW w:type="dxa" w:w="2400"/>
-            <w:tcBorders>
-              <w:top w:val="single" w:color="000000" w:sz="4"/>
-              <w:left w:val="none" w:color="FFFFFF" w:sz="0"/>
-              <w:bottom w:val="single" w:color="000000" w:sz="4"/>
-              <w:right w:val="none" w:color="FFFFFF" w:sz="0"/>
-            </w:tcBorders>
-            <w:shd w:fill="EDEDED" w:color="auto" w:val="clear"/>
-            <w:tcMar>
-              <w:top w:type="dxa" w:w="50"/>
-              <w:left w:type="dxa" w:w="70"/>
-              <w:bottom w:type="dxa" w:w="50"/>
-              <w:right w:type="dxa" w:w="70"/>
-            </w:tcMar>
-          </w:tcPr>
-          <w:p>
-            <w:pPr>
-              <w:bidi/>
-              <w:spacing w:after="0" w:line="276"/>
-              <w:jc w:val="center"/>
-            </w:pPr>
-            <w:r>
-              <w:rPr>
-                <w:rFonts w:ascii="Times New Roman" w:cs="David" w:eastAsia="David" w:hAnsi="Times New Roman"/>
-                <w:b/>
-                <w:bCs/>
-                <w:noProof/>
-                <w:sz w:val="22"/>
-                <w:szCs w:val="22"/>
-                <w:rtl/>
-                <w:lang w:val="en-US" w:eastAsia="en-US" w:bidi="he-IL"/>
-              </w:rPr>
-              <w:t xml:space="preserve">עם לקות למידה (n = 40)</w:t>
-            </w:r>
-          </w:p>
-        </w:tc>
-        <w:tc>
-          <w:tcPr>
-            <w:tcW w:type="dxa" w:w="2400"/>
-            <w:tcBorders>
-              <w:top w:val="single" w:color="000000" w:sz="4"/>
-              <w:left w:val="none" w:color="FFFFFF" w:sz="0"/>
-              <w:bottom w:val="single" w:color="000000" w:sz="4"/>
-              <w:right w:val="none" w:color="FFFFFF" w:sz="0"/>
-            </w:tcBorders>
-            <w:shd w:fill="EDEDED" w:color="auto" w:val="clear"/>
-            <w:tcMar>
-              <w:top w:type="dxa" w:w="50"/>
-              <w:left w:type="dxa" w:w="70"/>
-              <w:bottom w:type="dxa" w:w="50"/>
-              <w:right w:type="dxa" w:w="70"/>
-            </w:tcMar>
-          </w:tcPr>
-          <w:p>
-            <w:pPr>
-              <w:bidi/>
-              <w:spacing w:after="0" w:line="276"/>
-              <w:jc w:val="center"/>
-            </w:pPr>
-            <w:r>
-              <w:rPr>
-                <w:rFonts w:ascii="Times New Roman" w:cs="David" w:eastAsia="David" w:hAnsi="Times New Roman"/>
-                <w:b/>
-                <w:bCs/>
-                <w:noProof/>
-                <w:sz w:val="22"/>
-                <w:szCs w:val="22"/>
-                <w:rtl/>
-                <w:lang w:val="en-US" w:eastAsia="en-US" w:bidi="he-IL"/>
-              </w:rPr>
-              <w:t xml:space="preserve">ללא לקות למידה (n = 25)</w:t>
-            </w:r>
-          </w:p>
-        </w:tc>
-        <w:tc>
-          <w:tcPr>
-            <w:tcW w:type="dxa" w:w="1800"/>
-            <w:tcBorders>
-              <w:top w:val="single" w:color="000000" w:sz="4"/>
-              <w:left w:val="none" w:color="FFFFFF" w:sz="0"/>
-              <w:bottom w:val="single" w:color="000000" w:sz="4"/>
-              <w:right w:val="none" w:color="FFFFFF" w:sz="0"/>
-            </w:tcBorders>
-            <w:shd w:fill="EDEDED" w:color="auto" w:val="clear"/>
-            <w:tcMar>
-              <w:top w:type="dxa" w:w="50"/>
-              <w:left w:type="dxa" w:w="70"/>
-              <w:bottom w:type="dxa" w:w="50"/>
-              <w:right w:type="dxa" w:w="70"/>
-            </w:tcMar>
-          </w:tcPr>
-          <w:p>
-            <w:pPr>
-              <w:bidi/>
-              <w:spacing w:after="0" w:line="276"/>
-              <w:jc w:val="center"/>
-            </w:pPr>
-            <w:r>
-              <w:rPr>
-                <w:rFonts w:ascii="Times New Roman" w:cs="David" w:eastAsia="David" w:hAnsi="Times New Roman"/>
-                <w:b/>
-                <w:bCs/>
-                <w:noProof/>
-                <w:sz w:val="22"/>
-                <w:szCs w:val="22"/>
-                <w:rtl/>
-                <w:lang w:val="en-US" w:eastAsia="en-US" w:bidi="he-IL"/>
-              </w:rPr>
-              <w:t xml:space="preserve">סך הכול (N = 65)</w:t>
-            </w:r>
-          </w:p>
-        </w:tc>
-      </w:tr>
-      <w:tr>
-        <w:trPr>
-          <w:cantSplit/>
-          <w:tblHeader w:val="false"/>
-        </w:trPr>
-        <w:tc>
-          <w:tcPr>
-            <w:tcW w:type="dxa" w:w="4200"/>
-            <w:tcBorders>
-              <w:top w:val="none" w:color="FFFFFF" w:sz="0"/>
-              <w:left w:val="none" w:color="FFFFFF" w:sz="0"/>
-              <w:bottom w:val="none" w:color="FFFFFF" w:sz="0"/>
-              <w:right w:val="none" w:color="FFFFFF" w:sz="0"/>
-            </w:tcBorders>
-            <w:tcMar>
-              <w:top w:type="dxa" w:w="50"/>
-              <w:left w:type="dxa" w:w="70"/>
-              <w:bottom w:type="dxa" w:w="50"/>
-              <w:right w:type="dxa" w:w="70"/>
-            </w:tcMar>
-          </w:tcPr>
-          <w:p>
-            <w:pPr>
-              <w:bidi/>
-              <w:spacing w:after="0" w:line="276"/>
-              <w:jc w:val="right"/>
-            </w:pPr>
-            <w:r>
-              <w:rPr>
-                <w:rFonts w:ascii="Times New Roman" w:cs="David" w:eastAsia="David" w:hAnsi="Times New Roman"/>
-                <w:b w:val="false"/>
-                <w:bCs w:val="false"/>
-                <w:noProof/>
-                <w:sz w:val="22"/>
-                <w:szCs w:val="22"/>
-                <w:rtl/>
-                <w:lang w:val="en-US" w:eastAsia="en-US" w:bidi="he-IL"/>
-              </w:rPr>
-              <w:t xml:space="preserve">זמן מסך פנאי עד שעתיים ביום</w:t>
-            </w:r>
-          </w:p>
-        </w:tc>
-        <w:tc>
-          <w:tcPr>
-            <w:tcW w:type="dxa" w:w="2400"/>
-            <w:tcBorders>
-              <w:top w:val="none" w:color="FFFFFF" w:sz="0"/>
-              <w:left w:val="none" w:color="FFFFFF" w:sz="0"/>
-              <w:bottom w:val="none" w:color="FFFFFF" w:sz="0"/>
-              <w:right w:val="none" w:color="FFFFFF" w:sz="0"/>
-            </w:tcBorders>
-            <w:tcMar>
-              <w:top w:type="dxa" w:w="50"/>
-              <w:left w:type="dxa" w:w="70"/>
-              <w:bottom w:type="dxa" w:w="50"/>
-              <w:right w:type="dxa" w:w="70"/>
-            </w:tcMar>
-          </w:tcPr>
-          <w:p>
-            <w:pPr>
-              <w:bidi/>
-              <w:spacing w:after="0" w:line="276"/>
-              <w:jc w:val="center"/>
-            </w:pPr>
-            <w:r>
-              <w:rPr>
-                <w:rFonts w:ascii="Times New Roman" w:cs="David" w:eastAsia="David" w:hAnsi="Times New Roman"/>
-                <w:b w:val="false"/>
-                <w:bCs w:val="false"/>
-                <w:noProof/>
-                <w:sz w:val="22"/>
-                <w:szCs w:val="22"/>
-                <w:rtl/>
-                <w:lang w:val="en-US" w:eastAsia="en-US" w:bidi="he-IL"/>
-              </w:rPr>
-              <w:t xml:space="preserve">6 (15.0%)</w:t>
-            </w:r>
-          </w:p>
-        </w:tc>
-        <w:tc>
-          <w:tcPr>
-            <w:tcW w:type="dxa" w:w="2400"/>
-            <w:tcBorders>
-              <w:top w:val="none" w:color="FFFFFF" w:sz="0"/>
-              <w:left w:val="none" w:color="FFFFFF" w:sz="0"/>
-              <w:bottom w:val="none" w:color="FFFFFF" w:sz="0"/>
-              <w:right w:val="none" w:color="FFFFFF" w:sz="0"/>
-            </w:tcBorders>
-            <w:tcMar>
-              <w:top w:type="dxa" w:w="50"/>
-              <w:left w:type="dxa" w:w="70"/>
-              <w:bottom w:type="dxa" w:w="50"/>
-              <w:right w:type="dxa" w:w="70"/>
-            </w:tcMar>
-          </w:tcPr>
-          <w:p>
-            <w:pPr>
-              <w:bidi/>
-              <w:spacing w:after="0" w:line="276"/>
-              <w:jc w:val="center"/>
-            </w:pPr>
-            <w:r>
-              <w:rPr>
-                <w:rFonts w:ascii="Times New Roman" w:cs="David" w:eastAsia="David" w:hAnsi="Times New Roman"/>
-                <w:b w:val="false"/>
-                <w:bCs w:val="false"/>
-                <w:noProof/>
-                <w:sz w:val="22"/>
-                <w:szCs w:val="22"/>
-                <w:rtl/>
-                <w:lang w:val="en-US" w:eastAsia="en-US" w:bidi="he-IL"/>
-              </w:rPr>
-              <w:t xml:space="preserve">3 (12.0%)</w:t>
-            </w:r>
-          </w:p>
-        </w:tc>
-        <w:tc>
-          <w:tcPr>
-            <w:tcW w:type="dxa" w:w="1800"/>
-            <w:tcBorders>
-              <w:top w:val="none" w:color="FFFFFF" w:sz="0"/>
-              <w:left w:val="none" w:color="FFFFFF" w:sz="0"/>
-              <w:bottom w:val="none" w:color="FFFFFF" w:sz="0"/>
-              <w:right w:val="none" w:color="FFFFFF" w:sz="0"/>
-            </w:tcBorders>
-            <w:tcMar>
-              <w:top w:type="dxa" w:w="50"/>
-              <w:left w:type="dxa" w:w="70"/>
-              <w:bottom w:type="dxa" w:w="50"/>
-              <w:right w:type="dxa" w:w="70"/>
-            </w:tcMar>
-          </w:tcPr>
-          <w:p>
-            <w:pPr>
-              <w:bidi/>
-              <w:spacing w:after="0" w:line="276"/>
-              <w:jc w:val="center"/>
-            </w:pPr>
-            <w:r>
-              <w:rPr>
-                <w:rFonts w:ascii="Times New Roman" w:cs="David" w:eastAsia="David" w:hAnsi="Times New Roman"/>
-                <w:b w:val="false"/>
-                <w:bCs w:val="false"/>
-                <w:noProof/>
-                <w:sz w:val="22"/>
-                <w:szCs w:val="22"/>
-                <w:rtl/>
-                <w:lang w:val="en-US" w:eastAsia="en-US" w:bidi="he-IL"/>
-              </w:rPr>
-              <w:t xml:space="preserve">9 (13.8%)</w:t>
-            </w:r>
-          </w:p>
-        </w:tc>
-      </w:tr>
-      <w:tr>
-        <w:trPr>
-          <w:cantSplit/>
-          <w:tblHeader w:val="false"/>
-        </w:trPr>
-        <w:tc>
-          <w:tcPr>
-            <w:tcW w:type="dxa" w:w="4200"/>
-            <w:tcBorders>
-              <w:top w:val="none" w:color="FFFFFF" w:sz="0"/>
-              <w:left w:val="none" w:color="FFFFFF" w:sz="0"/>
-              <w:bottom w:val="none" w:color="FFFFFF" w:sz="0"/>
-              <w:right w:val="none" w:color="FFFFFF" w:sz="0"/>
-            </w:tcBorders>
-            <w:tcMar>
-              <w:top w:type="dxa" w:w="50"/>
-              <w:left w:type="dxa" w:w="70"/>
-              <w:bottom w:type="dxa" w:w="50"/>
-              <w:right w:type="dxa" w:w="70"/>
-            </w:tcMar>
-          </w:tcPr>
-          <w:p>
-            <w:pPr>
-              <w:bidi/>
-              <w:spacing w:after="0" w:line="276"/>
-              <w:jc w:val="right"/>
-            </w:pPr>
-            <w:r>
-              <w:rPr>
-                <w:rFonts w:ascii="Times New Roman" w:cs="David" w:eastAsia="David" w:hAnsi="Times New Roman"/>
-                <w:b w:val="false"/>
-                <w:bCs w:val="false"/>
-                <w:noProof/>
-                <w:sz w:val="22"/>
-                <w:szCs w:val="22"/>
-                <w:rtl/>
-                <w:lang w:val="en-US" w:eastAsia="en-US" w:bidi="he-IL"/>
-              </w:rPr>
-              <w:t xml:space="preserve">משך שינה לפי הגיל (9-11 / 8-10 שעות)</w:t>
-            </w:r>
-          </w:p>
-        </w:tc>
-        <w:tc>
-          <w:tcPr>
-            <w:tcW w:type="dxa" w:w="2400"/>
-            <w:tcBorders>
-              <w:top w:val="none" w:color="FFFFFF" w:sz="0"/>
-              <w:left w:val="none" w:color="FFFFFF" w:sz="0"/>
-              <w:bottom w:val="none" w:color="FFFFFF" w:sz="0"/>
-              <w:right w:val="none" w:color="FFFFFF" w:sz="0"/>
-            </w:tcBorders>
-            <w:tcMar>
-              <w:top w:type="dxa" w:w="50"/>
-              <w:left w:type="dxa" w:w="70"/>
-              <w:bottom w:type="dxa" w:w="50"/>
-              <w:right w:type="dxa" w:w="70"/>
-            </w:tcMar>
-          </w:tcPr>
-          <w:p>
-            <w:pPr>
-              <w:bidi/>
-              <w:spacing w:after="0" w:line="276"/>
-              <w:jc w:val="center"/>
-            </w:pPr>
-            <w:r>
-              <w:rPr>
-                <w:rFonts w:ascii="Times New Roman" w:cs="David" w:eastAsia="David" w:hAnsi="Times New Roman"/>
-                <w:b w:val="false"/>
-                <w:bCs w:val="false"/>
-                <w:noProof/>
-                <w:sz w:val="22"/>
-                <w:szCs w:val="22"/>
-                <w:rtl/>
-                <w:lang w:val="en-US" w:eastAsia="en-US" w:bidi="he-IL"/>
-              </w:rPr>
-              <w:t xml:space="preserve">12 (30.0%)</w:t>
-            </w:r>
-          </w:p>
-        </w:tc>
-        <w:tc>
-          <w:tcPr>
-            <w:tcW w:type="dxa" w:w="2400"/>
-            <w:tcBorders>
-              <w:top w:val="none" w:color="FFFFFF" w:sz="0"/>
-              <w:left w:val="none" w:color="FFFFFF" w:sz="0"/>
-              <w:bottom w:val="none" w:color="FFFFFF" w:sz="0"/>
-              <w:right w:val="none" w:color="FFFFFF" w:sz="0"/>
-            </w:tcBorders>
-            <w:tcMar>
-              <w:top w:type="dxa" w:w="50"/>
-              <w:left w:type="dxa" w:w="70"/>
-              <w:bottom w:type="dxa" w:w="50"/>
-              <w:right w:type="dxa" w:w="70"/>
-            </w:tcMar>
-          </w:tcPr>
-          <w:p>
-            <w:pPr>
-              <w:bidi/>
-              <w:spacing w:after="0" w:line="276"/>
-              <w:jc w:val="center"/>
-            </w:pPr>
-            <w:r>
-              <w:rPr>
-                <w:rFonts w:ascii="Times New Roman" w:cs="David" w:eastAsia="David" w:hAnsi="Times New Roman"/>
-                <w:b w:val="false"/>
-                <w:bCs w:val="false"/>
-                <w:noProof/>
-                <w:sz w:val="22"/>
-                <w:szCs w:val="22"/>
-                <w:rtl/>
-                <w:lang w:val="en-US" w:eastAsia="en-US" w:bidi="he-IL"/>
-              </w:rPr>
-              <w:t xml:space="preserve">14 (56.0%)</w:t>
-            </w:r>
-          </w:p>
-        </w:tc>
-        <w:tc>
-          <w:tcPr>
-            <w:tcW w:type="dxa" w:w="1800"/>
-            <w:tcBorders>
-              <w:top w:val="none" w:color="FFFFFF" w:sz="0"/>
-              <w:left w:val="none" w:color="FFFFFF" w:sz="0"/>
-              <w:bottom w:val="none" w:color="FFFFFF" w:sz="0"/>
-              <w:right w:val="none" w:color="FFFFFF" w:sz="0"/>
-            </w:tcBorders>
-            <w:tcMar>
-              <w:top w:type="dxa" w:w="50"/>
-              <w:left w:type="dxa" w:w="70"/>
-              <w:bottom w:type="dxa" w:w="50"/>
-              <w:right w:type="dxa" w:w="70"/>
-            </w:tcMar>
-          </w:tcPr>
-          <w:p>
-            <w:pPr>
-              <w:bidi/>
-              <w:spacing w:after="0" w:line="276"/>
-              <w:jc w:val="center"/>
-            </w:pPr>
-            <w:r>
-              <w:rPr>
-                <w:rFonts w:ascii="Times New Roman" w:cs="David" w:eastAsia="David" w:hAnsi="Times New Roman"/>
-                <w:b w:val="false"/>
-                <w:bCs w:val="false"/>
-                <w:noProof/>
-                <w:sz w:val="22"/>
-                <w:szCs w:val="22"/>
-                <w:rtl/>
-                <w:lang w:val="en-US" w:eastAsia="en-US" w:bidi="he-IL"/>
-              </w:rPr>
-              <w:t xml:space="preserve">26 (40.0%)</w:t>
-            </w:r>
-          </w:p>
-        </w:tc>
-      </w:tr>
-      <w:tr>
-        <w:trPr>
-          <w:cantSplit/>
-          <w:tblHeader w:val="false"/>
-        </w:trPr>
-        <w:tc>
-          <w:tcPr>
-            <w:tcW w:type="dxa" w:w="4200"/>
-            <w:tcBorders>
-              <w:top w:val="none" w:color="FFFFFF" w:sz="0"/>
-              <w:left w:val="none" w:color="FFFFFF" w:sz="0"/>
-              <w:bottom w:val="none" w:color="FFFFFF" w:sz="0"/>
-              <w:right w:val="none" w:color="FFFFFF" w:sz="0"/>
-            </w:tcBorders>
-            <w:tcMar>
-              <w:top w:type="dxa" w:w="50"/>
-              <w:left w:type="dxa" w:w="70"/>
-              <w:bottom w:type="dxa" w:w="50"/>
-              <w:right w:type="dxa" w:w="70"/>
-            </w:tcMar>
-          </w:tcPr>
-          <w:p>
-            <w:pPr>
-              <w:bidi/>
-              <w:spacing w:after="0" w:line="276"/>
-              <w:jc w:val="right"/>
-            </w:pPr>
-            <w:r>
-              <w:rPr>
-                <w:rFonts w:ascii="Times New Roman" w:cs="David" w:eastAsia="David" w:hAnsi="Times New Roman"/>
-                <w:b w:val="false"/>
-                <w:bCs w:val="false"/>
-                <w:noProof/>
-                <w:sz w:val="22"/>
-                <w:szCs w:val="22"/>
-                <w:rtl/>
-                <w:lang w:val="en-US" w:eastAsia="en-US" w:bidi="he-IL"/>
-              </w:rPr>
-              <w:t xml:space="preserve">60 דקות פעילות גופנית בכל יום</w:t>
-            </w:r>
-          </w:p>
-        </w:tc>
-        <w:tc>
-          <w:tcPr>
-            <w:tcW w:type="dxa" w:w="2400"/>
-            <w:tcBorders>
-              <w:top w:val="none" w:color="FFFFFF" w:sz="0"/>
-              <w:left w:val="none" w:color="FFFFFF" w:sz="0"/>
-              <w:bottom w:val="none" w:color="FFFFFF" w:sz="0"/>
-              <w:right w:val="none" w:color="FFFFFF" w:sz="0"/>
-            </w:tcBorders>
-            <w:tcMar>
-              <w:top w:type="dxa" w:w="50"/>
-              <w:left w:type="dxa" w:w="70"/>
-              <w:bottom w:type="dxa" w:w="50"/>
-              <w:right w:type="dxa" w:w="70"/>
-            </w:tcMar>
-          </w:tcPr>
-          <w:p>
-            <w:pPr>
-              <w:bidi/>
-              <w:spacing w:after="0" w:line="276"/>
-              <w:jc w:val="center"/>
-            </w:pPr>
-            <w:r>
-              <w:rPr>
-                <w:rFonts w:ascii="Times New Roman" w:cs="David" w:eastAsia="David" w:hAnsi="Times New Roman"/>
-                <w:b w:val="false"/>
-                <w:bCs w:val="false"/>
-                <w:noProof/>
-                <w:sz w:val="22"/>
-                <w:szCs w:val="22"/>
-                <w:rtl/>
-                <w:lang w:val="en-US" w:eastAsia="en-US" w:bidi="he-IL"/>
-              </w:rPr>
-              <w:t xml:space="preserve">1 (2.5%)</w:t>
-            </w:r>
-          </w:p>
-        </w:tc>
-        <w:tc>
-          <w:tcPr>
-            <w:tcW w:type="dxa" w:w="2400"/>
-            <w:tcBorders>
-              <w:top w:val="none" w:color="FFFFFF" w:sz="0"/>
-              <w:left w:val="none" w:color="FFFFFF" w:sz="0"/>
-              <w:bottom w:val="none" w:color="FFFFFF" w:sz="0"/>
-              <w:right w:val="none" w:color="FFFFFF" w:sz="0"/>
-            </w:tcBorders>
-            <w:tcMar>
-              <w:top w:type="dxa" w:w="50"/>
-              <w:left w:type="dxa" w:w="70"/>
-              <w:bottom w:type="dxa" w:w="50"/>
-              <w:right w:type="dxa" w:w="70"/>
-            </w:tcMar>
-          </w:tcPr>
-          <w:p>
-            <w:pPr>
-              <w:bidi/>
-              <w:spacing w:after="0" w:line="276"/>
-              <w:jc w:val="center"/>
-            </w:pPr>
-            <w:r>
-              <w:rPr>
-                <w:rFonts w:ascii="Times New Roman" w:cs="David" w:eastAsia="David" w:hAnsi="Times New Roman"/>
-                <w:b w:val="false"/>
-                <w:bCs w:val="false"/>
-                <w:noProof/>
-                <w:sz w:val="22"/>
-                <w:szCs w:val="22"/>
-                <w:rtl/>
-                <w:lang w:val="en-US" w:eastAsia="en-US" w:bidi="he-IL"/>
-              </w:rPr>
-              <w:t xml:space="preserve">1 (4.0%)</w:t>
-            </w:r>
-          </w:p>
-        </w:tc>
-        <w:tc>
-          <w:tcPr>
-            <w:tcW w:type="dxa" w:w="1800"/>
-            <w:tcBorders>
-              <w:top w:val="none" w:color="FFFFFF" w:sz="0"/>
-              <w:left w:val="none" w:color="FFFFFF" w:sz="0"/>
-              <w:bottom w:val="none" w:color="FFFFFF" w:sz="0"/>
-              <w:right w:val="none" w:color="FFFFFF" w:sz="0"/>
-            </w:tcBorders>
-            <w:tcMar>
-              <w:top w:type="dxa" w:w="50"/>
-              <w:left w:type="dxa" w:w="70"/>
-              <w:bottom w:type="dxa" w:w="50"/>
-              <w:right w:type="dxa" w:w="70"/>
-            </w:tcMar>
-          </w:tcPr>
-          <w:p>
-            <w:pPr>
-              <w:bidi/>
-              <w:spacing w:after="0" w:line="276"/>
-              <w:jc w:val="center"/>
-            </w:pPr>
-            <w:r>
-              <w:rPr>
-                <w:rFonts w:ascii="Times New Roman" w:cs="David" w:eastAsia="David" w:hAnsi="Times New Roman"/>
-                <w:b w:val="false"/>
-                <w:bCs w:val="false"/>
-                <w:noProof/>
-                <w:sz w:val="22"/>
-                <w:szCs w:val="22"/>
-                <w:rtl/>
-                <w:lang w:val="en-US" w:eastAsia="en-US" w:bidi="he-IL"/>
-              </w:rPr>
-              <w:t xml:space="preserve">2 (3.1%)</w:t>
-            </w:r>
-          </w:p>
-        </w:tc>
-      </w:tr>
-      <w:tr>
-        <w:trPr>
-          <w:cantSplit/>
-          <w:tblHeader w:val="false"/>
-        </w:trPr>
-        <w:tc>
-          <w:tcPr>
-            <w:tcW w:type="dxa" w:w="4200"/>
-            <w:tcBorders>
-              <w:top w:val="none" w:color="FFFFFF" w:sz="0"/>
-              <w:left w:val="none" w:color="FFFFFF" w:sz="0"/>
-              <w:bottom w:val="none" w:color="FFFFFF" w:sz="0"/>
-              <w:right w:val="none" w:color="FFFFFF" w:sz="0"/>
-            </w:tcBorders>
-            <w:tcMar>
-              <w:top w:type="dxa" w:w="50"/>
-              <w:left w:type="dxa" w:w="70"/>
-              <w:bottom w:type="dxa" w:w="50"/>
-              <w:right w:type="dxa" w:w="70"/>
-            </w:tcMar>
-          </w:tcPr>
-          <w:p>
-            <w:pPr>
-              <w:bidi/>
-              <w:spacing w:after="0" w:line="276"/>
-              <w:jc w:val="right"/>
-            </w:pPr>
-            <w:r>
-              <w:rPr>
-                <w:rFonts w:ascii="Times New Roman" w:cs="David" w:eastAsia="David" w:hAnsi="Times New Roman"/>
-                <w:b w:val="false"/>
-                <w:bCs w:val="false"/>
-                <w:noProof/>
-                <w:sz w:val="22"/>
-                <w:szCs w:val="22"/>
-                <w:rtl/>
-                <w:lang w:val="en-US" w:eastAsia="en-US" w:bidi="he-IL"/>
-              </w:rPr>
-              <w:t xml:space="preserve">אף המלצה</w:t>
-            </w:r>
-          </w:p>
-        </w:tc>
-        <w:tc>
-          <w:tcPr>
-            <w:tcW w:type="dxa" w:w="2400"/>
-            <w:tcBorders>
-              <w:top w:val="none" w:color="FFFFFF" w:sz="0"/>
-              <w:left w:val="none" w:color="FFFFFF" w:sz="0"/>
-              <w:bottom w:val="none" w:color="FFFFFF" w:sz="0"/>
-              <w:right w:val="none" w:color="FFFFFF" w:sz="0"/>
-            </w:tcBorders>
-            <w:tcMar>
-              <w:top w:type="dxa" w:w="50"/>
-              <w:left w:type="dxa" w:w="70"/>
-              <w:bottom w:type="dxa" w:w="50"/>
-              <w:right w:type="dxa" w:w="70"/>
-            </w:tcMar>
-          </w:tcPr>
-          <w:p>
-            <w:pPr>
-              <w:bidi/>
-              <w:spacing w:after="0" w:line="276"/>
-              <w:jc w:val="center"/>
-            </w:pPr>
-            <w:r>
-              <w:rPr>
-                <w:rFonts w:ascii="Times New Roman" w:cs="David" w:eastAsia="David" w:hAnsi="Times New Roman"/>
-                <w:b w:val="false"/>
-                <w:bCs w:val="false"/>
-                <w:noProof/>
-                <w:sz w:val="22"/>
-                <w:szCs w:val="22"/>
-                <w:rtl/>
-                <w:lang w:val="en-US" w:eastAsia="en-US" w:bidi="he-IL"/>
-              </w:rPr>
-              <w:t xml:space="preserve">24 (60.0%)</w:t>
-            </w:r>
-          </w:p>
-        </w:tc>
-        <w:tc>
-          <w:tcPr>
-            <w:tcW w:type="dxa" w:w="2400"/>
-            <w:tcBorders>
-              <w:top w:val="none" w:color="FFFFFF" w:sz="0"/>
-              <w:left w:val="none" w:color="FFFFFF" w:sz="0"/>
-              <w:bottom w:val="none" w:color="FFFFFF" w:sz="0"/>
-              <w:right w:val="none" w:color="FFFFFF" w:sz="0"/>
-            </w:tcBorders>
-            <w:tcMar>
-              <w:top w:type="dxa" w:w="50"/>
-              <w:left w:type="dxa" w:w="70"/>
-              <w:bottom w:type="dxa" w:w="50"/>
-              <w:right w:type="dxa" w:w="70"/>
-            </w:tcMar>
-          </w:tcPr>
-          <w:p>
-            <w:pPr>
-              <w:bidi/>
-              <w:spacing w:after="0" w:line="276"/>
-              <w:jc w:val="center"/>
-            </w:pPr>
-            <w:r>
-              <w:rPr>
-                <w:rFonts w:ascii="Times New Roman" w:cs="David" w:eastAsia="David" w:hAnsi="Times New Roman"/>
-                <w:b w:val="false"/>
-                <w:bCs w:val="false"/>
-                <w:noProof/>
-                <w:sz w:val="22"/>
-                <w:szCs w:val="22"/>
-                <w:rtl/>
-                <w:lang w:val="en-US" w:eastAsia="en-US" w:bidi="he-IL"/>
-              </w:rPr>
-              <w:t xml:space="preserve">10 (40.0%)</w:t>
-            </w:r>
-          </w:p>
-        </w:tc>
-        <w:tc>
-          <w:tcPr>
-            <w:tcW w:type="dxa" w:w="1800"/>
-            <w:tcBorders>
-              <w:top w:val="none" w:color="FFFFFF" w:sz="0"/>
-              <w:left w:val="none" w:color="FFFFFF" w:sz="0"/>
-              <w:bottom w:val="none" w:color="FFFFFF" w:sz="0"/>
-              <w:right w:val="none" w:color="FFFFFF" w:sz="0"/>
-            </w:tcBorders>
-            <w:tcMar>
-              <w:top w:type="dxa" w:w="50"/>
-              <w:left w:type="dxa" w:w="70"/>
-              <w:bottom w:type="dxa" w:w="50"/>
-              <w:right w:type="dxa" w:w="70"/>
-            </w:tcMar>
-          </w:tcPr>
-          <w:p>
-            <w:pPr>
-              <w:bidi/>
-              <w:spacing w:after="0" w:line="276"/>
-              <w:jc w:val="center"/>
-            </w:pPr>
-            <w:r>
-              <w:rPr>
-                <w:rFonts w:ascii="Times New Roman" w:cs="David" w:eastAsia="David" w:hAnsi="Times New Roman"/>
-                <w:b w:val="false"/>
-                <w:bCs w:val="false"/>
-                <w:noProof/>
-                <w:sz w:val="22"/>
-                <w:szCs w:val="22"/>
-                <w:rtl/>
-                <w:lang w:val="en-US" w:eastAsia="en-US" w:bidi="he-IL"/>
-              </w:rPr>
-              <w:t xml:space="preserve">34 (52.3%)</w:t>
-            </w:r>
-          </w:p>
-        </w:tc>
-      </w:tr>
-      <w:tr>
-        <w:trPr>
-          <w:cantSplit/>
-          <w:tblHeader w:val="false"/>
-        </w:trPr>
-        <w:tc>
-          <w:tcPr>
-            <w:tcW w:type="dxa" w:w="4200"/>
-            <w:tcBorders>
-              <w:top w:val="none" w:color="FFFFFF" w:sz="0"/>
-              <w:left w:val="none" w:color="FFFFFF" w:sz="0"/>
-              <w:bottom w:val="none" w:color="FFFFFF" w:sz="0"/>
-              <w:right w:val="none" w:color="FFFFFF" w:sz="0"/>
-            </w:tcBorders>
-            <w:tcMar>
-              <w:top w:type="dxa" w:w="50"/>
-              <w:left w:type="dxa" w:w="70"/>
-              <w:bottom w:type="dxa" w:w="50"/>
-              <w:right w:type="dxa" w:w="70"/>
-            </w:tcMar>
-          </w:tcPr>
-          <w:p>
-            <w:pPr>
-              <w:bidi/>
-              <w:spacing w:after="0" w:line="276"/>
-              <w:jc w:val="right"/>
-            </w:pPr>
-            <w:r>
-              <w:rPr>
-                <w:rFonts w:ascii="Times New Roman" w:cs="David" w:eastAsia="David" w:hAnsi="Times New Roman"/>
-                <w:b w:val="false"/>
-                <w:bCs w:val="false"/>
-                <w:noProof/>
-                <w:sz w:val="22"/>
-                <w:szCs w:val="22"/>
-                <w:rtl/>
-                <w:lang w:val="en-US" w:eastAsia="en-US" w:bidi="he-IL"/>
-              </w:rPr>
-              <w:t xml:space="preserve">המלצה אחת</w:t>
-            </w:r>
-          </w:p>
-        </w:tc>
-        <w:tc>
-          <w:tcPr>
-            <w:tcW w:type="dxa" w:w="2400"/>
-            <w:tcBorders>
-              <w:top w:val="none" w:color="FFFFFF" w:sz="0"/>
-              <w:left w:val="none" w:color="FFFFFF" w:sz="0"/>
-              <w:bottom w:val="none" w:color="FFFFFF" w:sz="0"/>
-              <w:right w:val="none" w:color="FFFFFF" w:sz="0"/>
-            </w:tcBorders>
-            <w:tcMar>
-              <w:top w:type="dxa" w:w="50"/>
-              <w:left w:type="dxa" w:w="70"/>
-              <w:bottom w:type="dxa" w:w="50"/>
-              <w:right w:type="dxa" w:w="70"/>
-            </w:tcMar>
-          </w:tcPr>
-          <w:p>
-            <w:pPr>
-              <w:bidi/>
-              <w:spacing w:after="0" w:line="276"/>
-              <w:jc w:val="center"/>
-            </w:pPr>
-            <w:r>
-              <w:rPr>
-                <w:rFonts w:ascii="Times New Roman" w:cs="David" w:eastAsia="David" w:hAnsi="Times New Roman"/>
-                <w:b w:val="false"/>
-                <w:bCs w:val="false"/>
-                <w:noProof/>
-                <w:sz w:val="22"/>
-                <w:szCs w:val="22"/>
-                <w:rtl/>
-                <w:lang w:val="en-US" w:eastAsia="en-US" w:bidi="he-IL"/>
-              </w:rPr>
-              <w:t xml:space="preserve">13 (32.5%)</w:t>
-            </w:r>
-          </w:p>
-        </w:tc>
-        <w:tc>
-          <w:tcPr>
-            <w:tcW w:type="dxa" w:w="2400"/>
-            <w:tcBorders>
-              <w:top w:val="none" w:color="FFFFFF" w:sz="0"/>
-              <w:left w:val="none" w:color="FFFFFF" w:sz="0"/>
-              <w:bottom w:val="none" w:color="FFFFFF" w:sz="0"/>
-              <w:right w:val="none" w:color="FFFFFF" w:sz="0"/>
-            </w:tcBorders>
-            <w:tcMar>
-              <w:top w:type="dxa" w:w="50"/>
-              <w:left w:type="dxa" w:w="70"/>
-              <w:bottom w:type="dxa" w:w="50"/>
-              <w:right w:type="dxa" w:w="70"/>
-            </w:tcMar>
-          </w:tcPr>
-          <w:p>
-            <w:pPr>
-              <w:bidi/>
-              <w:spacing w:after="0" w:line="276"/>
-              <w:jc w:val="center"/>
-            </w:pPr>
-            <w:r>
-              <w:rPr>
-                <w:rFonts w:ascii="Times New Roman" w:cs="David" w:eastAsia="David" w:hAnsi="Times New Roman"/>
-                <w:b w:val="false"/>
-                <w:bCs w:val="false"/>
-                <w:noProof/>
-                <w:sz w:val="22"/>
-                <w:szCs w:val="22"/>
-                <w:rtl/>
-                <w:lang w:val="en-US" w:eastAsia="en-US" w:bidi="he-IL"/>
-              </w:rPr>
-              <w:t xml:space="preserve">13 (52.0%)</w:t>
-            </w:r>
-          </w:p>
-        </w:tc>
-        <w:tc>
-          <w:tcPr>
-            <w:tcW w:type="dxa" w:w="1800"/>
-            <w:tcBorders>
-              <w:top w:val="none" w:color="FFFFFF" w:sz="0"/>
-              <w:left w:val="none" w:color="FFFFFF" w:sz="0"/>
-              <w:bottom w:val="none" w:color="FFFFFF" w:sz="0"/>
-              <w:right w:val="none" w:color="FFFFFF" w:sz="0"/>
-            </w:tcBorders>
-            <w:tcMar>
-              <w:top w:type="dxa" w:w="50"/>
-              <w:left w:type="dxa" w:w="70"/>
-              <w:bottom w:type="dxa" w:w="50"/>
-              <w:right w:type="dxa" w:w="70"/>
-            </w:tcMar>
-          </w:tcPr>
-          <w:p>
-            <w:pPr>
-              <w:bidi/>
-              <w:spacing w:after="0" w:line="276"/>
-              <w:jc w:val="center"/>
-            </w:pPr>
-            <w:r>
-              <w:rPr>
-                <w:rFonts w:ascii="Times New Roman" w:cs="David" w:eastAsia="David" w:hAnsi="Times New Roman"/>
-                <w:b w:val="false"/>
-                <w:bCs w:val="false"/>
-                <w:noProof/>
-                <w:sz w:val="22"/>
-                <w:szCs w:val="22"/>
-                <w:rtl/>
-                <w:lang w:val="en-US" w:eastAsia="en-US" w:bidi="he-IL"/>
-              </w:rPr>
-              <w:t xml:space="preserve">26 (40.0%)</w:t>
-            </w:r>
-          </w:p>
-        </w:tc>
-      </w:tr>
-      <w:tr>
-        <w:trPr>
-          <w:cantSplit/>
-          <w:tblHeader w:val="false"/>
-        </w:trPr>
-        <w:tc>
-          <w:tcPr>
-            <w:tcW w:type="dxa" w:w="4200"/>
-            <w:tcBorders>
-              <w:top w:val="none" w:color="FFFFFF" w:sz="0"/>
-              <w:left w:val="none" w:color="FFFFFF" w:sz="0"/>
-              <w:bottom w:val="none" w:color="FFFFFF" w:sz="0"/>
-              <w:right w:val="none" w:color="FFFFFF" w:sz="0"/>
-            </w:tcBorders>
-            <w:tcMar>
-              <w:top w:type="dxa" w:w="50"/>
-              <w:left w:type="dxa" w:w="70"/>
-              <w:bottom w:type="dxa" w:w="50"/>
-              <w:right w:type="dxa" w:w="70"/>
-            </w:tcMar>
-          </w:tcPr>
-          <w:p>
-            <w:pPr>
-              <w:bidi/>
-              <w:spacing w:after="0" w:line="276"/>
-              <w:jc w:val="right"/>
-            </w:pPr>
-            <w:r>
-              <w:rPr>
-                <w:rFonts w:ascii="Times New Roman" w:cs="David" w:eastAsia="David" w:hAnsi="Times New Roman"/>
-                <w:b w:val="false"/>
-                <w:bCs w:val="false"/>
-                <w:noProof/>
-                <w:sz w:val="22"/>
-                <w:szCs w:val="22"/>
-                <w:rtl/>
-                <w:lang w:val="en-US" w:eastAsia="en-US" w:bidi="he-IL"/>
-              </w:rPr>
-              <w:t xml:space="preserve">שתי המלצות</w:t>
-            </w:r>
-          </w:p>
-        </w:tc>
-        <w:tc>
-          <w:tcPr>
-            <w:tcW w:type="dxa" w:w="2400"/>
-            <w:tcBorders>
-              <w:top w:val="none" w:color="FFFFFF" w:sz="0"/>
-              <w:left w:val="none" w:color="FFFFFF" w:sz="0"/>
-              <w:bottom w:val="none" w:color="FFFFFF" w:sz="0"/>
-              <w:right w:val="none" w:color="FFFFFF" w:sz="0"/>
-            </w:tcBorders>
-            <w:tcMar>
-              <w:top w:type="dxa" w:w="50"/>
-              <w:left w:type="dxa" w:w="70"/>
-              <w:bottom w:type="dxa" w:w="50"/>
-              <w:right w:type="dxa" w:w="70"/>
-            </w:tcMar>
-          </w:tcPr>
-          <w:p>
-            <w:pPr>
-              <w:bidi/>
-              <w:spacing w:after="0" w:line="276"/>
-              <w:jc w:val="center"/>
-            </w:pPr>
-            <w:r>
-              <w:rPr>
-                <w:rFonts w:ascii="Times New Roman" w:cs="David" w:eastAsia="David" w:hAnsi="Times New Roman"/>
-                <w:b w:val="false"/>
-                <w:bCs w:val="false"/>
-                <w:noProof/>
-                <w:sz w:val="22"/>
-                <w:szCs w:val="22"/>
-                <w:rtl/>
-                <w:lang w:val="en-US" w:eastAsia="en-US" w:bidi="he-IL"/>
-              </w:rPr>
-              <w:t xml:space="preserve">3 (7.5%)</w:t>
-            </w:r>
-          </w:p>
-        </w:tc>
-        <w:tc>
-          <w:tcPr>
-            <w:tcW w:type="dxa" w:w="2400"/>
-            <w:tcBorders>
-              <w:top w:val="none" w:color="FFFFFF" w:sz="0"/>
-              <w:left w:val="none" w:color="FFFFFF" w:sz="0"/>
-              <w:bottom w:val="none" w:color="FFFFFF" w:sz="0"/>
-              <w:right w:val="none" w:color="FFFFFF" w:sz="0"/>
-            </w:tcBorders>
-            <w:tcMar>
-              <w:top w:type="dxa" w:w="50"/>
-              <w:left w:type="dxa" w:w="70"/>
-              <w:bottom w:type="dxa" w:w="50"/>
-              <w:right w:type="dxa" w:w="70"/>
-            </w:tcMar>
-          </w:tcPr>
-          <w:p>
-            <w:pPr>
-              <w:bidi/>
-              <w:spacing w:after="0" w:line="276"/>
-              <w:jc w:val="center"/>
-            </w:pPr>
-            <w:r>
-              <w:rPr>
-                <w:rFonts w:ascii="Times New Roman" w:cs="David" w:eastAsia="David" w:hAnsi="Times New Roman"/>
-                <w:b w:val="false"/>
-                <w:bCs w:val="false"/>
-                <w:noProof/>
-                <w:sz w:val="22"/>
-                <w:szCs w:val="22"/>
-                <w:rtl/>
-                <w:lang w:val="en-US" w:eastAsia="en-US" w:bidi="he-IL"/>
-              </w:rPr>
-              <w:t xml:space="preserve">1 (4.0%)</w:t>
-            </w:r>
-          </w:p>
-        </w:tc>
-        <w:tc>
-          <w:tcPr>
-            <w:tcW w:type="dxa" w:w="1800"/>
-            <w:tcBorders>
-              <w:top w:val="none" w:color="FFFFFF" w:sz="0"/>
-              <w:left w:val="none" w:color="FFFFFF" w:sz="0"/>
-              <w:bottom w:val="none" w:color="FFFFFF" w:sz="0"/>
-              <w:right w:val="none" w:color="FFFFFF" w:sz="0"/>
-            </w:tcBorders>
-            <w:tcMar>
-              <w:top w:type="dxa" w:w="50"/>
-              <w:left w:type="dxa" w:w="70"/>
-              <w:bottom w:type="dxa" w:w="50"/>
-              <w:right w:type="dxa" w:w="70"/>
-            </w:tcMar>
-          </w:tcPr>
-          <w:p>
-            <w:pPr>
-              <w:bidi/>
-              <w:spacing w:after="0" w:line="276"/>
-              <w:jc w:val="center"/>
-            </w:pPr>
-            <w:r>
-              <w:rPr>
-                <w:rFonts w:ascii="Times New Roman" w:cs="David" w:eastAsia="David" w:hAnsi="Times New Roman"/>
-                <w:b w:val="false"/>
-                <w:bCs w:val="false"/>
-                <w:noProof/>
-                <w:sz w:val="22"/>
-                <w:szCs w:val="22"/>
-                <w:rtl/>
-                <w:lang w:val="en-US" w:eastAsia="en-US" w:bidi="he-IL"/>
-              </w:rPr>
-              <w:t xml:space="preserve">4 (6.2%)</w:t>
-            </w:r>
-          </w:p>
-        </w:tc>
-      </w:tr>
-      <w:tr>
-        <w:trPr>
-          <w:cantSplit/>
-          <w:tblHeader w:val="false"/>
-        </w:trPr>
-        <w:tc>
-          <w:tcPr>
-            <w:tcW w:type="dxa" w:w="4200"/>
-            <w:tcBorders>
-              <w:top w:val="none" w:color="FFFFFF" w:sz="0"/>
-              <w:left w:val="none" w:color="FFFFFF" w:sz="0"/>
-              <w:bottom w:val="single" w:color="000000" w:sz="4"/>
-              <w:right w:val="none" w:color="FFFFFF" w:sz="0"/>
-            </w:tcBorders>
-            <w:tcMar>
-              <w:top w:type="dxa" w:w="50"/>
-              <w:left w:type="dxa" w:w="70"/>
-              <w:bottom w:type="dxa" w:w="50"/>
-              <w:right w:type="dxa" w:w="70"/>
-            </w:tcMar>
-          </w:tcPr>
-          <w:p>
-            <w:pPr>
-              <w:bidi/>
-              <w:spacing w:after="0" w:line="276"/>
-              <w:jc w:val="right"/>
-            </w:pPr>
-            <w:r>
-              <w:rPr>
-                <w:rFonts w:ascii="Times New Roman" w:cs="David" w:eastAsia="David" w:hAnsi="Times New Roman"/>
-                <w:b w:val="false"/>
-                <w:bCs w:val="false"/>
-                <w:noProof/>
-                <w:sz w:val="22"/>
-                <w:szCs w:val="22"/>
-                <w:rtl/>
-                <w:lang w:val="en-US" w:eastAsia="en-US" w:bidi="he-IL"/>
-              </w:rPr>
-              <w:t xml:space="preserve">שלוש המלצות</w:t>
-            </w:r>
-          </w:p>
-        </w:tc>
-        <w:tc>
-          <w:tcPr>
-            <w:tcW w:type="dxa" w:w="2400"/>
-            <w:tcBorders>
-              <w:top w:val="none" w:color="FFFFFF" w:sz="0"/>
-              <w:left w:val="none" w:color="FFFFFF" w:sz="0"/>
-              <w:bottom w:val="single" w:color="000000" w:sz="4"/>
-              <w:right w:val="none" w:color="FFFFFF" w:sz="0"/>
-            </w:tcBorders>
-            <w:tcMar>
-              <w:top w:type="dxa" w:w="50"/>
-              <w:left w:type="dxa" w:w="70"/>
-              <w:bottom w:type="dxa" w:w="50"/>
-              <w:right w:type="dxa" w:w="70"/>
-            </w:tcMar>
-          </w:tcPr>
-          <w:p>
-            <w:pPr>
-              <w:bidi/>
-              <w:spacing w:after="0" w:line="276"/>
-              <w:jc w:val="center"/>
-            </w:pPr>
-            <w:r>
-              <w:rPr>
-                <w:rFonts w:ascii="Times New Roman" w:cs="David" w:eastAsia="David" w:hAnsi="Times New Roman"/>
-                <w:b w:val="false"/>
-                <w:bCs w:val="false"/>
-                <w:noProof/>
-                <w:sz w:val="22"/>
-                <w:szCs w:val="22"/>
-                <w:rtl/>
-                <w:lang w:val="en-US" w:eastAsia="en-US" w:bidi="he-IL"/>
-              </w:rPr>
-              <w:t xml:space="preserve">0 (0.0%)</w:t>
-            </w:r>
-          </w:p>
-        </w:tc>
-        <w:tc>
-          <w:tcPr>
-            <w:tcW w:type="dxa" w:w="2400"/>
-            <w:tcBorders>
-              <w:top w:val="none" w:color="FFFFFF" w:sz="0"/>
-              <w:left w:val="none" w:color="FFFFFF" w:sz="0"/>
-              <w:bottom w:val="single" w:color="000000" w:sz="4"/>
-              <w:right w:val="none" w:color="FFFFFF" w:sz="0"/>
-            </w:tcBorders>
-            <w:tcMar>
-              <w:top w:type="dxa" w:w="50"/>
-              <w:left w:type="dxa" w:w="70"/>
-              <w:bottom w:type="dxa" w:w="50"/>
-              <w:right w:type="dxa" w:w="70"/>
-            </w:tcMar>
-          </w:tcPr>
-          <w:p>
-            <w:pPr>
-              <w:bidi/>
-              <w:spacing w:after="0" w:line="276"/>
-              <w:jc w:val="center"/>
-            </w:pPr>
-            <w:r>
-              <w:rPr>
-                <w:rFonts w:ascii="Times New Roman" w:cs="David" w:eastAsia="David" w:hAnsi="Times New Roman"/>
-                <w:b w:val="false"/>
-                <w:bCs w:val="false"/>
-                <w:noProof/>
-                <w:sz w:val="22"/>
-                <w:szCs w:val="22"/>
-                <w:rtl/>
-                <w:lang w:val="en-US" w:eastAsia="en-US" w:bidi="he-IL"/>
-              </w:rPr>
-              <w:t xml:space="preserve">1 (4.0%)</w:t>
-            </w:r>
-          </w:p>
-        </w:tc>
-        <w:tc>
-          <w:tcPr>
-            <w:tcW w:type="dxa" w:w="1800"/>
-            <w:tcBorders>
-              <w:top w:val="none" w:color="FFFFFF" w:sz="0"/>
-              <w:left w:val="none" w:color="FFFFFF" w:sz="0"/>
-              <w:bottom w:val="single" w:color="000000" w:sz="4"/>
-              <w:right w:val="none" w:color="FFFFFF" w:sz="0"/>
-            </w:tcBorders>
-            <w:tcMar>
-              <w:top w:type="dxa" w:w="50"/>
-              <w:left w:type="dxa" w:w="70"/>
-              <w:bottom w:type="dxa" w:w="50"/>
-              <w:right w:type="dxa" w:w="70"/>
-            </w:tcMar>
-          </w:tcPr>
-          <w:p>
-            <w:pPr>
-              <w:bidi/>
-              <w:spacing w:after="0" w:line="276"/>
-              <w:jc w:val="center"/>
-            </w:pPr>
-            <w:r>
-              <w:rPr>
-                <w:rFonts w:ascii="Times New Roman" w:cs="David" w:eastAsia="David" w:hAnsi="Times New Roman"/>
-                <w:b w:val="false"/>
-                <w:bCs w:val="false"/>
-                <w:noProof/>
-                <w:sz w:val="22"/>
-                <w:szCs w:val="22"/>
-                <w:rtl/>
-                <w:lang w:val="en-US" w:eastAsia="en-US" w:bidi="he-IL"/>
-              </w:rPr>
-              <w:t xml:space="preserve">1 (1.5%)</w:t>
-            </w:r>
-          </w:p>
-        </w:tc>
-      </w:tr>
-    </w:tbl>
-    <w:p>
-      <w:pPr>
-        <w:bidi/>
-        <w:spacing w:after="120" w:line="276"/>
-        <w:jc w:val="both"/>
-      </w:pPr>
-      <w:r>
-        <w:rPr>
-          <w:rFonts w:ascii="Times New Roman" w:cs="David" w:eastAsia="David" w:hAnsi="Times New Roman"/>
-          <w:noProof/>
-          <w:sz w:val="20"/>
-          <w:szCs w:val="20"/>
-          <w:rtl/>
-          <w:lang w:val="en-US" w:eastAsia="en-US" w:bidi="he-IL"/>
-        </w:rPr>
-        <w:t xml:space="preserve">הערה. הערכים הם שכיחות (אחוז מהקבוצה). מקור: פלט Frequencies בפיצול לפי קבוצה, נספח ב'.</w:t>
+        <w:t xml:space="preserve">תרשים 1 מציג את שיעורי העמידה בשלוש ההמלצות בשתי הקבוצות.</w:t>
       </w:r>
     </w:p>
     <w:p>
@@ -10106,7 +8155,7 @@
         </w:rPr>
         <w:drawing>
           <wp:inline distT="0" distB="0" distL="0" distR="0">
-            <wp:extent cx="4495800" cy="2771775"/>
+            <wp:extent cx="3962400" cy="2447925"/>
             <wp:effectExtent t="0" r="0" b="0" l="0"/>
             <wp:docPr id="1" name="" descr="" title=""/>
             <wp:cNvGraphicFramePr>
@@ -10131,7 +8180,7 @@
                   <pic:spPr bwMode="auto">
                     <a:xfrm>
                       <a:off x="0" y="0"/>
-                      <a:ext cx="4495800" cy="2771775"/>
+                      <a:ext cx="3962400" cy="2447925"/>
                     </a:xfrm>
                     <a:prstGeom prst="rect">
                       <a:avLst/>
@@ -10159,7 +8208,7 @@
           <w:rtl/>
           <w:lang w:val="en-US" w:eastAsia="en-US" w:bidi="he-IL"/>
         </w:rPr>
-        <w:t xml:space="preserve">מלוח 4 ומתרשים 1 עולה כי בקבוצת המחקר עמדו 15 אחוזים בהמלצת זמן המסך, 30 אחוזים בהמלצת השינה ותלמיד אחד בלבד (2.5 אחוזים) בהמלצה של 60 דקות פעילות בכל יום. 60 אחוזים מתלמידי קבוצת המחקר לא עמדו באף המלצה, 32.5 אחוזים עמדו בהמלצה אחת, 7.5 אחוזים בשתיים, ואיש לא עמד בשלושתן. בקבוצת ההשוואה עמדו 56 אחוזים בהמלצת השינה, ותלמיד אחד עמד בשלוש ההמלצות יחד. הפער הבולט בין הקבוצות הוא בהמלצת השינה.</w:t>
+        <w:t xml:space="preserve">מתרשים 1 עולה כי בקבוצת המחקר עמדו 15 אחוזים בהמלצת זמן המסך, 30 אחוזים בהמלצת השינה ותלמיד אחד בלבד (2.5 אחוזים) בהמלצה של 60 דקות פעילות בכל יום. 60 אחוזים מתלמידי קבוצת המחקר לא עמדו באף המלצה, 32.5 אחוזים עמדו בהמלצה אחת, 7.5 אחוזים בשתיים, ואיש לא עמד בשלושתן. בקבוצת ההשוואה עמדו 12 אחוזים בהמלצת המסכים, 56 אחוזים בהמלצת השינה ו-4 אחוזים בהמלצת הפעילות הגופנית, ותלמיד אחד עמד בשלוש ההמלצות יחד (פלט Frequencies בפיצול לפי קבוצה, נספח ב'). הפער הבולט בין הקבוצות הוא בהמלצת השינה.</w:t>
       </w:r>
     </w:p>
     <w:p>
@@ -10199,7 +8248,7 @@
           <w:rtl/>
           <w:lang w:val="en-US" w:eastAsia="en-US" w:bidi="he-IL"/>
         </w:rPr>
-        <w:t xml:space="preserve">ההשערה הראשונה שיערה קשר שלילי בין היקף החשיפה למסכים לבין משך השינה, וקשר חיובי בינו לבין שעת שינה מאוחרת וישנוניות בשעות היום. לוח 5 מציג את מתאמי פירסון בקבוצת המחקר.</w:t>
+        <w:t xml:space="preserve">ההשערה הראשונה שיערה קשר שלילי בין היקף החשיפה למסכים לבין משך השינה, וקשר חיובי בינו לבין שעת שינה מאוחרת וישנוניות בשעות היום. לוח 3 מציג את מתאמי פירסון בקבוצת המחקר.</w:t>
       </w:r>
     </w:p>
     <w:p>
@@ -10220,7 +8269,7 @@
           <w:rtl/>
           <w:lang w:val="en-US" w:eastAsia="en-US" w:bidi="he-IL"/>
         </w:rPr>
-        <w:t xml:space="preserve">לוח 5: מתאמי פירסון בין חשיפה למסכים לבין משתני השינה בקבוצת המחקר (n = 40)</w:t>
+        <w:t xml:space="preserve">לוח 3: מתאמי פירסון בין חשיפה למסכים לבין משתני השינה בקבוצת המחקר (n = 40)</w:t>
       </w:r>
     </w:p>
     <w:tbl>
@@ -10855,7 +8904,7 @@
           <w:rtl/>
           <w:lang w:val="en-US" w:eastAsia="en-US" w:bidi="he-IL"/>
         </w:rPr>
-        <w:t xml:space="preserve">מלוח 5 ניתן ללמוד כי ההשערה אוששה במלואה. זמן מסך הפנאי היומי היה קשור באופן שלילי למשך השינה ביום חול (r = -0.35, p = 0.025), ובאופן חיובי לשעת שינה מאוחרת יותר (r = 0.37, p = 0.018), לאיחור גדול יותר של שעת השינה בסוף השבוע (r = 0.33, p = 0.040) ולישנוניות בשעות היום (r = 0.52, p = 0.001). הקשר עם הישנוניות היה החזק מכולם. תדירות השימוש במסך בחצי השעה שלפני השינה הייתה קשורה לאותם משתנים באותו כיוון, אך הקשרים לא הגיעו למובהקות (r בין 0.19 ל-0.30).</w:t>
+        <w:t xml:space="preserve">מלוח 3 ניתן ללמוד כי ההשערה אוששה במלואה. זמן מסך הפנאי היומי היה קשור באופן שלילי למשך השינה ביום חול (r = -0.35, p = 0.025), ובאופן חיובי לשעת שינה מאוחרת יותר (r = 0.37, p = 0.018), לאיחור גדול יותר של שעת השינה בסוף השבוע (r = 0.33, p = 0.040) ולישנוניות בשעות היום (r = 0.52, p = 0.001). הקשר עם הישנוניות היה החזק מכולם. תדירות השימוש במסך בחצי השעה שלפני השינה הייתה קשורה לאותם משתנים באותו כיוון, אך הקשרים לא הגיעו למובהקות (r בין 0.19 ל-0.30).</w:t>
       </w:r>
     </w:p>
     <w:p>
@@ -10895,550 +8944,7 @@
           <w:rtl/>
           <w:lang w:val="en-US" w:eastAsia="en-US" w:bidi="he-IL"/>
         </w:rPr>
-        <w:t xml:space="preserve">ההשערה השנייה שיערה קשר שלילי בין היקף החשיפה למסכים לבין היקף הפעילות הגופנית. לוח 6 מציג את המתאמים.</w:t>
-      </w:r>
-    </w:p>
-    <w:p>
-      <w:pPr>
-        <w:keepNext/>
-        <w:bidi/>
-        <w:spacing w:after="80" w:before="200" w:line="360"/>
-        <w:jc w:val="right"/>
-      </w:pPr>
-      <w:r>
-        <w:rPr>
-          <w:rFonts w:ascii="Times New Roman" w:cs="David" w:eastAsia="David" w:hAnsi="Times New Roman"/>
-          <w:b/>
-          <w:bCs/>
-          <w:noProof/>
-          <w:sz w:val="24"/>
-          <w:szCs w:val="24"/>
-          <w:rtl/>
-          <w:lang w:val="en-US" w:eastAsia="en-US" w:bidi="he-IL"/>
-        </w:rPr>
-        <w:t xml:space="preserve">לוח 6: מתאמי פירסון בין חשיפה למסכים לבין מדדי הפעילות הגופנית בקבוצת המחקר (n = 40)</w:t>
-      </w:r>
-    </w:p>
-    <w:tbl>
-      <w:tblPr>
-        <w:bidiVisual/>
-        <w:tblW w:type="dxa" w:w="10800"/>
-        <w:tblBorders>
-          <w:top w:val="single" w:color="000000" w:sz="4"/>
-          <w:left w:val="none" w:color="FFFFFF" w:sz="0"/>
-          <w:bottom w:val="single" w:color="000000" w:sz="4"/>
-          <w:right w:val="none" w:color="FFFFFF" w:sz="0"/>
-          <w:insideH w:val="none" w:color="FFFFFF" w:sz="0"/>
-          <w:insideV w:val="none" w:color="FFFFFF" w:sz="0"/>
-        </w:tblBorders>
-      </w:tblPr>
-      <w:tblGrid>
-        <w:gridCol w:w="3400"/>
-        <w:gridCol w:w="2500"/>
-        <w:gridCol w:w="2500"/>
-        <w:gridCol w:w="2400"/>
-      </w:tblGrid>
-      <w:tr>
-        <w:trPr>
-          <w:cantSplit/>
-          <w:tblHeader/>
-        </w:trPr>
-        <w:tc>
-          <w:tcPr>
-            <w:tcW w:type="dxa" w:w="3400"/>
-            <w:tcBorders>
-              <w:top w:val="single" w:color="000000" w:sz="4"/>
-              <w:left w:val="none" w:color="FFFFFF" w:sz="0"/>
-              <w:bottom w:val="single" w:color="000000" w:sz="4"/>
-              <w:right w:val="none" w:color="FFFFFF" w:sz="0"/>
-            </w:tcBorders>
-            <w:shd w:fill="EDEDED" w:color="auto" w:val="clear"/>
-            <w:tcMar>
-              <w:top w:type="dxa" w:w="50"/>
-              <w:left w:type="dxa" w:w="70"/>
-              <w:bottom w:type="dxa" w:w="50"/>
-              <w:right w:type="dxa" w:w="70"/>
-            </w:tcMar>
-          </w:tcPr>
-          <w:p>
-            <w:pPr>
-              <w:bidi/>
-              <w:spacing w:after="0" w:line="276"/>
-              <w:jc w:val="right"/>
-            </w:pPr>
-            <w:r>
-              <w:rPr>
-                <w:rFonts w:ascii="Times New Roman" w:cs="David" w:eastAsia="David" w:hAnsi="Times New Roman"/>
-                <w:b/>
-                <w:bCs/>
-                <w:noProof/>
-                <w:sz w:val="22"/>
-                <w:szCs w:val="22"/>
-                <w:rtl/>
-                <w:lang w:val="en-US" w:eastAsia="en-US" w:bidi="he-IL"/>
-              </w:rPr>
-              <w:t xml:space="preserve">משתנה</w:t>
-            </w:r>
-          </w:p>
-        </w:tc>
-        <w:tc>
-          <w:tcPr>
-            <w:tcW w:type="dxa" w:w="2500"/>
-            <w:tcBorders>
-              <w:top w:val="single" w:color="000000" w:sz="4"/>
-              <w:left w:val="none" w:color="FFFFFF" w:sz="0"/>
-              <w:bottom w:val="single" w:color="000000" w:sz="4"/>
-              <w:right w:val="none" w:color="FFFFFF" w:sz="0"/>
-            </w:tcBorders>
-            <w:shd w:fill="EDEDED" w:color="auto" w:val="clear"/>
-            <w:tcMar>
-              <w:top w:type="dxa" w:w="50"/>
-              <w:left w:type="dxa" w:w="70"/>
-              <w:bottom w:type="dxa" w:w="50"/>
-              <w:right w:type="dxa" w:w="70"/>
-            </w:tcMar>
-          </w:tcPr>
-          <w:p>
-            <w:pPr>
-              <w:bidi/>
-              <w:spacing w:after="0" w:line="276"/>
-              <w:jc w:val="center"/>
-            </w:pPr>
-            <w:r>
-              <w:rPr>
-                <w:rFonts w:ascii="Times New Roman" w:cs="David" w:eastAsia="David" w:hAnsi="Times New Roman"/>
-                <w:b/>
-                <w:bCs/>
-                <w:noProof/>
-                <w:sz w:val="22"/>
-                <w:szCs w:val="22"/>
-                <w:rtl/>
-                <w:lang w:val="en-US" w:eastAsia="en-US" w:bidi="he-IL"/>
-              </w:rPr>
-              <w:t xml:space="preserve">ימים עם 60 דקות פעילות</w:t>
-            </w:r>
-          </w:p>
-        </w:tc>
-        <w:tc>
-          <w:tcPr>
-            <w:tcW w:type="dxa" w:w="2500"/>
-            <w:tcBorders>
-              <w:top w:val="single" w:color="000000" w:sz="4"/>
-              <w:left w:val="none" w:color="FFFFFF" w:sz="0"/>
-              <w:bottom w:val="single" w:color="000000" w:sz="4"/>
-              <w:right w:val="none" w:color="FFFFFF" w:sz="0"/>
-            </w:tcBorders>
-            <w:shd w:fill="EDEDED" w:color="auto" w:val="clear"/>
-            <w:tcMar>
-              <w:top w:type="dxa" w:w="50"/>
-              <w:left w:type="dxa" w:w="70"/>
-              <w:bottom w:type="dxa" w:w="50"/>
-              <w:right w:type="dxa" w:w="70"/>
-            </w:tcMar>
-          </w:tcPr>
-          <w:p>
-            <w:pPr>
-              <w:bidi/>
-              <w:spacing w:after="0" w:line="276"/>
-              <w:jc w:val="center"/>
-            </w:pPr>
-            <w:r>
-              <w:rPr>
-                <w:rFonts w:ascii="Times New Roman" w:cs="David" w:eastAsia="David" w:hAnsi="Times New Roman"/>
-                <w:b/>
-                <w:bCs/>
-                <w:noProof/>
-                <w:sz w:val="22"/>
-                <w:szCs w:val="22"/>
-                <w:rtl/>
-                <w:lang w:val="en-US" w:eastAsia="en-US" w:bidi="he-IL"/>
-              </w:rPr>
-              <w:t xml:space="preserve">שעות פעילות נמרצת בשבוע</w:t>
-            </w:r>
-          </w:p>
-        </w:tc>
-        <w:tc>
-          <w:tcPr>
-            <w:tcW w:type="dxa" w:w="2400"/>
-            <w:tcBorders>
-              <w:top w:val="single" w:color="000000" w:sz="4"/>
-              <w:left w:val="none" w:color="FFFFFF" w:sz="0"/>
-              <w:bottom w:val="single" w:color="000000" w:sz="4"/>
-              <w:right w:val="none" w:color="FFFFFF" w:sz="0"/>
-            </w:tcBorders>
-            <w:shd w:fill="EDEDED" w:color="auto" w:val="clear"/>
-            <w:tcMar>
-              <w:top w:type="dxa" w:w="50"/>
-              <w:left w:type="dxa" w:w="70"/>
-              <w:bottom w:type="dxa" w:w="50"/>
-              <w:right w:type="dxa" w:w="70"/>
-            </w:tcMar>
-          </w:tcPr>
-          <w:p>
-            <w:pPr>
-              <w:bidi/>
-              <w:spacing w:after="0" w:line="276"/>
-              <w:jc w:val="center"/>
-            </w:pPr>
-            <w:r>
-              <w:rPr>
-                <w:rFonts w:ascii="Times New Roman" w:cs="David" w:eastAsia="David" w:hAnsi="Times New Roman"/>
-                <w:b/>
-                <w:bCs/>
-                <w:noProof/>
-                <w:sz w:val="22"/>
-                <w:szCs w:val="22"/>
-                <w:rtl/>
-                <w:lang w:val="en-US" w:eastAsia="en-US" w:bidi="he-IL"/>
-              </w:rPr>
-              <w:t xml:space="preserve">תדירות פעילות נמרצת (הפוך)</w:t>
-            </w:r>
-          </w:p>
-        </w:tc>
-      </w:tr>
-      <w:tr>
-        <w:trPr>
-          <w:cantSplit/>
-          <w:tblHeader w:val="false"/>
-        </w:trPr>
-        <w:tc>
-          <w:tcPr>
-            <w:tcW w:type="dxa" w:w="3400"/>
-            <w:tcBorders>
-              <w:top w:val="none" w:color="FFFFFF" w:sz="0"/>
-              <w:left w:val="none" w:color="FFFFFF" w:sz="0"/>
-              <w:bottom w:val="none" w:color="FFFFFF" w:sz="0"/>
-              <w:right w:val="none" w:color="FFFFFF" w:sz="0"/>
-            </w:tcBorders>
-            <w:tcMar>
-              <w:top w:type="dxa" w:w="50"/>
-              <w:left w:type="dxa" w:w="70"/>
-              <w:bottom w:type="dxa" w:w="50"/>
-              <w:right w:type="dxa" w:w="70"/>
-            </w:tcMar>
-          </w:tcPr>
-          <w:p>
-            <w:pPr>
-              <w:bidi/>
-              <w:spacing w:after="0" w:line="276"/>
-              <w:jc w:val="right"/>
-            </w:pPr>
-            <w:r>
-              <w:rPr>
-                <w:rFonts w:ascii="Times New Roman" w:cs="David" w:eastAsia="David" w:hAnsi="Times New Roman"/>
-                <w:b w:val="false"/>
-                <w:bCs w:val="false"/>
-                <w:noProof/>
-                <w:sz w:val="22"/>
-                <w:szCs w:val="22"/>
-                <w:rtl/>
-                <w:lang w:val="en-US" w:eastAsia="en-US" w:bidi="he-IL"/>
-              </w:rPr>
-              <w:t xml:space="preserve">זמן מסך פנאי יומי</w:t>
-            </w:r>
-          </w:p>
-        </w:tc>
-        <w:tc>
-          <w:tcPr>
-            <w:tcW w:type="dxa" w:w="2500"/>
-            <w:tcBorders>
-              <w:top w:val="none" w:color="FFFFFF" w:sz="0"/>
-              <w:left w:val="none" w:color="FFFFFF" w:sz="0"/>
-              <w:bottom w:val="none" w:color="FFFFFF" w:sz="0"/>
-              <w:right w:val="none" w:color="FFFFFF" w:sz="0"/>
-            </w:tcBorders>
-            <w:tcMar>
-              <w:top w:type="dxa" w:w="50"/>
-              <w:left w:type="dxa" w:w="70"/>
-              <w:bottom w:type="dxa" w:w="50"/>
-              <w:right w:type="dxa" w:w="70"/>
-            </w:tcMar>
-          </w:tcPr>
-          <w:p>
-            <w:pPr>
-              <w:bidi/>
-              <w:spacing w:after="0" w:line="276"/>
-              <w:jc w:val="center"/>
-            </w:pPr>
-            <w:r>
-              <w:rPr>
-                <w:rFonts w:ascii="Times New Roman" w:cs="David" w:eastAsia="David" w:hAnsi="Times New Roman"/>
-                <w:b w:val="false"/>
-                <w:bCs w:val="false"/>
-                <w:noProof/>
-                <w:sz w:val="22"/>
-                <w:szCs w:val="22"/>
-                <w:rtl/>
-                <w:lang w:val="en-US" w:eastAsia="en-US" w:bidi="he-IL"/>
-              </w:rPr>
-              <w:t xml:space="preserve">-0.02</w:t>
-            </w:r>
-          </w:p>
-        </w:tc>
-        <w:tc>
-          <w:tcPr>
-            <w:tcW w:type="dxa" w:w="2500"/>
-            <w:tcBorders>
-              <w:top w:val="none" w:color="FFFFFF" w:sz="0"/>
-              <w:left w:val="none" w:color="FFFFFF" w:sz="0"/>
-              <w:bottom w:val="none" w:color="FFFFFF" w:sz="0"/>
-              <w:right w:val="none" w:color="FFFFFF" w:sz="0"/>
-            </w:tcBorders>
-            <w:tcMar>
-              <w:top w:type="dxa" w:w="50"/>
-              <w:left w:type="dxa" w:w="70"/>
-              <w:bottom w:type="dxa" w:w="50"/>
-              <w:right w:type="dxa" w:w="70"/>
-            </w:tcMar>
-          </w:tcPr>
-          <w:p>
-            <w:pPr>
-              <w:bidi/>
-              <w:spacing w:after="0" w:line="276"/>
-              <w:jc w:val="center"/>
-            </w:pPr>
-            <w:r>
-              <w:rPr>
-                <w:rFonts w:ascii="Times New Roman" w:cs="David" w:eastAsia="David" w:hAnsi="Times New Roman"/>
-                <w:b w:val="false"/>
-                <w:bCs w:val="false"/>
-                <w:noProof/>
-                <w:sz w:val="22"/>
-                <w:szCs w:val="22"/>
-                <w:rtl/>
-                <w:lang w:val="en-US" w:eastAsia="en-US" w:bidi="he-IL"/>
-              </w:rPr>
-              <w:t xml:space="preserve">0.00</w:t>
-            </w:r>
-          </w:p>
-        </w:tc>
-        <w:tc>
-          <w:tcPr>
-            <w:tcW w:type="dxa" w:w="2400"/>
-            <w:tcBorders>
-              <w:top w:val="none" w:color="FFFFFF" w:sz="0"/>
-              <w:left w:val="none" w:color="FFFFFF" w:sz="0"/>
-              <w:bottom w:val="none" w:color="FFFFFF" w:sz="0"/>
-              <w:right w:val="none" w:color="FFFFFF" w:sz="0"/>
-            </w:tcBorders>
-            <w:tcMar>
-              <w:top w:type="dxa" w:w="50"/>
-              <w:left w:type="dxa" w:w="70"/>
-              <w:bottom w:type="dxa" w:w="50"/>
-              <w:right w:type="dxa" w:w="70"/>
-            </w:tcMar>
-          </w:tcPr>
-          <w:p>
-            <w:pPr>
-              <w:bidi/>
-              <w:spacing w:after="0" w:line="276"/>
-              <w:jc w:val="center"/>
-            </w:pPr>
-            <w:r>
-              <w:rPr>
-                <w:rFonts w:ascii="Times New Roman" w:cs="David" w:eastAsia="David" w:hAnsi="Times New Roman"/>
-                <w:b w:val="false"/>
-                <w:bCs w:val="false"/>
-                <w:noProof/>
-                <w:sz w:val="22"/>
-                <w:szCs w:val="22"/>
-                <w:rtl/>
-                <w:lang w:val="en-US" w:eastAsia="en-US" w:bidi="he-IL"/>
-              </w:rPr>
-              <w:t xml:space="preserve">0.02</w:t>
-            </w:r>
-          </w:p>
-        </w:tc>
-      </w:tr>
-      <w:tr>
-        <w:trPr>
-          <w:cantSplit/>
-          <w:tblHeader w:val="false"/>
-        </w:trPr>
-        <w:tc>
-          <w:tcPr>
-            <w:tcW w:type="dxa" w:w="3400"/>
-            <w:tcBorders>
-              <w:top w:val="none" w:color="FFFFFF" w:sz="0"/>
-              <w:left w:val="none" w:color="FFFFFF" w:sz="0"/>
-              <w:bottom w:val="single" w:color="000000" w:sz="4"/>
-              <w:right w:val="none" w:color="FFFFFF" w:sz="0"/>
-            </w:tcBorders>
-            <w:tcMar>
-              <w:top w:type="dxa" w:w="50"/>
-              <w:left w:type="dxa" w:w="70"/>
-              <w:bottom w:type="dxa" w:w="50"/>
-              <w:right w:type="dxa" w:w="70"/>
-            </w:tcMar>
-          </w:tcPr>
-          <w:p>
-            <w:pPr>
-              <w:bidi/>
-              <w:spacing w:after="0" w:line="276"/>
-              <w:jc w:val="right"/>
-            </w:pPr>
-            <w:r>
-              <w:rPr>
-                <w:rFonts w:ascii="Times New Roman" w:cs="David" w:eastAsia="David" w:hAnsi="Times New Roman"/>
-                <w:b w:val="false"/>
-                <w:bCs w:val="false"/>
-                <w:noProof/>
-                <w:sz w:val="22"/>
-                <w:szCs w:val="22"/>
-                <w:rtl/>
-                <w:lang w:val="en-US" w:eastAsia="en-US" w:bidi="he-IL"/>
-              </w:rPr>
-              <w:t xml:space="preserve">p</w:t>
-            </w:r>
-          </w:p>
-        </w:tc>
-        <w:tc>
-          <w:tcPr>
-            <w:tcW w:type="dxa" w:w="2500"/>
-            <w:tcBorders>
-              <w:top w:val="none" w:color="FFFFFF" w:sz="0"/>
-              <w:left w:val="none" w:color="FFFFFF" w:sz="0"/>
-              <w:bottom w:val="single" w:color="000000" w:sz="4"/>
-              <w:right w:val="none" w:color="FFFFFF" w:sz="0"/>
-            </w:tcBorders>
-            <w:tcMar>
-              <w:top w:type="dxa" w:w="50"/>
-              <w:left w:type="dxa" w:w="70"/>
-              <w:bottom w:type="dxa" w:w="50"/>
-              <w:right w:type="dxa" w:w="70"/>
-            </w:tcMar>
-          </w:tcPr>
-          <w:p>
-            <w:pPr>
-              <w:bidi/>
-              <w:spacing w:after="0" w:line="276"/>
-              <w:jc w:val="center"/>
-            </w:pPr>
-            <w:r>
-              <w:rPr>
-                <w:rFonts w:ascii="Times New Roman" w:cs="David" w:eastAsia="David" w:hAnsi="Times New Roman"/>
-                <w:b w:val="false"/>
-                <w:bCs w:val="false"/>
-                <w:noProof/>
-                <w:sz w:val="22"/>
-                <w:szCs w:val="22"/>
-                <w:rtl/>
-                <w:lang w:val="en-US" w:eastAsia="en-US" w:bidi="he-IL"/>
-              </w:rPr>
-              <w:t xml:space="preserve">0.916</w:t>
-            </w:r>
-          </w:p>
-        </w:tc>
-        <w:tc>
-          <w:tcPr>
-            <w:tcW w:type="dxa" w:w="2500"/>
-            <w:tcBorders>
-              <w:top w:val="none" w:color="FFFFFF" w:sz="0"/>
-              <w:left w:val="none" w:color="FFFFFF" w:sz="0"/>
-              <w:bottom w:val="single" w:color="000000" w:sz="4"/>
-              <w:right w:val="none" w:color="FFFFFF" w:sz="0"/>
-            </w:tcBorders>
-            <w:tcMar>
-              <w:top w:type="dxa" w:w="50"/>
-              <w:left w:type="dxa" w:w="70"/>
-              <w:bottom w:type="dxa" w:w="50"/>
-              <w:right w:type="dxa" w:w="70"/>
-            </w:tcMar>
-          </w:tcPr>
-          <w:p>
-            <w:pPr>
-              <w:bidi/>
-              <w:spacing w:after="0" w:line="276"/>
-              <w:jc w:val="center"/>
-            </w:pPr>
-            <w:r>
-              <w:rPr>
-                <w:rFonts w:ascii="Times New Roman" w:cs="David" w:eastAsia="David" w:hAnsi="Times New Roman"/>
-                <w:b w:val="false"/>
-                <w:bCs w:val="false"/>
-                <w:noProof/>
-                <w:sz w:val="22"/>
-                <w:szCs w:val="22"/>
-                <w:rtl/>
-                <w:lang w:val="en-US" w:eastAsia="en-US" w:bidi="he-IL"/>
-              </w:rPr>
-              <w:t xml:space="preserve">0.976</w:t>
-            </w:r>
-          </w:p>
-        </w:tc>
-        <w:tc>
-          <w:tcPr>
-            <w:tcW w:type="dxa" w:w="2400"/>
-            <w:tcBorders>
-              <w:top w:val="none" w:color="FFFFFF" w:sz="0"/>
-              <w:left w:val="none" w:color="FFFFFF" w:sz="0"/>
-              <w:bottom w:val="single" w:color="000000" w:sz="4"/>
-              <w:right w:val="none" w:color="FFFFFF" w:sz="0"/>
-            </w:tcBorders>
-            <w:tcMar>
-              <w:top w:type="dxa" w:w="50"/>
-              <w:left w:type="dxa" w:w="70"/>
-              <w:bottom w:type="dxa" w:w="50"/>
-              <w:right w:type="dxa" w:w="70"/>
-            </w:tcMar>
-          </w:tcPr>
-          <w:p>
-            <w:pPr>
-              <w:bidi/>
-              <w:spacing w:after="0" w:line="276"/>
-              <w:jc w:val="center"/>
-            </w:pPr>
-            <w:r>
-              <w:rPr>
-                <w:rFonts w:ascii="Times New Roman" w:cs="David" w:eastAsia="David" w:hAnsi="Times New Roman"/>
-                <w:b w:val="false"/>
-                <w:bCs w:val="false"/>
-                <w:noProof/>
-                <w:sz w:val="22"/>
-                <w:szCs w:val="22"/>
-                <w:rtl/>
-                <w:lang w:val="en-US" w:eastAsia="en-US" w:bidi="he-IL"/>
-              </w:rPr>
-              <w:t xml:space="preserve">0.925</w:t>
-            </w:r>
-          </w:p>
-        </w:tc>
-      </w:tr>
-    </w:tbl>
-    <w:p>
-      <w:pPr>
-        <w:bidi/>
-        <w:spacing w:after="120" w:line="276"/>
-        <w:jc w:val="both"/>
-      </w:pPr>
-      <w:r>
-        <w:rPr>
-          <w:rFonts w:ascii="Times New Roman" w:cs="David" w:eastAsia="David" w:hAnsi="Times New Roman"/>
-          <w:noProof/>
-          <w:sz w:val="20"/>
-          <w:szCs w:val="20"/>
-          <w:rtl/>
-          <w:lang w:val="en-US" w:eastAsia="en-US" w:bidi="he-IL"/>
-        </w:rPr>
-        <w:t xml:space="preserve">הערה. תדירות הפעילות הנמרצת מקודדת הפוך: ערך גבוה = פחות פעילות. מקור: פלט Correlations, נספח ב'.</w:t>
-      </w:r>
-    </w:p>
-    <w:p>
-      <w:pPr>
-        <w:bidi/>
-        <w:spacing w:after="120" w:line="360"/>
-        <w:jc w:val="both"/>
-      </w:pPr>
-      <w:r>
-        <w:rPr>
-          <w:rFonts w:ascii="Times New Roman" w:cs="David" w:eastAsia="David" w:hAnsi="Times New Roman"/>
-          <w:noProof/>
-          <w:sz w:val="24"/>
-          <w:szCs w:val="24"/>
-          <w:rtl/>
-          <w:lang w:val="en-US" w:eastAsia="en-US" w:bidi="he-IL"/>
-        </w:rPr>
-        <w:t xml:space="preserve">מלוח 6 עולה כי ההשערה לא אוששה. בקבוצת המחקר לא נמצא קשר בין זמן מסך הפנאי לבין מספר הימים עם 60 דקות פעילות, מספר שעות הפעילות הנמרצת בשבוע או תדירותה, וכל המתאמים קרובים לאפס. גם בכלל המדגם הקשר היה חלש ולא מובהק (r = -0.16, p = 0.191). תלמידים שצפו במסכים שעות רבות לא היו בהכרח פחות פעילים מתלמידים שצפו מעט, ולהפך.</w:t>
+        <w:t xml:space="preserve">ההשערה השנייה שיערה קשר שלילי בין היקף החשיפה למסכים לבין היקף הפעילות הגופנית. ההשערה לא אוששה. בקבוצת המחקר לא נמצא קשר בין זמן מסך הפנאי לבין מספר הימים עם 60 דקות פעילות, מספר שעות הפעילות הנמרצת בשבוע או תדירותה, וכל המתאמים היו קרובים לאפס (r בין -0.09 ל-0.05, פלט Correlations, נספח ב'). גם בכלל המדגם הקשר היה חלש ולא מובהק (r = -0.16, p = 0.191). תלמידים שצפו במסכים שעות רבות לא היו בהכרח פחות פעילים מתלמידים שצפו מעט, ולהפך.</w:t>
       </w:r>
     </w:p>
     <w:p>
@@ -11478,7 +8984,7 @@
           <w:rtl/>
           <w:lang w:val="en-US" w:eastAsia="en-US" w:bidi="he-IL"/>
         </w:rPr>
-        <w:t xml:space="preserve">ההשערה השלישית שיערה קשר שלילי בין החשיפה למסכים לבין התפקוד הלימודי המדווח, וקשר חיובי בין שינה ופעילות גופנית לבין התפקוד הלימודי. לוח 7 מציג את המתאמים בקבוצת המחקר, ותרשים 2 מציג את הקשר בין זמן המסך לממוצע הציונים.</w:t>
+        <w:t xml:space="preserve">ההשערה השלישית שיערה קשר שלילי בין החשיפה למסכים לבין התפקוד הלימודי המדווח, וקשר חיובי בין שינה ופעילות גופנית לבין התפקוד הלימודי. לוח 4 מציג את המתאמים בקבוצת המחקר.</w:t>
       </w:r>
     </w:p>
     <w:p>
@@ -11499,7 +9005,7 @@
           <w:rtl/>
           <w:lang w:val="en-US" w:eastAsia="en-US" w:bidi="he-IL"/>
         </w:rPr>
-        <w:t xml:space="preserve">לוח 7: מתאמי פירסון בין שלוש ההתנהגויות לבין התפקוד הלימודי בקבוצת המחקר (n = 40)</w:t>
+        <w:t xml:space="preserve">לוח 4: מתאמי פירסון בין שלוש ההתנהגויות לבין התפקוד הלימודי בקבוצת המחקר (n = 40)</w:t>
       </w:r>
     </w:p>
     <w:tbl>
@@ -12694,74 +10200,20 @@
     </w:p>
     <w:p>
       <w:pPr>
-        <w:keepNext/>
         <w:bidi/>
-        <w:spacing w:after="80" w:before="200" w:line="360"/>
-        <w:jc w:val="right"/>
+        <w:spacing w:after="120" w:line="360"/>
+        <w:jc w:val="both"/>
       </w:pPr>
       <w:r>
         <w:rPr>
           <w:rFonts w:ascii="Times New Roman" w:cs="David" w:eastAsia="David" w:hAnsi="Times New Roman"/>
-          <w:b/>
-          <w:bCs/>
           <w:noProof/>
           <w:sz w:val="24"/>
           <w:szCs w:val="24"/>
           <w:rtl/>
           <w:lang w:val="en-US" w:eastAsia="en-US" w:bidi="he-IL"/>
         </w:rPr>
-        <w:t xml:space="preserve">תרשים 2: הקשר בין זמן מסך פנאי יומי לבין ממוצע הציונים בקבוצת המחקר (n = 40)</w:t>
-      </w:r>
-    </w:p>
-    <w:p>
-      <w:pPr>
-        <w:keepNext/>
-        <w:spacing w:after="60" w:before="120"/>
-        <w:jc w:val="center"/>
-      </w:pPr>
-      <w:r>
-        <w:rPr>
-          <w:noProof/>
-          <w:lang w:val="en-US" w:eastAsia="en-US" w:bidi="he-IL"/>
-        </w:rPr>
-        <w:drawing>
-          <wp:inline distT="0" distB="0" distL="0" distR="0">
-            <wp:extent cx="4495800" cy="2914650"/>
-            <wp:effectExtent t="0" r="0" b="0" l="0"/>
-            <wp:docPr id="1" name="" descr="" title=""/>
-            <wp:cNvGraphicFramePr>
-              <a:graphicFrameLocks xmlns:a="http://schemas.openxmlformats.org/drawingml/2006/main" noChangeAspect="1"/>
-            </wp:cNvGraphicFramePr>
-            <a:graphic xmlns:a="http://schemas.openxmlformats.org/drawingml/2006/main">
-              <a:graphicData uri="http://schemas.openxmlformats.org/drawingml/2006/picture">
-                <pic:pic xmlns:pic="http://schemas.openxmlformats.org/drawingml/2006/picture">
-                  <pic:nvPicPr>
-                    <pic:cNvPr id="0" name="" descr=""/>
-                    <pic:cNvPicPr>
-                      <a:picLocks noChangeAspect="1" noChangeArrowheads="1"/>
-                    </pic:cNvPicPr>
-                  </pic:nvPicPr>
-                  <pic:blipFill>
-                    <a:blip r:embed="rId11" cstate="none"/>
-                    <a:srcRect/>
-                    <a:stretch>
-                      <a:fillRect/>
-                    </a:stretch>
-                  </pic:blipFill>
-                  <pic:spPr bwMode="auto">
-                    <a:xfrm>
-                      <a:off x="0" y="0"/>
-                      <a:ext cx="4495800" cy="2914650"/>
-                    </a:xfrm>
-                    <a:prstGeom prst="rect">
-                      <a:avLst/>
-                    </a:prstGeom>
-                  </pic:spPr>
-                </pic:pic>
-              </a:graphicData>
-            </a:graphic>
-          </wp:inline>
-        </w:drawing>
+        <w:t xml:space="preserve">מלוח 4 עולה כי החלק הראשון של ההשערה אושש באופן ברור: זמן מסך הפנאי היה קשור באופן שלילי לממוצע הציונים (r = -0.53, p &lt; 0.001), לציון במתמטיקה (r = -0.46, p = 0.003), לציון באנגלית (r = -0.34, p = 0.032) ולתפקוד היומי בלמידה (r = -0.44, p = 0.005). החלק השני אושש חלקית. משך השינה עצמו לא היה קשור לציונים, אך היה קשור לתפקוד היומי בלמידה (r = 0.46, p = 0.003). סדירות השינה כן הייתה קשורה לציונים: איחור גדול יותר של שעת השינה בסוף השבוע היה קשור לממוצע ציונים נמוך יותר (r = -0.35, p = 0.028) ולציון נמוך יותר במתמטיקה (r = -0.39, p = 0.013). ישנוניות בשעות היום הייתה קשורה לממוצע ציונים נמוך יותר (r = -0.35, p = 0.027) ולתפקוד יומי נמוך יותר (r = -0.53, p &lt; 0.001). הפעילות הגופנית לא הייתה קשורה באופן מובהק לאף אחד ממדדי התפקוד הלימודי, אם כי כיוון הקשר עם ממוצע הציונים היה חיובי (r = 0.25, p = 0.114).</w:t>
       </w:r>
     </w:p>
     <w:p>
@@ -12779,25 +10231,7 @@
           <w:rtl/>
           <w:lang w:val="en-US" w:eastAsia="en-US" w:bidi="he-IL"/>
         </w:rPr>
-        <w:t xml:space="preserve">מלוח 7 ומתרשים 2 עולה כי החלק הראשון של ההשערה אושש באופן ברור: זמן מסך הפנאי היה קשור באופן שלילי לממוצע הציונים (r = -0.53, p &lt; 0.001), לציון במתמטיקה (r = -0.46, p = 0.003), לציון באנגלית (r = -0.34, p = 0.032) ולתפקוד היומי בלמידה (r = -0.44, p = 0.005). הקשר החזק ביותר נמצא עם ממוצע הציונים ועם המתמטיקה. החלק השני אושש חלקית. משך השינה עצמו לא היה קשור לציונים, אך היה קשור לתפקוד היומי בלמידה (r = 0.46, p = 0.003). סדירות השינה כן הייתה קשורה לציונים: איחור גדול יותר של שעת השינה בסוף השבוע היה קשור לממוצע ציונים נמוך יותר (r = -0.35, p = 0.028) ולציון נמוך יותר במתמטיקה (r = -0.39, p = 0.013). ישנוניות בשעות היום הייתה קשורה לממוצע ציונים נמוך יותר (r = -0.35, p = 0.027) ולתפקוד יומי נמוך יותר (r = -0.53, p &lt; 0.001). הפעילות הגופנית לא הייתה קשורה באופן מובהק לאף אחד ממדדי התפקוד הלימודי, אם כי כיוון הקשר עם ממוצע הציונים היה חיובי (r = 0.25, p = 0.114).</w:t>
-      </w:r>
-    </w:p>
-    <w:p>
-      <w:pPr>
-        <w:bidi/>
-        <w:spacing w:after="120" w:line="360"/>
-        <w:jc w:val="both"/>
-      </w:pPr>
-      <w:r>
-        <w:rPr>
-          <w:rFonts w:ascii="Times New Roman" w:cs="David" w:eastAsia="David" w:hAnsi="Times New Roman"/>
-          <w:noProof/>
-          <w:sz w:val="24"/>
-          <w:szCs w:val="24"/>
-          <w:rtl/>
-          <w:lang w:val="en-US" w:eastAsia="en-US" w:bidi="he-IL"/>
-        </w:rPr>
-        <w:t xml:space="preserve">כדי לבחון את התרומה הייחודית של כל התנהגות נערכה רגרסיה לינארית מרובה שבה ממוצע הציונים היה המשתנה התלוי. לוח 8 מציג את תוצאותיה.</w:t>
+        <w:t xml:space="preserve">כדי לבחון את התרומה הייחודית של כל התנהגות נערכה רגרסיה לינארית מרובה שבה ממוצע הציונים היה המשתנה התלוי. לוח 5 מציג את תוצאותיה.</w:t>
       </w:r>
     </w:p>
     <w:p>
@@ -12818,7 +10252,7 @@
           <w:rtl/>
           <w:lang w:val="en-US" w:eastAsia="en-US" w:bidi="he-IL"/>
         </w:rPr>
-        <w:t xml:space="preserve">לוח 8: רגרסיה לינארית מרובה לניבוי ממוצע הציונים בקבוצת המחקר (n = 40)</w:t>
+        <w:t xml:space="preserve">לוח 5: רגרסיה לינארית מרובה לניבוי ממוצע הציונים בקבוצת המחקר (n = 40)</w:t>
       </w:r>
     </w:p>
     <w:tbl>
@@ -14250,7 +11684,7 @@
           <w:rtl/>
           <w:lang w:val="en-US" w:eastAsia="en-US" w:bidi="he-IL"/>
         </w:rPr>
-        <w:t xml:space="preserve">מלוח 8 ניתן ללמוד כי המודל מובהק ומסביר 37 אחוזים מהשונות בממוצע הציונים. המנבא היחיד שתרם תרומה ייחודית מובהקת היה זמן מסך הפנאי (β = -0.41, p = 0.019): כל שעה נוספת של מסך ביום נקשרה לירידה של כ-1.5 נקודות בממוצע הציונים, בפיקוח על יתר המשתנים. תרומתה של הפעילות הגופנית הייתה חיובית אך לא מובהקת (β = 0.23, p = 0.136), ותרומת משתני השינה נבלעה ככל הנראה בקשר שלהם עם זמן המסך.</w:t>
+        <w:t xml:space="preserve">מלוח 5 ניתן ללמוד כי המודל מובהק ומסביר 37 אחוזים מהשונות בממוצע הציונים. המנבא היחיד שתרם תרומה ייחודית מובהקת היה זמן מסך הפנאי (β = -0.41, p = 0.019): כל שעה נוספת של מסך ביום נקשרה לירידה של כ-1.5 נקודות בממוצע הציונים, בפיקוח על יתר המשתנים. תרומתה של הפעילות הגופנית הייתה חיובית אך לא מובהקת (β = 0.23, p = 0.136), ותרומת משתני השינה נבלעה ככל הנראה בקשר שלהם עם זמן המסך.</w:t>
       </w:r>
     </w:p>
     <w:p>
@@ -14290,7 +11724,7 @@
           <w:rtl/>
           <w:lang w:val="en-US" w:eastAsia="en-US" w:bidi="he-IL"/>
         </w:rPr>
-        <w:t xml:space="preserve">ההשערה הרביעית שיערה שתלמידים העומדים בשתי המלצות לפחות ידווחו על תפקוד לימודי גבוה יותר מתלמידים העומדים בהמלצה אחת או באף אחת. מאחר שרק חמישה תלמידים בכלל המדגם עמדו בשתי המלצות או יותר, ההשערה נבדקה בכלל המדגם (N = 65) בניתוח שונות חד-כיווני עם שלוש קבוצות. לוח 9 ותרשים 3 מציגים את התוצאות.</w:t>
+        <w:t xml:space="preserve">ההשערה הרביעית שיערה שתלמידים העומדים בשתי המלצות לפחות ידווחו על תפקוד לימודי גבוה יותר מתלמידים העומדים בהמלצה אחת או באף אחת. מאחר שרק חמישה תלמידים בכלל המדגם עמדו בשתי המלצות או יותר, ההשערה נבדקה בכלל המדגם (N = 65) בניתוח שונות חד-כיווני עם שלוש קבוצות. לוח 6 מציג את התוצאות.</w:t>
       </w:r>
     </w:p>
     <w:p>
@@ -14311,7 +11745,7 @@
           <w:rtl/>
           <w:lang w:val="en-US" w:eastAsia="en-US" w:bidi="he-IL"/>
         </w:rPr>
-        <w:t xml:space="preserve">לוח 9: ממוצע ציונים ותפקוד יומי לפי מספר ההמלצות שמתקיימות (N = 65)</w:t>
+        <w:t xml:space="preserve">לוח 6: ממוצע ציונים ותפקוד יומי לפי מספר ההמלצות שמתקיימות (N = 65)</w:t>
       </w:r>
     </w:p>
     <w:tbl>
@@ -15128,78 +12562,6 @@
     </w:p>
     <w:p>
       <w:pPr>
-        <w:keepNext/>
-        <w:bidi/>
-        <w:spacing w:after="80" w:before="200" w:line="360"/>
-        <w:jc w:val="right"/>
-      </w:pPr>
-      <w:r>
-        <w:rPr>
-          <w:rFonts w:ascii="Times New Roman" w:cs="David" w:eastAsia="David" w:hAnsi="Times New Roman"/>
-          <w:b/>
-          <w:bCs/>
-          <w:noProof/>
-          <w:sz w:val="24"/>
-          <w:szCs w:val="24"/>
-          <w:rtl/>
-          <w:lang w:val="en-US" w:eastAsia="en-US" w:bidi="he-IL"/>
-        </w:rPr>
-        <w:t xml:space="preserve">תרשים 3: ממוצע הציונים לפי מספר ההמלצות שמתקיימות (N = 65, קווי השגיאה מייצגים שגיאת תקן)</w:t>
-      </w:r>
-    </w:p>
-    <w:p>
-      <w:pPr>
-        <w:keepNext/>
-        <w:spacing w:after="60" w:before="120"/>
-        <w:jc w:val="center"/>
-      </w:pPr>
-      <w:r>
-        <w:rPr>
-          <w:noProof/>
-          <w:lang w:val="en-US" w:eastAsia="en-US" w:bidi="he-IL"/>
-        </w:rPr>
-        <w:drawing>
-          <wp:inline distT="0" distB="0" distL="0" distR="0">
-            <wp:extent cx="3962400" cy="2733675"/>
-            <wp:effectExtent t="0" r="0" b="0" l="0"/>
-            <wp:docPr id="1" name="" descr="" title=""/>
-            <wp:cNvGraphicFramePr>
-              <a:graphicFrameLocks xmlns:a="http://schemas.openxmlformats.org/drawingml/2006/main" noChangeAspect="1"/>
-            </wp:cNvGraphicFramePr>
-            <a:graphic xmlns:a="http://schemas.openxmlformats.org/drawingml/2006/main">
-              <a:graphicData uri="http://schemas.openxmlformats.org/drawingml/2006/picture">
-                <pic:pic xmlns:pic="http://schemas.openxmlformats.org/drawingml/2006/picture">
-                  <pic:nvPicPr>
-                    <pic:cNvPr id="0" name="" descr=""/>
-                    <pic:cNvPicPr>
-                      <a:picLocks noChangeAspect="1" noChangeArrowheads="1"/>
-                    </pic:cNvPicPr>
-                  </pic:nvPicPr>
-                  <pic:blipFill>
-                    <a:blip r:embed="rId12" cstate="none"/>
-                    <a:srcRect/>
-                    <a:stretch>
-                      <a:fillRect/>
-                    </a:stretch>
-                  </pic:blipFill>
-                  <pic:spPr bwMode="auto">
-                    <a:xfrm>
-                      <a:off x="0" y="0"/>
-                      <a:ext cx="3962400" cy="2733675"/>
-                    </a:xfrm>
-                    <a:prstGeom prst="rect">
-                      <a:avLst/>
-                    </a:prstGeom>
-                  </pic:spPr>
-                </pic:pic>
-              </a:graphicData>
-            </a:graphic>
-          </wp:inline>
-        </w:drawing>
-      </w:r>
-    </w:p>
-    <w:p>
-      <w:pPr>
         <w:bidi/>
         <w:spacing w:after="120" w:line="360"/>
         <w:jc w:val="both"/>
@@ -15213,7 +12575,7 @@
           <w:rtl/>
           <w:lang w:val="en-US" w:eastAsia="en-US" w:bidi="he-IL"/>
         </w:rPr>
-        <w:t xml:space="preserve">מלוח 9 ומתרשים 3 עולה כי ההבדל בממוצע הציונים בין הקבוצות מובהק: ממוצע הציונים היה 71.65 בקרב תלמידים שלא עמדו באף המלצה, 77.04 בקרב העומדים בהמלצה אחת ו-80.20 בקרב העומדים בשתיים או יותר. ההבדל בין אף המלצה לבין המלצה אחת מובהק, וההבדל בין אף המלצה לבין שתיים או יותר קרוב למובהקות, ככל הנראה בגלל גודלה הקטן של הקבוצה. תמונה דומה התקבלה בתפקוד היומי בלמידה. ההשערה אוששה בעיקרה: כל המלצה נוספת שהתלמיד עומד בה מלווה בתפקוד לימודי טוב יותר.</w:t>
+        <w:t xml:space="preserve">מלוח 6 עולה כי ההבדל בממוצע הציונים בין הקבוצות מובהק: ממוצע הציונים היה 71.65 בקרב תלמידים שלא עמדו באף המלצה, 77.04 בקרב העומדים בהמלצה אחת ו-80.20 בקרב העומדים בשתיים או יותר. ההבדל בין אף המלצה לבין המלצה אחת מובהק, וההבדל בין אף המלצה לבין שתיים או יותר קרוב למובהקות, ככל הנראה בגלל גודלה הקטן של הקבוצה. תמונה דומה התקבלה בתפקוד היומי בלמידה. ההשערה אוששה בעיקרה: כל המלצה נוספת שהתלמיד עומד בה מלווה בתפקוד לימודי טוב יותר.</w:t>
       </w:r>
     </w:p>
     <w:p>
@@ -15253,7 +12615,7 @@
           <w:rtl/>
           <w:lang w:val="en-US" w:eastAsia="en-US" w:bidi="he-IL"/>
         </w:rPr>
-        <w:t xml:space="preserve">ההשערה החמישית שיערה שתלמידים עם לקויות למידה ידווחו על משך שינה קצר יותר, על ישנוניות רבה יותר ועל פעילות גופנית מועטה יותר, ושהשיעור העומד בהמלצות יהיה נמוך יותר בקרבם. לגבי כמות המסכים לא נוסחה השערה מכוונת. לוח 10 מציג את תוצאות מבחני t למדגמים בלתי תלויים, ולוח 11 את מבחני חי בריבוע לעמידה בהמלצות.</w:t>
+        <w:t xml:space="preserve">ההשערה החמישית שיערה שתלמידים עם לקויות למידה ידווחו על משך שינה קצר יותר, על ישנוניות רבה יותר ועל פעילות גופנית מועטה יותר, ושהשיעור העומד בהמלצות יהיה נמוך יותר בקרבם. לגבי כמות המסכים לא נוסחה השערה מכוונת. לוח 7 מציג את תוצאות מבחני t למדגמים בלתי תלויים, ואחריו מדווחים מבחני חי בריבוע לעמידה בהמלצות.</w:t>
       </w:r>
     </w:p>
     <w:p>
@@ -15274,7 +12636,7 @@
           <w:rtl/>
           <w:lang w:val="en-US" w:eastAsia="en-US" w:bidi="he-IL"/>
         </w:rPr>
-        <w:t xml:space="preserve">לוח 10: השוואת ממוצעים בין הקבוצות במבחני t למדגמים בלתי תלויים</w:t>
+        <w:t xml:space="preserve">לוח 7: השוואת ממוצעים בין הקבוצות במבחני t למדגמים בלתי תלויים</w:t>
       </w:r>
     </w:p>
     <w:tbl>
@@ -17605,835 +14967,6 @@
     </w:p>
     <w:p>
       <w:pPr>
-        <w:keepNext/>
-        <w:bidi/>
-        <w:spacing w:after="80" w:before="200" w:line="360"/>
-        <w:jc w:val="right"/>
-      </w:pPr>
-      <w:r>
-        <w:rPr>
-          <w:rFonts w:ascii="Times New Roman" w:cs="David" w:eastAsia="David" w:hAnsi="Times New Roman"/>
-          <w:b/>
-          <w:bCs/>
-          <w:noProof/>
-          <w:sz w:val="24"/>
-          <w:szCs w:val="24"/>
-          <w:rtl/>
-          <w:lang w:val="en-US" w:eastAsia="en-US" w:bidi="he-IL"/>
-        </w:rPr>
-        <w:t xml:space="preserve">לוח 11: עמידה בהמלצות לפי קבוצה, מבחני חי בריבוע</w:t>
-      </w:r>
-    </w:p>
-    <w:tbl>
-      <w:tblPr>
-        <w:bidiVisual/>
-        <w:tblW w:type="dxa" w:w="10700"/>
-        <w:tblBorders>
-          <w:top w:val="single" w:color="000000" w:sz="4"/>
-          <w:left w:val="none" w:color="FFFFFF" w:sz="0"/>
-          <w:bottom w:val="single" w:color="000000" w:sz="4"/>
-          <w:right w:val="none" w:color="FFFFFF" w:sz="0"/>
-          <w:insideH w:val="none" w:color="FFFFFF" w:sz="0"/>
-          <w:insideV w:val="none" w:color="FFFFFF" w:sz="0"/>
-        </w:tblBorders>
-      </w:tblPr>
-      <w:tblGrid>
-        <w:gridCol w:w="3300"/>
-        <w:gridCol w:w="2400"/>
-        <w:gridCol w:w="2400"/>
-        <w:gridCol w:w="1300"/>
-        <w:gridCol w:w="1300"/>
-      </w:tblGrid>
-      <w:tr>
-        <w:trPr>
-          <w:cantSplit/>
-          <w:tblHeader/>
-        </w:trPr>
-        <w:tc>
-          <w:tcPr>
-            <w:tcW w:type="dxa" w:w="3300"/>
-            <w:tcBorders>
-              <w:top w:val="single" w:color="000000" w:sz="4"/>
-              <w:left w:val="none" w:color="FFFFFF" w:sz="0"/>
-              <w:bottom w:val="single" w:color="000000" w:sz="4"/>
-              <w:right w:val="none" w:color="FFFFFF" w:sz="0"/>
-            </w:tcBorders>
-            <w:shd w:fill="EDEDED" w:color="auto" w:val="clear"/>
-            <w:tcMar>
-              <w:top w:type="dxa" w:w="50"/>
-              <w:left w:type="dxa" w:w="70"/>
-              <w:bottom w:type="dxa" w:w="50"/>
-              <w:right w:type="dxa" w:w="70"/>
-            </w:tcMar>
-          </w:tcPr>
-          <w:p>
-            <w:pPr>
-              <w:bidi/>
-              <w:spacing w:after="0" w:line="276"/>
-              <w:jc w:val="right"/>
-            </w:pPr>
-            <w:r>
-              <w:rPr>
-                <w:rFonts w:ascii="Times New Roman" w:cs="David" w:eastAsia="David" w:hAnsi="Times New Roman"/>
-                <w:b/>
-                <w:bCs/>
-                <w:noProof/>
-                <w:sz w:val="22"/>
-                <w:szCs w:val="22"/>
-                <w:rtl/>
-                <w:lang w:val="en-US" w:eastAsia="en-US" w:bidi="he-IL"/>
-              </w:rPr>
-              <w:t xml:space="preserve">המלצה</w:t>
-            </w:r>
-          </w:p>
-        </w:tc>
-        <w:tc>
-          <w:tcPr>
-            <w:tcW w:type="dxa" w:w="2400"/>
-            <w:tcBorders>
-              <w:top w:val="single" w:color="000000" w:sz="4"/>
-              <w:left w:val="none" w:color="FFFFFF" w:sz="0"/>
-              <w:bottom w:val="single" w:color="000000" w:sz="4"/>
-              <w:right w:val="none" w:color="FFFFFF" w:sz="0"/>
-            </w:tcBorders>
-            <w:shd w:fill="EDEDED" w:color="auto" w:val="clear"/>
-            <w:tcMar>
-              <w:top w:type="dxa" w:w="50"/>
-              <w:left w:type="dxa" w:w="70"/>
-              <w:bottom w:type="dxa" w:w="50"/>
-              <w:right w:type="dxa" w:w="70"/>
-            </w:tcMar>
-          </w:tcPr>
-          <w:p>
-            <w:pPr>
-              <w:bidi/>
-              <w:spacing w:after="0" w:line="276"/>
-              <w:jc w:val="center"/>
-            </w:pPr>
-            <w:r>
-              <w:rPr>
-                <w:rFonts w:ascii="Times New Roman" w:cs="David" w:eastAsia="David" w:hAnsi="Times New Roman"/>
-                <w:b/>
-                <w:bCs/>
-                <w:noProof/>
-                <w:sz w:val="22"/>
-                <w:szCs w:val="22"/>
-                <w:rtl/>
-                <w:lang w:val="en-US" w:eastAsia="en-US" w:bidi="he-IL"/>
-              </w:rPr>
-              <w:t xml:space="preserve">עם לקות למידה: עומדים</w:t>
-            </w:r>
-          </w:p>
-        </w:tc>
-        <w:tc>
-          <w:tcPr>
-            <w:tcW w:type="dxa" w:w="2400"/>
-            <w:tcBorders>
-              <w:top w:val="single" w:color="000000" w:sz="4"/>
-              <w:left w:val="none" w:color="FFFFFF" w:sz="0"/>
-              <w:bottom w:val="single" w:color="000000" w:sz="4"/>
-              <w:right w:val="none" w:color="FFFFFF" w:sz="0"/>
-            </w:tcBorders>
-            <w:shd w:fill="EDEDED" w:color="auto" w:val="clear"/>
-            <w:tcMar>
-              <w:top w:type="dxa" w:w="50"/>
-              <w:left w:type="dxa" w:w="70"/>
-              <w:bottom w:type="dxa" w:w="50"/>
-              <w:right w:type="dxa" w:w="70"/>
-            </w:tcMar>
-          </w:tcPr>
-          <w:p>
-            <w:pPr>
-              <w:bidi/>
-              <w:spacing w:after="0" w:line="276"/>
-              <w:jc w:val="center"/>
-            </w:pPr>
-            <w:r>
-              <w:rPr>
-                <w:rFonts w:ascii="Times New Roman" w:cs="David" w:eastAsia="David" w:hAnsi="Times New Roman"/>
-                <w:b/>
-                <w:bCs/>
-                <w:noProof/>
-                <w:sz w:val="22"/>
-                <w:szCs w:val="22"/>
-                <w:rtl/>
-                <w:lang w:val="en-US" w:eastAsia="en-US" w:bidi="he-IL"/>
-              </w:rPr>
-              <w:t xml:space="preserve">ללא לקות למידה: עומדים</w:t>
-            </w:r>
-          </w:p>
-        </w:tc>
-        <w:tc>
-          <w:tcPr>
-            <w:tcW w:type="dxa" w:w="1300"/>
-            <w:tcBorders>
-              <w:top w:val="single" w:color="000000" w:sz="4"/>
-              <w:left w:val="none" w:color="FFFFFF" w:sz="0"/>
-              <w:bottom w:val="single" w:color="000000" w:sz="4"/>
-              <w:right w:val="none" w:color="FFFFFF" w:sz="0"/>
-            </w:tcBorders>
-            <w:shd w:fill="EDEDED" w:color="auto" w:val="clear"/>
-            <w:tcMar>
-              <w:top w:type="dxa" w:w="50"/>
-              <w:left w:type="dxa" w:w="70"/>
-              <w:bottom w:type="dxa" w:w="50"/>
-              <w:right w:type="dxa" w:w="70"/>
-            </w:tcMar>
-          </w:tcPr>
-          <w:p>
-            <w:pPr>
-              <w:bidi/>
-              <w:spacing w:after="0" w:line="276"/>
-              <w:jc w:val="center"/>
-            </w:pPr>
-            <w:r>
-              <w:rPr>
-                <w:rFonts w:ascii="Times New Roman" w:cs="David" w:eastAsia="David" w:hAnsi="Times New Roman"/>
-                <w:b/>
-                <w:bCs/>
-                <w:noProof/>
-                <w:sz w:val="22"/>
-                <w:szCs w:val="22"/>
-                <w:rtl/>
-                <w:lang w:val="en-US" w:eastAsia="en-US" w:bidi="he-IL"/>
-              </w:rPr>
-              <w:t xml:space="preserve">χ²(1)</w:t>
-            </w:r>
-          </w:p>
-        </w:tc>
-        <w:tc>
-          <w:tcPr>
-            <w:tcW w:type="dxa" w:w="1300"/>
-            <w:tcBorders>
-              <w:top w:val="single" w:color="000000" w:sz="4"/>
-              <w:left w:val="none" w:color="FFFFFF" w:sz="0"/>
-              <w:bottom w:val="single" w:color="000000" w:sz="4"/>
-              <w:right w:val="none" w:color="FFFFFF" w:sz="0"/>
-            </w:tcBorders>
-            <w:shd w:fill="EDEDED" w:color="auto" w:val="clear"/>
-            <w:tcMar>
-              <w:top w:type="dxa" w:w="50"/>
-              <w:left w:type="dxa" w:w="70"/>
-              <w:bottom w:type="dxa" w:w="50"/>
-              <w:right w:type="dxa" w:w="70"/>
-            </w:tcMar>
-          </w:tcPr>
-          <w:p>
-            <w:pPr>
-              <w:bidi/>
-              <w:spacing w:after="0" w:line="276"/>
-              <w:jc w:val="center"/>
-            </w:pPr>
-            <w:r>
-              <w:rPr>
-                <w:rFonts w:ascii="Times New Roman" w:cs="David" w:eastAsia="David" w:hAnsi="Times New Roman"/>
-                <w:b/>
-                <w:bCs/>
-                <w:noProof/>
-                <w:sz w:val="22"/>
-                <w:szCs w:val="22"/>
-                <w:rtl/>
-                <w:lang w:val="en-US" w:eastAsia="en-US" w:bidi="he-IL"/>
-              </w:rPr>
-              <w:t xml:space="preserve">p</w:t>
-            </w:r>
-          </w:p>
-        </w:tc>
-      </w:tr>
-      <w:tr>
-        <w:trPr>
-          <w:cantSplit/>
-          <w:tblHeader w:val="false"/>
-        </w:trPr>
-        <w:tc>
-          <w:tcPr>
-            <w:tcW w:type="dxa" w:w="3300"/>
-            <w:tcBorders>
-              <w:top w:val="none" w:color="FFFFFF" w:sz="0"/>
-              <w:left w:val="none" w:color="FFFFFF" w:sz="0"/>
-              <w:bottom w:val="none" w:color="FFFFFF" w:sz="0"/>
-              <w:right w:val="none" w:color="FFFFFF" w:sz="0"/>
-            </w:tcBorders>
-            <w:tcMar>
-              <w:top w:type="dxa" w:w="50"/>
-              <w:left w:type="dxa" w:w="70"/>
-              <w:bottom w:type="dxa" w:w="50"/>
-              <w:right w:type="dxa" w:w="70"/>
-            </w:tcMar>
-          </w:tcPr>
-          <w:p>
-            <w:pPr>
-              <w:bidi/>
-              <w:spacing w:after="0" w:line="276"/>
-              <w:jc w:val="right"/>
-            </w:pPr>
-            <w:r>
-              <w:rPr>
-                <w:rFonts w:ascii="Times New Roman" w:cs="David" w:eastAsia="David" w:hAnsi="Times New Roman"/>
-                <w:b w:val="false"/>
-                <w:bCs w:val="false"/>
-                <w:noProof/>
-                <w:sz w:val="22"/>
-                <w:szCs w:val="22"/>
-                <w:rtl/>
-                <w:lang w:val="en-US" w:eastAsia="en-US" w:bidi="he-IL"/>
-              </w:rPr>
-              <w:t xml:space="preserve">זמן מסך עד שעתיים</w:t>
-            </w:r>
-          </w:p>
-        </w:tc>
-        <w:tc>
-          <w:tcPr>
-            <w:tcW w:type="dxa" w:w="2400"/>
-            <w:tcBorders>
-              <w:top w:val="none" w:color="FFFFFF" w:sz="0"/>
-              <w:left w:val="none" w:color="FFFFFF" w:sz="0"/>
-              <w:bottom w:val="none" w:color="FFFFFF" w:sz="0"/>
-              <w:right w:val="none" w:color="FFFFFF" w:sz="0"/>
-            </w:tcBorders>
-            <w:tcMar>
-              <w:top w:type="dxa" w:w="50"/>
-              <w:left w:type="dxa" w:w="70"/>
-              <w:bottom w:type="dxa" w:w="50"/>
-              <w:right w:type="dxa" w:w="70"/>
-            </w:tcMar>
-          </w:tcPr>
-          <w:p>
-            <w:pPr>
-              <w:bidi/>
-              <w:spacing w:after="0" w:line="276"/>
-              <w:jc w:val="center"/>
-            </w:pPr>
-            <w:r>
-              <w:rPr>
-                <w:rFonts w:ascii="Times New Roman" w:cs="David" w:eastAsia="David" w:hAnsi="Times New Roman"/>
-                <w:b w:val="false"/>
-                <w:bCs w:val="false"/>
-                <w:noProof/>
-                <w:sz w:val="22"/>
-                <w:szCs w:val="22"/>
-                <w:rtl/>
-                <w:lang w:val="en-US" w:eastAsia="en-US" w:bidi="he-IL"/>
-              </w:rPr>
-              <w:t xml:space="preserve">6 (15.0%)</w:t>
-            </w:r>
-          </w:p>
-        </w:tc>
-        <w:tc>
-          <w:tcPr>
-            <w:tcW w:type="dxa" w:w="2400"/>
-            <w:tcBorders>
-              <w:top w:val="none" w:color="FFFFFF" w:sz="0"/>
-              <w:left w:val="none" w:color="FFFFFF" w:sz="0"/>
-              <w:bottom w:val="none" w:color="FFFFFF" w:sz="0"/>
-              <w:right w:val="none" w:color="FFFFFF" w:sz="0"/>
-            </w:tcBorders>
-            <w:tcMar>
-              <w:top w:type="dxa" w:w="50"/>
-              <w:left w:type="dxa" w:w="70"/>
-              <w:bottom w:type="dxa" w:w="50"/>
-              <w:right w:type="dxa" w:w="70"/>
-            </w:tcMar>
-          </w:tcPr>
-          <w:p>
-            <w:pPr>
-              <w:bidi/>
-              <w:spacing w:after="0" w:line="276"/>
-              <w:jc w:val="center"/>
-            </w:pPr>
-            <w:r>
-              <w:rPr>
-                <w:rFonts w:ascii="Times New Roman" w:cs="David" w:eastAsia="David" w:hAnsi="Times New Roman"/>
-                <w:b w:val="false"/>
-                <w:bCs w:val="false"/>
-                <w:noProof/>
-                <w:sz w:val="22"/>
-                <w:szCs w:val="22"/>
-                <w:rtl/>
-                <w:lang w:val="en-US" w:eastAsia="en-US" w:bidi="he-IL"/>
-              </w:rPr>
-              <w:t xml:space="preserve">3 (12.0%)</w:t>
-            </w:r>
-          </w:p>
-        </w:tc>
-        <w:tc>
-          <w:tcPr>
-            <w:tcW w:type="dxa" w:w="1300"/>
-            <w:tcBorders>
-              <w:top w:val="none" w:color="FFFFFF" w:sz="0"/>
-              <w:left w:val="none" w:color="FFFFFF" w:sz="0"/>
-              <w:bottom w:val="none" w:color="FFFFFF" w:sz="0"/>
-              <w:right w:val="none" w:color="FFFFFF" w:sz="0"/>
-            </w:tcBorders>
-            <w:tcMar>
-              <w:top w:type="dxa" w:w="50"/>
-              <w:left w:type="dxa" w:w="70"/>
-              <w:bottom w:type="dxa" w:w="50"/>
-              <w:right w:type="dxa" w:w="70"/>
-            </w:tcMar>
-          </w:tcPr>
-          <w:p>
-            <w:pPr>
-              <w:bidi/>
-              <w:spacing w:after="0" w:line="276"/>
-              <w:jc w:val="center"/>
-            </w:pPr>
-            <w:r>
-              <w:rPr>
-                <w:rFonts w:ascii="Times New Roman" w:cs="David" w:eastAsia="David" w:hAnsi="Times New Roman"/>
-                <w:b w:val="false"/>
-                <w:bCs w:val="false"/>
-                <w:noProof/>
-                <w:sz w:val="22"/>
-                <w:szCs w:val="22"/>
-                <w:rtl/>
-                <w:lang w:val="en-US" w:eastAsia="en-US" w:bidi="he-IL"/>
-              </w:rPr>
-              <w:t xml:space="preserve">0.12</w:t>
-            </w:r>
-          </w:p>
-        </w:tc>
-        <w:tc>
-          <w:tcPr>
-            <w:tcW w:type="dxa" w:w="1300"/>
-            <w:tcBorders>
-              <w:top w:val="none" w:color="FFFFFF" w:sz="0"/>
-              <w:left w:val="none" w:color="FFFFFF" w:sz="0"/>
-              <w:bottom w:val="none" w:color="FFFFFF" w:sz="0"/>
-              <w:right w:val="none" w:color="FFFFFF" w:sz="0"/>
-            </w:tcBorders>
-            <w:tcMar>
-              <w:top w:type="dxa" w:w="50"/>
-              <w:left w:type="dxa" w:w="70"/>
-              <w:bottom w:type="dxa" w:w="50"/>
-              <w:right w:type="dxa" w:w="70"/>
-            </w:tcMar>
-          </w:tcPr>
-          <w:p>
-            <w:pPr>
-              <w:bidi/>
-              <w:spacing w:after="0" w:line="276"/>
-              <w:jc w:val="center"/>
-            </w:pPr>
-            <w:r>
-              <w:rPr>
-                <w:rFonts w:ascii="Times New Roman" w:cs="David" w:eastAsia="David" w:hAnsi="Times New Roman"/>
-                <w:b w:val="false"/>
-                <w:bCs w:val="false"/>
-                <w:noProof/>
-                <w:sz w:val="22"/>
-                <w:szCs w:val="22"/>
-                <w:rtl/>
-                <w:lang w:val="en-US" w:eastAsia="en-US" w:bidi="he-IL"/>
-              </w:rPr>
-              <w:t xml:space="preserve">0.733</w:t>
-            </w:r>
-          </w:p>
-        </w:tc>
-      </w:tr>
-      <w:tr>
-        <w:trPr>
-          <w:cantSplit/>
-          <w:tblHeader w:val="false"/>
-        </w:trPr>
-        <w:tc>
-          <w:tcPr>
-            <w:tcW w:type="dxa" w:w="3300"/>
-            <w:tcBorders>
-              <w:top w:val="none" w:color="FFFFFF" w:sz="0"/>
-              <w:left w:val="none" w:color="FFFFFF" w:sz="0"/>
-              <w:bottom w:val="none" w:color="FFFFFF" w:sz="0"/>
-              <w:right w:val="none" w:color="FFFFFF" w:sz="0"/>
-            </w:tcBorders>
-            <w:tcMar>
-              <w:top w:type="dxa" w:w="50"/>
-              <w:left w:type="dxa" w:w="70"/>
-              <w:bottom w:type="dxa" w:w="50"/>
-              <w:right w:type="dxa" w:w="70"/>
-            </w:tcMar>
-          </w:tcPr>
-          <w:p>
-            <w:pPr>
-              <w:bidi/>
-              <w:spacing w:after="0" w:line="276"/>
-              <w:jc w:val="right"/>
-            </w:pPr>
-            <w:r>
-              <w:rPr>
-                <w:rFonts w:ascii="Times New Roman" w:cs="David" w:eastAsia="David" w:hAnsi="Times New Roman"/>
-                <w:b w:val="false"/>
-                <w:bCs w:val="false"/>
-                <w:noProof/>
-                <w:sz w:val="22"/>
-                <w:szCs w:val="22"/>
-                <w:rtl/>
-                <w:lang w:val="en-US" w:eastAsia="en-US" w:bidi="he-IL"/>
-              </w:rPr>
-              <w:t xml:space="preserve">משך שינה לפי הגיל</w:t>
-            </w:r>
-          </w:p>
-        </w:tc>
-        <w:tc>
-          <w:tcPr>
-            <w:tcW w:type="dxa" w:w="2400"/>
-            <w:tcBorders>
-              <w:top w:val="none" w:color="FFFFFF" w:sz="0"/>
-              <w:left w:val="none" w:color="FFFFFF" w:sz="0"/>
-              <w:bottom w:val="none" w:color="FFFFFF" w:sz="0"/>
-              <w:right w:val="none" w:color="FFFFFF" w:sz="0"/>
-            </w:tcBorders>
-            <w:tcMar>
-              <w:top w:type="dxa" w:w="50"/>
-              <w:left w:type="dxa" w:w="70"/>
-              <w:bottom w:type="dxa" w:w="50"/>
-              <w:right w:type="dxa" w:w="70"/>
-            </w:tcMar>
-          </w:tcPr>
-          <w:p>
-            <w:pPr>
-              <w:bidi/>
-              <w:spacing w:after="0" w:line="276"/>
-              <w:jc w:val="center"/>
-            </w:pPr>
-            <w:r>
-              <w:rPr>
-                <w:rFonts w:ascii="Times New Roman" w:cs="David" w:eastAsia="David" w:hAnsi="Times New Roman"/>
-                <w:b w:val="false"/>
-                <w:bCs w:val="false"/>
-                <w:noProof/>
-                <w:sz w:val="22"/>
-                <w:szCs w:val="22"/>
-                <w:rtl/>
-                <w:lang w:val="en-US" w:eastAsia="en-US" w:bidi="he-IL"/>
-              </w:rPr>
-              <w:t xml:space="preserve">12 (30.0%)</w:t>
-            </w:r>
-          </w:p>
-        </w:tc>
-        <w:tc>
-          <w:tcPr>
-            <w:tcW w:type="dxa" w:w="2400"/>
-            <w:tcBorders>
-              <w:top w:val="none" w:color="FFFFFF" w:sz="0"/>
-              <w:left w:val="none" w:color="FFFFFF" w:sz="0"/>
-              <w:bottom w:val="none" w:color="FFFFFF" w:sz="0"/>
-              <w:right w:val="none" w:color="FFFFFF" w:sz="0"/>
-            </w:tcBorders>
-            <w:tcMar>
-              <w:top w:type="dxa" w:w="50"/>
-              <w:left w:type="dxa" w:w="70"/>
-              <w:bottom w:type="dxa" w:w="50"/>
-              <w:right w:type="dxa" w:w="70"/>
-            </w:tcMar>
-          </w:tcPr>
-          <w:p>
-            <w:pPr>
-              <w:bidi/>
-              <w:spacing w:after="0" w:line="276"/>
-              <w:jc w:val="center"/>
-            </w:pPr>
-            <w:r>
-              <w:rPr>
-                <w:rFonts w:ascii="Times New Roman" w:cs="David" w:eastAsia="David" w:hAnsi="Times New Roman"/>
-                <w:b w:val="false"/>
-                <w:bCs w:val="false"/>
-                <w:noProof/>
-                <w:sz w:val="22"/>
-                <w:szCs w:val="22"/>
-                <w:rtl/>
-                <w:lang w:val="en-US" w:eastAsia="en-US" w:bidi="he-IL"/>
-              </w:rPr>
-              <w:t xml:space="preserve">14 (56.0%)</w:t>
-            </w:r>
-          </w:p>
-        </w:tc>
-        <w:tc>
-          <w:tcPr>
-            <w:tcW w:type="dxa" w:w="1300"/>
-            <w:tcBorders>
-              <w:top w:val="none" w:color="FFFFFF" w:sz="0"/>
-              <w:left w:val="none" w:color="FFFFFF" w:sz="0"/>
-              <w:bottom w:val="none" w:color="FFFFFF" w:sz="0"/>
-              <w:right w:val="none" w:color="FFFFFF" w:sz="0"/>
-            </w:tcBorders>
-            <w:tcMar>
-              <w:top w:type="dxa" w:w="50"/>
-              <w:left w:type="dxa" w:w="70"/>
-              <w:bottom w:type="dxa" w:w="50"/>
-              <w:right w:type="dxa" w:w="70"/>
-            </w:tcMar>
-          </w:tcPr>
-          <w:p>
-            <w:pPr>
-              <w:bidi/>
-              <w:spacing w:after="0" w:line="276"/>
-              <w:jc w:val="center"/>
-            </w:pPr>
-            <w:r>
-              <w:rPr>
-                <w:rFonts w:ascii="Times New Roman" w:cs="David" w:eastAsia="David" w:hAnsi="Times New Roman"/>
-                <w:b w:val="false"/>
-                <w:bCs w:val="false"/>
-                <w:noProof/>
-                <w:sz w:val="22"/>
-                <w:szCs w:val="22"/>
-                <w:rtl/>
-                <w:lang w:val="en-US" w:eastAsia="en-US" w:bidi="he-IL"/>
-              </w:rPr>
-              <w:t xml:space="preserve">4.33</w:t>
-            </w:r>
-          </w:p>
-        </w:tc>
-        <w:tc>
-          <w:tcPr>
-            <w:tcW w:type="dxa" w:w="1300"/>
-            <w:tcBorders>
-              <w:top w:val="none" w:color="FFFFFF" w:sz="0"/>
-              <w:left w:val="none" w:color="FFFFFF" w:sz="0"/>
-              <w:bottom w:val="none" w:color="FFFFFF" w:sz="0"/>
-              <w:right w:val="none" w:color="FFFFFF" w:sz="0"/>
-            </w:tcBorders>
-            <w:tcMar>
-              <w:top w:type="dxa" w:w="50"/>
-              <w:left w:type="dxa" w:w="70"/>
-              <w:bottom w:type="dxa" w:w="50"/>
-              <w:right w:type="dxa" w:w="70"/>
-            </w:tcMar>
-          </w:tcPr>
-          <w:p>
-            <w:pPr>
-              <w:bidi/>
-              <w:spacing w:after="0" w:line="276"/>
-              <w:jc w:val="center"/>
-            </w:pPr>
-            <w:r>
-              <w:rPr>
-                <w:rFonts w:ascii="Times New Roman" w:cs="David" w:eastAsia="David" w:hAnsi="Times New Roman"/>
-                <w:b w:val="false"/>
-                <w:bCs w:val="false"/>
-                <w:noProof/>
-                <w:sz w:val="22"/>
-                <w:szCs w:val="22"/>
-                <w:rtl/>
-                <w:lang w:val="en-US" w:eastAsia="en-US" w:bidi="he-IL"/>
-              </w:rPr>
-              <w:t xml:space="preserve">0.037</w:t>
-            </w:r>
-          </w:p>
-        </w:tc>
-      </w:tr>
-      <w:tr>
-        <w:trPr>
-          <w:cantSplit/>
-          <w:tblHeader w:val="false"/>
-        </w:trPr>
-        <w:tc>
-          <w:tcPr>
-            <w:tcW w:type="dxa" w:w="3300"/>
-            <w:tcBorders>
-              <w:top w:val="none" w:color="FFFFFF" w:sz="0"/>
-              <w:left w:val="none" w:color="FFFFFF" w:sz="0"/>
-              <w:bottom w:val="single" w:color="000000" w:sz="4"/>
-              <w:right w:val="none" w:color="FFFFFF" w:sz="0"/>
-            </w:tcBorders>
-            <w:tcMar>
-              <w:top w:type="dxa" w:w="50"/>
-              <w:left w:type="dxa" w:w="70"/>
-              <w:bottom w:type="dxa" w:w="50"/>
-              <w:right w:type="dxa" w:w="70"/>
-            </w:tcMar>
-          </w:tcPr>
-          <w:p>
-            <w:pPr>
-              <w:bidi/>
-              <w:spacing w:after="0" w:line="276"/>
-              <w:jc w:val="right"/>
-            </w:pPr>
-            <w:r>
-              <w:rPr>
-                <w:rFonts w:ascii="Times New Roman" w:cs="David" w:eastAsia="David" w:hAnsi="Times New Roman"/>
-                <w:b w:val="false"/>
-                <w:bCs w:val="false"/>
-                <w:noProof/>
-                <w:sz w:val="22"/>
-                <w:szCs w:val="22"/>
-                <w:rtl/>
-                <w:lang w:val="en-US" w:eastAsia="en-US" w:bidi="he-IL"/>
-              </w:rPr>
-              <w:t xml:space="preserve">60 דקות פעילות בכל יום</w:t>
-            </w:r>
-          </w:p>
-        </w:tc>
-        <w:tc>
-          <w:tcPr>
-            <w:tcW w:type="dxa" w:w="2400"/>
-            <w:tcBorders>
-              <w:top w:val="none" w:color="FFFFFF" w:sz="0"/>
-              <w:left w:val="none" w:color="FFFFFF" w:sz="0"/>
-              <w:bottom w:val="single" w:color="000000" w:sz="4"/>
-              <w:right w:val="none" w:color="FFFFFF" w:sz="0"/>
-            </w:tcBorders>
-            <w:tcMar>
-              <w:top w:type="dxa" w:w="50"/>
-              <w:left w:type="dxa" w:w="70"/>
-              <w:bottom w:type="dxa" w:w="50"/>
-              <w:right w:type="dxa" w:w="70"/>
-            </w:tcMar>
-          </w:tcPr>
-          <w:p>
-            <w:pPr>
-              <w:bidi/>
-              <w:spacing w:after="0" w:line="276"/>
-              <w:jc w:val="center"/>
-            </w:pPr>
-            <w:r>
-              <w:rPr>
-                <w:rFonts w:ascii="Times New Roman" w:cs="David" w:eastAsia="David" w:hAnsi="Times New Roman"/>
-                <w:b w:val="false"/>
-                <w:bCs w:val="false"/>
-                <w:noProof/>
-                <w:sz w:val="22"/>
-                <w:szCs w:val="22"/>
-                <w:rtl/>
-                <w:lang w:val="en-US" w:eastAsia="en-US" w:bidi="he-IL"/>
-              </w:rPr>
-              <w:t xml:space="preserve">1 (2.5%)</w:t>
-            </w:r>
-          </w:p>
-        </w:tc>
-        <w:tc>
-          <w:tcPr>
-            <w:tcW w:type="dxa" w:w="2400"/>
-            <w:tcBorders>
-              <w:top w:val="none" w:color="FFFFFF" w:sz="0"/>
-              <w:left w:val="none" w:color="FFFFFF" w:sz="0"/>
-              <w:bottom w:val="single" w:color="000000" w:sz="4"/>
-              <w:right w:val="none" w:color="FFFFFF" w:sz="0"/>
-            </w:tcBorders>
-            <w:tcMar>
-              <w:top w:type="dxa" w:w="50"/>
-              <w:left w:type="dxa" w:w="70"/>
-              <w:bottom w:type="dxa" w:w="50"/>
-              <w:right w:type="dxa" w:w="70"/>
-            </w:tcMar>
-          </w:tcPr>
-          <w:p>
-            <w:pPr>
-              <w:bidi/>
-              <w:spacing w:after="0" w:line="276"/>
-              <w:jc w:val="center"/>
-            </w:pPr>
-            <w:r>
-              <w:rPr>
-                <w:rFonts w:ascii="Times New Roman" w:cs="David" w:eastAsia="David" w:hAnsi="Times New Roman"/>
-                <w:b w:val="false"/>
-                <w:bCs w:val="false"/>
-                <w:noProof/>
-                <w:sz w:val="22"/>
-                <w:szCs w:val="22"/>
-                <w:rtl/>
-                <w:lang w:val="en-US" w:eastAsia="en-US" w:bidi="he-IL"/>
-              </w:rPr>
-              <w:t xml:space="preserve">1 (4.0%)</w:t>
-            </w:r>
-          </w:p>
-        </w:tc>
-        <w:tc>
-          <w:tcPr>
-            <w:tcW w:type="dxa" w:w="1300"/>
-            <w:tcBorders>
-              <w:top w:val="none" w:color="FFFFFF" w:sz="0"/>
-              <w:left w:val="none" w:color="FFFFFF" w:sz="0"/>
-              <w:bottom w:val="single" w:color="000000" w:sz="4"/>
-              <w:right w:val="none" w:color="FFFFFF" w:sz="0"/>
-            </w:tcBorders>
-            <w:tcMar>
-              <w:top w:type="dxa" w:w="50"/>
-              <w:left w:type="dxa" w:w="70"/>
-              <w:bottom w:type="dxa" w:w="50"/>
-              <w:right w:type="dxa" w:w="70"/>
-            </w:tcMar>
-          </w:tcPr>
-          <w:p>
-            <w:pPr>
-              <w:bidi/>
-              <w:spacing w:after="0" w:line="276"/>
-              <w:jc w:val="center"/>
-            </w:pPr>
-            <w:r>
-              <w:rPr>
-                <w:rFonts w:ascii="Times New Roman" w:cs="David" w:eastAsia="David" w:hAnsi="Times New Roman"/>
-                <w:b w:val="false"/>
-                <w:bCs w:val="false"/>
-                <w:noProof/>
-                <w:sz w:val="22"/>
-                <w:szCs w:val="22"/>
-                <w:rtl/>
-                <w:lang w:val="en-US" w:eastAsia="en-US" w:bidi="he-IL"/>
-              </w:rPr>
-              <w:t xml:space="preserve">0.12</w:t>
-            </w:r>
-          </w:p>
-        </w:tc>
-        <w:tc>
-          <w:tcPr>
-            <w:tcW w:type="dxa" w:w="1300"/>
-            <w:tcBorders>
-              <w:top w:val="none" w:color="FFFFFF" w:sz="0"/>
-              <w:left w:val="none" w:color="FFFFFF" w:sz="0"/>
-              <w:bottom w:val="single" w:color="000000" w:sz="4"/>
-              <w:right w:val="none" w:color="FFFFFF" w:sz="0"/>
-            </w:tcBorders>
-            <w:tcMar>
-              <w:top w:type="dxa" w:w="50"/>
-              <w:left w:type="dxa" w:w="70"/>
-              <w:bottom w:type="dxa" w:w="50"/>
-              <w:right w:type="dxa" w:w="70"/>
-            </w:tcMar>
-          </w:tcPr>
-          <w:p>
-            <w:pPr>
-              <w:bidi/>
-              <w:spacing w:after="0" w:line="276"/>
-              <w:jc w:val="center"/>
-            </w:pPr>
-            <w:r>
-              <w:rPr>
-                <w:rFonts w:ascii="Times New Roman" w:cs="David" w:eastAsia="David" w:hAnsi="Times New Roman"/>
-                <w:b w:val="false"/>
-                <w:bCs w:val="false"/>
-                <w:noProof/>
-                <w:sz w:val="22"/>
-                <w:szCs w:val="22"/>
-                <w:rtl/>
-                <w:lang w:val="en-US" w:eastAsia="en-US" w:bidi="he-IL"/>
-              </w:rPr>
-              <w:t xml:space="preserve">0.733</w:t>
-            </w:r>
-          </w:p>
-        </w:tc>
-      </w:tr>
-    </w:tbl>
-    <w:p>
-      <w:pPr>
-        <w:bidi/>
-        <w:spacing w:after="120" w:line="276"/>
-        <w:jc w:val="both"/>
-      </w:pPr>
-      <w:r>
-        <w:rPr>
-          <w:rFonts w:ascii="Times New Roman" w:cs="David" w:eastAsia="David" w:hAnsi="Times New Roman"/>
-          <w:noProof/>
-          <w:sz w:val="20"/>
-          <w:szCs w:val="20"/>
-          <w:rtl/>
-          <w:lang w:val="en-US" w:eastAsia="en-US" w:bidi="he-IL"/>
-        </w:rPr>
-        <w:t xml:space="preserve">הערה. בהמלצת הפעילות הגופנית התאים קטנים מ-5 ומבחן פישר המדויק נתן p = 1.000; בהמלצת השינה מבחן פישר נתן p = 0.067. מקור: פלט Crosstabs, נספח ב'.</w:t>
-      </w:r>
-    </w:p>
-    <w:p>
-      <w:pPr>
         <w:bidi/>
         <w:spacing w:after="120" w:line="360"/>
         <w:jc w:val="both"/>
@@ -18447,7 +14980,7 @@
           <w:rtl/>
           <w:lang w:val="en-US" w:eastAsia="en-US" w:bidi="he-IL"/>
         </w:rPr>
-        <w:t xml:space="preserve">מלוחות 10 ו-11 עולה כי ההשערה אוששה חלקית. ההבדלים בכיוון המשוער נמצאו בכל משתני השינה והפעילות הגופנית: תלמידים עם לקויות למידה ישנו פחות (d = 0.26), הלכו לישון מאוחר יותר (d = 0.30), דיווחו על ישנוניות רבה יותר (d = 0.44) ועל פחות ימי פעילות גופנית (d = 0.33). גודלי האפקט קטנים עד בינוניים, אך אף אחד מההבדלים לא הגיע למובהקות סטטיסטית במדגם הנוכחי, וההבדל בישנוניות היה הקרוב ביותר (p = 0.092). לעומת זאת, ההבדל בעמידה בהמלצת השינה היה מובהק: 30 אחוזים מתלמידי קבוצת המחקר עמדו בהמלצה לעומת 56 אחוזים בקבוצת ההשוואה. בזמן המסך לא נמצא כל הבדל בין הקבוצות (d = 0.06), וגם לא בשיעור העומדים בהמלצת המסכים. הפער הבולט ביותר בין הקבוצות היה בתפקוד הלימודי: ממוצע הציונים של תלמידים עם לקויות למידה היה נמוך בכ-8 נקודות (d = 1.15), וכך גם הציונים במתמטיקה ובאנגלית והתפקוד היומי בלמידה. בתוך קבוצת המחקר לא נמצאו הבדלים מובהקים בין תלמידים עם וללא הפרעת קשב נלווית באף אחד ממשתני ההתנהגות.</w:t>
+        <w:t xml:space="preserve">מלוח 7 עולה כי ההשערה אוששה חלקית. ההבדלים בכיוון המשוער נמצאו בכל משתני השינה והפעילות הגופנית: תלמידים עם לקויות למידה ישנו פחות (d = 0.26), הלכו לישון מאוחר יותר (d = 0.30), דיווחו על ישנוניות רבה יותר (d = 0.44) ועל פחות ימי פעילות גופנית (d = 0.33). גודלי האפקט קטנים עד בינוניים, אך אף אחד מההבדלים לא הגיע למובהקות (הקרוב ביותר: ישנוניות, p = 0.092). לעומת זאת, ההבדל בעמידה בהמלצת השינה היה מובהק במבחן חי בריבוע: 30 אחוזים מתלמידי קבוצת המחקר עמדו בהמלצה לעומת 56 אחוזים בקבוצת ההשוואה (χ²(1) = 4.33, p = 0.037; מבחן פישר המדויק p = 0.067). בזמן המסך לא נמצא כל הבדל בין הקבוצות (d = 0.06), וגם לא בשיעור העומדים בהמלצת המסכים (15 לעומת 12 אחוזים) או בהמלצת הפעילות הגופנית (2.5 לעומת 4 אחוזים; פלט Crosstabs, נספח ב'). הפער הבולט ביותר בין הקבוצות היה בתפקוד הלימודי: ממוצע הציונים של תלמידים עם לקויות למידה היה נמוך בכ-8 נקודות (d = 1.15), וכך גם הציונים במתמטיקה ובאנגלית והתפקוד היומי בלמידה. בתוך קבוצת המחקר לא נמצאו הבדלים מובהקים בין תלמידים עם וללא הפרעת קשב נלווית באף אחד ממשתני ההתנהגות.</w:t>
       </w:r>
     </w:p>
     <w:p>
@@ -18487,770 +15020,7 @@
           <w:rtl/>
           <w:lang w:val="en-US" w:eastAsia="en-US" w:bidi="he-IL"/>
         </w:rPr>
-        <w:t xml:space="preserve">לוח 12 מסכם את מצב חמש ההשערות.</w:t>
-      </w:r>
-    </w:p>
-    <w:p>
-      <w:pPr>
-        <w:keepNext/>
-        <w:bidi/>
-        <w:spacing w:after="80" w:before="200" w:line="360"/>
-        <w:jc w:val="right"/>
-      </w:pPr>
-      <w:r>
-        <w:rPr>
-          <w:rFonts w:ascii="Times New Roman" w:cs="David" w:eastAsia="David" w:hAnsi="Times New Roman"/>
-          <w:b/>
-          <w:bCs/>
-          <w:noProof/>
-          <w:sz w:val="24"/>
-          <w:szCs w:val="24"/>
-          <w:rtl/>
-          <w:lang w:val="en-US" w:eastAsia="en-US" w:bidi="he-IL"/>
-        </w:rPr>
-        <w:t xml:space="preserve">לוח 12: סיכום השערות המחקר</w:t>
-      </w:r>
-    </w:p>
-    <w:tbl>
-      <w:tblPr>
-        <w:bidiVisual/>
-        <w:tblW w:type="dxa" w:w="10600"/>
-        <w:tblBorders>
-          <w:top w:val="single" w:color="000000" w:sz="4"/>
-          <w:left w:val="none" w:color="FFFFFF" w:sz="0"/>
-          <w:bottom w:val="single" w:color="000000" w:sz="4"/>
-          <w:right w:val="none" w:color="FFFFFF" w:sz="0"/>
-          <w:insideH w:val="none" w:color="FFFFFF" w:sz="0"/>
-          <w:insideV w:val="none" w:color="FFFFFF" w:sz="0"/>
-        </w:tblBorders>
-      </w:tblPr>
-      <w:tblGrid>
-        <w:gridCol w:w="1000"/>
-        <w:gridCol w:w="4600"/>
-        <w:gridCol w:w="5000"/>
-      </w:tblGrid>
-      <w:tr>
-        <w:trPr>
-          <w:cantSplit/>
-          <w:tblHeader/>
-        </w:trPr>
-        <w:tc>
-          <w:tcPr>
-            <w:tcW w:type="dxa" w:w="1000"/>
-            <w:tcBorders>
-              <w:top w:val="single" w:color="000000" w:sz="4"/>
-              <w:left w:val="none" w:color="FFFFFF" w:sz="0"/>
-              <w:bottom w:val="single" w:color="000000" w:sz="4"/>
-              <w:right w:val="none" w:color="FFFFFF" w:sz="0"/>
-            </w:tcBorders>
-            <w:shd w:fill="EDEDED" w:color="auto" w:val="clear"/>
-            <w:tcMar>
-              <w:top w:type="dxa" w:w="50"/>
-              <w:left w:type="dxa" w:w="70"/>
-              <w:bottom w:type="dxa" w:w="50"/>
-              <w:right w:type="dxa" w:w="70"/>
-            </w:tcMar>
-          </w:tcPr>
-          <w:p>
-            <w:pPr>
-              <w:bidi/>
-              <w:spacing w:after="0" w:line="276"/>
-              <w:jc w:val="right"/>
-            </w:pPr>
-            <w:r>
-              <w:rPr>
-                <w:rFonts w:ascii="Times New Roman" w:cs="David" w:eastAsia="David" w:hAnsi="Times New Roman"/>
-                <w:b/>
-                <w:bCs/>
-                <w:noProof/>
-                <w:sz w:val="22"/>
-                <w:szCs w:val="22"/>
-                <w:rtl/>
-                <w:lang w:val="en-US" w:eastAsia="en-US" w:bidi="he-IL"/>
-              </w:rPr>
-              <w:t xml:space="preserve">השערה</w:t>
-            </w:r>
-          </w:p>
-        </w:tc>
-        <w:tc>
-          <w:tcPr>
-            <w:tcW w:type="dxa" w:w="4600"/>
-            <w:tcBorders>
-              <w:top w:val="single" w:color="000000" w:sz="4"/>
-              <w:left w:val="none" w:color="FFFFFF" w:sz="0"/>
-              <w:bottom w:val="single" w:color="000000" w:sz="4"/>
-              <w:right w:val="none" w:color="FFFFFF" w:sz="0"/>
-            </w:tcBorders>
-            <w:shd w:fill="EDEDED" w:color="auto" w:val="clear"/>
-            <w:tcMar>
-              <w:top w:type="dxa" w:w="50"/>
-              <w:left w:type="dxa" w:w="70"/>
-              <w:bottom w:type="dxa" w:w="50"/>
-              <w:right w:type="dxa" w:w="70"/>
-            </w:tcMar>
-          </w:tcPr>
-          <w:p>
-            <w:pPr>
-              <w:bidi/>
-              <w:spacing w:after="0" w:line="276"/>
-              <w:jc w:val="center"/>
-            </w:pPr>
-            <w:r>
-              <w:rPr>
-                <w:rFonts w:ascii="Times New Roman" w:cs="David" w:eastAsia="David" w:hAnsi="Times New Roman"/>
-                <w:b/>
-                <w:bCs/>
-                <w:noProof/>
-                <w:sz w:val="22"/>
-                <w:szCs w:val="22"/>
-                <w:rtl/>
-                <w:lang w:val="en-US" w:eastAsia="en-US" w:bidi="he-IL"/>
-              </w:rPr>
-              <w:t xml:space="preserve">תוכן</w:t>
-            </w:r>
-          </w:p>
-        </w:tc>
-        <w:tc>
-          <w:tcPr>
-            <w:tcW w:type="dxa" w:w="5000"/>
-            <w:tcBorders>
-              <w:top w:val="single" w:color="000000" w:sz="4"/>
-              <w:left w:val="none" w:color="FFFFFF" w:sz="0"/>
-              <w:bottom w:val="single" w:color="000000" w:sz="4"/>
-              <w:right w:val="none" w:color="FFFFFF" w:sz="0"/>
-            </w:tcBorders>
-            <w:shd w:fill="EDEDED" w:color="auto" w:val="clear"/>
-            <w:tcMar>
-              <w:top w:type="dxa" w:w="50"/>
-              <w:left w:type="dxa" w:w="70"/>
-              <w:bottom w:type="dxa" w:w="50"/>
-              <w:right w:type="dxa" w:w="70"/>
-            </w:tcMar>
-          </w:tcPr>
-          <w:p>
-            <w:pPr>
-              <w:bidi/>
-              <w:spacing w:after="0" w:line="276"/>
-              <w:jc w:val="center"/>
-            </w:pPr>
-            <w:r>
-              <w:rPr>
-                <w:rFonts w:ascii="Times New Roman" w:cs="David" w:eastAsia="David" w:hAnsi="Times New Roman"/>
-                <w:b/>
-                <w:bCs/>
-                <w:noProof/>
-                <w:sz w:val="22"/>
-                <w:szCs w:val="22"/>
-                <w:rtl/>
-                <w:lang w:val="en-US" w:eastAsia="en-US" w:bidi="he-IL"/>
-              </w:rPr>
-              <w:t xml:space="preserve">תוצאה</w:t>
-            </w:r>
-          </w:p>
-        </w:tc>
-      </w:tr>
-      <w:tr>
-        <w:trPr>
-          <w:cantSplit/>
-          <w:tblHeader w:val="false"/>
-        </w:trPr>
-        <w:tc>
-          <w:tcPr>
-            <w:tcW w:type="dxa" w:w="1000"/>
-            <w:tcBorders>
-              <w:top w:val="none" w:color="FFFFFF" w:sz="0"/>
-              <w:left w:val="none" w:color="FFFFFF" w:sz="0"/>
-              <w:bottom w:val="none" w:color="FFFFFF" w:sz="0"/>
-              <w:right w:val="none" w:color="FFFFFF" w:sz="0"/>
-            </w:tcBorders>
-            <w:tcMar>
-              <w:top w:type="dxa" w:w="50"/>
-              <w:left w:type="dxa" w:w="70"/>
-              <w:bottom w:type="dxa" w:w="50"/>
-              <w:right w:type="dxa" w:w="70"/>
-            </w:tcMar>
-          </w:tcPr>
-          <w:p>
-            <w:pPr>
-              <w:bidi/>
-              <w:spacing w:after="0" w:line="276"/>
-              <w:jc w:val="right"/>
-            </w:pPr>
-            <w:r>
-              <w:rPr>
-                <w:rFonts w:ascii="Times New Roman" w:cs="David" w:eastAsia="David" w:hAnsi="Times New Roman"/>
-                <w:b w:val="false"/>
-                <w:bCs w:val="false"/>
-                <w:noProof/>
-                <w:sz w:val="22"/>
-                <w:szCs w:val="22"/>
-                <w:rtl/>
-                <w:lang w:val="en-US" w:eastAsia="en-US" w:bidi="he-IL"/>
-              </w:rPr>
-              <w:t xml:space="preserve">1</w:t>
-            </w:r>
-          </w:p>
-        </w:tc>
-        <w:tc>
-          <w:tcPr>
-            <w:tcW w:type="dxa" w:w="4600"/>
-            <w:tcBorders>
-              <w:top w:val="none" w:color="FFFFFF" w:sz="0"/>
-              <w:left w:val="none" w:color="FFFFFF" w:sz="0"/>
-              <w:bottom w:val="none" w:color="FFFFFF" w:sz="0"/>
-              <w:right w:val="none" w:color="FFFFFF" w:sz="0"/>
-            </w:tcBorders>
-            <w:tcMar>
-              <w:top w:type="dxa" w:w="50"/>
-              <w:left w:type="dxa" w:w="70"/>
-              <w:bottom w:type="dxa" w:w="50"/>
-              <w:right w:type="dxa" w:w="70"/>
-            </w:tcMar>
-          </w:tcPr>
-          <w:p>
-            <w:pPr>
-              <w:bidi/>
-              <w:spacing w:after="0" w:line="276"/>
-              <w:jc w:val="center"/>
-            </w:pPr>
-            <w:r>
-              <w:rPr>
-                <w:rFonts w:ascii="Times New Roman" w:cs="David" w:eastAsia="David" w:hAnsi="Times New Roman"/>
-                <w:b w:val="false"/>
-                <w:bCs w:val="false"/>
-                <w:noProof/>
-                <w:sz w:val="22"/>
-                <w:szCs w:val="22"/>
-                <w:rtl/>
-                <w:lang w:val="en-US" w:eastAsia="en-US" w:bidi="he-IL"/>
-              </w:rPr>
-              <w:t xml:space="preserve">מסכים קשורים לפחות שינה, לשינה מאוחרת ולישנוניות</w:t>
-            </w:r>
-          </w:p>
-        </w:tc>
-        <w:tc>
-          <w:tcPr>
-            <w:tcW w:type="dxa" w:w="5000"/>
-            <w:tcBorders>
-              <w:top w:val="none" w:color="FFFFFF" w:sz="0"/>
-              <w:left w:val="none" w:color="FFFFFF" w:sz="0"/>
-              <w:bottom w:val="none" w:color="FFFFFF" w:sz="0"/>
-              <w:right w:val="none" w:color="FFFFFF" w:sz="0"/>
-            </w:tcBorders>
-            <w:tcMar>
-              <w:top w:type="dxa" w:w="50"/>
-              <w:left w:type="dxa" w:w="70"/>
-              <w:bottom w:type="dxa" w:w="50"/>
-              <w:right w:type="dxa" w:w="70"/>
-            </w:tcMar>
-          </w:tcPr>
-          <w:p>
-            <w:pPr>
-              <w:bidi/>
-              <w:spacing w:after="0" w:line="276"/>
-              <w:jc w:val="center"/>
-            </w:pPr>
-            <w:r>
-              <w:rPr>
-                <w:rFonts w:ascii="Times New Roman" w:cs="David" w:eastAsia="David" w:hAnsi="Times New Roman"/>
-                <w:b w:val="false"/>
-                <w:bCs w:val="false"/>
-                <w:noProof/>
-                <w:sz w:val="22"/>
-                <w:szCs w:val="22"/>
-                <w:rtl/>
-                <w:lang w:val="en-US" w:eastAsia="en-US" w:bidi="he-IL"/>
-              </w:rPr>
-              <w:t xml:space="preserve">אוששה</w:t>
-            </w:r>
-          </w:p>
-        </w:tc>
-      </w:tr>
-      <w:tr>
-        <w:trPr>
-          <w:cantSplit/>
-          <w:tblHeader w:val="false"/>
-        </w:trPr>
-        <w:tc>
-          <w:tcPr>
-            <w:tcW w:type="dxa" w:w="1000"/>
-            <w:tcBorders>
-              <w:top w:val="none" w:color="FFFFFF" w:sz="0"/>
-              <w:left w:val="none" w:color="FFFFFF" w:sz="0"/>
-              <w:bottom w:val="none" w:color="FFFFFF" w:sz="0"/>
-              <w:right w:val="none" w:color="FFFFFF" w:sz="0"/>
-            </w:tcBorders>
-            <w:tcMar>
-              <w:top w:type="dxa" w:w="50"/>
-              <w:left w:type="dxa" w:w="70"/>
-              <w:bottom w:type="dxa" w:w="50"/>
-              <w:right w:type="dxa" w:w="70"/>
-            </w:tcMar>
-          </w:tcPr>
-          <w:p>
-            <w:pPr>
-              <w:bidi/>
-              <w:spacing w:after="0" w:line="276"/>
-              <w:jc w:val="right"/>
-            </w:pPr>
-            <w:r>
-              <w:rPr>
-                <w:rFonts w:ascii="Times New Roman" w:cs="David" w:eastAsia="David" w:hAnsi="Times New Roman"/>
-                <w:b w:val="false"/>
-                <w:bCs w:val="false"/>
-                <w:noProof/>
-                <w:sz w:val="22"/>
-                <w:szCs w:val="22"/>
-                <w:rtl/>
-                <w:lang w:val="en-US" w:eastAsia="en-US" w:bidi="he-IL"/>
-              </w:rPr>
-              <w:t xml:space="preserve">2</w:t>
-            </w:r>
-          </w:p>
-        </w:tc>
-        <w:tc>
-          <w:tcPr>
-            <w:tcW w:type="dxa" w:w="4600"/>
-            <w:tcBorders>
-              <w:top w:val="none" w:color="FFFFFF" w:sz="0"/>
-              <w:left w:val="none" w:color="FFFFFF" w:sz="0"/>
-              <w:bottom w:val="none" w:color="FFFFFF" w:sz="0"/>
-              <w:right w:val="none" w:color="FFFFFF" w:sz="0"/>
-            </w:tcBorders>
-            <w:tcMar>
-              <w:top w:type="dxa" w:w="50"/>
-              <w:left w:type="dxa" w:w="70"/>
-              <w:bottom w:type="dxa" w:w="50"/>
-              <w:right w:type="dxa" w:w="70"/>
-            </w:tcMar>
-          </w:tcPr>
-          <w:p>
-            <w:pPr>
-              <w:bidi/>
-              <w:spacing w:after="0" w:line="276"/>
-              <w:jc w:val="center"/>
-            </w:pPr>
-            <w:r>
-              <w:rPr>
-                <w:rFonts w:ascii="Times New Roman" w:cs="David" w:eastAsia="David" w:hAnsi="Times New Roman"/>
-                <w:b w:val="false"/>
-                <w:bCs w:val="false"/>
-                <w:noProof/>
-                <w:sz w:val="22"/>
-                <w:szCs w:val="22"/>
-                <w:rtl/>
-                <w:lang w:val="en-US" w:eastAsia="en-US" w:bidi="he-IL"/>
-              </w:rPr>
-              <w:t xml:space="preserve">מסכים קשורים לפחות פעילות גופנית</w:t>
-            </w:r>
-          </w:p>
-        </w:tc>
-        <w:tc>
-          <w:tcPr>
-            <w:tcW w:type="dxa" w:w="5000"/>
-            <w:tcBorders>
-              <w:top w:val="none" w:color="FFFFFF" w:sz="0"/>
-              <w:left w:val="none" w:color="FFFFFF" w:sz="0"/>
-              <w:bottom w:val="none" w:color="FFFFFF" w:sz="0"/>
-              <w:right w:val="none" w:color="FFFFFF" w:sz="0"/>
-            </w:tcBorders>
-            <w:tcMar>
-              <w:top w:type="dxa" w:w="50"/>
-              <w:left w:type="dxa" w:w="70"/>
-              <w:bottom w:type="dxa" w:w="50"/>
-              <w:right w:type="dxa" w:w="70"/>
-            </w:tcMar>
-          </w:tcPr>
-          <w:p>
-            <w:pPr>
-              <w:bidi/>
-              <w:spacing w:after="0" w:line="276"/>
-              <w:jc w:val="center"/>
-            </w:pPr>
-            <w:r>
-              <w:rPr>
-                <w:rFonts w:ascii="Times New Roman" w:cs="David" w:eastAsia="David" w:hAnsi="Times New Roman"/>
-                <w:b w:val="false"/>
-                <w:bCs w:val="false"/>
-                <w:noProof/>
-                <w:sz w:val="22"/>
-                <w:szCs w:val="22"/>
-                <w:rtl/>
-                <w:lang w:val="en-US" w:eastAsia="en-US" w:bidi="he-IL"/>
-              </w:rPr>
-              <w:t xml:space="preserve">לא אוששה</w:t>
-            </w:r>
-          </w:p>
-        </w:tc>
-      </w:tr>
-      <w:tr>
-        <w:trPr>
-          <w:cantSplit/>
-          <w:tblHeader w:val="false"/>
-        </w:trPr>
-        <w:tc>
-          <w:tcPr>
-            <w:tcW w:type="dxa" w:w="1000"/>
-            <w:tcBorders>
-              <w:top w:val="none" w:color="FFFFFF" w:sz="0"/>
-              <w:left w:val="none" w:color="FFFFFF" w:sz="0"/>
-              <w:bottom w:val="none" w:color="FFFFFF" w:sz="0"/>
-              <w:right w:val="none" w:color="FFFFFF" w:sz="0"/>
-            </w:tcBorders>
-            <w:tcMar>
-              <w:top w:type="dxa" w:w="50"/>
-              <w:left w:type="dxa" w:w="70"/>
-              <w:bottom w:type="dxa" w:w="50"/>
-              <w:right w:type="dxa" w:w="70"/>
-            </w:tcMar>
-          </w:tcPr>
-          <w:p>
-            <w:pPr>
-              <w:bidi/>
-              <w:spacing w:after="0" w:line="276"/>
-              <w:jc w:val="right"/>
-            </w:pPr>
-            <w:r>
-              <w:rPr>
-                <w:rFonts w:ascii="Times New Roman" w:cs="David" w:eastAsia="David" w:hAnsi="Times New Roman"/>
-                <w:b w:val="false"/>
-                <w:bCs w:val="false"/>
-                <w:noProof/>
-                <w:sz w:val="22"/>
-                <w:szCs w:val="22"/>
-                <w:rtl/>
-                <w:lang w:val="en-US" w:eastAsia="en-US" w:bidi="he-IL"/>
-              </w:rPr>
-              <w:t xml:space="preserve">3</w:t>
-            </w:r>
-          </w:p>
-        </w:tc>
-        <w:tc>
-          <w:tcPr>
-            <w:tcW w:type="dxa" w:w="4600"/>
-            <w:tcBorders>
-              <w:top w:val="none" w:color="FFFFFF" w:sz="0"/>
-              <w:left w:val="none" w:color="FFFFFF" w:sz="0"/>
-              <w:bottom w:val="none" w:color="FFFFFF" w:sz="0"/>
-              <w:right w:val="none" w:color="FFFFFF" w:sz="0"/>
-            </w:tcBorders>
-            <w:tcMar>
-              <w:top w:type="dxa" w:w="50"/>
-              <w:left w:type="dxa" w:w="70"/>
-              <w:bottom w:type="dxa" w:w="50"/>
-              <w:right w:type="dxa" w:w="70"/>
-            </w:tcMar>
-          </w:tcPr>
-          <w:p>
-            <w:pPr>
-              <w:bidi/>
-              <w:spacing w:after="0" w:line="276"/>
-              <w:jc w:val="center"/>
-            </w:pPr>
-            <w:r>
-              <w:rPr>
-                <w:rFonts w:ascii="Times New Roman" w:cs="David" w:eastAsia="David" w:hAnsi="Times New Roman"/>
-                <w:b w:val="false"/>
-                <w:bCs w:val="false"/>
-                <w:noProof/>
-                <w:sz w:val="22"/>
-                <w:szCs w:val="22"/>
-                <w:rtl/>
-                <w:lang w:val="en-US" w:eastAsia="en-US" w:bidi="he-IL"/>
-              </w:rPr>
-              <w:t xml:space="preserve">מסכים, שינה ופעילות גופנית קשורים לתפקוד הלימודי</w:t>
-            </w:r>
-          </w:p>
-        </w:tc>
-        <w:tc>
-          <w:tcPr>
-            <w:tcW w:type="dxa" w:w="5000"/>
-            <w:tcBorders>
-              <w:top w:val="none" w:color="FFFFFF" w:sz="0"/>
-              <w:left w:val="none" w:color="FFFFFF" w:sz="0"/>
-              <w:bottom w:val="none" w:color="FFFFFF" w:sz="0"/>
-              <w:right w:val="none" w:color="FFFFFF" w:sz="0"/>
-            </w:tcBorders>
-            <w:tcMar>
-              <w:top w:type="dxa" w:w="50"/>
-              <w:left w:type="dxa" w:w="70"/>
-              <w:bottom w:type="dxa" w:w="50"/>
-              <w:right w:type="dxa" w:w="70"/>
-            </w:tcMar>
-          </w:tcPr>
-          <w:p>
-            <w:pPr>
-              <w:bidi/>
-              <w:spacing w:after="0" w:line="276"/>
-              <w:jc w:val="center"/>
-            </w:pPr>
-            <w:r>
-              <w:rPr>
-                <w:rFonts w:ascii="Times New Roman" w:cs="David" w:eastAsia="David" w:hAnsi="Times New Roman"/>
-                <w:b w:val="false"/>
-                <w:bCs w:val="false"/>
-                <w:noProof/>
-                <w:sz w:val="22"/>
-                <w:szCs w:val="22"/>
-                <w:rtl/>
-                <w:lang w:val="en-US" w:eastAsia="en-US" w:bidi="he-IL"/>
-              </w:rPr>
-              <w:t xml:space="preserve">אוששה חלקית: מסכים, סדירות שינה וישנוניות כן; משך שינה ופעילות גופנית לא</w:t>
-            </w:r>
-          </w:p>
-        </w:tc>
-      </w:tr>
-      <w:tr>
-        <w:trPr>
-          <w:cantSplit/>
-          <w:tblHeader w:val="false"/>
-        </w:trPr>
-        <w:tc>
-          <w:tcPr>
-            <w:tcW w:type="dxa" w:w="1000"/>
-            <w:tcBorders>
-              <w:top w:val="none" w:color="FFFFFF" w:sz="0"/>
-              <w:left w:val="none" w:color="FFFFFF" w:sz="0"/>
-              <w:bottom w:val="none" w:color="FFFFFF" w:sz="0"/>
-              <w:right w:val="none" w:color="FFFFFF" w:sz="0"/>
-            </w:tcBorders>
-            <w:tcMar>
-              <w:top w:type="dxa" w:w="50"/>
-              <w:left w:type="dxa" w:w="70"/>
-              <w:bottom w:type="dxa" w:w="50"/>
-              <w:right w:type="dxa" w:w="70"/>
-            </w:tcMar>
-          </w:tcPr>
-          <w:p>
-            <w:pPr>
-              <w:bidi/>
-              <w:spacing w:after="0" w:line="276"/>
-              <w:jc w:val="right"/>
-            </w:pPr>
-            <w:r>
-              <w:rPr>
-                <w:rFonts w:ascii="Times New Roman" w:cs="David" w:eastAsia="David" w:hAnsi="Times New Roman"/>
-                <w:b w:val="false"/>
-                <w:bCs w:val="false"/>
-                <w:noProof/>
-                <w:sz w:val="22"/>
-                <w:szCs w:val="22"/>
-                <w:rtl/>
-                <w:lang w:val="en-US" w:eastAsia="en-US" w:bidi="he-IL"/>
-              </w:rPr>
-              <w:t xml:space="preserve">4</w:t>
-            </w:r>
-          </w:p>
-        </w:tc>
-        <w:tc>
-          <w:tcPr>
-            <w:tcW w:type="dxa" w:w="4600"/>
-            <w:tcBorders>
-              <w:top w:val="none" w:color="FFFFFF" w:sz="0"/>
-              <w:left w:val="none" w:color="FFFFFF" w:sz="0"/>
-              <w:bottom w:val="none" w:color="FFFFFF" w:sz="0"/>
-              <w:right w:val="none" w:color="FFFFFF" w:sz="0"/>
-            </w:tcBorders>
-            <w:tcMar>
-              <w:top w:type="dxa" w:w="50"/>
-              <w:left w:type="dxa" w:w="70"/>
-              <w:bottom w:type="dxa" w:w="50"/>
-              <w:right w:type="dxa" w:w="70"/>
-            </w:tcMar>
-          </w:tcPr>
-          <w:p>
-            <w:pPr>
-              <w:bidi/>
-              <w:spacing w:after="0" w:line="276"/>
-              <w:jc w:val="center"/>
-            </w:pPr>
-            <w:r>
-              <w:rPr>
-                <w:rFonts w:ascii="Times New Roman" w:cs="David" w:eastAsia="David" w:hAnsi="Times New Roman"/>
-                <w:b w:val="false"/>
-                <w:bCs w:val="false"/>
-                <w:noProof/>
-                <w:sz w:val="22"/>
-                <w:szCs w:val="22"/>
-                <w:rtl/>
-                <w:lang w:val="en-US" w:eastAsia="en-US" w:bidi="he-IL"/>
-              </w:rPr>
-              <w:t xml:space="preserve">עמידה ביותר המלצות קשורה לתפקוד לימודי טוב יותר</w:t>
-            </w:r>
-          </w:p>
-        </w:tc>
-        <w:tc>
-          <w:tcPr>
-            <w:tcW w:type="dxa" w:w="5000"/>
-            <w:tcBorders>
-              <w:top w:val="none" w:color="FFFFFF" w:sz="0"/>
-              <w:left w:val="none" w:color="FFFFFF" w:sz="0"/>
-              <w:bottom w:val="none" w:color="FFFFFF" w:sz="0"/>
-              <w:right w:val="none" w:color="FFFFFF" w:sz="0"/>
-            </w:tcBorders>
-            <w:tcMar>
-              <w:top w:type="dxa" w:w="50"/>
-              <w:left w:type="dxa" w:w="70"/>
-              <w:bottom w:type="dxa" w:w="50"/>
-              <w:right w:type="dxa" w:w="70"/>
-            </w:tcMar>
-          </w:tcPr>
-          <w:p>
-            <w:pPr>
-              <w:bidi/>
-              <w:spacing w:after="0" w:line="276"/>
-              <w:jc w:val="center"/>
-            </w:pPr>
-            <w:r>
-              <w:rPr>
-                <w:rFonts w:ascii="Times New Roman" w:cs="David" w:eastAsia="David" w:hAnsi="Times New Roman"/>
-                <w:b w:val="false"/>
-                <w:bCs w:val="false"/>
-                <w:noProof/>
-                <w:sz w:val="22"/>
-                <w:szCs w:val="22"/>
-                <w:rtl/>
-                <w:lang w:val="en-US" w:eastAsia="en-US" w:bidi="he-IL"/>
-              </w:rPr>
-              <w:t xml:space="preserve">אוששה</w:t>
-            </w:r>
-          </w:p>
-        </w:tc>
-      </w:tr>
-      <w:tr>
-        <w:trPr>
-          <w:cantSplit/>
-          <w:tblHeader w:val="false"/>
-        </w:trPr>
-        <w:tc>
-          <w:tcPr>
-            <w:tcW w:type="dxa" w:w="1000"/>
-            <w:tcBorders>
-              <w:top w:val="none" w:color="FFFFFF" w:sz="0"/>
-              <w:left w:val="none" w:color="FFFFFF" w:sz="0"/>
-              <w:bottom w:val="single" w:color="000000" w:sz="4"/>
-              <w:right w:val="none" w:color="FFFFFF" w:sz="0"/>
-            </w:tcBorders>
-            <w:tcMar>
-              <w:top w:type="dxa" w:w="50"/>
-              <w:left w:type="dxa" w:w="70"/>
-              <w:bottom w:type="dxa" w:w="50"/>
-              <w:right w:type="dxa" w:w="70"/>
-            </w:tcMar>
-          </w:tcPr>
-          <w:p>
-            <w:pPr>
-              <w:bidi/>
-              <w:spacing w:after="0" w:line="276"/>
-              <w:jc w:val="right"/>
-            </w:pPr>
-            <w:r>
-              <w:rPr>
-                <w:rFonts w:ascii="Times New Roman" w:cs="David" w:eastAsia="David" w:hAnsi="Times New Roman"/>
-                <w:b w:val="false"/>
-                <w:bCs w:val="false"/>
-                <w:noProof/>
-                <w:sz w:val="22"/>
-                <w:szCs w:val="22"/>
-                <w:rtl/>
-                <w:lang w:val="en-US" w:eastAsia="en-US" w:bidi="he-IL"/>
-              </w:rPr>
-              <w:t xml:space="preserve">5</w:t>
-            </w:r>
-          </w:p>
-        </w:tc>
-        <w:tc>
-          <w:tcPr>
-            <w:tcW w:type="dxa" w:w="4600"/>
-            <w:tcBorders>
-              <w:top w:val="none" w:color="FFFFFF" w:sz="0"/>
-              <w:left w:val="none" w:color="FFFFFF" w:sz="0"/>
-              <w:bottom w:val="single" w:color="000000" w:sz="4"/>
-              <w:right w:val="none" w:color="FFFFFF" w:sz="0"/>
-            </w:tcBorders>
-            <w:tcMar>
-              <w:top w:type="dxa" w:w="50"/>
-              <w:left w:type="dxa" w:w="70"/>
-              <w:bottom w:type="dxa" w:w="50"/>
-              <w:right w:type="dxa" w:w="70"/>
-            </w:tcMar>
-          </w:tcPr>
-          <w:p>
-            <w:pPr>
-              <w:bidi/>
-              <w:spacing w:after="0" w:line="276"/>
-              <w:jc w:val="center"/>
-            </w:pPr>
-            <w:r>
-              <w:rPr>
-                <w:rFonts w:ascii="Times New Roman" w:cs="David" w:eastAsia="David" w:hAnsi="Times New Roman"/>
-                <w:b w:val="false"/>
-                <w:bCs w:val="false"/>
-                <w:noProof/>
-                <w:sz w:val="22"/>
-                <w:szCs w:val="22"/>
-                <w:rtl/>
-                <w:lang w:val="en-US" w:eastAsia="en-US" w:bidi="he-IL"/>
-              </w:rPr>
-              <w:t xml:space="preserve">תלמידים עם לקויות למידה ישנים פחות, ישנוניים ופעילים פחות, ועומדים פחות בהמלצות</w:t>
-            </w:r>
-          </w:p>
-        </w:tc>
-        <w:tc>
-          <w:tcPr>
-            <w:tcW w:type="dxa" w:w="5000"/>
-            <w:tcBorders>
-              <w:top w:val="none" w:color="FFFFFF" w:sz="0"/>
-              <w:left w:val="none" w:color="FFFFFF" w:sz="0"/>
-              <w:bottom w:val="single" w:color="000000" w:sz="4"/>
-              <w:right w:val="none" w:color="FFFFFF" w:sz="0"/>
-            </w:tcBorders>
-            <w:tcMar>
-              <w:top w:type="dxa" w:w="50"/>
-              <w:left w:type="dxa" w:w="70"/>
-              <w:bottom w:type="dxa" w:w="50"/>
-              <w:right w:type="dxa" w:w="70"/>
-            </w:tcMar>
-          </w:tcPr>
-          <w:p>
-            <w:pPr>
-              <w:bidi/>
-              <w:spacing w:after="0" w:line="276"/>
-              <w:jc w:val="center"/>
-            </w:pPr>
-            <w:r>
-              <w:rPr>
-                <w:rFonts w:ascii="Times New Roman" w:cs="David" w:eastAsia="David" w:hAnsi="Times New Roman"/>
-                <w:b w:val="false"/>
-                <w:bCs w:val="false"/>
-                <w:noProof/>
-                <w:sz w:val="22"/>
-                <w:szCs w:val="22"/>
-                <w:rtl/>
-                <w:lang w:val="en-US" w:eastAsia="en-US" w:bidi="he-IL"/>
-              </w:rPr>
-              <w:t xml:space="preserve">אוששה חלקית: עמידה בהמלצת השינה ותפקוד לימודי נמוכים יותר; יתר ההבדלים בכיוון המשוער אך לא מובהקים</w:t>
-            </w:r>
-          </w:p>
-        </w:tc>
-      </w:tr>
-    </w:tbl>
-    <w:p>
-      <w:pPr>
-        <w:bidi/>
-        <w:spacing w:after="120" w:line="360"/>
-        <w:jc w:val="both"/>
-      </w:pPr>
-      <w:r>
-        <w:rPr>
-          <w:rFonts w:ascii="Times New Roman" w:cs="David" w:eastAsia="David" w:hAnsi="Times New Roman"/>
-          <w:noProof/>
-          <w:sz w:val="24"/>
-          <w:szCs w:val="24"/>
-          <w:rtl/>
-          <w:lang w:val="en-US" w:eastAsia="en-US" w:bidi="he-IL"/>
-        </w:rPr>
-        <w:t xml:space="preserve">מלוח 12 עולה כי שתי ההשערות שעסקו במסכים ובתפקוד הלימודי אוששו: ככל שתלמידים עם לקויות למידה חשופים יותר למסכים, הם ישנים פחות, הולכים לישון מאוחר יותר, ישנוניים יותר ביום ומשיגים ציונים נמוכים יותר, וזמן המסך היה המנבא היחיד שנותר מובהק ברגרסיה. ההשערה על מסכים ופעילות גופנית לא אוששה, ופעילות גופנית לא נקשרה באופן מובהק לתפקוד הלימודי. תלמידים העומדים ביותר המלצות דיווחו על תפקוד לימודי טוב יותר. ההשוואה בין הקבוצות העלתה שתלמידים עם לקויות למידה אינם צופים במסכים יותר מעמיתיהם, אך שיעור נמוך יותר מהם ישן די הצורך, והפער בתפקוד הלימודי ביניהם גדול.</w:t>
+        <w:t xml:space="preserve">מבין חמש ההשערות, שתי ההשערות שעסקו במסכים ובתפקוד הלימודי אוששו: ככל שתלמידים עם לקויות למידה חשופים יותר למסכים, הם ישנים פחות, הולכים לישון מאוחר יותר, ישנוניים יותר ביום ומשיגים ציונים נמוכים יותר, וזמן המסך היה המנבא היחיד שנותר מובהק ברגרסיה. ההשערה על מסכים ופעילות גופנית לא אוששה, ופעילות גופנית לא נקשרה באופן מובהק לתפקוד הלימודי. תלמידים העומדים ביותר המלצות דיווחו על תפקוד לימודי טוב יותר. ההשוואה בין הקבוצות העלתה שתלמידים עם לקויות למידה אינם צופים במסכים יותר מעמיתיהם, אך שיעור נמוך יותר מהם ישן די הצורך, והפער בתפקוד הלימודי ביניהם גדול.</w:t>
       </w:r>
     </w:p>
     <w:p>
@@ -19291,7 +15061,7 @@
           <w:rtl/>
           <w:lang w:val="en-US" w:eastAsia="en-US" w:bidi="he-IL"/>
         </w:rPr>
-        <w:t xml:space="preserve">מטרת המחקר הייתה לתאר את דפוסי החשיפה למסכים, השינה והפעילות הגופנית בקרב תלמידים עם לקויות למידה, לבחון את הקשרים ביניהם ובינם לבין התפקוד הלימודי, ולהשוות את דפוסי ההתנהגות של תלמידים אלה לאלה של תלמידים ללא לקות. הדיון עוקב אחר סדר ההשערות, מעמת את הממצאים עם הספרות שנסקרה בפרק הראשון, ומסיים במסקנות, בהשלכות יישומיות, במגבלות ובכיווני מחקר עתידיים.</w:t>
+        <w:t xml:space="preserve">מטרת המחקר הייתה לתאר את דפוסי החשיפה למסכים, השינה והפעילות הגופנית בקרב תלמידים עם לקויות למידה, לבחון את הקשרים ביניהם ובינם לבין התפקוד הלימודי, ולהשוות את דפוסי ההתנהגות של תלמידים אלה לאלה של תלמידים ללא לקות. הדיון עוקב אחר סדר ההשערות ומעמת את הממצאים עם הספרות שנסקרה בפרק הראשון.</w:t>
       </w:r>
     </w:p>
     <w:p>
@@ -19349,7 +15119,7 @@
           <w:rtl/>
           <w:lang w:val="en-US" w:eastAsia="en-US" w:bidi="he-IL"/>
         </w:rPr>
-        <w:t xml:space="preserve">גם הקשר בין מסכים לשינה, שההשערה הראשונה עסקה בו, התקבל בבירור ובכיוון שתיארה הסקירה השיטתית של מחקרים ממדינות מערביות: שעת שינה מאוחרת יותר, שינה קצרה יותר ואיכות שינה ירודה (Lund et al., 2021). הקשר החזק ביותר נמצא עם הישנוניות בשעות היום, ולא עם משך השינה עצמו. ייתכן שההסבר טמון בכך שמשך השינה מדווח בקירוב ושעות השינה נמדדות ברזולוציה של רבע שעה, ואילו הישנוניות נמדדה בסולם רב-פריטים ומהימן שמשקף את המחיר המצטבר של שינה קצרה, מאוחרת ולא סדירה. ההמלצה הישראלית להרחיק מסכים מחדרי השינה (משרד הבריאות, 2026) מקבלת כאן תמיכה: יותר ממחצית מתלמידי קבוצת המחקר מחזיקים מסך בחדר השינה, וכמעט שלושה רבעים משתמשים בו לפני השינה כמעט תמיד.</w:t>
+        <w:t xml:space="preserve">גם הקשר בין מסכים לשינה, שההשערה הראשונה עסקה בו, התקבל בבירור ובכיוון שתיארה הסקירה השיטתית של מחקרים ממדינות מערביות: שעת שינה מאוחרת יותר, שינה קצרה יותר ואיכות שינה ירודה (Lund et al., 2021). הקשר החזק ביותר נמצא עם הישנוניות בשעות היום, ולא עם משך השינה עצמו. ייתכן שההסבר הוא שמשך השינה מדווח בקירוב, ואילו הישנוניות נמדדה בסולם רב-פריטים ומהימן שמשקף את המחיר המצטבר של שינה קצרה, מאוחרת ולא סדירה. ההמלצה הישראלית להרחיק מסכים מחדרי השינה (משרד הבריאות, 2026) מקבלת כאן תמיכה: יותר ממחצית מתלמידי קבוצת המחקר מחזיקים מסך בחדר השינה, וכמעט שלושה רבעים משתמשים בו לפני השינה כמעט תמיד.</w:t>
       </w:r>
     </w:p>
     <w:p>
@@ -19407,7 +15177,7 @@
           <w:rtl/>
           <w:lang w:val="en-US" w:eastAsia="en-US" w:bidi="he-IL"/>
         </w:rPr>
-        <w:t xml:space="preserve">הפעילות הגופנית גם לא נקשרה באופן מובהק לתפקוד הלימודי, אם כי כיוון הקשר היה חיובי ותרומתה ברגרסיה הייתה השנייה בגודלה אחרי המסכים. ממצא זה מזכיר את המחקר הישראלי שמצא שהקשר בין ספורט להישגים תלוי במגדר ובסוג הפעילות ואינו אחיד (שחף ואחרים, 2014). ייתכן שמדד גס של ימי פעילות אינו לוכד את ההבדל בין פעילות מובנית שתורמת ללמידה, כמו זו שנבדקה בתוכנית האימון התנועתי לתלמידות עם לקויות למידה (בן-אשר וברגר, 2013), לבין פעילות אקראית. הממצא שתלמידים עם לקויות למידה פעילים פחות מעמיתיהם, גם אם ההבדל לא הגיע למובהקות, תואם את הסקירה שקשרה בין הליקויים המוטוריים של תלמידים אלה לבין הימנעות מפעילות (Blanchet &amp; Assaiante, 2022), ומדגיש את החשיבות של איתור מוקדם של קשיים מוטוריים בבית הספר, למשל באמצעות המורה לחינוך גופני (עוגב ויזדי-עוגב, 2024).</w:t>
+        <w:t xml:space="preserve">הפעילות הגופנית גם לא נקשרה באופן מובהק לתפקוד הלימודי, אם כי כיוון הקשר היה חיובי ותרומתה ברגרסיה הייתה השנייה בגודלה אחרי המסכים. ממצא זה מזכיר את המחקר הישראלי שמצא שהקשר בין ספורט להישגים תלוי במגדר ובסוג הפעילות ואינו אחיד (שחף ואחרים, 2014). ייתכן שמדד גס של ימי פעילות אינו לוכד את ההבדל בין פעילות מובנית שתורמת ללמידה (בן-אשר וברגר, 2013) לבין פעילות אקראית. הממצא שתלמידים עם לקויות למידה פעילים פחות מעמיתיהם, גם אם ההבדל לא הגיע למובהקות, תואם את הסקירה שקשרה בין הליקויים המוטוריים של תלמידים אלה לבין הימנעות מפעילות (Blanchet &amp; Assaiante, 2022), ומדגיש את החשיבות של איתור מוקדם של קשיים מוטוריים בבית הספר, למשל באמצעות המורה לחינוך גופני (עוגב ויזדי-עוגב, 2024).</w:t>
       </w:r>
     </w:p>
     <w:p>
@@ -19487,7 +15257,7 @@
           <w:rtl/>
           <w:lang w:val="en-US" w:eastAsia="en-US" w:bidi="he-IL"/>
         </w:rPr>
-        <w:t xml:space="preserve">ההשוואה בין הקבוצות העלתה שלוש תובנות. ראשית, תלמידים עם לקויות למידה אינם חשופים למסכים יותר מעמיתיהם. הממצא חוזר על מה שנמצא בהשוואה בין מתבגרים עם הפרעת קשב עם ובלי לקות למידה נלווית, שם לא נמצא הבדל בכמות השימוש אלא באופיו (Kocabas et al., 2025). מכאן שהבעיה אינה "יותר מסכים" אלא מה שהמסכים עושים לתלמיד שהלמידה קשה לו ממילא: אותה כמות של מסך נקשרה בקבוצת המחקר לפגיעה גדולה יותר בציונים מאשר בכלל המדגם. שנית, שיעור נמוך משמעותית מתלמידי קבוצת המחקר ישן די הצורך, וההבדלים בישנוניות ובשעת השינה היו בכיוון המשוער בגודל אפקט בינוני. הממצא מתיישב עם השיעורים הגבוהים של הפרעות שינה שדווחו בקרב ילדים עם לקות למידה ספציפית ועם דיסלקציה (Jeffcock &amp; Dimitriou, 2025; Saccani et al., 2022). בניגוד למחקר האיטלקי, שמצא את הקשיים הבולטים ביותר בקרב ילדים עם תחלואה כפולה של לקות למידה והפרעת קשב, במחקר הנוכחי לא נמצאו הבדלים בין תלמידים עם וללא הפרעת קשב בתוך קבוצת המחקר. ההסבר האפשרי הוא שכמחצית מהתלמידים עם הפרעת קשב נוטלים טיפול תרופתי, וכן שהמדגם קטן. שלישית, הפער בתפקוד הלימודי בין הקבוצות היה גדול, ובכך אין חדש. החידוש הוא שבתוך קבוצת המחקר, זמן המסך והישנוניות הסבירו חלק ניכר מהשונות בציונים. משמע, לא כל הפער בין תלמיד עם לקות למידה לבין עמיתיו נגזר מהלקות עצמה, וחלק ממנו קשור להרגלים שניתן לשנות. הקשר בין תפקודים ניהוליים לבין הבנת הנקרא שנמצא אצל תלמידים עם לקויות למידה בישראל (בשארה ווייס, 2025) מציע מנגנון אפשרי: הקושי בוויסות עצמי מקשה על התלמיד לסגור את המסך וללכת לישון, והשינה החסרה פוגעת שוב באותם תפקודים ניהוליים שהלמידה נשענת עליהם.</w:t>
+        <w:t xml:space="preserve">ההשוואה בין הקבוצות העלתה שלוש תובנות. ראשית, תלמידים עם לקויות למידה אינם חשופים למסכים יותר מעמיתיהם. הממצא חוזר על מה שנמצא בהשוואה בין מתבגרים עם הפרעת קשב עם ובלי לקות למידה נלווית, שם לא נמצא הבדל בכמות השימוש אלא באופיו (Kocabas et al., 2025). מכאן שהבעיה אינה "יותר מסכים" אלא מה שהמסכים עושים לתלמיד שהלמידה קשה לו ממילא: אותה כמות של מסך נקשרה בקבוצת המחקר לפגיעה גדולה יותר בציונים מאשר בכלל המדגם. שנית, שיעור נמוך משמעותית מתלמידי קבוצת המחקר ישן די הצורך, וההבדלים בישנוניות ובשעת השינה היו בכיוון המשוער בגודל אפקט בינוני. הממצא מתיישב עם השיעורים הגבוהים של הפרעות שינה שדווחו בקרב ילדים עם לקות למידה ספציפית ועם דיסלקציה (Jeffcock &amp; Dimitriou, 2025; Saccani et al., 2022). בניגוד למחקר האיטלקי, שמצא את הקשיים הבולטים ביותר בקרב ילדים עם תחלואה כפולה של לקות למידה והפרעת קשב, במחקר הנוכחי לא נמצאו הבדלים בין תלמידים עם וללא הפרעת קשב בתוך קבוצת המחקר. ייתכן שהסיבה היא הטיפול התרופתי שכמחצית מהם נוטלים, וכן גודל המדגם. שלישית, הפער בתפקוד הלימודי בין הקבוצות היה גדול, אך החידוש הוא שבתוך קבוצת המחקר זמן המסך והישנוניות הסבירו חלק ניכר מהשונות בציונים. משמע, לא כל הפער בין תלמיד עם לקות למידה לבין עמיתיו נגזר מהלקות עצמה, וחלק ממנו קשור להרגלים שניתן לשנות. הקשר בין תפקודים ניהוליים לבין הבנת הנקרא שנמצא אצל תלמידים עם לקויות למידה בישראל (בשארה ווייס, 2025) מציע מנגנון אפשרי: הקושי בוויסות עצמי מקשה על התלמיד לסגור את המסך וללכת לישון, והשינה החסרה פוגעת שוב באותם תפקודים ניהוליים שהלמידה נשענת עליהם.</w:t>
       </w:r>
     </w:p>
     <w:p>
@@ -19567,7 +15337,7 @@
           <w:rtl/>
           <w:lang w:val="en-US" w:eastAsia="en-US" w:bidi="he-IL"/>
         </w:rPr>
-        <w:t xml:space="preserve">תרומת המחקר היא בהבאת המודל של שלוש ההתנהגויות, שנחקר עד כה באוכלוסייה הכללית, אל תלמידים עם לקויות למידה בישראל, ובמדידת שלוש ההתנהגויות יחד באותו מדגם. מהממצאים נגזרות כמה המלצות מעשיות. ברמת בית הספר, מומלץ שמרכז התמיכה או רכז לקויות הלמידה יכלול בתוכנית העבודה עם כל תלמיד מאובחן שיחה קצרה על הרגלי מסך ושינה, בדומה לשיחה על התאמות בבחינות, ויציע כלים פשוטים: שעת סיום קבועה למסכים, טעינת הטלפון מחוץ לחדר השינה ושמירה על שעת השינה גם בסוף השבוע. עוד מומלץ שהמורה לחינוך גופני יקבל את רשימת התלמידים עם לקויות למידה ויעקוב אחר השתתפותם בשיעורים, בהתאם לתפקידו כגורם מאתר של קשיים מוטוריים (עוגב ויזדי-עוגב, 2024), ושבית הספר יציע להם פעילות תנועתית מובנית בקבוצה קטנה, כפי שנוסה בהצלחה בישראל (בן-אשר וברגר, 2013). ברמת ההורים, ההמלצה החשובה ביותר היא להוציא את המסכים מחדר השינה ולהפסיק את השימוש בהם חצי שעה לפני השינה, בהתאם להמלצות משרד הבריאות (2026), ולשמור על שעת שינה קבועה בסוף השבוע. ברמת המדיניות, ראוי שההמלצות הארציות בנושא מסכים ושינה יתייחסו במפורש לתלמידים עם לקויות למידה ויועברו דרך אגף לקויות למידה והפרעות קשב, שכן הממצאים מראים שאצל תלמידים אלה המחיר של אותה כמות מסך גבוה יותר. דוגמה לאפשרות כזו היא תוכנית חברו"ת, תוכנית חונכות מקוונת שבה סטודנטים לחינוך גופני ליוו בני נוער בסיכון בפעילות גופנית ובקשר אישי במשך כחצי שנה בתקופת הקורונה. בקרב 27 המשתתפים בתוכנית נמצאה לאחריה עלייה בחוסן ובתמיכה החברתית וירידה במצוקה הפסיכולוגית, ואילו בקבוצת הביקורת לא נמצא שינוי (גלסר ואחרים, 2022). מודל דומה, שמשלב פעילות גופנית עם ליווי אישי, עשוי להתאים גם לתלמידים עם לקויות למידה, שאצלם ההימנעות מפעילות קשורה לא פעם לחוויית כישלון ולא לחוסר עניין.</w:t>
+        <w:t xml:space="preserve">תרומת המחקר היא בהבאת המודל של שלוש ההתנהגויות, שנחקר עד כה באוכלוסייה הכללית, אל תלמידים עם לקויות למידה בישראל, ובמדידת שלוש ההתנהגויות יחד באותו מדגם. מהממצאים נגזרות כמה המלצות מעשיות. ברמת בית הספר, מומלץ שמרכז התמיכה או רכז לקויות הלמידה יכלול בתוכנית העבודה עם כל תלמיד מאובחן שיחה קצרה על הרגלי מסך ושינה, בדומה לשיחה על התאמות בבחינות, ויציע כלים פשוטים: שעת סיום קבועה למסכים, טעינת הטלפון מחוץ לחדר השינה ושמירה על שעת השינה גם בסוף השבוע. עוד מומלץ שהמורה לחינוך גופני יקבל את רשימת התלמידים עם לקויות למידה ויעקוב אחר השתתפותם בשיעורים, בהתאם לתפקידו כגורם מאתר של קשיים מוטוריים (עוגב ויזדי-עוגב, 2024), ושבית הספר יציע להם פעילות תנועתית מובנית בקבוצה קטנה, כפי שנוסה בהצלחה בישראל (בן-אשר וברגר, 2013). ברמת ההורים, ההמלצה החשובה ביותר היא להוציא את המסכים מחדר השינה ולהפסיק את השימוש בהם חצי שעה לפני השינה, בהתאם להמלצות משרד הבריאות (2026), ולשמור על שעת שינה קבועה בסוף השבוע. ברמת המדיניות, ראוי שההמלצות הארציות בנושא מסכים ושינה יתייחסו במפורש לתלמידים עם לקויות למידה, שכן אצלם המחיר של אותה כמות מסך גבוה יותר. דוגמה למודל התערבות אפשרי היא תוכנית חברו"ת, תוכנית חונכות מקוונת שבה סטודנטים לחינוך גופני ליוו בני נוער בסיכון בפעילות גופנית ובקשר אישי במשך כחצי שנה בתקופת הקורונה. בקרב המשתתפים נמצאה לאחריה עלייה בחוסן ובתמיכה החברתית וירידה במצוקה הפסיכולוגית, ואילו בקבוצת הביקורת לא נמצא שינוי (גלסר ואחרים, 2022). מודל דומה, שמשלב פעילות גופנית עם ליווי אישי, עשוי להתאים גם לתלמידים עם לקויות למידה, שאצלם ההימנעות מפעילות קשורה לא פעם לחוויית כישלון ולא לחוסר עניין.</w:t>
       </w:r>
     </w:p>
     <w:p>
@@ -19705,7 +15475,7 @@
           <w:rtl/>
           <w:lang w:val="en-US" w:eastAsia="en-US" w:bidi="he-IL"/>
         </w:rPr>
-        <w:t xml:space="preserve">העבודה יצאה מהשאלה כיצד מתחלקות 24 השעות של תלמיד עם לקות למידה בין מסכים, שינה ותנועה, ומה הקשר בין החלוקה הזאת לבין תפקודו בלימודים. הספרות הראתה שבאוכלוסייה הכללית שלוש ההתנהגויות קשורות זו לזו ולהישגים, ושתלמידים עם לקויות למידה פגיעים במיוחד לשינה לקויה ולקשיים מוטוריים, אך לא נמצא מחקר שבדק את שלושתן יחד באוכלוסייה זו בישראל. המחקר הנוכחי, מחקר כמותי בקרב 40 תלמידים עם לקויות למידה ו-25 תלמידים ללא לקות בכיתות ז' עד י"ב, מצא שזמן המסך הוא הגורם הקשור באופן החזק ביותר לשינה קצרה ומאוחרת, לישנוניות ולציונים נמוכים, שתלמידים עם לקויות למידה ישנים די הצורך בשיעור נמוך משמעותית מעמיתיהם, שהפעילות הגופנית נמוכה בשתי הקבוצות, ושכל המלצה שמתקיימת מלווה בתפקוד לימודי טוב יותר. המסקנה המעשית פשוטה: לצד ההתאמות בבחינות, שיחה על שעת כיבוי המסכים והוצאת הטלפון מחדר השינה היא התערבות זולה שעשויה לתרום לתלמיד עם לקות למידה לא פחות. הצעד הבא הוא מחקר גדול יותר, במערך אורך ובמדידה אובייקטיבית, שיבדוק אם שינוי ההרגלים אכן משנה את התוצאות.</w:t>
+        <w:t xml:space="preserve">העבודה יצאה מהשאלה כיצד מתחלקות 24 השעות של תלמיד עם לקות למידה בין מסכים, שינה ותנועה, ומה הקשר בין החלוקה הזאת לבין תפקודו בלימודים. הספרות הראתה שבאוכלוסייה הכללית שלוש ההתנהגויות קשורות זו לזו ולהישגים, אך לא נמצא מחקר שבדק את שלושתן יחד בקרב תלמידים עם לקויות למידה בישראל. המחקר הנוכחי, מחקר כמותי בקרב 40 תלמידים עם לקויות למידה ו-25 תלמידים ללא לקות בכיתות ז' עד י"ב, מצא שזמן המסך הוא הגורם הקשור באופן החזק ביותר לשינה קצרה ומאוחרת, לישנוניות ולציונים נמוכים, שתלמידים עם לקויות למידה ישנים די הצורך בשיעור נמוך משמעותית מעמיתיהם, שהפעילות הגופנית נמוכה בשתי הקבוצות, ושכל המלצה שמתקיימת מלווה בתפקוד לימודי טוב יותר. המסקנה המעשית פשוטה: לצד ההתאמות בבחינות, שיחה על שעת כיבוי המסכים והוצאת הטלפון מחדר השינה היא התערבות זולה שעשויה לתרום לתלמיד עם לקות למידה לא פחות. הצעד הבא הוא מחקר גדול יותר, במערך אורך ובמדידה אובייקטיבית, שיבדוק אם שינוי ההרגלים אכן משנה את התוצאות.</w:t>
       </w:r>
     </w:p>
     <w:p>

</xml_diff>

<commit_message>
Seminar: format Hebrew bibliography per APA 7 Hebrew guide (bold journal titles, no comma before final author, no database URLs)
Co-Authored-By: Claude Fable 5.1 <noreply@anthropic.com>
Claude-Session: https://claude.ai/code/session_019RaBW72rT1xkbcXD9zJSh3
</commit_message>
<xml_diff>
--- a/seminar/עבודה_סמינריונית_סופית_מסכים_שינה_פעילות_גופנית_לקויות_למידה.docx
+++ b/seminar/עבודה_סמינריונית_סופית_מסכים_שינה_פעילות_גופנית_לקויות_למידה.docx
@@ -2083,7 +2083,7 @@
           <w:rtl/>
           <w:lang w:val="en-US" w:eastAsia="en-US" w:bidi="he-IL"/>
         </w:rPr>
-        <w:t xml:space="preserve">העבודה הנוכחית מפנה את השאלה הזאת לאוכלוסייה שכמעט אינה מופיעה במחקרים האלה: תלמידים עם לקויות למידה. לקות למידה היא הפרעה נוירו-התפתחותית שמתבטאת בקושי מתמשך ברכישת קריאה, כתיבה או חשבון, והיא מוגדרת בישראל על פי המדריך האבחוני האמריקני (ארן-ארנרייך, 2013; משרד החינוך, ל.ת.). לתלמידים אלה יש סיבות להיות פגיעים יותר לחוסר איזון בין מסכים, שינה ותנועה. מחקרים מצביעים על שיעורים גבוהים של הפרעות שינה בקרב ילדים עם דיסלקציה ועם לקות למידה ספציפית (Jeffcock &amp; Dimitriou, 2025; Saccani et al., 2022) ועל קשיים מוטוריים שמלווים את הלקות ומקשים על השתתפות בפעילות גופנית (Blanchet &amp; Assaiante, 2022). בישראל, ניתוח של נתוני הסקר הארצי HBSC הראה שבני נוער עם מוגבלויות הלומדים בחינוך הכללי נבדלים מעמיתיהם בהרגלי הפעילות הגופנית ובמדדי הרווחה (הראל-פיש ואחרים, 2024). עם זאת, כמעט אין מחקר שבדק את שלוש ההתנהגויות יחד בקרב תלמידים עם לקויות למידה, ובוודאי לא בישראל.</w:t>
+        <w:t xml:space="preserve">העבודה הנוכחית מפנה את השאלה הזאת לאוכלוסייה שכמעט אינה מופיעה במחקרים האלה: תלמידים עם לקויות למידה. לקות למידה היא הפרעה נוירו-התפתחותית שמתבטאת בקושי מתמשך ברכישת קריאה, כתיבה או חשבון, והיא מוגדרת בישראל על פי המדריך האבחוני האמריקני (ארן-ארנרייך, 2013; משרד החינוך, ח"ת). לתלמידים אלה יש סיבות להיות פגיעים יותר לחוסר איזון בין מסכים, שינה ותנועה. מחקרים מצביעים על שיעורים גבוהים של הפרעות שינה בקרב ילדים עם דיסלקציה ועם לקות למידה ספציפית (Jeffcock &amp; Dimitriou, 2025; Saccani et al., 2022) ועל קשיים מוטוריים שמלווים את הלקות ומקשים על השתתפות בפעילות גופנית (Blanchet &amp; Assaiante, 2022). בישראל, ניתוח של נתוני הסקר הארצי HBSC הראה שבני נוער עם מוגבלויות הלומדים בחינוך הכללי נבדלים מעמיתיהם בהרגלי הפעילות הגופנית ובמדדי הרווחה (הראל-פיש ואחרים, 2024). עם זאת, כמעט אין מחקר שבדק את שלוש ההתנהגויות יחד בקרב תלמידים עם לקויות למידה, ובוודאי לא בישראל.</w:t>
       </w:r>
     </w:p>
     <w:p>
@@ -2200,7 +2200,7 @@
           <w:rtl/>
           <w:lang w:val="en-US" w:eastAsia="en-US" w:bidi="he-IL"/>
         </w:rPr>
-        <w:t xml:space="preserve">המהדורה החמישית של המדריך האבחוני האמריקני הביאה עמה שינוי מושגי בתחום. במקום המונח "לקות" (Disability) נבחר המונח "הפרעה" (Disorder), ולקות הלמידה הוגדרה כהפרעה נוירו-התפתחותית שבה קשיים ברכישת קריאה, כתיבה או חשבון נמשכים שישה חודשים לפחות למרות התערבות ממוקדת, פוגעים בתפקוד הלימודי או היומיומי, מתחילים בשנות בית הספר ואינם מוסברים על ידי מוגבלות שכלית, ליקוי חושי או חסך בהוראה. ההגדרה עברה מהסתמכות על פער בין אינטליגנציה להישגים אל דרישה לתיעוד של קושי מתמשך שאינו נענה להתערבות. השכיחות בקרב ילדים בגיל בית הספר נאמדת בחמישה עד חמישה עשר אחוזים (American Psychiatric Association, 2013, כפי שמצוטט אצל ארן-ארנרייך, 2013).</w:t>
+        <w:t xml:space="preserve">המהדורה החמישית של המדריך האבחוני האמריקני הביאה עמה שינוי מושגי בתחום. במקום המונח "לקות" (Disability) נבחר המונח "הפרעה" (Disorder), ולקות הלמידה הוגדרה כהפרעה נוירו-התפתחותית שבה קשיים ברכישת קריאה, כתיבה או חשבון נמשכים שישה חודשים לפחות למרות התערבות ממוקדת, פוגעים בתפקוד הלימודי או היומיומי, מתחילים בשנות בית הספר ואינם מוסברים על ידי מוגבלות שכלית, ליקוי חושי או חסך בהוראה. ההגדרה עברה מהסתמכות על פער בין אינטליגנציה להישגים אל דרישה לתיעוד של קושי מתמשך שאינו נענה להתערבות. השכיחות בקרב ילדים בגיל בית הספר נאמדת בחמישה עד חמישה עשר אחוזים (American Psychiatric Association, 2013, מצוטט אצל ארן-ארנרייך, 2013).</w:t>
       </w:r>
     </w:p>
     <w:p>
@@ -2218,7 +2218,7 @@
           <w:rtl/>
           <w:lang w:val="en-US" w:eastAsia="en-US" w:bidi="he-IL"/>
         </w:rPr>
-        <w:t xml:space="preserve">בישראל אימץ משרד החינוך את ההגדרה של המדריך האמריקני כבסיס לאבחון ולמתן התאמות, ואגף לקויות למידה והפרעות קשב בשירות הפסיכולוגי-ייעוצי אחראי על גיבוש המדיניות בתחום (משרד החינוך, ל.ת.). דוח של מרכז המחקר והמידע של הכנסת סקר את הליכי האיתור והאבחון במערכת החינוך והצביע על פערים בין מגזרים ובין שכבות גיל בזמינות האבחון ובמתן ההתאמות (אבגר, 2018).</w:t>
+        <w:t xml:space="preserve">בישראל אימץ משרד החינוך את ההגדרה של המדריך האמריקני כבסיס לאבחון ולמתן התאמות, ואגף לקויות למידה והפרעות קשב בשירות הפסיכולוגי-ייעוצי אחראי על גיבוש המדיניות בתחום (משרד החינוך, ח"ת). דוח של מרכז המחקר והמידע של הכנסת סקר את הליכי האיתור והאבחון במערכת החינוך והצביע על פערים בין מגזרים ובין שכבות גיל בזמינות האבחון ובמתן ההתאמות (אבגר, 2018).</w:t>
       </w:r>
     </w:p>
     <w:p>
@@ -15558,7 +15558,31 @@
           <w:rtl/>
           <w:lang w:val="en-US" w:eastAsia="en-US" w:bidi="he-IL"/>
         </w:rPr>
-        <w:t xml:space="preserve">אבגר, ע' (2018). לקויות למידה במערכת החינוך בישראל. הכנסת, מרכז המחקר והמידע. https://fs.knesset.gov.il/globaldocs/MMM/27414620-973d-e811-80df-00155d0a9876/2_27414620-973d-e811-80df-00155d0a9876_11_13740.pdf</w:t>
+        <w:t xml:space="preserve">אבגר, ע' (2018). </w:t>
+      </w:r>
+      <w:r>
+        <w:rPr>
+          <w:rFonts w:ascii="Times New Roman" w:cs="David" w:eastAsia="David" w:hAnsi="Times New Roman"/>
+          <w:b/>
+          <w:bCs/>
+          <w:noProof/>
+          <w:sz w:val="24"/>
+          <w:szCs w:val="24"/>
+          <w:rtl/>
+          <w:lang w:val="en-US" w:eastAsia="en-US" w:bidi="he-IL"/>
+        </w:rPr>
+        <w:t xml:space="preserve">לקויות למידה במערכת החינוך בישראל</w:t>
+      </w:r>
+      <w:r>
+        <w:rPr>
+          <w:rFonts w:ascii="Times New Roman" w:cs="David" w:eastAsia="David" w:hAnsi="Times New Roman"/>
+          <w:noProof/>
+          <w:sz w:val="24"/>
+          <w:szCs w:val="24"/>
+          <w:rtl/>
+          <w:lang w:val="en-US" w:eastAsia="en-US" w:bidi="he-IL"/>
+        </w:rPr>
+        <w:t xml:space="preserve">. הכנסת, מרכז המחקר והמידע. https://fs.knesset.gov.il/globaldocs/MMM/27414620-973d-e811-80df-00155d0a9876/2_27414620-973d-e811-80df-00155d0a9876_11_13740.pdf</w:t>
       </w:r>
     </w:p>
     <w:p>
@@ -15577,7 +15601,31 @@
           <w:rtl/>
           <w:lang w:val="en-US" w:eastAsia="en-US" w:bidi="he-IL"/>
         </w:rPr>
-        <w:t xml:space="preserve">איגוד האינטרנט הישראלי (2022). בני נוער, הורים ומסכים בישראל: סקר שימושים ופערים (קיץ 2022). https://www.isoc.org.il/sts-data/screentime_2022</w:t>
+        <w:t xml:space="preserve">איגוד האינטרנט הישראלי. (2022). </w:t>
+      </w:r>
+      <w:r>
+        <w:rPr>
+          <w:rFonts w:ascii="Times New Roman" w:cs="David" w:eastAsia="David" w:hAnsi="Times New Roman"/>
+          <w:b/>
+          <w:bCs/>
+          <w:noProof/>
+          <w:sz w:val="24"/>
+          <w:szCs w:val="24"/>
+          <w:rtl/>
+          <w:lang w:val="en-US" w:eastAsia="en-US" w:bidi="he-IL"/>
+        </w:rPr>
+        <w:t xml:space="preserve">בני נוער, הורים ומסכים בישראל: סקר שימושים ופערים (קיץ 2022)</w:t>
+      </w:r>
+      <w:r>
+        <w:rPr>
+          <w:rFonts w:ascii="Times New Roman" w:cs="David" w:eastAsia="David" w:hAnsi="Times New Roman"/>
+          <w:noProof/>
+          <w:sz w:val="24"/>
+          <w:szCs w:val="24"/>
+          <w:rtl/>
+          <w:lang w:val="en-US" w:eastAsia="en-US" w:bidi="he-IL"/>
+        </w:rPr>
+        <w:t xml:space="preserve">. https://www.isoc.org.il/sts-data/screentime_2022</w:t>
       </w:r>
     </w:p>
     <w:p>
@@ -15596,7 +15644,31 @@
           <w:rtl/>
           <w:lang w:val="en-US" w:eastAsia="en-US" w:bidi="he-IL"/>
         </w:rPr>
-        <w:t xml:space="preserve">ארן-ארנרייך, י' (2013, 7 בנובמבר). לקות למידה או הפרעת למידה? אבחון קשיי למידה על פי ה-DSM 5. פסיכולוגיה עברית. https://www.hebpsy.net/articles.asp?id=3043</w:t>
+        <w:t xml:space="preserve">ארן-ארנרייך, י' (2013, 7 בנובמבר). </w:t>
+      </w:r>
+      <w:r>
+        <w:rPr>
+          <w:rFonts w:ascii="Times New Roman" w:cs="David" w:eastAsia="David" w:hAnsi="Times New Roman"/>
+          <w:b/>
+          <w:bCs/>
+          <w:noProof/>
+          <w:sz w:val="24"/>
+          <w:szCs w:val="24"/>
+          <w:rtl/>
+          <w:lang w:val="en-US" w:eastAsia="en-US" w:bidi="he-IL"/>
+        </w:rPr>
+        <w:t xml:space="preserve">לקות למידה או הפרעת למידה? אבחון קשיי למידה על פי ה-DSM-5</w:t>
+      </w:r>
+      <w:r>
+        <w:rPr>
+          <w:rFonts w:ascii="Times New Roman" w:cs="David" w:eastAsia="David" w:hAnsi="Times New Roman"/>
+          <w:noProof/>
+          <w:sz w:val="24"/>
+          <w:szCs w:val="24"/>
+          <w:rtl/>
+          <w:lang w:val="en-US" w:eastAsia="en-US" w:bidi="he-IL"/>
+        </w:rPr>
+        <w:t xml:space="preserve">. פסיכולוגיה עברית. https://www.hebpsy.net/articles.asp?id=3043</w:t>
       </w:r>
     </w:p>
     <w:p>
@@ -15615,7 +15687,31 @@
           <w:rtl/>
           <w:lang w:val="en-US" w:eastAsia="en-US" w:bidi="he-IL"/>
         </w:rPr>
-        <w:t xml:space="preserve">בן-אשר, ס', וברגר, ר' (2013). שיפור כישורי למידה של תלמידות עם ליקויי למידה באמצעות אימון בתנועה משולב בהתערבות קוגניטיבית-התנהגותית: מחקר גישוש. בתנועה: כתב-עת למדעי החינוך הגופני והספורט, י(3), 287-307.</w:t>
+        <w:t xml:space="preserve">בן-אשר, ס' וברגר, ר' (2013). שיפור כישורי למידה של תלמידות עם ליקויי למידה באמצעות אימון בתנועה משולב בהתערבות קוגניטיבית-התנהגותית: מחקר גישוש. </w:t>
+      </w:r>
+      <w:r>
+        <w:rPr>
+          <w:rFonts w:ascii="Times New Roman" w:cs="David" w:eastAsia="David" w:hAnsi="Times New Roman"/>
+          <w:b/>
+          <w:bCs/>
+          <w:noProof/>
+          <w:sz w:val="24"/>
+          <w:szCs w:val="24"/>
+          <w:rtl/>
+          <w:lang w:val="en-US" w:eastAsia="en-US" w:bidi="he-IL"/>
+        </w:rPr>
+        <w:t xml:space="preserve">בתנועה: כתב-עת למדעי החינוך הגופני והספורט, י</w:t>
+      </w:r>
+      <w:r>
+        <w:rPr>
+          <w:rFonts w:ascii="Times New Roman" w:cs="David" w:eastAsia="David" w:hAnsi="Times New Roman"/>
+          <w:noProof/>
+          <w:sz w:val="24"/>
+          <w:szCs w:val="24"/>
+          <w:rtl/>
+          <w:lang w:val="en-US" w:eastAsia="en-US" w:bidi="he-IL"/>
+        </w:rPr>
+        <w:t xml:space="preserve">(3), 287-307.</w:t>
       </w:r>
     </w:p>
     <w:p>
@@ -15634,7 +15730,31 @@
           <w:rtl/>
           <w:lang w:val="en-US" w:eastAsia="en-US" w:bidi="he-IL"/>
         </w:rPr>
-        <w:t xml:space="preserve">בק, ה', טסלר, ר', מורן, ד', קולובוב, ט', והראל-פיש, י' (2018). מודל רב-רמות להבנת הגורמים המנבאים התנהגויות בריאות: הרגלי פעילות גופנית ותזונה בריאה בקרב תלמידים בישראל. בתנועה: כתב-עת למדעי החינוך הגופני והספורט, יא(4), 510-533.</w:t>
+        <w:t xml:space="preserve">בק, ה', טסלר, ר', מורן, ד', קולובוב, ט' והראל-פיש, י' (2018). מודל רב-רמות להבנת הגורמים המנבאים התנהגויות בריאות: הרגלי פעילות גופנית ותזונה בריאה בקרב תלמידים בישראל. </w:t>
+      </w:r>
+      <w:r>
+        <w:rPr>
+          <w:rFonts w:ascii="Times New Roman" w:cs="David" w:eastAsia="David" w:hAnsi="Times New Roman"/>
+          <w:b/>
+          <w:bCs/>
+          <w:noProof/>
+          <w:sz w:val="24"/>
+          <w:szCs w:val="24"/>
+          <w:rtl/>
+          <w:lang w:val="en-US" w:eastAsia="en-US" w:bidi="he-IL"/>
+        </w:rPr>
+        <w:t xml:space="preserve">בתנועה: כתב-עת למדעי החינוך הגופני והספורט, יא</w:t>
+      </w:r>
+      <w:r>
+        <w:rPr>
+          <w:rFonts w:ascii="Times New Roman" w:cs="David" w:eastAsia="David" w:hAnsi="Times New Roman"/>
+          <w:noProof/>
+          <w:sz w:val="24"/>
+          <w:szCs w:val="24"/>
+          <w:rtl/>
+          <w:lang w:val="en-US" w:eastAsia="en-US" w:bidi="he-IL"/>
+        </w:rPr>
+        <w:t xml:space="preserve">(4), 510-533.</w:t>
       </w:r>
     </w:p>
     <w:p>
@@ -15653,7 +15773,31 @@
           <w:rtl/>
           <w:lang w:val="en-US" w:eastAsia="en-US" w:bidi="he-IL"/>
         </w:rPr>
-        <w:t xml:space="preserve">בשארה, ס', ווייס, י' (2025). קשר בין תפקודים ניהוליים וידע עולם להבנת הנקרא בקרב תלמידים עם לקויות למידה ותלמידים בלי לקויות למידה. הייעוץ החינוכי. https://www.shaanan.ac.il/wp-content/uploads/2025/02/Bishara-Weiss.pdf</w:t>
+        <w:t xml:space="preserve">בשארה, ס' ווייס, י' (2025). קשר בין תפקודים ניהוליים וידע עולם להבנת הנקרא בקרב תלמידים עם לקויות למידה ותלמידים בלי לקויות למידה. </w:t>
+      </w:r>
+      <w:r>
+        <w:rPr>
+          <w:rFonts w:ascii="Times New Roman" w:cs="David" w:eastAsia="David" w:hAnsi="Times New Roman"/>
+          <w:b/>
+          <w:bCs/>
+          <w:noProof/>
+          <w:sz w:val="24"/>
+          <w:szCs w:val="24"/>
+          <w:rtl/>
+          <w:lang w:val="en-US" w:eastAsia="en-US" w:bidi="he-IL"/>
+        </w:rPr>
+        <w:t xml:space="preserve">הייעוץ החינוכי</w:t>
+      </w:r>
+      <w:r>
+        <w:rPr>
+          <w:rFonts w:ascii="Times New Roman" w:cs="David" w:eastAsia="David" w:hAnsi="Times New Roman"/>
+          <w:noProof/>
+          <w:sz w:val="24"/>
+          <w:szCs w:val="24"/>
+          <w:rtl/>
+          <w:lang w:val="en-US" w:eastAsia="en-US" w:bidi="he-IL"/>
+        </w:rPr>
+        <w:t xml:space="preserve">. https://www.shaanan.ac.il/wp-content/uploads/2025/02/Bishara-Weiss.pdf</w:t>
       </w:r>
     </w:p>
     <w:p>
@@ -15672,7 +15816,31 @@
           <w:rtl/>
           <w:lang w:val="en-US" w:eastAsia="en-US" w:bidi="he-IL"/>
         </w:rPr>
-        <w:t xml:space="preserve">גלסר, מ', גרין, ג', ברק, ש', יוסף, ג', רגב, ע', זיגדון, א', עופרי, ל', וטסלר, ר' (2022). תוכנית התערבות מקוונת חברו"ת (חוסן, בריאות ותקווה) לעידוד הרגלי פעילות גופנית ושיפור מדדים רגשיים וחברתיים בקרב בני נוער בסיכון במהלך משבר מגפת הקורונה 2020. בתנועה: כתב-עת למדעי החינוך הגופני והספורט, יג(4), 401-421. https://www.jstor.org/stable/27194292</w:t>
+        <w:t xml:space="preserve">גלסר, מ', גרין, ג', ברק, ש', יוסף, ג', רגב, ע', זיגדון, א', עופרי, ל' וטסלר, ר' (2022). תוכנית התערבות מקוונת חברו"ת (חוסן, בריאות ותקווה) לעידוד הרגלי פעילות גופנית ושיפור מדדים רגשיים וחברתיים בקרב בני נוער בסיכון במהלך משבר מגפת הקורונה 2020. </w:t>
+      </w:r>
+      <w:r>
+        <w:rPr>
+          <w:rFonts w:ascii="Times New Roman" w:cs="David" w:eastAsia="David" w:hAnsi="Times New Roman"/>
+          <w:b/>
+          <w:bCs/>
+          <w:noProof/>
+          <w:sz w:val="24"/>
+          <w:szCs w:val="24"/>
+          <w:rtl/>
+          <w:lang w:val="en-US" w:eastAsia="en-US" w:bidi="he-IL"/>
+        </w:rPr>
+        <w:t xml:space="preserve">בתנועה: כתב-עת למדעי החינוך הגופני והספורט, יג</w:t>
+      </w:r>
+      <w:r>
+        <w:rPr>
+          <w:rFonts w:ascii="Times New Roman" w:cs="David" w:eastAsia="David" w:hAnsi="Times New Roman"/>
+          <w:noProof/>
+          <w:sz w:val="24"/>
+          <w:szCs w:val="24"/>
+          <w:rtl/>
+          <w:lang w:val="en-US" w:eastAsia="en-US" w:bidi="he-IL"/>
+        </w:rPr>
+        <w:t xml:space="preserve">(4), 401-421.</w:t>
       </w:r>
     </w:p>
     <w:p>
@@ -15691,7 +15859,31 @@
           <w:rtl/>
           <w:lang w:val="en-US" w:eastAsia="en-US" w:bidi="he-IL"/>
         </w:rPr>
-        <w:t xml:space="preserve">גספר, ל' ס', סנטוס, ב', בארוס-ויאגס, א' ת', קרדוזו, ז', אמרל, ס' ו', קרוואליאש-אלמיידה, ק', סנטוס-קרוואליו, א', קבדאש, ק', ואלוורו, א' ר' (2020). כוחות-העל של השינה שלנו. Frontiers for Young Minds. https://kids.frontiersin.org/he/articles/10.3389/frym.2020.540052-he</w:t>
+        <w:t xml:space="preserve">גספר, ל"ס, סנטוס, ב', בארוס-ויאגס, א"ת, קרדוזו, ז', אמרל, ס"ו, קרוואליאש-אלמיידה, ק', סנטוס-קרוואליו, א', קבדאש, ק' ואלוורו, א"ר (2020). כוחות-העל של השינה שלנו. </w:t>
+      </w:r>
+      <w:r>
+        <w:rPr>
+          <w:rFonts w:ascii="Times New Roman" w:cs="David" w:eastAsia="David" w:hAnsi="Times New Roman"/>
+          <w:b/>
+          <w:bCs/>
+          <w:noProof/>
+          <w:sz w:val="24"/>
+          <w:szCs w:val="24"/>
+          <w:rtl/>
+          <w:lang w:val="en-US" w:eastAsia="en-US" w:bidi="he-IL"/>
+        </w:rPr>
+        <w:t xml:space="preserve">Frontiers for Young Minds, 8</w:t>
+      </w:r>
+      <w:r>
+        <w:rPr>
+          <w:rFonts w:ascii="Times New Roman" w:cs="David" w:eastAsia="David" w:hAnsi="Times New Roman"/>
+          <w:noProof/>
+          <w:sz w:val="24"/>
+          <w:szCs w:val="24"/>
+          <w:rtl/>
+          <w:lang w:val="en-US" w:eastAsia="en-US" w:bidi="he-IL"/>
+        </w:rPr>
+        <w:t xml:space="preserve">. https://kids.frontiersin.org/he/articles/10.3389/frym.2020.540052-he</w:t>
       </w:r>
     </w:p>
     <w:p>
@@ -15710,7 +15902,31 @@
           <w:rtl/>
           <w:lang w:val="en-US" w:eastAsia="en-US" w:bidi="he-IL"/>
         </w:rPr>
-        <w:t xml:space="preserve">דובנוב-רז, ג', בר-יוסף, ר', גולן, ר', נבות-מינצר, ד', נמט, ד', צוקר-טולדנו, מ', קונסטנטיני, נ', אריאלי, ר', דותן, ר', ופלק, ב' (2019). פעילות גופנית וספורט בילדים ובבני נוער: נייר עמדה. ההסתדרות הרפואית בישראל. https://www.ima.org.il/MainSiteNew/EditClinicalInstruction.aspx?ClinicalInstructionId=1437</w:t>
+        <w:t xml:space="preserve">דובנוב-רז, ג', בר-יוסף, ר', גולן, ר', נבות-מינצר, ד', נמט, ד', צוקר-טולדנו, מ', קונסטנטיני, נ', אריאלי, ר', דותן, ר' ופלק, ב' (2019). </w:t>
+      </w:r>
+      <w:r>
+        <w:rPr>
+          <w:rFonts w:ascii="Times New Roman" w:cs="David" w:eastAsia="David" w:hAnsi="Times New Roman"/>
+          <w:b/>
+          <w:bCs/>
+          <w:noProof/>
+          <w:sz w:val="24"/>
+          <w:szCs w:val="24"/>
+          <w:rtl/>
+          <w:lang w:val="en-US" w:eastAsia="en-US" w:bidi="he-IL"/>
+        </w:rPr>
+        <w:t xml:space="preserve">פעילות גופנית וספורט בילדים ובבני נוער: נייר עמדה</w:t>
+      </w:r>
+      <w:r>
+        <w:rPr>
+          <w:rFonts w:ascii="Times New Roman" w:cs="David" w:eastAsia="David" w:hAnsi="Times New Roman"/>
+          <w:noProof/>
+          <w:sz w:val="24"/>
+          <w:szCs w:val="24"/>
+          <w:rtl/>
+          <w:lang w:val="en-US" w:eastAsia="en-US" w:bidi="he-IL"/>
+        </w:rPr>
+        <w:t xml:space="preserve">. ההסתדרות הרפואית בישראל. https://www.ima.org.il/MainSiteNew/EditClinicalInstruction.aspx?ClinicalInstructionId=1437</w:t>
       </w:r>
     </w:p>
     <w:p>
@@ -15729,7 +15945,31 @@
           <w:rtl/>
           <w:lang w:val="en-US" w:eastAsia="en-US" w:bidi="he-IL"/>
         </w:rPr>
-        <w:t xml:space="preserve">העמותה הישראלית לריפוי בעיסוק (2017). נייר עמדה: התערבות בריפוי בעיסוק לקידום השתתפות ואיכות החיים של ילדים, מתבגרים ומבוגרים עם הפרעת קשב. כתב עת ישראלי לריפוי בעיסוק, 26(3), 184-194.</w:t>
+        <w:t xml:space="preserve">העמותה הישראלית לריפוי בעיסוק. (2017). נייר עמדה: התערבות בריפוי בעיסוק לקידום השתתפות ואיכות החיים של ילדים, מתבגרים ומבוגרים עם הפרעת קשב. </w:t>
+      </w:r>
+      <w:r>
+        <w:rPr>
+          <w:rFonts w:ascii="Times New Roman" w:cs="David" w:eastAsia="David" w:hAnsi="Times New Roman"/>
+          <w:b/>
+          <w:bCs/>
+          <w:noProof/>
+          <w:sz w:val="24"/>
+          <w:szCs w:val="24"/>
+          <w:rtl/>
+          <w:lang w:val="en-US" w:eastAsia="en-US" w:bidi="he-IL"/>
+        </w:rPr>
+        <w:t xml:space="preserve">כתב עת ישראלי לריפוי בעיסוק, 26</w:t>
+      </w:r>
+      <w:r>
+        <w:rPr>
+          <w:rFonts w:ascii="Times New Roman" w:cs="David" w:eastAsia="David" w:hAnsi="Times New Roman"/>
+          <w:noProof/>
+          <w:sz w:val="24"/>
+          <w:szCs w:val="24"/>
+          <w:rtl/>
+          <w:lang w:val="en-US" w:eastAsia="en-US" w:bidi="he-IL"/>
+        </w:rPr>
+        <w:t xml:space="preserve">(3), 184-194.</w:t>
       </w:r>
     </w:p>
     <w:p>
@@ -15748,7 +15988,31 @@
           <w:rtl/>
           <w:lang w:val="en-US" w:eastAsia="en-US" w:bidi="he-IL"/>
         </w:rPr>
-        <w:t xml:space="preserve">הראל-פיש, ה' (קזולה), טסלר, ר', והראל-פיש, י' (2024). הרגלי פעילות גופנית, התנהגויות סיכון, רווחה נפשית וגורמי חוסן: ניתוח משווה בקרב בני נוער עם וללא מוגבלויות הלומדים בבתי ספר בחינוך הכללי. בתנועה: כתב-עת למדעי החינוך הגופני והספורט, יד(2), 241-280.</w:t>
+        <w:t xml:space="preserve">הראל-פיש, ה' (קזולה), טסלר, ר' והראל-פיש, י' (2024). הרגלי פעילות גופנית, התנהגויות סיכון, רווחה נפשית וגורמי חוסן: ניתוח משווה בקרב בני נוער עם וללא מוגבלויות הלומדים בבתי ספר בחינוך הכללי. </w:t>
+      </w:r>
+      <w:r>
+        <w:rPr>
+          <w:rFonts w:ascii="Times New Roman" w:cs="David" w:eastAsia="David" w:hAnsi="Times New Roman"/>
+          <w:b/>
+          <w:bCs/>
+          <w:noProof/>
+          <w:sz w:val="24"/>
+          <w:szCs w:val="24"/>
+          <w:rtl/>
+          <w:lang w:val="en-US" w:eastAsia="en-US" w:bidi="he-IL"/>
+        </w:rPr>
+        <w:t xml:space="preserve">בתנועה: כתב-עת למדעי החינוך הגופני והספורט, יד</w:t>
+      </w:r>
+      <w:r>
+        <w:rPr>
+          <w:rFonts w:ascii="Times New Roman" w:cs="David" w:eastAsia="David" w:hAnsi="Times New Roman"/>
+          <w:noProof/>
+          <w:sz w:val="24"/>
+          <w:szCs w:val="24"/>
+          <w:rtl/>
+          <w:lang w:val="en-US" w:eastAsia="en-US" w:bidi="he-IL"/>
+        </w:rPr>
+        <w:t xml:space="preserve">(2), 241-280.</w:t>
       </w:r>
     </w:p>
     <w:p>
@@ -15767,7 +16031,31 @@
           <w:rtl/>
           <w:lang w:val="en-US" w:eastAsia="en-US" w:bidi="he-IL"/>
         </w:rPr>
-        <w:t xml:space="preserve">משרד הבריאות (2026). על ילדים ובני נוער ומסכים: המלצות להורים. אפשריבריא. https://efsharibari.health.gov.il/well-being/rational-use-of-screens/children-and-screens/</w:t>
+        <w:t xml:space="preserve">משרד הבריאות. (2026, 3 בספטמבר). </w:t>
+      </w:r>
+      <w:r>
+        <w:rPr>
+          <w:rFonts w:ascii="Times New Roman" w:cs="David" w:eastAsia="David" w:hAnsi="Times New Roman"/>
+          <w:b/>
+          <w:bCs/>
+          <w:noProof/>
+          <w:sz w:val="24"/>
+          <w:szCs w:val="24"/>
+          <w:rtl/>
+          <w:lang w:val="en-US" w:eastAsia="en-US" w:bidi="he-IL"/>
+        </w:rPr>
+        <w:t xml:space="preserve">על ילדים ובני נוער ומסכים: המלצות להורים</w:t>
+      </w:r>
+      <w:r>
+        <w:rPr>
+          <w:rFonts w:ascii="Times New Roman" w:cs="David" w:eastAsia="David" w:hAnsi="Times New Roman"/>
+          <w:noProof/>
+          <w:sz w:val="24"/>
+          <w:szCs w:val="24"/>
+          <w:rtl/>
+          <w:lang w:val="en-US" w:eastAsia="en-US" w:bidi="he-IL"/>
+        </w:rPr>
+        <w:t xml:space="preserve">. אפשריבריא. https://efsharibari.health.gov.il/well-being/rational-use-of-screens/children-and-screens/</w:t>
       </w:r>
     </w:p>
     <w:p>
@@ -15786,7 +16074,31 @@
           <w:rtl/>
           <w:lang w:val="en-US" w:eastAsia="en-US" w:bidi="he-IL"/>
         </w:rPr>
-        <w:t xml:space="preserve">משרד החינוך, השירות הפסיכולוגי-ייעוצי (ל.ת.). לקויות למידה: הגדרות ותיאוריה. שפ"ינט. https://shefi.education.gov.il/learning-disabilities/definitions-and-theory/</w:t>
+        <w:t xml:space="preserve">משרד החינוך, השירות הפסיכולוגי-ייעוצי. (ח"ת). </w:t>
+      </w:r>
+      <w:r>
+        <w:rPr>
+          <w:rFonts w:ascii="Times New Roman" w:cs="David" w:eastAsia="David" w:hAnsi="Times New Roman"/>
+          <w:b/>
+          <w:bCs/>
+          <w:noProof/>
+          <w:sz w:val="24"/>
+          <w:szCs w:val="24"/>
+          <w:rtl/>
+          <w:lang w:val="en-US" w:eastAsia="en-US" w:bidi="he-IL"/>
+        </w:rPr>
+        <w:t xml:space="preserve">לקויות למידה: הגדרות ותיאוריה</w:t>
+      </w:r>
+      <w:r>
+        <w:rPr>
+          <w:rFonts w:ascii="Times New Roman" w:cs="David" w:eastAsia="David" w:hAnsi="Times New Roman"/>
+          <w:noProof/>
+          <w:sz w:val="24"/>
+          <w:szCs w:val="24"/>
+          <w:rtl/>
+          <w:lang w:val="en-US" w:eastAsia="en-US" w:bidi="he-IL"/>
+        </w:rPr>
+        <w:t xml:space="preserve">. שפ"ינט. https://shefi.education.gov.il/learning-disabilities/definitions-and-theory/</w:t>
       </w:r>
     </w:p>
     <w:p>
@@ -15805,7 +16117,31 @@
           <w:rtl/>
           <w:lang w:val="en-US" w:eastAsia="en-US" w:bidi="he-IL"/>
         </w:rPr>
-        <w:t xml:space="preserve">ניסנהולץ-גנות, ר', מאור, ר', עופרי, ל', סלע, י', זיגדון, א', הראל-פיש, י', וטסלר, ר' (2021). החינוך הגופני כגורם מגן להתנהגויות סיכון בקרב בני נוער בישראל: הבדלי גיל ומגדר. בתנועה: כתב-עת למדעי החינוך הגופני והספורט, יג(1), 57-70.</w:t>
+        <w:t xml:space="preserve">ניסנהולץ-גנות, ר', מאור, ר', עופרי, ל', סלע, י', זיגדון, א', הראל-פיש, י' וטסלר, ר' (2021). החינוך הגופני כגורם מגן להתנהגויות סיכון בקרב בני נוער בישראל: הבדלי גיל ומגדר. </w:t>
+      </w:r>
+      <w:r>
+        <w:rPr>
+          <w:rFonts w:ascii="Times New Roman" w:cs="David" w:eastAsia="David" w:hAnsi="Times New Roman"/>
+          <w:b/>
+          <w:bCs/>
+          <w:noProof/>
+          <w:sz w:val="24"/>
+          <w:szCs w:val="24"/>
+          <w:rtl/>
+          <w:lang w:val="en-US" w:eastAsia="en-US" w:bidi="he-IL"/>
+        </w:rPr>
+        <w:t xml:space="preserve">בתנועה: כתב-עת למדעי החינוך הגופני והספורט, יג</w:t>
+      </w:r>
+      <w:r>
+        <w:rPr>
+          <w:rFonts w:ascii="Times New Roman" w:cs="David" w:eastAsia="David" w:hAnsi="Times New Roman"/>
+          <w:noProof/>
+          <w:sz w:val="24"/>
+          <w:szCs w:val="24"/>
+          <w:rtl/>
+          <w:lang w:val="en-US" w:eastAsia="en-US" w:bidi="he-IL"/>
+        </w:rPr>
+        <w:t xml:space="preserve">(1), 57-70.</w:t>
       </w:r>
     </w:p>
     <w:p>
@@ -15824,7 +16160,31 @@
           <w:rtl/>
           <w:lang w:val="en-US" w:eastAsia="en-US" w:bidi="he-IL"/>
         </w:rPr>
-        <w:t xml:space="preserve">סלפטי, י', זמיר, י', ושרף-בוסל, ד' (2019). למידה מבוססת תנועה. לקסי-קיי, 12, 19-21.</w:t>
+        <w:t xml:space="preserve">סלפטי, י', זמיר, י' ושרף-בוסל, ד' (2019). למידה מבוססת תנועה. </w:t>
+      </w:r>
+      <w:r>
+        <w:rPr>
+          <w:rFonts w:ascii="Times New Roman" w:cs="David" w:eastAsia="David" w:hAnsi="Times New Roman"/>
+          <w:b/>
+          <w:bCs/>
+          <w:noProof/>
+          <w:sz w:val="24"/>
+          <w:szCs w:val="24"/>
+          <w:rtl/>
+          <w:lang w:val="en-US" w:eastAsia="en-US" w:bidi="he-IL"/>
+        </w:rPr>
+        <w:t xml:space="preserve">לקסי-קיי, 12</w:t>
+      </w:r>
+      <w:r>
+        <w:rPr>
+          <w:rFonts w:ascii="Times New Roman" w:cs="David" w:eastAsia="David" w:hAnsi="Times New Roman"/>
+          <w:noProof/>
+          <w:sz w:val="24"/>
+          <w:szCs w:val="24"/>
+          <w:rtl/>
+          <w:lang w:val="en-US" w:eastAsia="en-US" w:bidi="he-IL"/>
+        </w:rPr>
+        <w:t xml:space="preserve">, 19-21.</w:t>
       </w:r>
     </w:p>
     <w:p>
@@ -15843,7 +16203,31 @@
           <w:rtl/>
           <w:lang w:val="en-US" w:eastAsia="en-US" w:bidi="he-IL"/>
         </w:rPr>
-        <w:t xml:space="preserve">עוגב, א', ויזדי-עוגב, א' (2024). איתור מוקדם של ילדים עם הפרעה התפתחותית בקואורדינציה (DCD): השוואה בין דירוג ההורים לבין דירוג המורה לחינוך גופני בשאלוני האיתור. בתנועה: כתב-עת למדעי החינוך הגופני והספורט, יד(2).</w:t>
+        <w:t xml:space="preserve">עוגב, א' ויזדי-עוגב, א' (2024). איתור מוקדם של ילדים עם הפרעה התפתחותית בקואורדינציה (DCD): השוואה בין דירוג ההורים לבין דירוג המורה לחינוך גופני בשאלוני האיתור. </w:t>
+      </w:r>
+      <w:r>
+        <w:rPr>
+          <w:rFonts w:ascii="Times New Roman" w:cs="David" w:eastAsia="David" w:hAnsi="Times New Roman"/>
+          <w:b/>
+          <w:bCs/>
+          <w:noProof/>
+          <w:sz w:val="24"/>
+          <w:szCs w:val="24"/>
+          <w:rtl/>
+          <w:lang w:val="en-US" w:eastAsia="en-US" w:bidi="he-IL"/>
+        </w:rPr>
+        <w:t xml:space="preserve">בתנועה: כתב-עת למדעי החינוך הגופני והספורט, יד</w:t>
+      </w:r>
+      <w:r>
+        <w:rPr>
+          <w:rFonts w:ascii="Times New Roman" w:cs="David" w:eastAsia="David" w:hAnsi="Times New Roman"/>
+          <w:noProof/>
+          <w:sz w:val="24"/>
+          <w:szCs w:val="24"/>
+          <w:rtl/>
+          <w:lang w:val="en-US" w:eastAsia="en-US" w:bidi="he-IL"/>
+        </w:rPr>
+        <w:t xml:space="preserve">(2).</w:t>
       </w:r>
     </w:p>
     <w:p>
@@ -15862,7 +16246,31 @@
           <w:rtl/>
           <w:lang w:val="en-US" w:eastAsia="en-US" w:bidi="he-IL"/>
         </w:rPr>
-        <w:t xml:space="preserve">פחימה, ד', צווילינג, מ', ניסנהולץ-גנות, ר', גרין, ג', ברק, ש', רגב, ע', הלוי-הוכוולד, ע', הראל-פיש, י', וטסלר, ר' (2024). מגמות בתדירות ובמשך הפעילות הגופנית בקרב ילדים ובני נוער מבתי ספר ממלכתיים וממלכתיים-דתיים לאורך השנים 2010-2018. רוח הספורט, 10, 55-70. https://www.telhai.ac.il/sites/default/files/2024-01/4.pdf</w:t>
+        <w:t xml:space="preserve">פחימה, ד', צווילינג, מ', ניסנהולץ-גנות, ר', גרין, ג', ברק, ש', רגב, ע', הלוי-הוכוולד, ע', הראל-פיש, י' וטסלר, ר' (2024). מגמות בתדירות ובמשך הפעילות הגופנית בקרב ילדים ובני נוער מבתי ספר ממלכתיים וממלכתיים-דתיים לאורך השנים 2010-2018. </w:t>
+      </w:r>
+      <w:r>
+        <w:rPr>
+          <w:rFonts w:ascii="Times New Roman" w:cs="David" w:eastAsia="David" w:hAnsi="Times New Roman"/>
+          <w:b/>
+          <w:bCs/>
+          <w:noProof/>
+          <w:sz w:val="24"/>
+          <w:szCs w:val="24"/>
+          <w:rtl/>
+          <w:lang w:val="en-US" w:eastAsia="en-US" w:bidi="he-IL"/>
+        </w:rPr>
+        <w:t xml:space="preserve">רוח הספורט, 10</w:t>
+      </w:r>
+      <w:r>
+        <w:rPr>
+          <w:rFonts w:ascii="Times New Roman" w:cs="David" w:eastAsia="David" w:hAnsi="Times New Roman"/>
+          <w:noProof/>
+          <w:sz w:val="24"/>
+          <w:szCs w:val="24"/>
+          <w:rtl/>
+          <w:lang w:val="en-US" w:eastAsia="en-US" w:bidi="he-IL"/>
+        </w:rPr>
+        <w:t xml:space="preserve">, 55-70. https://www.telhai.ac.il/sites/default/files/2024-01/4.pdf</w:t>
       </w:r>
     </w:p>
     <w:p>
@@ -15881,7 +16289,31 @@
           <w:rtl/>
           <w:lang w:val="en-US" w:eastAsia="en-US" w:bidi="he-IL"/>
         </w:rPr>
-        <w:t xml:space="preserve">שחף, מ', כץ, י', ושובל, א' (2014). ספורט, הישגים לימודיים ומגדר: האומנם שילוש מנצח? רוח הספורט, 1, 89-98.</w:t>
+        <w:t xml:space="preserve">שחף, מ', כץ, י' ושובל, א' (2014). ספורט, הישגים לימודיים ומגדר: האומנם שילוש מנצח? </w:t>
+      </w:r>
+      <w:r>
+        <w:rPr>
+          <w:rFonts w:ascii="Times New Roman" w:cs="David" w:eastAsia="David" w:hAnsi="Times New Roman"/>
+          <w:b/>
+          <w:bCs/>
+          <w:noProof/>
+          <w:sz w:val="24"/>
+          <w:szCs w:val="24"/>
+          <w:rtl/>
+          <w:lang w:val="en-US" w:eastAsia="en-US" w:bidi="he-IL"/>
+        </w:rPr>
+        <w:t xml:space="preserve">רוח הספורט, 1</w:t>
+      </w:r>
+      <w:r>
+        <w:rPr>
+          <w:rFonts w:ascii="Times New Roman" w:cs="David" w:eastAsia="David" w:hAnsi="Times New Roman"/>
+          <w:noProof/>
+          <w:sz w:val="24"/>
+          <w:szCs w:val="24"/>
+          <w:rtl/>
+          <w:lang w:val="en-US" w:eastAsia="en-US" w:bidi="he-IL"/>
+        </w:rPr>
+        <w:t xml:space="preserve">, 89-98.</w:t>
       </w:r>
     </w:p>
     <w:p>
@@ -15900,7 +16332,31 @@
           <w:rtl/>
           <w:lang w:val="en-US" w:eastAsia="en-US" w:bidi="he-IL"/>
         </w:rPr>
-        <w:t xml:space="preserve">שחף, מ', ושלג, מ' (2020). פעילות גופנית בשעות הפנאי וחרדה מצבית בקרב ילדים המתגוררים ביישובי קו העימות בישראל לעומת ילדים המתגוררים במרכז הארץ. בתנועה: כתב-עת למדעי החינוך הגופני והספורט, יב(3), 342-364. https://www.jstor.org/stable/26934757</w:t>
+        <w:t xml:space="preserve">שחף, מ' ושלג, מ' (2020). פעילות גופנית בשעות הפנאי וחרדה מצבית בקרב ילדים המתגוררים ביישובי קו העימות בישראל לעומת ילדים המתגוררים במרכז הארץ. </w:t>
+      </w:r>
+      <w:r>
+        <w:rPr>
+          <w:rFonts w:ascii="Times New Roman" w:cs="David" w:eastAsia="David" w:hAnsi="Times New Roman"/>
+          <w:b/>
+          <w:bCs/>
+          <w:noProof/>
+          <w:sz w:val="24"/>
+          <w:szCs w:val="24"/>
+          <w:rtl/>
+          <w:lang w:val="en-US" w:eastAsia="en-US" w:bidi="he-IL"/>
+        </w:rPr>
+        <w:t xml:space="preserve">בתנועה: כתב-עת למדעי החינוך הגופני והספורט, יב</w:t>
+      </w:r>
+      <w:r>
+        <w:rPr>
+          <w:rFonts w:ascii="Times New Roman" w:cs="David" w:eastAsia="David" w:hAnsi="Times New Roman"/>
+          <w:noProof/>
+          <w:sz w:val="24"/>
+          <w:szCs w:val="24"/>
+          <w:rtl/>
+          <w:lang w:val="en-US" w:eastAsia="en-US" w:bidi="he-IL"/>
+        </w:rPr>
+        <w:t xml:space="preserve">(3), 342-364.</w:t>
       </w:r>
     </w:p>
     <w:p>

</xml_diff>

<commit_message>
Seminar: suppress spell-check marks in all document parts (styles, footer, notes, numbering) and hide proofing errors in settings
Co-Authored-By: Claude Fable 5.1 <noreply@anthropic.com>
Claude-Session: https://claude.ai/code/session_019RaBW72rT1xkbcXD9zJSh3
</commit_message>
<xml_diff>
--- a/seminar/עבודה_סמינריונית_סופית_מסכים_שינה_פעילות_גופנית_לקויות_למידה.docx
+++ b/seminar/עבודה_סמינריונית_סופית_מסכים_שינה_פעילות_גופנית_לקויות_למידה.docx
@@ -47978,10 +47978,16 @@
       <w:r>
         <w:rPr>
           <w:rStyle w:val="EndnoteReference"/>
+          <w:noProof/>
+          <w:lang w:val="en-US" w:eastAsia="en-US" w:bidi="he-IL"/>
         </w:rPr>
         <w:endnoteRef/>
       </w:r>
       <w:r>
+        <w:rPr>
+          <w:noProof/>
+          <w:lang w:val="en-US" w:eastAsia="en-US" w:bidi="he-IL"/>
+        </w:rPr>
         <w:separator/>
       </w:r>
     </w:p>
@@ -47994,10 +48000,16 @@
       <w:r>
         <w:rPr>
           <w:rStyle w:val="EndnoteReference"/>
+          <w:noProof/>
+          <w:lang w:val="en-US" w:eastAsia="en-US" w:bidi="he-IL"/>
         </w:rPr>
         <w:endnoteRef/>
       </w:r>
       <w:r>
+        <w:rPr>
+          <w:noProof/>
+          <w:lang w:val="en-US" w:eastAsia="en-US" w:bidi="he-IL"/>
+        </w:rPr>
         <w:continuationSeparator/>
       </w:r>
     </w:p>
@@ -48014,8 +48026,10 @@
     <w:r>
       <w:rPr>
         <w:rFonts w:ascii="Times New Roman" w:cs="David" w:eastAsia="David" w:hAnsi="Times New Roman"/>
+        <w:noProof/>
         <w:sz w:val="20"/>
         <w:szCs w:val="20"/>
+        <w:lang w:val="en-US" w:eastAsia="en-US" w:bidi="he-IL"/>
       </w:rPr>
       <w:fldChar w:fldCharType="begin"/>
       <w:instrText xml:space="preserve">PAGE</w:instrText>
@@ -48042,10 +48056,16 @@
       <w:r>
         <w:rPr>
           <w:rStyle w:val="FootnoteReference"/>
+          <w:noProof/>
+          <w:lang w:val="en-US" w:eastAsia="en-US" w:bidi="he-IL"/>
         </w:rPr>
         <w:footnoteRef/>
       </w:r>
       <w:r>
+        <w:rPr>
+          <w:noProof/>
+          <w:lang w:val="en-US" w:eastAsia="en-US" w:bidi="he-IL"/>
+        </w:rPr>
         <w:separator/>
       </w:r>
     </w:p>
@@ -48058,10 +48078,16 @@
       <w:r>
         <w:rPr>
           <w:rStyle w:val="FootnoteReference"/>
+          <w:noProof/>
+          <w:lang w:val="en-US" w:eastAsia="en-US" w:bidi="he-IL"/>
         </w:rPr>
         <w:footnoteRef/>
       </w:r>
       <w:r>
+        <w:rPr>
+          <w:noProof/>
+          <w:lang w:val="en-US" w:eastAsia="en-US" w:bidi="he-IL"/>
+        </w:rPr>
         <w:continuationSeparator/>
       </w:r>
     </w:p>
@@ -48167,8 +48193,10 @@
       </w:pPr>
       <w:rPr>
         <w:rFonts w:ascii="Times New Roman" w:cs="David" w:eastAsia="David" w:hAnsi="Times New Roman"/>
+        <w:noProof/>
         <w:sz w:val="24"/>
         <w:szCs w:val="24"/>
+        <w:lang w:val="en-US" w:eastAsia="en-US" w:bidi="he-IL"/>
       </w:rPr>
     </w:lvl>
   </w:abstractNum>
@@ -48184,8 +48212,10 @@
       </w:pPr>
       <w:rPr>
         <w:rFonts w:ascii="Times New Roman" w:cs="David" w:eastAsia="David" w:hAnsi="Times New Roman"/>
+        <w:noProof/>
         <w:sz w:val="24"/>
         <w:szCs w:val="24"/>
+        <w:lang w:val="en-US" w:eastAsia="en-US" w:bidi="he-IL"/>
       </w:rPr>
     </w:lvl>
   </w:abstractNum>
@@ -48201,8 +48231,10 @@
       </w:pPr>
       <w:rPr>
         <w:rFonts w:ascii="Times New Roman" w:cs="David" w:eastAsia="David" w:hAnsi="Times New Roman"/>
+        <w:noProof/>
         <w:sz w:val="24"/>
         <w:szCs w:val="24"/>
+        <w:lang w:val="en-US" w:eastAsia="en-US" w:bidi="he-IL"/>
       </w:rPr>
     </w:lvl>
   </w:abstractNum>
@@ -48218,8 +48250,10 @@
       </w:pPr>
       <w:rPr>
         <w:rFonts w:ascii="Times New Roman" w:cs="David" w:eastAsia="David" w:hAnsi="Times New Roman"/>
+        <w:noProof/>
         <w:sz w:val="24"/>
         <w:szCs w:val="24"/>
+        <w:lang w:val="en-US" w:eastAsia="en-US" w:bidi="he-IL"/>
       </w:rPr>
     </w:lvl>
   </w:abstractNum>
@@ -48235,8 +48269,10 @@
       </w:pPr>
       <w:rPr>
         <w:rFonts w:ascii="Times New Roman" w:cs="David" w:eastAsia="David" w:hAnsi="Times New Roman"/>
+        <w:noProof/>
         <w:sz w:val="24"/>
         <w:szCs w:val="24"/>
+        <w:lang w:val="en-US" w:eastAsia="en-US" w:bidi="he-IL"/>
       </w:rPr>
     </w:lvl>
   </w:abstractNum>
@@ -48252,8 +48288,10 @@
       </w:pPr>
       <w:rPr>
         <w:rFonts w:ascii="Times New Roman" w:cs="David" w:eastAsia="David" w:hAnsi="Times New Roman"/>
+        <w:noProof/>
         <w:sz w:val="24"/>
         <w:szCs w:val="24"/>
+        <w:lang w:val="en-US" w:eastAsia="en-US" w:bidi="he-IL"/>
       </w:rPr>
     </w:lvl>
   </w:abstractNum>
@@ -48269,8 +48307,10 @@
       </w:pPr>
       <w:rPr>
         <w:rFonts w:ascii="Times New Roman" w:cs="David" w:eastAsia="David" w:hAnsi="Times New Roman"/>
+        <w:noProof/>
         <w:sz w:val="24"/>
         <w:szCs w:val="24"/>
+        <w:lang w:val="en-US" w:eastAsia="en-US" w:bidi="he-IL"/>
       </w:rPr>
     </w:lvl>
   </w:abstractNum>
@@ -48286,8 +48326,10 @@
       </w:pPr>
       <w:rPr>
         <w:rFonts w:ascii="Times New Roman" w:cs="David" w:eastAsia="David" w:hAnsi="Times New Roman"/>
+        <w:noProof/>
         <w:sz w:val="24"/>
         <w:szCs w:val="24"/>
+        <w:lang w:val="en-US" w:eastAsia="en-US" w:bidi="he-IL"/>
       </w:rPr>
     </w:lvl>
   </w:abstractNum>
@@ -48303,8 +48345,10 @@
       </w:pPr>
       <w:rPr>
         <w:rFonts w:ascii="Times New Roman" w:cs="David" w:eastAsia="David" w:hAnsi="Times New Roman"/>
+        <w:noProof/>
         <w:sz w:val="24"/>
         <w:szCs w:val="24"/>
+        <w:lang w:val="en-US" w:eastAsia="en-US" w:bidi="he-IL"/>
       </w:rPr>
     </w:lvl>
   </w:abstractNum>
@@ -48320,8 +48364,10 @@
       </w:pPr>
       <w:rPr>
         <w:rFonts w:ascii="Times New Roman" w:cs="David" w:eastAsia="David" w:hAnsi="Times New Roman"/>
+        <w:noProof/>
         <w:sz w:val="24"/>
         <w:szCs w:val="24"/>
+        <w:lang w:val="en-US" w:eastAsia="en-US" w:bidi="he-IL"/>
       </w:rPr>
     </w:lvl>
   </w:abstractNum>
@@ -48418,8 +48464,10 @@
     <w:rPrDefault>
       <w:rPr>
         <w:rFonts w:ascii="Times New Roman" w:cs="David" w:eastAsia="David" w:hAnsi="Times New Roman"/>
+        <w:noProof/>
         <w:sz w:val="24"/>
         <w:szCs w:val="24"/>
+        <w:lang w:val="en-US" w:eastAsia="en-US" w:bidi="he-IL"/>
       </w:rPr>
     </w:rPrDefault>
     <w:pPrDefault/>
@@ -48430,8 +48478,10 @@
     <w:next w:val="Normal"/>
     <w:qFormat/>
     <w:rPr>
+      <w:noProof/>
       <w:sz w:val="56"/>
       <w:szCs w:val="56"/>
+      <w:lang w:val="en-US" w:eastAsia="en-US" w:bidi="he-IL"/>
     </w:rPr>
   </w:style>
   <w:style w:type="paragraph" w:styleId="Heading1">
@@ -48440,9 +48490,11 @@
     <w:next w:val="Normal"/>
     <w:qFormat/>
     <w:rPr>
+      <w:noProof/>
       <w:color w:val="2E74B5"/>
       <w:sz w:val="32"/>
       <w:szCs w:val="32"/>
+      <w:lang w:val="en-US" w:eastAsia="en-US" w:bidi="he-IL"/>
     </w:rPr>
   </w:style>
   <w:style w:type="paragraph" w:styleId="Heading2">
@@ -48451,9 +48503,11 @@
     <w:next w:val="Normal"/>
     <w:qFormat/>
     <w:rPr>
+      <w:noProof/>
       <w:color w:val="2E74B5"/>
       <w:sz w:val="26"/>
       <w:szCs w:val="26"/>
+      <w:lang w:val="en-US" w:eastAsia="en-US" w:bidi="he-IL"/>
     </w:rPr>
   </w:style>
   <w:style w:type="paragraph" w:styleId="Heading3">
@@ -48462,9 +48516,11 @@
     <w:next w:val="Normal"/>
     <w:qFormat/>
     <w:rPr>
+      <w:noProof/>
       <w:color w:val="1F4D78"/>
       <w:sz w:val="24"/>
       <w:szCs w:val="24"/>
+      <w:lang w:val="en-US" w:eastAsia="en-US" w:bidi="he-IL"/>
     </w:rPr>
   </w:style>
   <w:style w:type="paragraph" w:styleId="Heading4">
@@ -48475,7 +48531,9 @@
     <w:rPr>
       <w:i/>
       <w:iCs/>
+      <w:noProof/>
       <w:color w:val="2E74B5"/>
+      <w:lang w:val="en-US" w:eastAsia="en-US" w:bidi="he-IL"/>
     </w:rPr>
   </w:style>
   <w:style w:type="paragraph" w:styleId="Heading5">
@@ -48484,7 +48542,9 @@
     <w:next w:val="Normal"/>
     <w:qFormat/>
     <w:rPr>
+      <w:noProof/>
       <w:color w:val="2E74B5"/>
+      <w:lang w:val="en-US" w:eastAsia="en-US" w:bidi="he-IL"/>
     </w:rPr>
   </w:style>
   <w:style w:type="paragraph" w:styleId="Heading6">
@@ -48493,7 +48553,9 @@
     <w:next w:val="Normal"/>
     <w:qFormat/>
     <w:rPr>
+      <w:noProof/>
       <w:color w:val="1F4D78"/>
+      <w:lang w:val="en-US" w:eastAsia="en-US" w:bidi="he-IL"/>
     </w:rPr>
   </w:style>
   <w:style w:type="paragraph" w:styleId="Strong">
@@ -48504,6 +48566,8 @@
     <w:rPr>
       <w:b/>
       <w:bCs/>
+      <w:noProof/>
+      <w:lang w:val="en-US" w:eastAsia="en-US" w:bidi="he-IL"/>
     </w:rPr>
   </w:style>
   <w:style w:type="paragraph" w:styleId="ListParagraph">
@@ -48517,8 +48581,10 @@
     <w:uiPriority w:val="99"/>
     <w:unhideWhenUsed/>
     <w:rPr>
+      <w:noProof/>
       <w:color w:val="0563C1"/>
       <w:u w:val="single"/>
+      <w:lang w:val="en-US" w:eastAsia="en-US" w:bidi="he-IL"/>
     </w:rPr>
   </w:style>
   <w:style w:type="character" w:styleId="FootnoteReference">
@@ -48528,7 +48594,9 @@
     <w:semiHidden/>
     <w:unhideWhenUsed/>
     <w:rPr>
+      <w:noProof/>
       <w:vertAlign w:val="superscript"/>
+      <w:lang w:val="en-US" w:eastAsia="en-US" w:bidi="he-IL"/>
     </w:rPr>
   </w:style>
   <w:style w:type="paragraph" w:styleId="FootnoteText">
@@ -48542,8 +48610,10 @@
       <w:spacing w:after="0" w:line="240" w:lineRule="auto"/>
     </w:pPr>
     <w:rPr>
+      <w:noProof/>
       <w:sz w:val="20"/>
       <w:szCs w:val="20"/>
+      <w:lang w:val="en-US" w:eastAsia="en-US" w:bidi="he-IL"/>
     </w:rPr>
   </w:style>
   <w:style w:type="character" w:styleId="FootnoteTextChar">
@@ -48554,8 +48624,10 @@
     <w:semiHidden/>
     <w:unhideWhenUsed/>
     <w:rPr>
+      <w:noProof/>
       <w:sz w:val="20"/>
       <w:szCs w:val="20"/>
+      <w:lang w:val="en-US" w:eastAsia="en-US" w:bidi="he-IL"/>
     </w:rPr>
   </w:style>
   <w:style w:type="character" w:styleId="EndnoteReference">
@@ -48565,7 +48637,9 @@
     <w:semiHidden/>
     <w:unhideWhenUsed/>
     <w:rPr>
+      <w:noProof/>
       <w:vertAlign w:val="superscript"/>
+      <w:lang w:val="en-US" w:eastAsia="en-US" w:bidi="he-IL"/>
     </w:rPr>
   </w:style>
   <w:style w:type="paragraph" w:styleId="EndnoteText">
@@ -48579,8 +48653,10 @@
       <w:spacing w:after="0" w:line="240" w:lineRule="auto"/>
     </w:pPr>
     <w:rPr>
+      <w:noProof/>
       <w:sz w:val="20"/>
       <w:szCs w:val="20"/>
+      <w:lang w:val="en-US" w:eastAsia="en-US" w:bidi="he-IL"/>
     </w:rPr>
   </w:style>
   <w:style w:type="character" w:styleId="EndnoteTextChar">
@@ -48591,8 +48667,10 @@
     <w:semiHidden/>
     <w:unhideWhenUsed/>
     <w:rPr>
+      <w:noProof/>
       <w:sz w:val="20"/>
       <w:szCs w:val="20"/>
+      <w:lang w:val="en-US" w:eastAsia="en-US" w:bidi="he-IL"/>
     </w:rPr>
   </w:style>
   <w:style w:type="paragraph" w:styleId="Heading1">
@@ -48608,9 +48686,11 @@
       <w:rFonts w:ascii="Times New Roman" w:cs="David" w:eastAsia="David" w:hAnsi="Times New Roman"/>
       <w:b/>
       <w:bCs/>
+      <w:noProof/>
       <w:color w:val="000000"/>
       <w:sz w:val="32"/>
       <w:szCs w:val="32"/>
+      <w:lang w:val="en-US" w:eastAsia="en-US" w:bidi="he-IL"/>
     </w:rPr>
   </w:style>
   <w:style w:type="paragraph" w:styleId="Heading2">
@@ -48626,9 +48706,11 @@
       <w:rFonts w:ascii="Times New Roman" w:cs="David" w:eastAsia="David" w:hAnsi="Times New Roman"/>
       <w:b/>
       <w:bCs/>
+      <w:noProof/>
       <w:color w:val="000000"/>
       <w:sz w:val="28"/>
       <w:szCs w:val="28"/>
+      <w:lang w:val="en-US" w:eastAsia="en-US" w:bidi="he-IL"/>
     </w:rPr>
   </w:style>
   <w:style w:type="paragraph" w:styleId="Heading3">
@@ -48644,9 +48726,11 @@
       <w:rFonts w:ascii="Times New Roman" w:cs="David" w:eastAsia="David" w:hAnsi="Times New Roman"/>
       <w:b/>
       <w:bCs/>
+      <w:noProof/>
       <w:color w:val="000000"/>
       <w:sz w:val="24"/>
       <w:szCs w:val="24"/>
+      <w:lang w:val="en-US" w:eastAsia="en-US" w:bidi="he-IL"/>
     </w:rPr>
   </w:style>
 </w:styles>

</xml_diff>

<commit_message>
Seminar: align with course guidelines (intro structure rationale, sample age/sex, answers to research questions, personal insights section, no chapter page breaks)
Co-Authored-By: Claude Fable 5.1 <noreply@anthropic.com>
Claude-Session: https://claude.ai/code/session_019RaBW72rT1xkbcXD9zJSh3
</commit_message>
<xml_diff>
--- a/seminar/עבודה_סמינריונית_סופית_מסכים_שינה_פעילות_גופנית_לקויות_למידה.docx
+++ b/seminar/עבודה_סמינריונית_סופית_מסכים_שינה_פעילות_גופנית_לקויות_למידה.docx
@@ -552,7 +552,7 @@
               <w:szCs w:val="24"/>
               <w:rtl/>
             </w:rPr>
-            <w:t>5</w:t>
+            <w:t>4</w:t>
           </w:r>
         </w:p>
         <w:p>
@@ -589,7 +589,7 @@
               <w:szCs w:val="24"/>
               <w:rtl/>
             </w:rPr>
-            <w:t>5</w:t>
+            <w:t>4</w:t>
           </w:r>
         </w:p>
         <w:p>
@@ -626,7 +626,7 @@
               <w:szCs w:val="24"/>
               <w:rtl/>
             </w:rPr>
-            <w:t>6</w:t>
+            <w:t>5</w:t>
           </w:r>
         </w:p>
         <w:p>
@@ -663,7 +663,7 @@
               <w:szCs w:val="24"/>
               <w:rtl/>
             </w:rPr>
-            <w:t>7</w:t>
+            <w:t>6</w:t>
           </w:r>
         </w:p>
         <w:p>
@@ -737,7 +737,7 @@
               <w:szCs w:val="24"/>
               <w:rtl/>
             </w:rPr>
-            <w:t>9</w:t>
+            <w:t>8</w:t>
           </w:r>
         </w:p>
         <w:p>
@@ -814,7 +814,7 @@
               <w:szCs w:val="24"/>
               <w:rtl/>
             </w:rPr>
-            <w:t>12</w:t>
+            <w:t>10</w:t>
           </w:r>
         </w:p>
         <w:p>
@@ -851,7 +851,7 @@
               <w:szCs w:val="24"/>
               <w:rtl/>
             </w:rPr>
-            <w:t>12</w:t>
+            <w:t>10</w:t>
           </w:r>
         </w:p>
         <w:p>
@@ -888,7 +888,7 @@
               <w:szCs w:val="24"/>
               <w:rtl/>
             </w:rPr>
-            <w:t>12</w:t>
+            <w:t>11</w:t>
           </w:r>
         </w:p>
         <w:p>
@@ -925,7 +925,7 @@
               <w:szCs w:val="24"/>
               <w:rtl/>
             </w:rPr>
-            <w:t>13</w:t>
+            <w:t>12</w:t>
           </w:r>
         </w:p>
         <w:p>
@@ -962,7 +962,7 @@
               <w:szCs w:val="24"/>
               <w:rtl/>
             </w:rPr>
-            <w:t>14</w:t>
+            <w:t>13</w:t>
           </w:r>
         </w:p>
         <w:p>
@@ -999,7 +999,7 @@
               <w:szCs w:val="24"/>
               <w:rtl/>
             </w:rPr>
-            <w:t>14</w:t>
+            <w:t>13</w:t>
           </w:r>
         </w:p>
         <w:p>
@@ -1036,7 +1036,7 @@
               <w:szCs w:val="24"/>
               <w:rtl/>
             </w:rPr>
-            <w:t>15</w:t>
+            <w:t>14</w:t>
           </w:r>
         </w:p>
         <w:p>
@@ -1073,7 +1073,7 @@
               <w:szCs w:val="24"/>
               <w:rtl/>
             </w:rPr>
-            <w:t>15</w:t>
+            <w:t>14</w:t>
           </w:r>
         </w:p>
         <w:p>
@@ -1113,7 +1113,7 @@
               <w:szCs w:val="24"/>
               <w:rtl/>
             </w:rPr>
-            <w:t>16</w:t>
+            <w:t>14</w:t>
           </w:r>
         </w:p>
         <w:p>
@@ -1150,7 +1150,7 @@
               <w:szCs w:val="24"/>
               <w:rtl/>
             </w:rPr>
-            <w:t>16</w:t>
+            <w:t>15</w:t>
           </w:r>
         </w:p>
         <w:p>
@@ -1187,7 +1187,7 @@
               <w:szCs w:val="24"/>
               <w:rtl/>
             </w:rPr>
-            <w:t>17</w:t>
+            <w:t>16</w:t>
           </w:r>
         </w:p>
         <w:p>
@@ -1224,7 +1224,7 @@
               <w:szCs w:val="24"/>
               <w:rtl/>
             </w:rPr>
-            <w:t>17</w:t>
+            <w:t>16</w:t>
           </w:r>
         </w:p>
         <w:p>
@@ -1261,7 +1261,7 @@
               <w:szCs w:val="24"/>
               <w:rtl/>
             </w:rPr>
-            <w:t>19</w:t>
+            <w:t>18</w:t>
           </w:r>
         </w:p>
         <w:p>
@@ -1298,7 +1298,7 @@
               <w:szCs w:val="24"/>
               <w:rtl/>
             </w:rPr>
-            <w:t>20</w:t>
+            <w:t>19</w:t>
           </w:r>
         </w:p>
         <w:p>
@@ -1335,7 +1335,7 @@
               <w:szCs w:val="24"/>
               <w:rtl/>
             </w:rPr>
-            <w:t>20</w:t>
+            <w:t>19</w:t>
           </w:r>
         </w:p>
         <w:p>
@@ -1372,7 +1372,7 @@
               <w:szCs w:val="24"/>
               <w:rtl/>
             </w:rPr>
-            <w:t>22</w:t>
+            <w:t>21</w:t>
           </w:r>
         </w:p>
         <w:p>
@@ -1409,7 +1409,7 @@
               <w:szCs w:val="24"/>
               <w:rtl/>
             </w:rPr>
-            <w:t>22</w:t>
+            <w:t>21</w:t>
           </w:r>
         </w:p>
         <w:p>
@@ -1430,7 +1430,7 @@
               <w:rtl/>
               <w:lang w:val="en-US" w:bidi="he-IL"/>
             </w:rPr>
-            <w:t xml:space="preserve">3.9 סיכום הממצאים</w:t>
+            <w:t xml:space="preserve">3.9 סיכום הממצאים: תשובות לשאלות המחקר ולהשערות</w:t>
           </w:r>
           <w:r>
             <w:rPr>
@@ -1446,7 +1446,7 @@
               <w:szCs w:val="24"/>
               <w:rtl/>
             </w:rPr>
-            <w:t>24</w:t>
+            <w:t>23</w:t>
           </w:r>
         </w:p>
         <w:p>
@@ -1486,7 +1486,7 @@
               <w:szCs w:val="24"/>
               <w:rtl/>
             </w:rPr>
-            <w:t>25</w:t>
+            <w:t>23</w:t>
           </w:r>
         </w:p>
         <w:p>
@@ -1523,7 +1523,7 @@
               <w:szCs w:val="24"/>
               <w:rtl/>
             </w:rPr>
-            <w:t>25</w:t>
+            <w:t>23</w:t>
           </w:r>
         </w:p>
         <w:p>
@@ -1560,7 +1560,7 @@
               <w:szCs w:val="24"/>
               <w:rtl/>
             </w:rPr>
-            <w:t>25</w:t>
+            <w:t>24</w:t>
           </w:r>
         </w:p>
         <w:p>
@@ -1597,7 +1597,7 @@
               <w:szCs w:val="24"/>
               <w:rtl/>
             </w:rPr>
-            <w:t>26</w:t>
+            <w:t>24</w:t>
           </w:r>
         </w:p>
         <w:p>
@@ -1634,6 +1634,80 @@
               <w:szCs w:val="24"/>
               <w:rtl/>
             </w:rPr>
+            <w:t>25</w:t>
+          </w:r>
+        </w:p>
+        <w:p>
+          <w:pPr>
+            <w:bidi/>
+            <w:tabs>
+              <w:tab w:val="right" w:leader="dot" w:pos="9020"/>
+            </w:tabs>
+            <w:ind w:start="440"/>
+            <w:spacing w:after="40" w:line="240"/>
+          </w:pPr>
+          <w:r>
+            <w:rPr>
+              <w:rFonts w:ascii="Times New Roman" w:cs="David" w:hAnsi="Times New Roman"/>
+              <w:noProof/>
+              <w:sz w:val="24"/>
+              <w:szCs w:val="24"/>
+              <w:rtl/>
+              <w:lang w:val="en-US" w:bidi="he-IL"/>
+            </w:rPr>
+            <w:t xml:space="preserve">4.5 תובנות אישיות</w:t>
+          </w:r>
+          <w:r>
+            <w:rPr>
+              <w:noProof/>
+            </w:rPr>
+            <w:tab/>
+          </w:r>
+          <w:r>
+            <w:rPr>
+              <w:rFonts w:ascii="Times New Roman" w:cs="David" w:hAnsi="Times New Roman"/>
+              <w:noProof/>
+              <w:sz w:val="24"/>
+              <w:szCs w:val="24"/>
+              <w:rtl/>
+            </w:rPr>
+            <w:t>25</w:t>
+          </w:r>
+        </w:p>
+        <w:p>
+          <w:pPr>
+            <w:bidi/>
+            <w:tabs>
+              <w:tab w:val="right" w:leader="dot" w:pos="9020"/>
+            </w:tabs>
+            <w:ind w:start="440"/>
+            <w:spacing w:after="40" w:line="240"/>
+          </w:pPr>
+          <w:r>
+            <w:rPr>
+              <w:rFonts w:ascii="Times New Roman" w:cs="David" w:hAnsi="Times New Roman"/>
+              <w:noProof/>
+              <w:sz w:val="24"/>
+              <w:szCs w:val="24"/>
+              <w:rtl/>
+              <w:lang w:val="en-US" w:bidi="he-IL"/>
+            </w:rPr>
+            <w:t xml:space="preserve">4.6 מסקנות</w:t>
+          </w:r>
+          <w:r>
+            <w:rPr>
+              <w:noProof/>
+            </w:rPr>
+            <w:tab/>
+          </w:r>
+          <w:r>
+            <w:rPr>
+              <w:rFonts w:ascii="Times New Roman" w:cs="David" w:hAnsi="Times New Roman"/>
+              <w:noProof/>
+              <w:sz w:val="24"/>
+              <w:szCs w:val="24"/>
+              <w:rtl/>
+            </w:rPr>
             <w:t>26</w:t>
           </w:r>
         </w:p>
@@ -1655,7 +1729,44 @@
               <w:rtl/>
               <w:lang w:val="en-US" w:bidi="he-IL"/>
             </w:rPr>
-            <w:t xml:space="preserve">4.5 מסקנות</w:t>
+            <w:t xml:space="preserve">4.7 תרומת המחקר והשלכות יישומיות</w:t>
+          </w:r>
+          <w:r>
+            <w:rPr>
+              <w:noProof/>
+            </w:rPr>
+            <w:tab/>
+          </w:r>
+          <w:r>
+            <w:rPr>
+              <w:rFonts w:ascii="Times New Roman" w:cs="David" w:hAnsi="Times New Roman"/>
+              <w:noProof/>
+              <w:sz w:val="24"/>
+              <w:szCs w:val="24"/>
+              <w:rtl/>
+            </w:rPr>
+            <w:t>26</w:t>
+          </w:r>
+        </w:p>
+        <w:p>
+          <w:pPr>
+            <w:bidi/>
+            <w:tabs>
+              <w:tab w:val="right" w:leader="dot" w:pos="9020"/>
+            </w:tabs>
+            <w:ind w:start="440"/>
+            <w:spacing w:after="40" w:line="240"/>
+          </w:pPr>
+          <w:r>
+            <w:rPr>
+              <w:rFonts w:ascii="Times New Roman" w:cs="David" w:hAnsi="Times New Roman"/>
+              <w:noProof/>
+              <w:sz w:val="24"/>
+              <w:szCs w:val="24"/>
+              <w:rtl/>
+              <w:lang w:val="en-US" w:bidi="he-IL"/>
+            </w:rPr>
+            <w:t xml:space="preserve">4.8 הערכה ביקורתית ומגבלות המחקר</w:t>
           </w:r>
           <w:r>
             <w:rPr>
@@ -1692,7 +1803,7 @@
               <w:rtl/>
               <w:lang w:val="en-US" w:bidi="he-IL"/>
             </w:rPr>
-            <w:t xml:space="preserve">4.6 תרומת המחקר והשלכות יישומיות</w:t>
+            <w:t xml:space="preserve">4.9 כיווני מחקר עתידיים</w:t>
           </w:r>
           <w:r>
             <w:rPr>
@@ -1729,7 +1840,7 @@
               <w:rtl/>
               <w:lang w:val="en-US" w:bidi="he-IL"/>
             </w:rPr>
-            <w:t xml:space="preserve">4.7 הערכה ביקורתית ומגבלות המחקר</w:t>
+            <w:t xml:space="preserve">4.10 סיכום</w:t>
           </w:r>
           <w:r>
             <w:rPr>
@@ -1745,81 +1856,7 @@
               <w:szCs w:val="24"/>
               <w:rtl/>
             </w:rPr>
-            <w:t>28</w:t>
-          </w:r>
-        </w:p>
-        <w:p>
-          <w:pPr>
-            <w:bidi/>
-            <w:tabs>
-              <w:tab w:val="right" w:leader="dot" w:pos="9020"/>
-            </w:tabs>
-            <w:ind w:start="440"/>
-            <w:spacing w:after="40" w:line="240"/>
-          </w:pPr>
-          <w:r>
-            <w:rPr>
-              <w:rFonts w:ascii="Times New Roman" w:cs="David" w:hAnsi="Times New Roman"/>
-              <w:noProof/>
-              <w:sz w:val="24"/>
-              <w:szCs w:val="24"/>
-              <w:rtl/>
-              <w:lang w:val="en-US" w:bidi="he-IL"/>
-            </w:rPr>
-            <w:t xml:space="preserve">4.8 כיווני מחקר עתידיים</w:t>
-          </w:r>
-          <w:r>
-            <w:rPr>
-              <w:noProof/>
-            </w:rPr>
-            <w:tab/>
-          </w:r>
-          <w:r>
-            <w:rPr>
-              <w:rFonts w:ascii="Times New Roman" w:cs="David" w:hAnsi="Times New Roman"/>
-              <w:noProof/>
-              <w:sz w:val="24"/>
-              <w:szCs w:val="24"/>
-              <w:rtl/>
-            </w:rPr>
-            <w:t>28</w:t>
-          </w:r>
-        </w:p>
-        <w:p>
-          <w:pPr>
-            <w:bidi/>
-            <w:tabs>
-              <w:tab w:val="right" w:leader="dot" w:pos="9020"/>
-            </w:tabs>
-            <w:ind w:start="440"/>
-            <w:spacing w:after="40" w:line="240"/>
-          </w:pPr>
-          <w:r>
-            <w:rPr>
-              <w:rFonts w:ascii="Times New Roman" w:cs="David" w:hAnsi="Times New Roman"/>
-              <w:noProof/>
-              <w:sz w:val="24"/>
-              <w:szCs w:val="24"/>
-              <w:rtl/>
-              <w:lang w:val="en-US" w:bidi="he-IL"/>
-            </w:rPr>
-            <w:t xml:space="preserve">4.9 סיכום</w:t>
-          </w:r>
-          <w:r>
-            <w:rPr>
-              <w:noProof/>
-            </w:rPr>
-            <w:tab/>
-          </w:r>
-          <w:r>
-            <w:rPr>
-              <w:rFonts w:ascii="Times New Roman" w:cs="David" w:hAnsi="Times New Roman"/>
-              <w:noProof/>
-              <w:sz w:val="24"/>
-              <w:szCs w:val="24"/>
-              <w:rtl/>
-            </w:rPr>
-            <w:t>28</w:t>
+            <w:t>27</w:t>
           </w:r>
         </w:p>
         <w:p>
@@ -1859,7 +1896,7 @@
               <w:szCs w:val="24"/>
               <w:rtl/>
             </w:rPr>
-            <w:t>30</w:t>
+            <w:t>29</w:t>
           </w:r>
         </w:p>
         <w:p>
@@ -1899,7 +1936,7 @@
               <w:szCs w:val="24"/>
               <w:rtl/>
             </w:rPr>
-            <w:t>31</w:t>
+            <w:t>30</w:t>
           </w:r>
         </w:p>
         <w:p>
@@ -1939,7 +1976,7 @@
               <w:szCs w:val="24"/>
               <w:rtl/>
             </w:rPr>
-            <w:t>34</w:t>
+            <w:t>33</w:t>
           </w:r>
         </w:p>
         <w:p>
@@ -1976,7 +2013,7 @@
               <w:szCs w:val="24"/>
               <w:rtl/>
             </w:rPr>
-            <w:t>34</w:t>
+            <w:t>33</w:t>
           </w:r>
         </w:p>
         <w:p>
@@ -2013,7 +2050,7 @@
               <w:szCs w:val="24"/>
               <w:rtl/>
             </w:rPr>
-            <w:t>38</w:t>
+            <w:t>37</w:t>
           </w:r>
         </w:p>
         <w:p>
@@ -2119,7 +2156,7 @@
           <w:rtl/>
           <w:lang w:val="en-US" w:eastAsia="en-US" w:bidi="he-IL"/>
         </w:rPr>
-        <w:t xml:space="preserve">מטרת המחקר היא לתאר את דפוסי החשיפה למסכים, השינה והפעילות הגופנית בקרב תלמידים עם לקויות למידה בחטיבת הביניים ובחטיבה העליונה, לבחון את הקשרים בין שלוש ההתנהגויות לבין התפקוד הלימודי המדווח, ולהשוות את דפוסי ההתנהגות של תלמידים עם לקויות למידה לאלה של תלמידים ללא לקות. המחקר כמותי ומבוסס על שאלון דיווח עצמי אנונימי.</w:t>
+        <w:t xml:space="preserve">מטרת המחקר היא לתאר את דפוסי החשיפה למסכים, השינה והפעילות הגופנית בקרב תלמידים עם לקויות למידה בחטיבת הביניים ובחטיבה העליונה, לבחון את הקשרים בין שלוש ההתנהגויות לבין התפקוד הלימודי המדווח, ולהשוות את דפוסי ההתנהגות של תלמידים עם לקויות למידה לאלה של תלמידים ללא לקות. המחקר כמותי: 65 תלמידי כיתות ז' עד י"ב, 40 מהם עם לקות למידה מאובחנת ו-25 ללא לקות, מילאו שאלון דיווח עצמי אנונימי, והנתונים נותחו באמצעות מתאמים, מבחני t, ניתוח שונות ורגרסיה מרובה.</w:t>
       </w:r>
     </w:p>
     <w:p>
@@ -2137,13 +2174,12 @@
           <w:rtl/>
           <w:lang w:val="en-US" w:eastAsia="en-US" w:bidi="he-IL"/>
         </w:rPr>
-        <w:t xml:space="preserve">העבודה בנויה כך: הפרק הראשון סוקר את הספרות. הוא פותח בהגדרת לקויות למידה ובמאפייניהן, ממשיך לשלוש ההתנהגויות הנחקרות ולמודל המשולב של 24 השעות, מציג את תמונת המצב בישראל ומסתיים ברציונל, במטרות, בשאלות ובהשערות המחקר. הפרק השני מתאר את שיטת המחקר: מערך המחקר, אוכלוסיית המחקר, כלי המחקר, ההליך, דרכי ניתוח הנתונים, השיקולים האתיים ומגבלות המחקר. הפרק השלישי מציג את הממצאים לפי סדר שאלות המחקר וההשערות, והפרק הרביעי דן בהם לאור הספרות, מציע מסקנות והמלצות ומסכם. גבולות העבודה: היא עוסקת בתלמידים עם לקות למידה מאובחנת בכיתות ז' עד י"ב, ואינה עוסקת במוגבלות שכלית, באוטיזם או בלקויות חושיות. הפרעת קשב נדונה רק במידה שהיא נלווית ללקות למידה.</w:t>
+        <w:t xml:space="preserve">העבודה בנויה כך: הפרק הראשון סוקר את הספרות. הוא פותח בהגדרת לקויות למידה ובמאפייניהן, ממשיך לשלוש ההתנהגויות הנחקרות ולמודל המשולב של 24 השעות, מציג את תמונת המצב בישראל ומסתיים ברציונל, במטרות, בשאלות ובהשערות המחקר. הפרק השני מתאר את שיטת המחקר: מערך המחקר, אוכלוסיית המחקר, כלי המחקר, ההליך, דרכי ניתוח הנתונים, השיקולים האתיים ומגבלות המחקר. הפרק השלישי מציג את הממצאים לפי סדר שאלות המחקר וההשערות, והפרק הרביעי דן בהם לאור הספרות, מציע מסקנות והמלצות ומסכם. מבנה זה נבחר משום שהוא עוקב אחר מהלך המחקר עצמו: תחילה מה שכבר ידוע, אחר כך כיצד נבדק מה שאינו ידוע, ולבסוף מה נמצא ומה משמעותו. גבולות העבודה: היא עוסקת בתלמידים עם לקות למידה מאובחנת בכיתות ז' עד י"ב, ואינה עוסקת במוגבלות שכלית, באוטיזם או בלקויות חושיות. הפרעת קשב נדונה רק במידה שהיא נלווית ללקות למידה.</w:t>
       </w:r>
     </w:p>
     <w:p>
       <w:pPr>
         <w:pStyle w:val="Heading1"/>
-        <w:pageBreakBefore/>
         <w:bidi/>
         <w:spacing w:after="240" w:before="240" w:line="360"/>
         <w:jc w:val="right"/>
@@ -3063,7 +3099,6 @@
     <w:p>
       <w:pPr>
         <w:pStyle w:val="Heading1"/>
-        <w:pageBreakBefore/>
         <w:bidi/>
         <w:spacing w:after="240" w:before="240" w:line="360"/>
         <w:jc w:val="right"/>
@@ -3270,7 +3305,7 @@
           <w:rtl/>
           <w:lang w:val="en-US" w:eastAsia="en-US" w:bidi="he-IL"/>
         </w:rPr>
-        <w:t xml:space="preserve">אוכלוסיית המחקר היא תלמידי כיתות ז' עד י"ב במערכת החינוך בישראל. קבוצת המחקר כוללת תלמידים בעלי אבחון תקף של לקות למידה (אבחון דידקטי או פסיכו-דידקטי) המקבלים התאמות בלמידה או בבחינות. קבוצת ההשוואה כוללת תלמידים מאותן שכבות גיל ללא אבחון של לקות למידה. גודל המדגם המתוכנן היה 120 תלמידים: 60 בקבוצת המחקר ו-60 בקבוצת ההשוואה, בטווח הגילים 12 עד 18. חישוב מקדים באמצעות מחשבון עוצמה סטטיסטית הראה שמדגם של 60 בכל קבוצה מאפשר לזהות הבדל בגודל אפקט בינוני (d = 0.5) בעוצמה של כ-77 אחוזים ברמת מובהקות של 5 אחוזים, ומדגם של 60 בקבוצת המחקר מאפשר לזהות מתאם בינוני (r = 0.35) בעוצמה דומה. בפועל השתתפו במחקר 65 תלמידים, 40 בקבוצת המחקר ו-25 בקבוצת ההשוואה, ומשמעות הפער מהמתוכנן נדונה בפרק המגבלות.</w:t>
+        <w:t xml:space="preserve">אוכלוסיית המחקר היא תלמידי כיתות ז' עד י"ב במערכת החינוך בישראל. קבוצת המחקר כוללת תלמידים בעלי אבחון תקף של לקות למידה (אבחון דידקטי או פסיכו-דידקטי) המקבלים התאמות בלמידה או בבחינות. קבוצת ההשוואה כוללת תלמידים מאותן שכבות גיל ללא אבחון של לקות למידה. גודל המדגם המתוכנן היה 120 תלמידים: 60 בקבוצת המחקר ו-60 בקבוצת ההשוואה, בטווח הגילים 12 עד 18. חישוב מקדים באמצעות מחשבון עוצמה סטטיסטית הראה שמדגם של 60 בכל קבוצה מאפשר לזהות הבדל בגודל אפקט בינוני (d = 0.5) בעוצמה של כ-77 אחוזים ברמת מובהקות של 5 אחוזים, ומדגם של 60 בקבוצת המחקר מאפשר לזהות מתאם בינוני (r = 0.35) בעוצמה דומה. בפועל השתתפו במחקר 65 תלמידים, 33 בנים ו-32 בנות, בגילי 12 עד 18 (גיל ממוצע 15.11, סטיית תקן 1.72), 40 בקבוצת המחקר ו-25 בקבוצת ההשוואה, ומשמעות הפער מהמתוכנן נדונה בסעיף 4.8.</w:t>
       </w:r>
     </w:p>
     <w:p>
@@ -3688,13 +3723,12 @@
           <w:rtl/>
           <w:lang w:val="en-US" w:eastAsia="en-US" w:bidi="he-IL"/>
         </w:rPr>
-        <w:t xml:space="preserve">למחקר כמה מגבלות שיש להביא בחשבון בפירוש הממצאים. המערך רוחבי, ולכן הוא יכול להצביע על קשרים אך לא על כיוון סיבתי. כל המשתנים נמדדו בדיווח עצמי, ודיווח על זמן מסך ועל ציונים חשוף להטיות של זיכרון ושל רצייה חברתית. הדגימה הייתה דגימת נוחות בשני בתי ספר, והמדגם שהתקבל קטן מהמתוכנן, ולכן ההכללה מוגבלת. קבוצת התלמידים עם לקויות למידה אינה אחידה, וסולם הישנוניות חובר לצורך המחקר ולא עבר תיקוף מלא. המגבלות נדונות בהרחבה בסעיף 4.7.</w:t>
+        <w:t xml:space="preserve">למחקר כמה מגבלות שיש להביא בחשבון בפירוש הממצאים. המערך רוחבי, ולכן הוא יכול להצביע על קשרים אך לא על כיוון סיבתי. כל המשתנים נמדדו בדיווח עצמי, ודיווח על זמן מסך ועל ציונים חשוף להטיות של זיכרון ושל רצייה חברתית. הדגימה הייתה דגימת נוחות בשני בתי ספר, והמדגם שהתקבל קטן מהמתוכנן, ולכן ההכללה מוגבלת. קבוצת התלמידים עם לקויות למידה אינה אחידה, וסולם הישנוניות חובר לצורך המחקר ולא עבר תיקוף מלא. המגבלות נדונות בהרחבה בסעיף 4.8.</w:t>
       </w:r>
     </w:p>
     <w:p>
       <w:pPr>
         <w:pStyle w:val="Heading1"/>
-        <w:pageBreakBefore/>
         <w:bidi/>
         <w:spacing w:after="240" w:before="240" w:line="360"/>
         <w:jc w:val="right"/>
@@ -4450,6 +4484,197 @@
                 <w:rtl/>
                 <w:lang w:val="en-US" w:eastAsia="en-US" w:bidi="he-IL"/>
               </w:rPr>
+              <w:t xml:space="preserve">גיל</w:t>
+            </w:r>
+          </w:p>
+        </w:tc>
+        <w:tc>
+          <w:tcPr>
+            <w:tcW w:type="dxa" w:w="2400"/>
+            <w:tcBorders>
+              <w:top w:val="none" w:color="FFFFFF" w:sz="0"/>
+              <w:left w:val="none" w:color="FFFFFF" w:sz="0"/>
+              <w:bottom w:val="none" w:color="FFFFFF" w:sz="0"/>
+              <w:right w:val="none" w:color="FFFFFF" w:sz="0"/>
+            </w:tcBorders>
+            <w:tcMar>
+              <w:top w:type="dxa" w:w="50"/>
+              <w:left w:type="dxa" w:w="70"/>
+              <w:bottom w:type="dxa" w:w="50"/>
+              <w:right w:type="dxa" w:w="70"/>
+            </w:tcMar>
+          </w:tcPr>
+          <w:p>
+            <w:pPr>
+              <w:bidi/>
+              <w:spacing w:after="0" w:line="276"/>
+              <w:jc w:val="center"/>
+            </w:pPr>
+            <w:r>
+              <w:rPr>
+                <w:rFonts w:ascii="Times New Roman" w:cs="David" w:eastAsia="David" w:hAnsi="Times New Roman"/>
+                <w:b w:val="false"/>
+                <w:bCs w:val="false"/>
+                <w:noProof/>
+                <w:sz w:val="22"/>
+                <w:szCs w:val="22"/>
+                <w:rtl/>
+                <w:lang w:val="en-US" w:eastAsia="en-US" w:bidi="he-IL"/>
+              </w:rPr>
+              <w:t xml:space="preserve">ממוצע (סטיית תקן)</w:t>
+            </w:r>
+          </w:p>
+        </w:tc>
+        <w:tc>
+          <w:tcPr>
+            <w:tcW w:type="dxa" w:w="2200"/>
+            <w:tcBorders>
+              <w:top w:val="none" w:color="FFFFFF" w:sz="0"/>
+              <w:left w:val="none" w:color="FFFFFF" w:sz="0"/>
+              <w:bottom w:val="none" w:color="FFFFFF" w:sz="0"/>
+              <w:right w:val="none" w:color="FFFFFF" w:sz="0"/>
+            </w:tcBorders>
+            <w:tcMar>
+              <w:top w:type="dxa" w:w="50"/>
+              <w:left w:type="dxa" w:w="70"/>
+              <w:bottom w:type="dxa" w:w="50"/>
+              <w:right w:type="dxa" w:w="70"/>
+            </w:tcMar>
+          </w:tcPr>
+          <w:p>
+            <w:pPr>
+              <w:bidi/>
+              <w:spacing w:after="0" w:line="276"/>
+              <w:jc w:val="center"/>
+            </w:pPr>
+            <w:r>
+              <w:rPr>
+                <w:rFonts w:ascii="Times New Roman" w:cs="David" w:eastAsia="David" w:hAnsi="Times New Roman"/>
+                <w:b w:val="false"/>
+                <w:bCs w:val="false"/>
+                <w:noProof/>
+                <w:sz w:val="22"/>
+                <w:szCs w:val="22"/>
+                <w:rtl/>
+                <w:lang w:val="en-US" w:eastAsia="en-US" w:bidi="he-IL"/>
+              </w:rPr>
+              <w:t xml:space="preserve">14.82 (1.82)</w:t>
+            </w:r>
+          </w:p>
+        </w:tc>
+        <w:tc>
+          <w:tcPr>
+            <w:tcW w:type="dxa" w:w="2200"/>
+            <w:tcBorders>
+              <w:top w:val="none" w:color="FFFFFF" w:sz="0"/>
+              <w:left w:val="none" w:color="FFFFFF" w:sz="0"/>
+              <w:bottom w:val="none" w:color="FFFFFF" w:sz="0"/>
+              <w:right w:val="none" w:color="FFFFFF" w:sz="0"/>
+            </w:tcBorders>
+            <w:tcMar>
+              <w:top w:type="dxa" w:w="50"/>
+              <w:left w:type="dxa" w:w="70"/>
+              <w:bottom w:type="dxa" w:w="50"/>
+              <w:right w:type="dxa" w:w="70"/>
+            </w:tcMar>
+          </w:tcPr>
+          <w:p>
+            <w:pPr>
+              <w:bidi/>
+              <w:spacing w:after="0" w:line="276"/>
+              <w:jc w:val="center"/>
+            </w:pPr>
+            <w:r>
+              <w:rPr>
+                <w:rFonts w:ascii="Times New Roman" w:cs="David" w:eastAsia="David" w:hAnsi="Times New Roman"/>
+                <w:b w:val="false"/>
+                <w:bCs w:val="false"/>
+                <w:noProof/>
+                <w:sz w:val="22"/>
+                <w:szCs w:val="22"/>
+                <w:rtl/>
+                <w:lang w:val="en-US" w:eastAsia="en-US" w:bidi="he-IL"/>
+              </w:rPr>
+              <w:t xml:space="preserve">15.56 (1.45)</w:t>
+            </w:r>
+          </w:p>
+        </w:tc>
+        <w:tc>
+          <w:tcPr>
+            <w:tcW w:type="dxa" w:w="1800"/>
+            <w:tcBorders>
+              <w:top w:val="none" w:color="FFFFFF" w:sz="0"/>
+              <w:left w:val="none" w:color="FFFFFF" w:sz="0"/>
+              <w:bottom w:val="none" w:color="FFFFFF" w:sz="0"/>
+              <w:right w:val="none" w:color="FFFFFF" w:sz="0"/>
+            </w:tcBorders>
+            <w:tcMar>
+              <w:top w:type="dxa" w:w="50"/>
+              <w:left w:type="dxa" w:w="70"/>
+              <w:bottom w:type="dxa" w:w="50"/>
+              <w:right w:type="dxa" w:w="70"/>
+            </w:tcMar>
+          </w:tcPr>
+          <w:p>
+            <w:pPr>
+              <w:bidi/>
+              <w:spacing w:after="0" w:line="276"/>
+              <w:jc w:val="center"/>
+            </w:pPr>
+            <w:r>
+              <w:rPr>
+                <w:rFonts w:ascii="Times New Roman" w:cs="David" w:eastAsia="David" w:hAnsi="Times New Roman"/>
+                <w:b w:val="false"/>
+                <w:bCs w:val="false"/>
+                <w:noProof/>
+                <w:sz w:val="22"/>
+                <w:szCs w:val="22"/>
+                <w:rtl/>
+                <w:lang w:val="en-US" w:eastAsia="en-US" w:bidi="he-IL"/>
+              </w:rPr>
+              <w:t xml:space="preserve">15.11 (1.72)</w:t>
+            </w:r>
+          </w:p>
+        </w:tc>
+      </w:tr>
+      <w:tr>
+        <w:trPr>
+          <w:cantSplit/>
+          <w:tblHeader w:val="false"/>
+        </w:trPr>
+        <w:tc>
+          <w:tcPr>
+            <w:tcW w:type="dxa" w:w="2000"/>
+            <w:tcBorders>
+              <w:top w:val="none" w:color="FFFFFF" w:sz="0"/>
+              <w:left w:val="none" w:color="FFFFFF" w:sz="0"/>
+              <w:bottom w:val="none" w:color="FFFFFF" w:sz="0"/>
+              <w:right w:val="none" w:color="FFFFFF" w:sz="0"/>
+            </w:tcBorders>
+            <w:tcMar>
+              <w:top w:type="dxa" w:w="50"/>
+              <w:left w:type="dxa" w:w="70"/>
+              <w:bottom w:type="dxa" w:w="50"/>
+              <w:right w:type="dxa" w:w="70"/>
+            </w:tcMar>
+          </w:tcPr>
+          <w:p>
+            <w:pPr>
+              <w:bidi/>
+              <w:spacing w:after="0" w:line="276"/>
+              <w:jc w:val="right"/>
+            </w:pPr>
+            <w:r>
+              <w:rPr>
+                <w:rFonts w:ascii="Times New Roman" w:cs="David" w:eastAsia="David" w:hAnsi="Times New Roman"/>
+                <w:b w:val="false"/>
+                <w:bCs w:val="false"/>
+                <w:noProof/>
+                <w:sz w:val="22"/>
+                <w:szCs w:val="22"/>
+                <w:rtl/>
+                <w:lang w:val="en-US" w:eastAsia="en-US" w:bidi="he-IL"/>
+              </w:rPr>
               <w:t xml:space="preserve">כיתה</w:t>
             </w:r>
           </w:p>
@@ -5765,7 +5990,7 @@
           <w:rtl/>
           <w:lang w:val="en-US" w:eastAsia="en-US" w:bidi="he-IL"/>
         </w:rPr>
-        <w:t xml:space="preserve">הערה. הערכים הם שכיחות (אחוז מהקבוצה). מקור: פלט Frequencies, נספח ב'.</w:t>
+        <w:t xml:space="preserve">הערה. הערכים הם שכיחות (אחוז מהקבוצה), למעט גיל: ממוצע (סטיית תקן). מקור: פלט Frequencies ו-Descriptives, נספח ב'.</w:t>
       </w:r>
     </w:p>
     <w:p>
@@ -15002,7 +15227,7 @@
           <w:rtl/>
           <w:lang w:val="en-US" w:eastAsia="en-US" w:bidi="he-IL"/>
         </w:rPr>
-        <w:t xml:space="preserve">3.9 סיכום הממצאים</w:t>
+        <w:t xml:space="preserve">3.9 סיכום הממצאים: תשובות לשאלות המחקר ולהשערות</w:t>
       </w:r>
     </w:p>
     <w:p>
@@ -15020,13 +15245,12 @@
           <w:rtl/>
           <w:lang w:val="en-US" w:eastAsia="en-US" w:bidi="he-IL"/>
         </w:rPr>
-        <w:t xml:space="preserve">מבין חמש ההשערות, שתי ההשערות שעסקו במסכים ובתפקוד הלימודי אוששו: ככל שתלמידים עם לקויות למידה חשופים יותר למסכים, הם ישנים פחות, הולכים לישון מאוחר יותר, ישנוניים יותר ביום ומשיגים ציונים נמוכים יותר, וזמן המסך היה המנבא היחיד שנותר מובהק ברגרסיה. ההשערה על מסכים ופעילות גופנית לא אוששה, ופעילות גופנית לא נקשרה באופן מובהק לתפקוד הלימודי. תלמידים העומדים ביותר המלצות דיווחו על תפקוד לימודי טוב יותר. ההשוואה בין הקבוצות העלתה שתלמידים עם לקויות למידה אינם צופים במסכים יותר מעמיתיהם, אך שיעור נמוך יותר מהם ישן די הצורך, והפער בתפקוד הלימודי ביניהם גדול.</w:t>
+        <w:t xml:space="preserve">בסיום פרק הממצאים ניתן להשיב על חמש שאלות המחקר. לשאלה הראשונה: תלמידים עם לקויות למידה דיווחו על כארבע שעות מסך פנאי ביום, על פחות משמונה שעות שינה בלילה עם איחור ניכר של שעת השינה בסוף השבוע, ועל פחות משלושה ימי פעילות גופנית בשבוע. 15 אחוזים עמדו בהמלצת המסכים, 30 אחוזים בהמלצת השינה, 2.5 אחוזים בהמלצת הפעילות הגופנית, ואיש לא עמד בשלושתן. לשאלה השנייה: כן, חשיפה רבה יותר למסכים הייתה קשורה לשינה קצרה ומאוחרת יותר ולישנוניות רבה יותר בשעות היום, וההשערה הראשונה אוששה. לשאלה השלישית: לא נמצא קשר בין חשיפה למסכים לבין פעילות גופנית, וההשערה השנייה לא אוששה. לשאלה הרביעית: זמן המסך היה קשור באופן שלילי לכל מדדי התפקוד הלימודי ונותר המנבא היחיד המובהק ברגרסיה; סדירות השינה והישנוניות היו קשורות לציונים, ואילו הפעילות הגופנית לא, כך שההשערה השלישית אוששה חלקית. תלמידים העומדים ביותר המלצות דיווחו על תפקוד לימודי טוב יותר, וההשערה הרביעית אוששה. לשאלה החמישית: תלמידים עם לקויות למידה אינם צופים במסכים יותר מעמיתיהם, אך שיעור נמוך יותר מהם ישן די הצורך; ההבדלים בישנוניות ובפעילות הגופנית היו בכיוון המשוער אך לא מובהקים, והפער בתפקוד הלימודי היה גדול, כך שההשערה החמישית אוששה חלקית.</w:t>
       </w:r>
     </w:p>
     <w:p>
       <w:pPr>
         <w:pStyle w:val="Heading1"/>
-        <w:pageBreakBefore/>
         <w:bidi/>
         <w:spacing w:after="240" w:before="240" w:line="360"/>
         <w:jc w:val="right"/>
@@ -15279,7 +15503,47 @@
           <w:rtl/>
           <w:lang w:val="en-US" w:eastAsia="en-US" w:bidi="he-IL"/>
         </w:rPr>
-        <w:t xml:space="preserve">4.5 מסקנות</w:t>
+        <w:t xml:space="preserve">4.5 תובנות אישיות</w:t>
+      </w:r>
+    </w:p>
+    <w:p>
+      <w:pPr>
+        <w:bidi/>
+        <w:spacing w:after="120" w:line="360"/>
+        <w:jc w:val="both"/>
+      </w:pPr>
+      <w:r>
+        <w:rPr>
+          <w:rFonts w:ascii="Times New Roman" w:cs="David" w:eastAsia="David" w:hAnsi="Times New Roman"/>
+          <w:noProof/>
+          <w:sz w:val="24"/>
+          <w:szCs w:val="24"/>
+          <w:rtl/>
+          <w:lang w:val="en-US" w:eastAsia="en-US" w:bidi="he-IL"/>
+        </w:rPr>
+        <w:t xml:space="preserve">שלוש תובנות אישיות עלו מהעבודה. הראשונה: השיח על תלמידים עם לקויות למידה בבתי הספר מתמקד בהתאמות ובבחינות, ואילו הממצאים מראים שהרגלי היום-יום, ובראשם שעת כיבוי המסכים והוצאת הטלפון מחדר השינה, קשורים לתפקוד הלימודי לא פחות. השנייה: הממצא שתלמידים עם לקויות למידה אינם צופים במסכים יותר מעמיתיהם, אך משלמים על אותה כמות מחיר לימודי גבוה יותר, שינה את הדרך שבה כותבת העבודה תופסת את הנושא. הבעיה אינה "ילדים של מסכים" אלא פגיעות שונה לאותו הרגל, ולכן גם ההתערבות צריכה להיות מותאמת לתלמיד המאובחן ולא כללית. השלישית, מתודולוגית: הקושי לגייס קבוצת השוואה בגודל דומה מלמד שמחקר על תלמידים מאובחנים חייב לפנות לכלל תלמידי הכיתה כשותפים, וכך גם נמנע סימון של התלמידים המאובחנים בפני חבריהם.</w:t>
+      </w:r>
+    </w:p>
+    <w:p>
+      <w:pPr>
+        <w:pStyle w:val="Heading2"/>
+        <w:bidi/>
+        <w:spacing w:after="120" w:before="240" w:line="360"/>
+        <w:jc w:val="right"/>
+      </w:pPr>
+      <w:r>
+        <w:rPr>
+          <w:rFonts w:ascii="Times New Roman" w:cs="David" w:eastAsia="David" w:hAnsi="Times New Roman"/>
+          <w:b/>
+          <w:bCs/>
+          <w:noProof/>
+          <w:color w:val="000000"/>
+          <w:sz w:val="28"/>
+          <w:szCs w:val="28"/>
+          <w:rtl/>
+          <w:lang w:val="en-US" w:eastAsia="en-US" w:bidi="he-IL"/>
+        </w:rPr>
+        <w:t xml:space="preserve">4.6 מסקנות</w:t>
       </w:r>
     </w:p>
     <w:p>
@@ -15319,7 +15583,7 @@
           <w:rtl/>
           <w:lang w:val="en-US" w:eastAsia="en-US" w:bidi="he-IL"/>
         </w:rPr>
-        <w:t xml:space="preserve">4.6 תרומת המחקר והשלכות יישומיות</w:t>
+        <w:t xml:space="preserve">4.7 תרומת המחקר והשלכות יישומיות</w:t>
       </w:r>
     </w:p>
     <w:p>
@@ -15359,7 +15623,7 @@
           <w:rtl/>
           <w:lang w:val="en-US" w:eastAsia="en-US" w:bidi="he-IL"/>
         </w:rPr>
-        <w:t xml:space="preserve">4.7 הערכה ביקורתית ומגבלות המחקר</w:t>
+        <w:t xml:space="preserve">4.8 הערכה ביקורתית ומגבלות המחקר</w:t>
       </w:r>
     </w:p>
     <w:p>
@@ -15377,7 +15641,7 @@
           <w:rtl/>
           <w:lang w:val="en-US" w:eastAsia="en-US" w:bidi="he-IL"/>
         </w:rPr>
-        <w:t xml:space="preserve">הערכה ביקורתית של המחקר מעלה שתי נקודות שכותב העבודה רואה כחשובות במיוחד. הראשונה נוגעת למדידה: זמן המסך נמדד כסכום שעות, ואילו הממצא של קוקבש ואחרים (Kocabas et al., 2025) מרמז שאצל תלמידים עם לקויות למידה השאלה החשובה היא מה עושים מול המסך ולא רק כמה. ייתכן שחלק מהקשר שנמצא עם הציונים משקף שימוש פסיבי ומאוחר בלילה, ולא כל שימוש, ומדד כולל מטשטש זאת. השנייה נוגעת לכיוון ההשפעה: הפרשנות שהמסכים פוגעים בשינה ובלמידה טבעית ומתיישבת עם הספרות, אך תלמיד שנכשל בלמידה ומתקשה להירדם עשוי לברוח אל המסך, ואז המסך הוא סימפטום ולא סיבה. המחקר הנוכחי אינו יכול להכריע בין שני ההסברים, והתובנה המעשית שלו תקפה בשניהם: הרגלי המסך והשינה הם נקודת כניסה נגישה להתערבות, גם אם אינם המקור היחיד לקושי.</w:t>
+        <w:t xml:space="preserve">הערכה ביקורתית של המחקר מעלה שתי נקודות שכותבת העבודה רואה כחשובות במיוחד. הראשונה נוגעת למדידה: זמן המסך נמדד כסכום שעות, ואילו הממצא של קוקבש ואחרים (Kocabas et al., 2025) מרמז שאצל תלמידים עם לקויות למידה השאלה החשובה היא מה עושים מול המסך ולא רק כמה. ייתכן שחלק מהקשר שנמצא עם הציונים משקף שימוש פסיבי ומאוחר בלילה, ולא כל שימוש, ומדד כולל מטשטש זאת. השנייה נוגעת לכיוון ההשפעה: הפרשנות שהמסכים פוגעים בשינה ובלמידה טבעית ומתיישבת עם הספרות, אך תלמיד שנכשל בלמידה ומתקשה להירדם עשוי לברוח אל המסך, ואז המסך הוא סימפטום ולא סיבה. המחקר הנוכחי אינו יכול להכריע בין שני ההסברים, והתובנה המעשית שלו תקפה בשניהם: הרגלי המסך והשינה הם נקודת כניסה נגישה להתערבות, גם אם אינם המקור היחיד לקושי.</w:t>
       </w:r>
     </w:p>
     <w:p>
@@ -15417,7 +15681,7 @@
           <w:rtl/>
           <w:lang w:val="en-US" w:eastAsia="en-US" w:bidi="he-IL"/>
         </w:rPr>
-        <w:t xml:space="preserve">4.8 כיווני מחקר עתידיים</w:t>
+        <w:t xml:space="preserve">4.9 כיווני מחקר עתידיים</w:t>
       </w:r>
     </w:p>
     <w:p>
@@ -15457,7 +15721,7 @@
           <w:rtl/>
           <w:lang w:val="en-US" w:eastAsia="en-US" w:bidi="he-IL"/>
         </w:rPr>
-        <w:t xml:space="preserve">4.9 סיכום</w:t>
+        <w:t xml:space="preserve">4.10 סיכום</w:t>
       </w:r>
     </w:p>
     <w:p>
@@ -28475,7 +28739,7 @@
           <w:szCs w:val="16"/>
           <w:lang w:val="en-US" w:eastAsia="en-US" w:bidi="he-IL"/>
         </w:rPr>
-        <w:t xml:space="preserve">**. Correlation is significant at the 0.01 level (2-tailed).  *. Correlation is significant at the 0.05 level (2-tailed).</w:t>
+        <w:t xml:space="preserve">**. Correlation is significant at the 0.01 level (2-tailed). *. Correlation is significant at the 0.05 level (2-tailed).</w:t>
       </w:r>
     </w:p>
     <w:p>
@@ -29348,7 +29612,7 @@
           <w:szCs w:val="16"/>
           <w:lang w:val="en-US" w:eastAsia="en-US" w:bidi="he-IL"/>
         </w:rPr>
-        <w:t xml:space="preserve">**. Correlation is significant at the 0.01 level (2-tailed).  *. Correlation is significant at the 0.05 level (2-tailed).</w:t>
+        <w:t xml:space="preserve">**. Correlation is significant at the 0.01 level (2-tailed). *. Correlation is significant at the 0.05 level (2-tailed).</w:t>
       </w:r>
     </w:p>
     <w:p>
@@ -33107,7 +33371,7 @@
           <w:szCs w:val="16"/>
           <w:lang w:val="en-US" w:eastAsia="en-US" w:bidi="he-IL"/>
         </w:rPr>
-        <w:t xml:space="preserve">**. Correlation is significant at the 0.01 level (2-tailed).  *. Correlation is significant at the 0.05 level (2-tailed).</w:t>
+        <w:t xml:space="preserve">**. Correlation is significant at the 0.01 level (2-tailed). *. Correlation is significant at the 0.05 level (2-tailed).</w:t>
       </w:r>
     </w:p>
     <w:p>

</xml_diff>